<commit_message>
feat: actualizar plantilla de tickets
</commit_message>
<xml_diff>
--- a/pesaje/analytica/Report/PrintRecepcionGuiaRecepcionV2.docx
+++ b/pesaje/analytica/Report/PrintRecepcionGuiaRecepcionV2.docx
@@ -578,17 +578,17 @@
                 <w:rFonts w:ascii="Arial" w:hAnsi="Arial"/>
                 <w:b/>
                 <w:bCs/>
-                <w:color w:val="auto"/>
-                <w:sz w:val="16"/>
-                <w:szCs w:val="16"/>
-              </w:rPr>
-            </w:pPr>
-            <w:r>
-              <w:rPr>
-                <w:rFonts w:ascii="Arial" w:hAnsi="Arial"/>
-                <w:b/>
-                <w:bCs/>
-                <w:color w:val="auto"/>
+                <w:color w:val="000000" w:themeColor="text1"/>
+                <w:sz w:val="16"/>
+                <w:szCs w:val="16"/>
+              </w:rPr>
+            </w:pPr>
+            <w:r>
+              <w:rPr>
+                <w:rFonts w:ascii="Arial" w:hAnsi="Arial"/>
+                <w:b/>
+                <w:bCs/>
+                <w:color w:val="000000" w:themeColor="text1"/>
                 <w:sz w:val="16"/>
                 <w:szCs w:val="16"/>
                 <w:lang w:val="es-PE"/>
@@ -605,14 +605,15 @@
             <w:pPr>
               <w:rPr>
                 <w:rFonts w:ascii="Arial" w:hAnsi="Arial"/>
-                <w:color w:val="auto"/>
-                <w:sz w:val="16"/>
-                <w:szCs w:val="16"/>
-              </w:rPr>
-            </w:pPr>
-            <w:r>
-              <w:rPr>
-                <w:rFonts w:ascii="Arial" w:hAnsi="Arial"/>
+                <w:color w:val="000000" w:themeColor="text1"/>
+                <w:sz w:val="16"/>
+                <w:szCs w:val="16"/>
+              </w:rPr>
+            </w:pPr>
+            <w:r>
+              <w:rPr>
+                <w:rFonts w:ascii="Arial" w:hAnsi="Arial"/>
+                <w:color w:val="000000" w:themeColor="text1"/>
                 <w:sz w:val="16"/>
                 <w:szCs w:val="16"/>
               </w:rPr>
@@ -621,7 +622,7 @@
             <w:r>
               <w:rPr>
                 <w:rFonts w:ascii="Arial" w:hAnsi="Arial"/>
-                <w:color w:val="auto"/>
+                <w:color w:val="000000" w:themeColor="text1"/>
                 <w:sz w:val="16"/>
                 <w:szCs w:val="16"/>
               </w:rPr>
@@ -630,7 +631,7 @@
             <w:r>
               <w:rPr>
                 <w:rFonts w:ascii="Arial" w:hAnsi="Arial"/>
-                <w:color w:val="auto"/>
+                <w:color w:val="000000" w:themeColor="text1"/>
                 <w:sz w:val="16"/>
                 <w:szCs w:val="16"/>
               </w:rPr>
@@ -639,7 +640,7 @@
             <w:r>
               <w:rPr>
                 <w:rFonts w:ascii="Arial" w:hAnsi="Arial"/>
-                <w:color w:val="auto"/>
+                <w:color w:val="000000" w:themeColor="text1"/>
                 <w:sz w:val="16"/>
                 <w:szCs w:val="16"/>
               </w:rPr>
@@ -648,6 +649,7 @@
             <w:r>
               <w:rPr>
                 <w:rFonts w:ascii="Arial" w:hAnsi="Arial"/>
+                <w:color w:val="000000" w:themeColor="text1"/>
                 <w:sz w:val="16"/>
                 <w:szCs w:val="16"/>
               </w:rPr>
@@ -656,7 +658,7 @@
             <w:r>
               <w:rPr>
                 <w:rFonts w:ascii="Arial" w:hAnsi="Arial"/>
-                <w:color w:val="auto"/>
+                <w:color w:val="000000" w:themeColor="text1"/>
                 <w:sz w:val="16"/>
                 <w:szCs w:val="16"/>
               </w:rPr>
@@ -665,6 +667,7 @@
             <w:r>
               <w:rPr>
                 <w:rFonts w:ascii="Arial" w:hAnsi="Arial"/>
+                <w:color w:val="000000" w:themeColor="text1"/>
                 <w:sz w:val="16"/>
                 <w:szCs w:val="16"/>
               </w:rPr>
@@ -682,7 +685,7 @@
                 <w:rFonts w:ascii="Arial" w:hAnsi="Arial"/>
                 <w:b/>
                 <w:bCs/>
-                <w:color w:val="auto"/>
+                <w:color w:val="000000" w:themeColor="text1"/>
                 <w:sz w:val="16"/>
                 <w:szCs w:val="16"/>
               </w:rPr>
@@ -693,7 +696,7 @@
                 <w:rFonts w:ascii="Arial" w:hAnsi="Arial"/>
                 <w:b/>
                 <w:bCs/>
-                <w:color w:val="auto"/>
+                <w:color w:val="000000" w:themeColor="text1"/>
                 <w:sz w:val="16"/>
                 <w:szCs w:val="16"/>
                 <w:lang w:val="es-PE"/>
@@ -706,7 +709,7 @@
                 <w:rFonts w:ascii="Arial" w:hAnsi="Arial"/>
                 <w:b/>
                 <w:bCs/>
-                <w:color w:val="auto"/>
+                <w:color w:val="000000" w:themeColor="text1"/>
                 <w:sz w:val="16"/>
                 <w:szCs w:val="16"/>
                 <w:lang w:val="es-PE"/>
@@ -718,7 +721,7 @@
                 <w:rFonts w:ascii="Arial" w:hAnsi="Arial"/>
                 <w:b/>
                 <w:bCs/>
-                <w:color w:val="auto"/>
+                <w:color w:val="000000" w:themeColor="text1"/>
                 <w:sz w:val="16"/>
                 <w:szCs w:val="16"/>
                 <w:lang w:val="es-PE"/>
@@ -730,7 +733,7 @@
                 <w:rFonts w:ascii="Arial" w:hAnsi="Arial"/>
                 <w:b/>
                 <w:bCs/>
-                <w:color w:val="auto"/>
+                <w:color w:val="000000" w:themeColor="text1"/>
                 <w:sz w:val="16"/>
                 <w:szCs w:val="16"/>
                 <w:lang w:val="es-PE"/>
@@ -743,7 +746,7 @@
                 <w:rFonts w:ascii="Arial" w:hAnsi="Arial"/>
                 <w:b/>
                 <w:bCs/>
-                <w:color w:val="auto"/>
+                <w:color w:val="000000" w:themeColor="text1"/>
                 <w:sz w:val="16"/>
                 <w:szCs w:val="16"/>
                 <w:lang w:val="es-PE"/>
@@ -761,14 +764,15 @@
             <w:pPr>
               <w:rPr>
                 <w:rFonts w:ascii="Arial" w:hAnsi="Arial"/>
-                <w:color w:val="auto"/>
-                <w:sz w:val="16"/>
-                <w:szCs w:val="16"/>
-              </w:rPr>
-            </w:pPr>
-            <w:r>
-              <w:rPr>
-                <w:rFonts w:ascii="Arial" w:hAnsi="Arial"/>
+                <w:color w:val="000000" w:themeColor="text1"/>
+                <w:sz w:val="16"/>
+                <w:szCs w:val="16"/>
+              </w:rPr>
+            </w:pPr>
+            <w:r>
+              <w:rPr>
+                <w:rFonts w:ascii="Arial" w:hAnsi="Arial"/>
+                <w:color w:val="000000" w:themeColor="text1"/>
                 <w:sz w:val="16"/>
                 <w:szCs w:val="16"/>
               </w:rPr>
@@ -777,7 +781,7 @@
             <w:r>
               <w:rPr>
                 <w:rFonts w:ascii="Arial" w:hAnsi="Arial"/>
-                <w:color w:val="auto"/>
+                <w:color w:val="000000" w:themeColor="text1"/>
                 <w:sz w:val="16"/>
                 <w:szCs w:val="16"/>
               </w:rPr>
@@ -786,6 +790,7 @@
             <w:r>
               <w:rPr>
                 <w:rFonts w:ascii="Arial" w:hAnsi="Arial"/>
+                <w:color w:val="000000" w:themeColor="text1"/>
                 <w:sz w:val="16"/>
                 <w:szCs w:val="16"/>
               </w:rPr>
@@ -794,7 +799,7 @@
             <w:r>
               <w:rPr>
                 <w:rFonts w:ascii="Arial" w:hAnsi="Arial"/>
-                <w:color w:val="auto"/>
+                <w:color w:val="000000" w:themeColor="text1"/>
                 <w:sz w:val="16"/>
                 <w:szCs w:val="16"/>
               </w:rPr>
@@ -803,6 +808,7 @@
             <w:r>
               <w:rPr>
                 <w:rFonts w:ascii="Arial" w:hAnsi="Arial"/>
+                <w:color w:val="000000" w:themeColor="text1"/>
                 <w:sz w:val="16"/>
                 <w:szCs w:val="16"/>
               </w:rPr>
@@ -825,17 +831,17 @@
                 <w:rFonts w:ascii="Arial" w:hAnsi="Arial"/>
                 <w:b/>
                 <w:bCs/>
-                <w:color w:val="auto"/>
-                <w:sz w:val="16"/>
-                <w:szCs w:val="16"/>
-              </w:rPr>
-            </w:pPr>
-            <w:r>
-              <w:rPr>
-                <w:rFonts w:ascii="Arial" w:hAnsi="Arial"/>
-                <w:b/>
-                <w:bCs/>
-                <w:color w:val="auto"/>
+                <w:color w:val="000000" w:themeColor="text1"/>
+                <w:sz w:val="16"/>
+                <w:szCs w:val="16"/>
+              </w:rPr>
+            </w:pPr>
+            <w:r>
+              <w:rPr>
+                <w:rFonts w:ascii="Arial" w:hAnsi="Arial"/>
+                <w:b/>
+                <w:bCs/>
+                <w:color w:val="000000" w:themeColor="text1"/>
                 <w:sz w:val="16"/>
                 <w:szCs w:val="16"/>
                 <w:lang w:val="es-PE"/>
@@ -852,14 +858,15 @@
             <w:pPr>
               <w:rPr>
                 <w:rFonts w:ascii="Arial" w:hAnsi="Arial"/>
-                <w:color w:val="auto"/>
-                <w:sz w:val="16"/>
-                <w:szCs w:val="16"/>
-              </w:rPr>
-            </w:pPr>
-            <w:r>
-              <w:rPr>
-                <w:rFonts w:ascii="Arial" w:hAnsi="Arial"/>
+                <w:color w:val="000000" w:themeColor="text1"/>
+                <w:sz w:val="16"/>
+                <w:szCs w:val="16"/>
+              </w:rPr>
+            </w:pPr>
+            <w:r>
+              <w:rPr>
+                <w:rFonts w:ascii="Arial" w:hAnsi="Arial"/>
+                <w:color w:val="000000" w:themeColor="text1"/>
                 <w:sz w:val="16"/>
                 <w:szCs w:val="16"/>
               </w:rPr>
@@ -868,7 +875,7 @@
             <w:r>
               <w:rPr>
                 <w:rFonts w:ascii="Arial" w:hAnsi="Arial"/>
-                <w:color w:val="auto"/>
+                <w:color w:val="000000" w:themeColor="text1"/>
                 <w:sz w:val="16"/>
                 <w:szCs w:val="16"/>
               </w:rPr>
@@ -877,6 +884,7 @@
             <w:r>
               <w:rPr>
                 <w:rFonts w:ascii="Arial" w:hAnsi="Arial"/>
+                <w:color w:val="000000" w:themeColor="text1"/>
                 <w:sz w:val="16"/>
                 <w:szCs w:val="16"/>
               </w:rPr>
@@ -885,7 +893,7 @@
             <w:r>
               <w:rPr>
                 <w:rFonts w:ascii="Arial" w:hAnsi="Arial"/>
-                <w:color w:val="auto"/>
+                <w:color w:val="000000" w:themeColor="text1"/>
                 <w:sz w:val="16"/>
                 <w:szCs w:val="16"/>
               </w:rPr>
@@ -894,6 +902,7 @@
             <w:r>
               <w:rPr>
                 <w:rFonts w:ascii="Arial" w:hAnsi="Arial"/>
+                <w:color w:val="000000" w:themeColor="text1"/>
                 <w:sz w:val="16"/>
                 <w:szCs w:val="16"/>
               </w:rPr>
@@ -911,17 +920,17 @@
                 <w:rFonts w:ascii="Arial" w:hAnsi="Arial"/>
                 <w:b/>
                 <w:bCs/>
-                <w:color w:val="auto"/>
-                <w:sz w:val="16"/>
-                <w:szCs w:val="16"/>
-              </w:rPr>
-            </w:pPr>
-            <w:r>
-              <w:rPr>
-                <w:rFonts w:ascii="Arial" w:hAnsi="Arial"/>
-                <w:b/>
-                <w:bCs/>
-                <w:color w:val="auto"/>
+                <w:color w:val="000000" w:themeColor="text1"/>
+                <w:sz w:val="16"/>
+                <w:szCs w:val="16"/>
+              </w:rPr>
+            </w:pPr>
+            <w:r>
+              <w:rPr>
+                <w:rFonts w:ascii="Arial" w:hAnsi="Arial"/>
+                <w:b/>
+                <w:bCs/>
+                <w:color w:val="000000" w:themeColor="text1"/>
                 <w:sz w:val="16"/>
                 <w:szCs w:val="16"/>
                 <w:lang w:val="es-PE"/>
@@ -938,14 +947,15 @@
             <w:pPr>
               <w:rPr>
                 <w:rFonts w:ascii="Arial" w:hAnsi="Arial"/>
-                <w:color w:val="auto"/>
-                <w:sz w:val="16"/>
-                <w:szCs w:val="16"/>
-              </w:rPr>
-            </w:pPr>
-            <w:r>
-              <w:rPr>
-                <w:rFonts w:ascii="Arial" w:hAnsi="Arial"/>
+                <w:color w:val="000000" w:themeColor="text1"/>
+                <w:sz w:val="16"/>
+                <w:szCs w:val="16"/>
+              </w:rPr>
+            </w:pPr>
+            <w:r>
+              <w:rPr>
+                <w:rFonts w:ascii="Arial" w:hAnsi="Arial"/>
+                <w:color w:val="000000" w:themeColor="text1"/>
                 <w:sz w:val="16"/>
                 <w:szCs w:val="16"/>
               </w:rPr>
@@ -954,7 +964,7 @@
             <w:r>
               <w:rPr>
                 <w:rFonts w:ascii="Arial" w:hAnsi="Arial"/>
-                <w:color w:val="auto"/>
+                <w:color w:val="000000" w:themeColor="text1"/>
                 <w:sz w:val="16"/>
                 <w:szCs w:val="16"/>
               </w:rPr>
@@ -963,7 +973,7 @@
             <w:r>
               <w:rPr>
                 <w:rFonts w:ascii="Arial" w:hAnsi="Arial"/>
-                <w:color w:val="auto"/>
+                <w:color w:val="000000" w:themeColor="text1"/>
                 <w:sz w:val="16"/>
                 <w:szCs w:val="16"/>
               </w:rPr>
@@ -972,7 +982,7 @@
             <w:r>
               <w:rPr>
                 <w:rFonts w:ascii="Arial" w:hAnsi="Arial"/>
-                <w:color w:val="auto"/>
+                <w:color w:val="000000" w:themeColor="text1"/>
                 <w:sz w:val="16"/>
                 <w:szCs w:val="16"/>
               </w:rPr>
@@ -981,6 +991,7 @@
             <w:r>
               <w:rPr>
                 <w:rFonts w:ascii="Arial" w:hAnsi="Arial"/>
+                <w:color w:val="000000" w:themeColor="text1"/>
                 <w:sz w:val="16"/>
                 <w:szCs w:val="16"/>
               </w:rPr>
@@ -989,7 +1000,7 @@
             <w:r>
               <w:rPr>
                 <w:rFonts w:ascii="Arial" w:hAnsi="Arial"/>
-                <w:color w:val="auto"/>
+                <w:color w:val="000000" w:themeColor="text1"/>
                 <w:sz w:val="16"/>
                 <w:szCs w:val="16"/>
               </w:rPr>
@@ -998,6 +1009,7 @@
             <w:r>
               <w:rPr>
                 <w:rFonts w:ascii="Arial" w:hAnsi="Arial"/>
+                <w:color w:val="000000" w:themeColor="text1"/>
                 <w:sz w:val="16"/>
                 <w:szCs w:val="16"/>
               </w:rPr>
@@ -1020,7 +1032,7 @@
                 <w:rFonts w:ascii="Arial" w:hAnsi="Arial"/>
                 <w:b/>
                 <w:bCs/>
-                <w:color w:val="auto"/>
+                <w:color w:val="000000" w:themeColor="text1"/>
                 <w:sz w:val="16"/>
                 <w:szCs w:val="16"/>
                 <w:lang w:val="es-PE"/>
@@ -1031,7 +1043,7 @@
                 <w:rFonts w:ascii="Arial" w:hAnsi="Arial"/>
                 <w:b/>
                 <w:bCs/>
-                <w:color w:val="auto"/>
+                <w:color w:val="000000" w:themeColor="text1"/>
                 <w:sz w:val="16"/>
                 <w:szCs w:val="16"/>
                 <w:lang w:val="es-PE"/>
@@ -1048,14 +1060,15 @@
             <w:pPr>
               <w:rPr>
                 <w:rFonts w:ascii="Arial" w:hAnsi="Arial"/>
-                <w:color w:val="auto"/>
-                <w:sz w:val="16"/>
-                <w:szCs w:val="16"/>
-              </w:rPr>
-            </w:pPr>
-            <w:r>
-              <w:rPr>
-                <w:rFonts w:ascii="Arial" w:hAnsi="Arial"/>
+                <w:color w:val="000000" w:themeColor="text1"/>
+                <w:sz w:val="16"/>
+                <w:szCs w:val="16"/>
+              </w:rPr>
+            </w:pPr>
+            <w:r>
+              <w:rPr>
+                <w:rFonts w:ascii="Arial" w:hAnsi="Arial"/>
+                <w:color w:val="000000" w:themeColor="text1"/>
                 <w:sz w:val="16"/>
                 <w:szCs w:val="16"/>
               </w:rPr>
@@ -1064,7 +1077,7 @@
             <w:r>
               <w:rPr>
                 <w:rFonts w:ascii="Arial" w:hAnsi="Arial"/>
-                <w:color w:val="auto"/>
+                <w:color w:val="000000" w:themeColor="text1"/>
                 <w:sz w:val="16"/>
                 <w:szCs w:val="16"/>
               </w:rPr>
@@ -1073,6 +1086,7 @@
             <w:r>
               <w:rPr>
                 <w:rFonts w:ascii="Arial" w:hAnsi="Arial"/>
+                <w:color w:val="000000" w:themeColor="text1"/>
                 <w:sz w:val="16"/>
                 <w:szCs w:val="16"/>
               </w:rPr>
@@ -1081,7 +1095,7 @@
             <w:r>
               <w:rPr>
                 <w:rFonts w:ascii="Arial" w:hAnsi="Arial"/>
-                <w:color w:val="auto"/>
+                <w:color w:val="000000" w:themeColor="text1"/>
                 <w:sz w:val="16"/>
                 <w:szCs w:val="16"/>
               </w:rPr>
@@ -1090,6 +1104,7 @@
             <w:r>
               <w:rPr>
                 <w:rFonts w:ascii="Arial" w:hAnsi="Arial"/>
+                <w:color w:val="000000" w:themeColor="text1"/>
                 <w:sz w:val="16"/>
                 <w:szCs w:val="16"/>
               </w:rPr>
@@ -1107,7 +1122,7 @@
                 <w:rFonts w:ascii="Arial" w:hAnsi="Arial"/>
                 <w:b/>
                 <w:bCs/>
-                <w:color w:val="auto"/>
+                <w:color w:val="000000" w:themeColor="text1"/>
                 <w:sz w:val="16"/>
                 <w:szCs w:val="16"/>
                 <w:lang w:val="es-PE"/>
@@ -1118,7 +1133,7 @@
                 <w:rFonts w:ascii="Arial" w:hAnsi="Arial"/>
                 <w:b/>
                 <w:bCs/>
-                <w:color w:val="auto"/>
+                <w:color w:val="000000" w:themeColor="text1"/>
                 <w:sz w:val="16"/>
                 <w:szCs w:val="16"/>
                 <w:lang w:val="es-PE"/>
@@ -1135,14 +1150,15 @@
             <w:pPr>
               <w:rPr>
                 <w:rFonts w:ascii="Arial" w:hAnsi="Arial"/>
-                <w:color w:val="auto"/>
-                <w:sz w:val="16"/>
-                <w:szCs w:val="16"/>
-              </w:rPr>
-            </w:pPr>
-            <w:r>
-              <w:rPr>
-                <w:rFonts w:ascii="Arial" w:hAnsi="Arial"/>
+                <w:color w:val="000000" w:themeColor="text1"/>
+                <w:sz w:val="16"/>
+                <w:szCs w:val="16"/>
+              </w:rPr>
+            </w:pPr>
+            <w:r>
+              <w:rPr>
+                <w:rFonts w:ascii="Arial" w:hAnsi="Arial"/>
+                <w:color w:val="000000" w:themeColor="text1"/>
                 <w:sz w:val="16"/>
                 <w:szCs w:val="16"/>
               </w:rPr>
@@ -1151,7 +1167,7 @@
             <w:r>
               <w:rPr>
                 <w:rFonts w:ascii="Arial" w:hAnsi="Arial"/>
-                <w:color w:val="auto"/>
+                <w:color w:val="000000" w:themeColor="text1"/>
                 <w:sz w:val="16"/>
                 <w:szCs w:val="16"/>
               </w:rPr>
@@ -1160,7 +1176,7 @@
             <w:r>
               <w:rPr>
                 <w:rFonts w:ascii="Arial" w:hAnsi="Arial"/>
-                <w:color w:val="auto"/>
+                <w:color w:val="000000" w:themeColor="text1"/>
                 <w:sz w:val="16"/>
                 <w:szCs w:val="16"/>
               </w:rPr>
@@ -1169,7 +1185,7 @@
             <w:r>
               <w:rPr>
                 <w:rFonts w:ascii="Arial" w:hAnsi="Arial"/>
-                <w:color w:val="auto"/>
+                <w:color w:val="000000" w:themeColor="text1"/>
                 <w:sz w:val="16"/>
                 <w:szCs w:val="16"/>
               </w:rPr>
@@ -1178,6 +1194,7 @@
             <w:r>
               <w:rPr>
                 <w:rFonts w:ascii="Arial" w:hAnsi="Arial"/>
+                <w:color w:val="000000" w:themeColor="text1"/>
                 <w:sz w:val="16"/>
                 <w:szCs w:val="16"/>
               </w:rPr>
@@ -1186,7 +1203,7 @@
             <w:r>
               <w:rPr>
                 <w:rFonts w:ascii="Arial" w:hAnsi="Arial"/>
-                <w:color w:val="auto"/>
+                <w:color w:val="000000" w:themeColor="text1"/>
                 <w:sz w:val="16"/>
                 <w:szCs w:val="16"/>
               </w:rPr>
@@ -1195,6 +1212,7 @@
             <w:r>
               <w:rPr>
                 <w:rFonts w:ascii="Arial" w:hAnsi="Arial"/>
+                <w:color w:val="000000" w:themeColor="text1"/>
                 <w:sz w:val="16"/>
                 <w:szCs w:val="16"/>
               </w:rPr>
@@ -1203,7 +1221,7 @@
             <w:r>
               <w:rPr>
                 <w:rFonts w:ascii="Arial" w:hAnsi="Arial"/>
-                <w:color w:val="auto"/>
+                <w:color w:val="000000" w:themeColor="text1"/>
                 <w:sz w:val="16"/>
                 <w:szCs w:val="16"/>
               </w:rPr>
@@ -1226,7 +1244,7 @@
                 <w:rFonts w:ascii="Arial" w:hAnsi="Arial"/>
                 <w:b/>
                 <w:bCs/>
-                <w:color w:val="auto"/>
+                <w:color w:val="000000" w:themeColor="text1"/>
                 <w:sz w:val="16"/>
                 <w:szCs w:val="16"/>
                 <w:lang w:val="es-PE"/>
@@ -1237,7 +1255,7 @@
                 <w:rFonts w:ascii="Arial" w:hAnsi="Arial"/>
                 <w:b/>
                 <w:bCs/>
-                <w:color w:val="auto"/>
+                <w:color w:val="000000" w:themeColor="text1"/>
                 <w:sz w:val="16"/>
                 <w:szCs w:val="16"/>
                 <w:lang w:val="es-PE"/>
@@ -1254,14 +1272,15 @@
             <w:pPr>
               <w:rPr>
                 <w:rFonts w:ascii="Arial" w:hAnsi="Arial"/>
-                <w:color w:val="auto"/>
-                <w:sz w:val="16"/>
-                <w:szCs w:val="16"/>
-              </w:rPr>
-            </w:pPr>
-            <w:r>
-              <w:rPr>
-                <w:rFonts w:ascii="Arial" w:hAnsi="Arial"/>
+                <w:color w:val="000000" w:themeColor="text1"/>
+                <w:sz w:val="16"/>
+                <w:szCs w:val="16"/>
+              </w:rPr>
+            </w:pPr>
+            <w:r>
+              <w:rPr>
+                <w:rFonts w:ascii="Arial" w:hAnsi="Arial"/>
+                <w:color w:val="000000" w:themeColor="text1"/>
                 <w:sz w:val="16"/>
                 <w:szCs w:val="16"/>
               </w:rPr>
@@ -1270,7 +1289,7 @@
             <w:r>
               <w:rPr>
                 <w:rFonts w:ascii="Arial" w:hAnsi="Arial"/>
-                <w:color w:val="auto"/>
+                <w:color w:val="000000" w:themeColor="text1"/>
                 <w:sz w:val="16"/>
                 <w:szCs w:val="16"/>
               </w:rPr>
@@ -1279,6 +1298,7 @@
             <w:r>
               <w:rPr>
                 <w:rFonts w:ascii="Arial" w:hAnsi="Arial"/>
+                <w:color w:val="000000" w:themeColor="text1"/>
                 <w:sz w:val="16"/>
                 <w:szCs w:val="16"/>
               </w:rPr>
@@ -1287,7 +1307,7 @@
             <w:r>
               <w:rPr>
                 <w:rFonts w:ascii="Arial" w:hAnsi="Arial"/>
-                <w:color w:val="auto"/>
+                <w:color w:val="000000" w:themeColor="text1"/>
                 <w:sz w:val="16"/>
                 <w:szCs w:val="16"/>
               </w:rPr>
@@ -1296,6 +1316,7 @@
             <w:r>
               <w:rPr>
                 <w:rFonts w:ascii="Arial" w:hAnsi="Arial"/>
+                <w:color w:val="000000" w:themeColor="text1"/>
                 <w:sz w:val="16"/>
                 <w:szCs w:val="16"/>
               </w:rPr>
@@ -1311,7 +1332,7 @@
             <w:pPr>
               <w:rPr>
                 <w:rFonts w:ascii="Arial" w:hAnsi="Arial"/>
-                <w:color w:val="auto"/>
+                <w:color w:val="000000" w:themeColor="text1"/>
                 <w:sz w:val="16"/>
                 <w:szCs w:val="16"/>
                 <w:lang w:val="es-PE"/>
@@ -1327,7 +1348,7 @@
             <w:pPr>
               <w:rPr>
                 <w:rFonts w:ascii="Arial" w:hAnsi="Arial"/>
-                <w:color w:val="auto"/>
+                <w:color w:val="000000" w:themeColor="text1"/>
                 <w:sz w:val="16"/>
                 <w:szCs w:val="16"/>
               </w:rPr>
@@ -1351,7 +1372,7 @@
               <w:rPr>
                 <w:rFonts w:ascii="Arial" w:hAnsi="Arial"/>
                 <w:b/>
-                <w:color w:val="auto"/>
+                <w:color w:val="000000" w:themeColor="text1"/>
                 <w:sz w:val="16"/>
                 <w:szCs w:val="16"/>
                 <w:lang w:val="es-PE"/>
@@ -1371,7 +1392,7 @@
               <w:rPr>
                 <w:rFonts w:ascii="Arial" w:hAnsi="Arial"/>
                 <w:bCs/>
-                <w:color w:val="auto"/>
+                <w:color w:val="000000" w:themeColor="text1"/>
                 <w:sz w:val="16"/>
                 <w:szCs w:val="16"/>
               </w:rPr>
@@ -1390,7 +1411,7 @@
               <w:rPr>
                 <w:rFonts w:ascii="Arial" w:hAnsi="Arial"/>
                 <w:b/>
-                <w:color w:val="auto"/>
+                <w:color w:val="000000" w:themeColor="text1"/>
                 <w:sz w:val="16"/>
                 <w:szCs w:val="16"/>
                 <w:lang w:val="es-PE"/>
@@ -1410,7 +1431,7 @@
               <w:rPr>
                 <w:rFonts w:ascii="Arial" w:hAnsi="Arial"/>
                 <w:bCs/>
-                <w:color w:val="auto"/>
+                <w:color w:val="000000" w:themeColor="text1"/>
                 <w:sz w:val="16"/>
                 <w:szCs w:val="16"/>
               </w:rPr>
@@ -1436,7 +1457,7 @@
                 <w:rFonts w:ascii="Arial" w:hAnsi="Arial"/>
                 <w:b/>
                 <w:bCs/>
-                <w:color w:val="auto"/>
+                <w:color w:val="000000" w:themeColor="text1"/>
                 <w:sz w:val="16"/>
                 <w:szCs w:val="16"/>
                 <w:u w:val="single"/>
@@ -1458,7 +1479,7 @@
               <w:rPr>
                 <w:rFonts w:ascii="Arial" w:hAnsi="Arial"/>
                 <w:b/>
-                <w:color w:val="auto"/>
+                <w:color w:val="000000" w:themeColor="text1"/>
                 <w:sz w:val="16"/>
                 <w:szCs w:val="16"/>
                 <w:u w:val="single"/>
@@ -1481,17 +1502,17 @@
               <w:rPr>
                 <w:rFonts w:ascii="Arial" w:hAnsi="Arial"/>
                 <w:bCs/>
-                <w:color w:val="auto"/>
-                <w:sz w:val="16"/>
-                <w:szCs w:val="16"/>
-              </w:rPr>
-            </w:pPr>
-            <w:r>
-              <w:rPr>
-                <w:rFonts w:ascii="Arial" w:hAnsi="Arial"/>
-                <w:b/>
-                <w:bCs/>
-                <w:color w:val="auto"/>
+                <w:color w:val="000000" w:themeColor="text1"/>
+                <w:sz w:val="16"/>
+                <w:szCs w:val="16"/>
+              </w:rPr>
+            </w:pPr>
+            <w:r>
+              <w:rPr>
+                <w:rFonts w:ascii="Arial" w:hAnsi="Arial"/>
+                <w:b/>
+                <w:bCs/>
+                <w:color w:val="000000" w:themeColor="text1"/>
                 <w:sz w:val="16"/>
                 <w:szCs w:val="16"/>
                 <w:u w:val="single"/>
@@ -1504,7 +1525,7 @@
                 <w:rFonts w:ascii="Arial" w:hAnsi="Arial"/>
                 <w:b/>
                 <w:bCs/>
-                <w:color w:val="auto"/>
+                <w:color w:val="000000" w:themeColor="text1"/>
                 <w:sz w:val="16"/>
                 <w:szCs w:val="16"/>
                 <w:u w:val="single"/>
@@ -1524,7 +1545,7 @@
               <w:rPr>
                 <w:rFonts w:ascii="Arial" w:hAnsi="Arial"/>
                 <w:b/>
-                <w:color w:val="auto"/>
+                <w:color w:val="000000" w:themeColor="text1"/>
                 <w:sz w:val="16"/>
                 <w:szCs w:val="16"/>
                 <w:u w:val="single"/>
@@ -1534,7 +1555,7 @@
               <w:rPr>
                 <w:rFonts w:ascii="Arial" w:hAnsi="Arial"/>
                 <w:b/>
-                <w:color w:val="auto"/>
+                <w:color w:val="000000" w:themeColor="text1"/>
                 <w:sz w:val="16"/>
                 <w:szCs w:val="16"/>
                 <w:u w:val="single"/>
@@ -1545,7 +1566,7 @@
               <w:rPr>
                 <w:rFonts w:ascii="Arial" w:hAnsi="Arial"/>
                 <w:b/>
-                <w:color w:val="auto"/>
+                <w:color w:val="000000" w:themeColor="text1"/>
                 <w:sz w:val="16"/>
                 <w:szCs w:val="16"/>
                 <w:u w:val="single"/>
@@ -1569,17 +1590,17 @@
                 <w:rFonts w:ascii="Arial" w:hAnsi="Arial"/>
                 <w:b/>
                 <w:bCs/>
-                <w:color w:val="auto"/>
-                <w:sz w:val="16"/>
-                <w:szCs w:val="16"/>
-              </w:rPr>
-            </w:pPr>
-            <w:r>
-              <w:rPr>
-                <w:rFonts w:ascii="Arial" w:hAnsi="Arial"/>
-                <w:b/>
-                <w:bCs/>
-                <w:color w:val="auto"/>
+                <w:color w:val="000000" w:themeColor="text1"/>
+                <w:sz w:val="16"/>
+                <w:szCs w:val="16"/>
+              </w:rPr>
+            </w:pPr>
+            <w:r>
+              <w:rPr>
+                <w:rFonts w:ascii="Arial" w:hAnsi="Arial"/>
+                <w:b/>
+                <w:bCs/>
+                <w:color w:val="000000" w:themeColor="text1"/>
                 <w:sz w:val="16"/>
                 <w:szCs w:val="16"/>
                 <w:lang w:val="es-PE"/>
@@ -1591,7 +1612,7 @@
                 <w:rFonts w:ascii="Arial" w:hAnsi="Arial"/>
                 <w:b/>
                 <w:bCs/>
-                <w:color w:val="auto"/>
+                <w:color w:val="000000" w:themeColor="text1"/>
                 <w:sz w:val="16"/>
                 <w:szCs w:val="16"/>
                 <w:lang w:val="es-PE"/>
@@ -1608,14 +1629,15 @@
             <w:pPr>
               <w:rPr>
                 <w:rFonts w:ascii="Arial" w:hAnsi="Arial"/>
-                <w:color w:val="auto"/>
-                <w:sz w:val="16"/>
-                <w:szCs w:val="16"/>
-              </w:rPr>
-            </w:pPr>
-            <w:r>
-              <w:rPr>
-                <w:rFonts w:ascii="Arial" w:hAnsi="Arial"/>
+                <w:color w:val="000000" w:themeColor="text1"/>
+                <w:sz w:val="16"/>
+                <w:szCs w:val="16"/>
+              </w:rPr>
+            </w:pPr>
+            <w:r>
+              <w:rPr>
+                <w:rFonts w:ascii="Arial" w:hAnsi="Arial"/>
+                <w:color w:val="000000" w:themeColor="text1"/>
                 <w:sz w:val="16"/>
                 <w:szCs w:val="16"/>
               </w:rPr>
@@ -1624,7 +1646,7 @@
             <w:r>
               <w:rPr>
                 <w:rFonts w:ascii="Arial" w:hAnsi="Arial"/>
-                <w:color w:val="auto"/>
+                <w:color w:val="000000" w:themeColor="text1"/>
                 <w:sz w:val="16"/>
                 <w:szCs w:val="16"/>
               </w:rPr>
@@ -1633,6 +1655,7 @@
             <w:r>
               <w:rPr>
                 <w:rFonts w:ascii="Arial" w:hAnsi="Arial"/>
+                <w:color w:val="000000" w:themeColor="text1"/>
                 <w:sz w:val="16"/>
                 <w:szCs w:val="16"/>
               </w:rPr>
@@ -1641,7 +1664,7 @@
             <w:r>
               <w:rPr>
                 <w:rFonts w:ascii="Arial" w:hAnsi="Arial"/>
-                <w:color w:val="auto"/>
+                <w:color w:val="000000" w:themeColor="text1"/>
                 <w:sz w:val="16"/>
                 <w:szCs w:val="16"/>
               </w:rPr>
@@ -1650,6 +1673,7 @@
             <w:r>
               <w:rPr>
                 <w:rFonts w:ascii="Arial" w:hAnsi="Arial"/>
+                <w:color w:val="000000" w:themeColor="text1"/>
                 <w:sz w:val="16"/>
                 <w:szCs w:val="16"/>
               </w:rPr>
@@ -1667,17 +1691,17 @@
                 <w:rFonts w:ascii="Arial" w:hAnsi="Arial"/>
                 <w:b/>
                 <w:bCs/>
-                <w:color w:val="auto"/>
-                <w:sz w:val="16"/>
-                <w:szCs w:val="16"/>
-              </w:rPr>
-            </w:pPr>
-            <w:r>
-              <w:rPr>
-                <w:rFonts w:ascii="Arial" w:hAnsi="Arial"/>
-                <w:b/>
-                <w:bCs/>
-                <w:color w:val="auto"/>
+                <w:color w:val="000000" w:themeColor="text1"/>
+                <w:sz w:val="16"/>
+                <w:szCs w:val="16"/>
+              </w:rPr>
+            </w:pPr>
+            <w:r>
+              <w:rPr>
+                <w:rFonts w:ascii="Arial" w:hAnsi="Arial"/>
+                <w:b/>
+                <w:bCs/>
+                <w:color w:val="000000" w:themeColor="text1"/>
                 <w:sz w:val="16"/>
                 <w:szCs w:val="16"/>
                 <w:lang w:val="es-PE"/>
@@ -1694,14 +1718,15 @@
             <w:pPr>
               <w:rPr>
                 <w:rFonts w:ascii="Arial" w:hAnsi="Arial"/>
-                <w:color w:val="auto"/>
-                <w:sz w:val="16"/>
-                <w:szCs w:val="16"/>
-              </w:rPr>
-            </w:pPr>
-            <w:r>
-              <w:rPr>
-                <w:rFonts w:ascii="Arial" w:hAnsi="Arial"/>
+                <w:color w:val="000000" w:themeColor="text1"/>
+                <w:sz w:val="16"/>
+                <w:szCs w:val="16"/>
+              </w:rPr>
+            </w:pPr>
+            <w:r>
+              <w:rPr>
+                <w:rFonts w:ascii="Arial" w:hAnsi="Arial"/>
+                <w:color w:val="000000" w:themeColor="text1"/>
                 <w:sz w:val="16"/>
                 <w:szCs w:val="16"/>
               </w:rPr>
@@ -1710,7 +1735,7 @@
             <w:r>
               <w:rPr>
                 <w:rFonts w:ascii="Arial" w:hAnsi="Arial"/>
-                <w:color w:val="auto"/>
+                <w:color w:val="000000" w:themeColor="text1"/>
                 <w:sz w:val="16"/>
                 <w:szCs w:val="16"/>
               </w:rPr>
@@ -1719,6 +1744,7 @@
             <w:r>
               <w:rPr>
                 <w:rFonts w:ascii="Arial" w:hAnsi="Arial"/>
+                <w:color w:val="000000" w:themeColor="text1"/>
                 <w:sz w:val="16"/>
                 <w:szCs w:val="16"/>
               </w:rPr>
@@ -1727,7 +1753,7 @@
             <w:r>
               <w:rPr>
                 <w:rFonts w:ascii="Arial" w:hAnsi="Arial"/>
-                <w:color w:val="auto"/>
+                <w:color w:val="000000" w:themeColor="text1"/>
                 <w:sz w:val="16"/>
                 <w:szCs w:val="16"/>
               </w:rPr>
@@ -1736,6 +1762,7 @@
             <w:r>
               <w:rPr>
                 <w:rFonts w:ascii="Arial" w:hAnsi="Arial"/>
+                <w:color w:val="000000" w:themeColor="text1"/>
                 <w:sz w:val="16"/>
                 <w:szCs w:val="16"/>
               </w:rPr>
@@ -1758,17 +1785,17 @@
                 <w:rFonts w:ascii="Arial" w:hAnsi="Arial"/>
                 <w:b/>
                 <w:bCs/>
-                <w:color w:val="auto"/>
-                <w:sz w:val="16"/>
-                <w:szCs w:val="16"/>
-              </w:rPr>
-            </w:pPr>
-            <w:r>
-              <w:rPr>
-                <w:rFonts w:ascii="Arial" w:hAnsi="Arial"/>
-                <w:b/>
-                <w:bCs/>
-                <w:color w:val="auto"/>
+                <w:color w:val="000000" w:themeColor="text1"/>
+                <w:sz w:val="16"/>
+                <w:szCs w:val="16"/>
+              </w:rPr>
+            </w:pPr>
+            <w:r>
+              <w:rPr>
+                <w:rFonts w:ascii="Arial" w:hAnsi="Arial"/>
+                <w:b/>
+                <w:bCs/>
+                <w:color w:val="000000" w:themeColor="text1"/>
                 <w:sz w:val="16"/>
                 <w:szCs w:val="16"/>
                 <w:lang w:val="es-PE"/>
@@ -1780,7 +1807,7 @@
                 <w:rFonts w:ascii="Arial" w:hAnsi="Arial"/>
                 <w:b/>
                 <w:bCs/>
-                <w:color w:val="auto"/>
+                <w:color w:val="000000" w:themeColor="text1"/>
                 <w:sz w:val="16"/>
                 <w:szCs w:val="16"/>
                 <w:lang w:val="es-PE"/>
@@ -1797,14 +1824,15 @@
             <w:pPr>
               <w:rPr>
                 <w:rFonts w:ascii="Arial" w:hAnsi="Arial"/>
-                <w:color w:val="auto"/>
-                <w:sz w:val="16"/>
-                <w:szCs w:val="16"/>
-              </w:rPr>
-            </w:pPr>
-            <w:r>
-              <w:rPr>
-                <w:rFonts w:ascii="Arial" w:hAnsi="Arial"/>
+                <w:color w:val="000000" w:themeColor="text1"/>
+                <w:sz w:val="16"/>
+                <w:szCs w:val="16"/>
+              </w:rPr>
+            </w:pPr>
+            <w:r>
+              <w:rPr>
+                <w:rFonts w:ascii="Arial" w:hAnsi="Arial"/>
+                <w:color w:val="000000" w:themeColor="text1"/>
                 <w:sz w:val="16"/>
                 <w:szCs w:val="16"/>
               </w:rPr>
@@ -1813,7 +1841,7 @@
             <w:r>
               <w:rPr>
                 <w:rFonts w:ascii="Arial" w:hAnsi="Arial"/>
-                <w:color w:val="auto"/>
+                <w:color w:val="000000" w:themeColor="text1"/>
                 <w:sz w:val="16"/>
                 <w:szCs w:val="16"/>
               </w:rPr>
@@ -1822,6 +1850,7 @@
             <w:r>
               <w:rPr>
                 <w:rFonts w:ascii="Arial" w:hAnsi="Arial"/>
+                <w:color w:val="000000" w:themeColor="text1"/>
                 <w:sz w:val="16"/>
                 <w:szCs w:val="16"/>
               </w:rPr>
@@ -1830,7 +1859,7 @@
             <w:r>
               <w:rPr>
                 <w:rFonts w:ascii="Arial" w:hAnsi="Arial"/>
-                <w:color w:val="auto"/>
+                <w:color w:val="000000" w:themeColor="text1"/>
                 <w:sz w:val="16"/>
                 <w:szCs w:val="16"/>
               </w:rPr>
@@ -1839,6 +1868,7 @@
             <w:r>
               <w:rPr>
                 <w:rFonts w:ascii="Arial" w:hAnsi="Arial"/>
+                <w:color w:val="000000" w:themeColor="text1"/>
                 <w:sz w:val="16"/>
                 <w:szCs w:val="16"/>
               </w:rPr>
@@ -1856,17 +1886,17 @@
                 <w:rFonts w:ascii="Arial" w:hAnsi="Arial"/>
                 <w:b/>
                 <w:bCs/>
-                <w:color w:val="auto"/>
-                <w:sz w:val="16"/>
-                <w:szCs w:val="16"/>
-              </w:rPr>
-            </w:pPr>
-            <w:r>
-              <w:rPr>
-                <w:rFonts w:ascii="Arial" w:hAnsi="Arial"/>
-                <w:b/>
-                <w:bCs/>
-                <w:color w:val="auto"/>
+                <w:color w:val="000000" w:themeColor="text1"/>
+                <w:sz w:val="16"/>
+                <w:szCs w:val="16"/>
+              </w:rPr>
+            </w:pPr>
+            <w:r>
+              <w:rPr>
+                <w:rFonts w:ascii="Arial" w:hAnsi="Arial"/>
+                <w:b/>
+                <w:bCs/>
+                <w:color w:val="000000" w:themeColor="text1"/>
                 <w:sz w:val="16"/>
                 <w:szCs w:val="16"/>
                 <w:lang w:val="es-PE"/>
@@ -1883,14 +1913,15 @@
             <w:pPr>
               <w:rPr>
                 <w:rFonts w:ascii="Arial" w:hAnsi="Arial"/>
-                <w:color w:val="auto"/>
-                <w:sz w:val="16"/>
-                <w:szCs w:val="16"/>
-              </w:rPr>
-            </w:pPr>
-            <w:r>
-              <w:rPr>
-                <w:rFonts w:ascii="Arial" w:hAnsi="Arial"/>
+                <w:color w:val="000000" w:themeColor="text1"/>
+                <w:sz w:val="16"/>
+                <w:szCs w:val="16"/>
+              </w:rPr>
+            </w:pPr>
+            <w:r>
+              <w:rPr>
+                <w:rFonts w:ascii="Arial" w:hAnsi="Arial"/>
+                <w:color w:val="000000" w:themeColor="text1"/>
                 <w:sz w:val="16"/>
                 <w:szCs w:val="16"/>
               </w:rPr>
@@ -1899,7 +1930,7 @@
             <w:r>
               <w:rPr>
                 <w:rFonts w:ascii="Arial" w:hAnsi="Arial"/>
-                <w:color w:val="auto"/>
+                <w:color w:val="000000" w:themeColor="text1"/>
                 <w:sz w:val="16"/>
                 <w:szCs w:val="16"/>
               </w:rPr>
@@ -1908,6 +1939,7 @@
             <w:r>
               <w:rPr>
                 <w:rFonts w:ascii="Arial" w:hAnsi="Arial"/>
+                <w:color w:val="000000" w:themeColor="text1"/>
                 <w:sz w:val="16"/>
                 <w:szCs w:val="16"/>
               </w:rPr>
@@ -1916,7 +1948,7 @@
             <w:r>
               <w:rPr>
                 <w:rFonts w:ascii="Arial" w:hAnsi="Arial"/>
-                <w:color w:val="auto"/>
+                <w:color w:val="000000" w:themeColor="text1"/>
                 <w:sz w:val="16"/>
                 <w:szCs w:val="16"/>
               </w:rPr>
@@ -1925,6 +1957,7 @@
             <w:r>
               <w:rPr>
                 <w:rFonts w:ascii="Arial" w:hAnsi="Arial"/>
+                <w:color w:val="000000" w:themeColor="text1"/>
                 <w:sz w:val="16"/>
                 <w:szCs w:val="16"/>
               </w:rPr>
@@ -1947,7 +1980,7 @@
                 <w:rFonts w:ascii="Arial" w:hAnsi="Arial"/>
                 <w:b/>
                 <w:bCs/>
-                <w:color w:val="auto"/>
+                <w:color w:val="000000" w:themeColor="text1"/>
                 <w:sz w:val="16"/>
                 <w:szCs w:val="16"/>
               </w:rPr>
@@ -1958,7 +1991,7 @@
                 <w:rFonts w:ascii="Arial" w:hAnsi="Arial"/>
                 <w:b/>
                 <w:bCs/>
-                <w:color w:val="auto"/>
+                <w:color w:val="000000" w:themeColor="text1"/>
                 <w:sz w:val="16"/>
                 <w:szCs w:val="16"/>
                 <w:lang w:val="es-PE"/>
@@ -1971,7 +2004,7 @@
                 <w:rFonts w:ascii="Arial" w:hAnsi="Arial"/>
                 <w:b/>
                 <w:bCs/>
-                <w:color w:val="auto"/>
+                <w:color w:val="000000" w:themeColor="text1"/>
                 <w:sz w:val="16"/>
                 <w:szCs w:val="16"/>
                 <w:lang w:val="es-PE"/>
@@ -1983,7 +2016,7 @@
                 <w:rFonts w:ascii="Arial" w:hAnsi="Arial"/>
                 <w:b/>
                 <w:bCs/>
-                <w:color w:val="auto"/>
+                <w:color w:val="000000" w:themeColor="text1"/>
                 <w:sz w:val="16"/>
                 <w:szCs w:val="16"/>
                 <w:lang w:val="es-PE"/>
@@ -1995,7 +2028,7 @@
                 <w:rFonts w:ascii="Arial" w:hAnsi="Arial"/>
                 <w:b/>
                 <w:bCs/>
-                <w:color w:val="auto"/>
+                <w:color w:val="000000" w:themeColor="text1"/>
                 <w:sz w:val="16"/>
                 <w:szCs w:val="16"/>
                 <w:lang w:val="es-PE"/>
@@ -2012,14 +2045,15 @@
             <w:pPr>
               <w:rPr>
                 <w:rFonts w:ascii="Arial" w:hAnsi="Arial"/>
-                <w:color w:val="auto"/>
-                <w:sz w:val="16"/>
-                <w:szCs w:val="16"/>
-              </w:rPr>
-            </w:pPr>
-            <w:r>
-              <w:rPr>
-                <w:rFonts w:ascii="Arial" w:hAnsi="Arial"/>
+                <w:color w:val="000000" w:themeColor="text1"/>
+                <w:sz w:val="16"/>
+                <w:szCs w:val="16"/>
+              </w:rPr>
+            </w:pPr>
+            <w:r>
+              <w:rPr>
+                <w:rFonts w:ascii="Arial" w:hAnsi="Arial"/>
+                <w:color w:val="000000" w:themeColor="text1"/>
                 <w:sz w:val="16"/>
                 <w:szCs w:val="16"/>
               </w:rPr>
@@ -2028,7 +2062,7 @@
             <w:r>
               <w:rPr>
                 <w:rFonts w:ascii="Arial" w:hAnsi="Arial"/>
-                <w:color w:val="auto"/>
+                <w:color w:val="000000" w:themeColor="text1"/>
                 <w:sz w:val="16"/>
                 <w:szCs w:val="16"/>
               </w:rPr>
@@ -2037,6 +2071,7 @@
             <w:r>
               <w:rPr>
                 <w:rFonts w:ascii="Arial" w:hAnsi="Arial"/>
+                <w:color w:val="000000" w:themeColor="text1"/>
                 <w:sz w:val="16"/>
                 <w:szCs w:val="16"/>
               </w:rPr>
@@ -2045,7 +2080,7 @@
             <w:r>
               <w:rPr>
                 <w:rFonts w:ascii="Arial" w:hAnsi="Arial"/>
-                <w:color w:val="auto"/>
+                <w:color w:val="000000" w:themeColor="text1"/>
                 <w:sz w:val="16"/>
                 <w:szCs w:val="16"/>
               </w:rPr>
@@ -2054,6 +2089,7 @@
             <w:r>
               <w:rPr>
                 <w:rFonts w:ascii="Arial" w:hAnsi="Arial"/>
+                <w:color w:val="000000" w:themeColor="text1"/>
                 <w:sz w:val="16"/>
                 <w:szCs w:val="16"/>
               </w:rPr>
@@ -2071,17 +2107,17 @@
                 <w:rFonts w:ascii="Arial" w:hAnsi="Arial"/>
                 <w:b/>
                 <w:bCs/>
-                <w:color w:val="auto"/>
-                <w:sz w:val="16"/>
-                <w:szCs w:val="16"/>
-              </w:rPr>
-            </w:pPr>
-            <w:r>
-              <w:rPr>
-                <w:rFonts w:ascii="Arial" w:hAnsi="Arial"/>
-                <w:b/>
-                <w:bCs/>
-                <w:color w:val="auto"/>
+                <w:color w:val="000000" w:themeColor="text1"/>
+                <w:sz w:val="16"/>
+                <w:szCs w:val="16"/>
+              </w:rPr>
+            </w:pPr>
+            <w:r>
+              <w:rPr>
+                <w:rFonts w:ascii="Arial" w:hAnsi="Arial"/>
+                <w:b/>
+                <w:bCs/>
+                <w:color w:val="000000" w:themeColor="text1"/>
                 <w:sz w:val="16"/>
                 <w:szCs w:val="16"/>
                 <w:lang w:val="es-PE"/>
@@ -2098,14 +2134,15 @@
             <w:pPr>
               <w:rPr>
                 <w:rFonts w:ascii="Arial" w:hAnsi="Arial"/>
-                <w:color w:val="auto"/>
-                <w:sz w:val="16"/>
-                <w:szCs w:val="16"/>
-              </w:rPr>
-            </w:pPr>
-            <w:r>
-              <w:rPr>
-                <w:rFonts w:ascii="Arial" w:hAnsi="Arial"/>
+                <w:color w:val="000000" w:themeColor="text1"/>
+                <w:sz w:val="16"/>
+                <w:szCs w:val="16"/>
+              </w:rPr>
+            </w:pPr>
+            <w:r>
+              <w:rPr>
+                <w:rFonts w:ascii="Arial" w:hAnsi="Arial"/>
+                <w:color w:val="000000" w:themeColor="text1"/>
                 <w:sz w:val="16"/>
                 <w:szCs w:val="16"/>
               </w:rPr>
@@ -2114,7 +2151,7 @@
             <w:r>
               <w:rPr>
                 <w:rFonts w:ascii="Arial" w:hAnsi="Arial"/>
-                <w:color w:val="auto"/>
+                <w:color w:val="000000" w:themeColor="text1"/>
                 <w:sz w:val="16"/>
                 <w:szCs w:val="16"/>
               </w:rPr>
@@ -2123,6 +2160,7 @@
             <w:r>
               <w:rPr>
                 <w:rFonts w:ascii="Arial" w:hAnsi="Arial"/>
+                <w:color w:val="000000" w:themeColor="text1"/>
                 <w:sz w:val="16"/>
                 <w:szCs w:val="16"/>
               </w:rPr>
@@ -2131,7 +2169,7 @@
             <w:r>
               <w:rPr>
                 <w:rFonts w:ascii="Arial" w:hAnsi="Arial"/>
-                <w:color w:val="auto"/>
+                <w:color w:val="000000" w:themeColor="text1"/>
                 <w:sz w:val="16"/>
                 <w:szCs w:val="16"/>
               </w:rPr>
@@ -2140,6 +2178,7 @@
             <w:r>
               <w:rPr>
                 <w:rFonts w:ascii="Arial" w:hAnsi="Arial"/>
+                <w:color w:val="000000" w:themeColor="text1"/>
                 <w:sz w:val="16"/>
                 <w:szCs w:val="16"/>
               </w:rPr>
@@ -2162,7 +2201,7 @@
                 <w:rFonts w:ascii="Arial" w:hAnsi="Arial"/>
                 <w:b/>
                 <w:bCs/>
-                <w:color w:val="auto"/>
+                <w:color w:val="000000" w:themeColor="text1"/>
                 <w:sz w:val="16"/>
                 <w:szCs w:val="16"/>
                 <w:lang w:val="es-PE"/>
@@ -2174,7 +2213,7 @@
                 <w:rFonts w:ascii="Arial" w:hAnsi="Arial"/>
                 <w:b/>
                 <w:bCs/>
-                <w:color w:val="auto"/>
+                <w:color w:val="000000" w:themeColor="text1"/>
                 <w:sz w:val="16"/>
                 <w:szCs w:val="16"/>
                 <w:lang w:val="es-PE"/>
@@ -2187,7 +2226,7 @@
                 <w:rFonts w:ascii="Arial" w:hAnsi="Arial"/>
                 <w:b/>
                 <w:bCs/>
-                <w:color w:val="auto"/>
+                <w:color w:val="000000" w:themeColor="text1"/>
                 <w:sz w:val="16"/>
                 <w:szCs w:val="16"/>
                 <w:lang w:val="es-PE"/>
@@ -2204,14 +2243,15 @@
             <w:pPr>
               <w:rPr>
                 <w:rFonts w:ascii="Arial" w:hAnsi="Arial"/>
-                <w:color w:val="auto"/>
-                <w:sz w:val="16"/>
-                <w:szCs w:val="16"/>
-              </w:rPr>
-            </w:pPr>
-            <w:r>
-              <w:rPr>
-                <w:rFonts w:ascii="Arial" w:hAnsi="Arial"/>
+                <w:color w:val="000000" w:themeColor="text1"/>
+                <w:sz w:val="16"/>
+                <w:szCs w:val="16"/>
+              </w:rPr>
+            </w:pPr>
+            <w:r>
+              <w:rPr>
+                <w:rFonts w:ascii="Arial" w:hAnsi="Arial"/>
+                <w:color w:val="000000" w:themeColor="text1"/>
                 <w:sz w:val="16"/>
                 <w:szCs w:val="16"/>
               </w:rPr>
@@ -2220,7 +2260,7 @@
             <w:r>
               <w:rPr>
                 <w:rFonts w:ascii="Arial" w:hAnsi="Arial"/>
-                <w:color w:val="auto"/>
+                <w:color w:val="000000" w:themeColor="text1"/>
                 <w:sz w:val="16"/>
                 <w:szCs w:val="16"/>
               </w:rPr>
@@ -2229,6 +2269,7 @@
             <w:r>
               <w:rPr>
                 <w:rFonts w:ascii="Arial" w:hAnsi="Arial"/>
+                <w:color w:val="000000" w:themeColor="text1"/>
                 <w:sz w:val="16"/>
                 <w:szCs w:val="16"/>
               </w:rPr>
@@ -2237,7 +2278,7 @@
             <w:r>
               <w:rPr>
                 <w:rFonts w:ascii="Arial" w:hAnsi="Arial"/>
-                <w:color w:val="auto"/>
+                <w:color w:val="000000" w:themeColor="text1"/>
                 <w:sz w:val="16"/>
                 <w:szCs w:val="16"/>
               </w:rPr>
@@ -2246,6 +2287,7 @@
             <w:r>
               <w:rPr>
                 <w:rFonts w:ascii="Arial" w:hAnsi="Arial"/>
+                <w:color w:val="000000" w:themeColor="text1"/>
                 <w:sz w:val="16"/>
                 <w:szCs w:val="16"/>
               </w:rPr>
@@ -2263,7 +2305,7 @@
                 <w:rFonts w:ascii="Arial" w:hAnsi="Arial"/>
                 <w:b/>
                 <w:bCs/>
-                <w:color w:val="auto"/>
+                <w:color w:val="000000" w:themeColor="text1"/>
                 <w:sz w:val="16"/>
                 <w:szCs w:val="16"/>
                 <w:lang w:val="es-PE"/>
@@ -2274,7 +2316,7 @@
                 <w:rFonts w:ascii="Arial" w:hAnsi="Arial"/>
                 <w:b/>
                 <w:bCs/>
-                <w:color w:val="auto"/>
+                <w:color w:val="000000" w:themeColor="text1"/>
                 <w:sz w:val="16"/>
                 <w:szCs w:val="16"/>
                 <w:lang w:val="es-PE"/>
@@ -2291,14 +2333,15 @@
             <w:pPr>
               <w:rPr>
                 <w:rFonts w:ascii="Arial" w:hAnsi="Arial"/>
-                <w:color w:val="auto"/>
-                <w:sz w:val="16"/>
-                <w:szCs w:val="16"/>
-              </w:rPr>
-            </w:pPr>
-            <w:r>
-              <w:rPr>
-                <w:rFonts w:ascii="Arial" w:hAnsi="Arial"/>
+                <w:color w:val="000000" w:themeColor="text1"/>
+                <w:sz w:val="16"/>
+                <w:szCs w:val="16"/>
+              </w:rPr>
+            </w:pPr>
+            <w:r>
+              <w:rPr>
+                <w:rFonts w:ascii="Arial" w:hAnsi="Arial"/>
+                <w:color w:val="000000" w:themeColor="text1"/>
                 <w:sz w:val="16"/>
                 <w:szCs w:val="16"/>
               </w:rPr>
@@ -2307,7 +2350,7 @@
             <w:r>
               <w:rPr>
                 <w:rFonts w:ascii="Arial" w:hAnsi="Arial"/>
-                <w:color w:val="auto"/>
+                <w:color w:val="000000" w:themeColor="text1"/>
                 <w:sz w:val="16"/>
                 <w:szCs w:val="16"/>
               </w:rPr>
@@ -2316,6 +2359,7 @@
             <w:r>
               <w:rPr>
                 <w:rFonts w:ascii="Arial" w:hAnsi="Arial"/>
+                <w:color w:val="000000" w:themeColor="text1"/>
                 <w:sz w:val="16"/>
                 <w:szCs w:val="16"/>
               </w:rPr>
@@ -2324,7 +2368,7 @@
             <w:r>
               <w:rPr>
                 <w:rFonts w:ascii="Arial" w:hAnsi="Arial"/>
-                <w:color w:val="auto"/>
+                <w:color w:val="000000" w:themeColor="text1"/>
                 <w:sz w:val="16"/>
                 <w:szCs w:val="16"/>
               </w:rPr>
@@ -2333,6 +2377,7 @@
             <w:r>
               <w:rPr>
                 <w:rFonts w:ascii="Arial" w:hAnsi="Arial"/>
+                <w:color w:val="000000" w:themeColor="text1"/>
                 <w:sz w:val="16"/>
                 <w:szCs w:val="16"/>
               </w:rPr>
@@ -2341,7 +2386,7 @@
             <w:r>
               <w:rPr>
                 <w:rFonts w:ascii="Arial" w:hAnsi="Arial"/>
-                <w:color w:val="auto"/>
+                <w:color w:val="000000" w:themeColor="text1"/>
                 <w:sz w:val="16"/>
                 <w:szCs w:val="16"/>
               </w:rPr>
@@ -2363,6 +2408,7 @@
               <w:rPr>
                 <w:rFonts w:ascii="Arial" w:hAnsi="Arial"/>
                 <w:b/>
+                <w:color w:val="000000" w:themeColor="text1"/>
                 <w:sz w:val="16"/>
                 <w:szCs w:val="16"/>
                 <w:lang w:val="es-PE"/>
@@ -2379,6 +2425,7 @@
               <w:rPr>
                 <w:rFonts w:ascii="Arial" w:hAnsi="Arial"/>
                 <w:bCs/>
+                <w:color w:val="000000" w:themeColor="text1"/>
                 <w:sz w:val="16"/>
                 <w:szCs w:val="16"/>
               </w:rPr>
@@ -2394,6 +2441,7 @@
               <w:rPr>
                 <w:rFonts w:ascii="Arial" w:hAnsi="Arial"/>
                 <w:b/>
+                <w:color w:val="000000" w:themeColor="text1"/>
                 <w:sz w:val="16"/>
                 <w:szCs w:val="16"/>
                 <w:lang w:val="es-PE"/>
@@ -2410,6 +2458,7 @@
               <w:rPr>
                 <w:rFonts w:ascii="Arial" w:hAnsi="Arial"/>
                 <w:bCs/>
+                <w:color w:val="000000" w:themeColor="text1"/>
                 <w:sz w:val="16"/>
                 <w:szCs w:val="16"/>
               </w:rPr>
@@ -2430,7 +2479,7 @@
               <w:rPr>
                 <w:rFonts w:ascii="Arial" w:hAnsi="Arial"/>
                 <w:b/>
-                <w:color w:val="auto"/>
+                <w:color w:val="000000" w:themeColor="text1"/>
                 <w:sz w:val="16"/>
                 <w:szCs w:val="16"/>
                 <w:lang w:val="es-PE"/>
@@ -2440,7 +2489,7 @@
               <w:rPr>
                 <w:rFonts w:ascii="Arial" w:hAnsi="Arial"/>
                 <w:b/>
-                <w:color w:val="auto"/>
+                <w:color w:val="000000" w:themeColor="text1"/>
                 <w:sz w:val="16"/>
                 <w:szCs w:val="16"/>
                 <w:lang w:val="es-PE"/>
@@ -2458,7 +2507,7 @@
               <w:rPr>
                 <w:rFonts w:ascii="Arial" w:hAnsi="Arial"/>
                 <w:bCs/>
-                <w:color w:val="auto"/>
+                <w:color w:val="000000" w:themeColor="text1"/>
                 <w:sz w:val="16"/>
                 <w:szCs w:val="16"/>
               </w:rPr>
@@ -2474,7 +2523,7 @@
               <w:rPr>
                 <w:rFonts w:ascii="Arial" w:hAnsi="Arial"/>
                 <w:b/>
-                <w:color w:val="auto"/>
+                <w:color w:val="000000" w:themeColor="text1"/>
                 <w:sz w:val="16"/>
                 <w:szCs w:val="16"/>
                 <w:lang w:val="es-PE"/>
@@ -2491,7 +2540,7 @@
               <w:rPr>
                 <w:rFonts w:ascii="Arial" w:hAnsi="Arial"/>
                 <w:bCs/>
-                <w:color w:val="auto"/>
+                <w:color w:val="000000" w:themeColor="text1"/>
                 <w:sz w:val="16"/>
                 <w:szCs w:val="16"/>
               </w:rPr>
@@ -2541,6 +2590,7 @@
               <w:rPr>
                 <w:rFonts w:ascii="Arial" w:hAnsi="Arial"/>
                 <w:b/>
+                <w:color w:val="000000" w:themeColor="text1"/>
                 <w:w w:val="96"/>
                 <w:sz w:val="16"/>
                 <w:szCs w:val="16"/>
@@ -2551,6 +2601,7 @@
               <w:rPr>
                 <w:rFonts w:ascii="Arial" w:hAnsi="Arial"/>
                 <w:b/>
+                <w:color w:val="000000" w:themeColor="text1"/>
                 <w:w w:val="96"/>
                 <w:sz w:val="16"/>
                 <w:szCs w:val="16"/>
@@ -2575,6 +2626,7 @@
               <w:rPr>
                 <w:rFonts w:ascii="Arial" w:hAnsi="Arial"/>
                 <w:b/>
+                <w:color w:val="000000" w:themeColor="text1"/>
                 <w:w w:val="96"/>
                 <w:sz w:val="16"/>
                 <w:szCs w:val="16"/>
@@ -2584,6 +2636,7 @@
               <w:rPr>
                 <w:rFonts w:ascii="Arial" w:hAnsi="Arial"/>
                 <w:b/>
+                <w:color w:val="000000" w:themeColor="text1"/>
                 <w:w w:val="96"/>
                 <w:sz w:val="16"/>
                 <w:szCs w:val="16"/>
@@ -2607,6 +2660,7 @@
               <w:rPr>
                 <w:rFonts w:ascii="Arial" w:hAnsi="Arial"/>
                 <w:b/>
+                <w:color w:val="000000" w:themeColor="text1"/>
                 <w:w w:val="96"/>
                 <w:sz w:val="16"/>
                 <w:szCs w:val="16"/>
@@ -2616,6 +2670,7 @@
               <w:rPr>
                 <w:rFonts w:ascii="Arial" w:hAnsi="Arial"/>
                 <w:b/>
+                <w:color w:val="000000" w:themeColor="text1"/>
                 <w:w w:val="96"/>
                 <w:sz w:val="16"/>
                 <w:szCs w:val="16"/>
@@ -2639,6 +2694,7 @@
               <w:rPr>
                 <w:rFonts w:ascii="Arial" w:hAnsi="Arial"/>
                 <w:b/>
+                <w:color w:val="000000" w:themeColor="text1"/>
                 <w:w w:val="96"/>
                 <w:sz w:val="16"/>
                 <w:szCs w:val="16"/>
@@ -2648,6 +2704,7 @@
               <w:rPr>
                 <w:rFonts w:ascii="Arial" w:hAnsi="Arial"/>
                 <w:b/>
+                <w:color w:val="000000" w:themeColor="text1"/>
                 <w:w w:val="96"/>
                 <w:sz w:val="16"/>
                 <w:szCs w:val="16"/>
@@ -2671,6 +2728,7 @@
               <w:rPr>
                 <w:rFonts w:ascii="Arial" w:hAnsi="Arial"/>
                 <w:b/>
+                <w:color w:val="000000" w:themeColor="text1"/>
                 <w:w w:val="96"/>
                 <w:sz w:val="16"/>
                 <w:szCs w:val="16"/>
@@ -2681,6 +2739,7 @@
               <w:rPr>
                 <w:rFonts w:ascii="Arial" w:hAnsi="Arial"/>
                 <w:b/>
+                <w:color w:val="000000" w:themeColor="text1"/>
                 <w:w w:val="96"/>
                 <w:sz w:val="16"/>
                 <w:szCs w:val="16"/>
@@ -2705,6 +2764,7 @@
               <w:rPr>
                 <w:rFonts w:ascii="Arial" w:hAnsi="Arial"/>
                 <w:b/>
+                <w:color w:val="000000" w:themeColor="text1"/>
                 <w:w w:val="96"/>
                 <w:sz w:val="16"/>
                 <w:szCs w:val="16"/>
@@ -2715,6 +2775,7 @@
               <w:rPr>
                 <w:rFonts w:ascii="Arial" w:hAnsi="Arial"/>
                 <w:b/>
+                <w:color w:val="000000" w:themeColor="text1"/>
                 <w:w w:val="96"/>
                 <w:sz w:val="16"/>
                 <w:szCs w:val="16"/>
@@ -2740,6 +2801,7 @@
               <w:rPr>
                 <w:rFonts w:ascii="Arial" w:hAnsi="Arial"/>
                 <w:b/>
+                <w:color w:val="000000" w:themeColor="text1"/>
                 <w:w w:val="96"/>
                 <w:sz w:val="16"/>
                 <w:szCs w:val="16"/>
@@ -2749,6 +2811,7 @@
               <w:rPr>
                 <w:rFonts w:ascii="Arial" w:hAnsi="Arial"/>
                 <w:b/>
+                <w:color w:val="000000" w:themeColor="text1"/>
                 <w:w w:val="96"/>
                 <w:sz w:val="16"/>
                 <w:szCs w:val="16"/>
@@ -2776,6 +2839,7 @@
               <w:rPr>
                 <w:rFonts w:ascii="Arial" w:hAnsi="Arial"/>
                 <w:b/>
+                <w:color w:val="000000" w:themeColor="text1"/>
                 <w:w w:val="96"/>
                 <w:sz w:val="14"/>
                 <w:szCs w:val="14"/>
@@ -2785,6 +2849,7 @@
               <w:rPr>
                 <w:rFonts w:ascii="Arial" w:hAnsi="Arial"/>
                 <w:bCs/>
+                <w:color w:val="000000" w:themeColor="text1"/>
                 <w:sz w:val="14"/>
                 <w:szCs w:val="14"/>
               </w:rPr>
@@ -2794,6 +2859,7 @@
               <w:rPr>
                 <w:rFonts w:ascii="Arial" w:hAnsi="Arial"/>
                 <w:bCs/>
+                <w:color w:val="000000" w:themeColor="text1"/>
                 <w:sz w:val="14"/>
                 <w:szCs w:val="14"/>
               </w:rPr>
@@ -2803,6 +2869,7 @@
               <w:rPr>
                 <w:rFonts w:ascii="Arial" w:hAnsi="Arial"/>
                 <w:bCs/>
+                <w:color w:val="000000" w:themeColor="text1"/>
                 <w:sz w:val="14"/>
                 <w:szCs w:val="14"/>
               </w:rPr>
@@ -2813,6 +2880,7 @@
                 <w:rFonts w:ascii="Arial" w:hAnsi="Arial"/>
                 <w:bCs/>
                 <w:noProof/>
+                <w:color w:val="000000" w:themeColor="text1"/>
                 <w:sz w:val="14"/>
                 <w:szCs w:val="14"/>
               </w:rPr>
@@ -2822,6 +2890,7 @@
               <w:rPr>
                 <w:rFonts w:ascii="Arial" w:hAnsi="Arial"/>
                 <w:bCs/>
+                <w:color w:val="000000" w:themeColor="text1"/>
                 <w:sz w:val="14"/>
                 <w:szCs w:val="14"/>
               </w:rPr>
@@ -2843,6 +2912,7 @@
               <w:rPr>
                 <w:rFonts w:ascii="Arial" w:hAnsi="Arial"/>
                 <w:bCs/>
+                <w:color w:val="000000" w:themeColor="text1"/>
                 <w:sz w:val="14"/>
                 <w:szCs w:val="14"/>
               </w:rPr>
@@ -2851,6 +2921,7 @@
               <w:rPr>
                 <w:rFonts w:ascii="Arial" w:hAnsi="Arial"/>
                 <w:bCs/>
+                <w:color w:val="000000" w:themeColor="text1"/>
                 <w:sz w:val="14"/>
                 <w:szCs w:val="14"/>
               </w:rPr>
@@ -2860,6 +2931,7 @@
               <w:rPr>
                 <w:rFonts w:ascii="Arial" w:hAnsi="Arial"/>
                 <w:bCs/>
+                <w:color w:val="000000" w:themeColor="text1"/>
                 <w:sz w:val="14"/>
                 <w:szCs w:val="14"/>
               </w:rPr>
@@ -2869,6 +2941,7 @@
               <w:rPr>
                 <w:rFonts w:ascii="Arial" w:hAnsi="Arial"/>
                 <w:bCs/>
+                <w:color w:val="000000" w:themeColor="text1"/>
                 <w:sz w:val="14"/>
                 <w:szCs w:val="14"/>
               </w:rPr>
@@ -2879,6 +2952,7 @@
                 <w:rFonts w:ascii="Arial" w:hAnsi="Arial"/>
                 <w:bCs/>
                 <w:noProof/>
+                <w:color w:val="000000" w:themeColor="text1"/>
                 <w:sz w:val="14"/>
                 <w:szCs w:val="14"/>
               </w:rPr>
@@ -2888,6 +2962,7 @@
               <w:rPr>
                 <w:rFonts w:ascii="Arial" w:hAnsi="Arial"/>
                 <w:bCs/>
+                <w:color w:val="000000" w:themeColor="text1"/>
                 <w:sz w:val="14"/>
                 <w:szCs w:val="14"/>
               </w:rPr>
@@ -2909,6 +2984,7 @@
               <w:rPr>
                 <w:rFonts w:ascii="Arial" w:hAnsi="Arial"/>
                 <w:bCs/>
+                <w:color w:val="000000" w:themeColor="text1"/>
                 <w:sz w:val="14"/>
                 <w:szCs w:val="14"/>
               </w:rPr>
@@ -2917,6 +2993,7 @@
               <w:rPr>
                 <w:rFonts w:ascii="Arial" w:hAnsi="Arial"/>
                 <w:bCs/>
+                <w:color w:val="000000" w:themeColor="text1"/>
                 <w:sz w:val="14"/>
                 <w:szCs w:val="14"/>
               </w:rPr>
@@ -2926,6 +3003,7 @@
               <w:rPr>
                 <w:rFonts w:ascii="Arial" w:hAnsi="Arial"/>
                 <w:bCs/>
+                <w:color w:val="000000" w:themeColor="text1"/>
                 <w:sz w:val="14"/>
                 <w:szCs w:val="14"/>
               </w:rPr>
@@ -2935,6 +3013,7 @@
               <w:rPr>
                 <w:rFonts w:ascii="Arial" w:hAnsi="Arial"/>
                 <w:bCs/>
+                <w:color w:val="000000" w:themeColor="text1"/>
                 <w:sz w:val="14"/>
                 <w:szCs w:val="14"/>
               </w:rPr>
@@ -2945,6 +3024,7 @@
                 <w:rFonts w:ascii="Arial" w:hAnsi="Arial"/>
                 <w:bCs/>
                 <w:noProof/>
+                <w:color w:val="000000" w:themeColor="text1"/>
                 <w:sz w:val="14"/>
                 <w:szCs w:val="14"/>
               </w:rPr>
@@ -2954,6 +3034,7 @@
               <w:rPr>
                 <w:rFonts w:ascii="Arial" w:hAnsi="Arial"/>
                 <w:bCs/>
+                <w:color w:val="000000" w:themeColor="text1"/>
                 <w:sz w:val="14"/>
                 <w:szCs w:val="14"/>
               </w:rPr>
@@ -2975,6 +3056,7 @@
               <w:rPr>
                 <w:rFonts w:ascii="Arial" w:hAnsi="Arial"/>
                 <w:b/>
+                <w:color w:val="000000" w:themeColor="text1"/>
                 <w:w w:val="96"/>
                 <w:sz w:val="14"/>
                 <w:szCs w:val="14"/>
@@ -2984,6 +3066,7 @@
               <w:rPr>
                 <w:rFonts w:ascii="Arial" w:hAnsi="Arial"/>
                 <w:bCs/>
+                <w:color w:val="000000" w:themeColor="text1"/>
                 <w:sz w:val="14"/>
                 <w:szCs w:val="14"/>
               </w:rPr>
@@ -2993,6 +3076,7 @@
               <w:rPr>
                 <w:rFonts w:ascii="Arial" w:hAnsi="Arial"/>
                 <w:bCs/>
+                <w:color w:val="000000" w:themeColor="text1"/>
                 <w:sz w:val="14"/>
                 <w:szCs w:val="14"/>
               </w:rPr>
@@ -3002,6 +3086,7 @@
               <w:rPr>
                 <w:rFonts w:ascii="Arial" w:hAnsi="Arial"/>
                 <w:bCs/>
+                <w:color w:val="000000" w:themeColor="text1"/>
                 <w:sz w:val="14"/>
                 <w:szCs w:val="14"/>
               </w:rPr>
@@ -3012,6 +3097,7 @@
                 <w:rFonts w:ascii="Arial" w:hAnsi="Arial"/>
                 <w:bCs/>
                 <w:noProof/>
+                <w:color w:val="000000" w:themeColor="text1"/>
                 <w:sz w:val="14"/>
                 <w:szCs w:val="14"/>
               </w:rPr>
@@ -3021,6 +3107,7 @@
               <w:rPr>
                 <w:rFonts w:ascii="Arial" w:hAnsi="Arial"/>
                 <w:bCs/>
+                <w:color w:val="000000" w:themeColor="text1"/>
                 <w:sz w:val="14"/>
                 <w:szCs w:val="14"/>
               </w:rPr>
@@ -3042,6 +3129,7 @@
               <w:rPr>
                 <w:rFonts w:ascii="Arial" w:hAnsi="Arial"/>
                 <w:b/>
+                <w:color w:val="000000" w:themeColor="text1"/>
                 <w:w w:val="96"/>
                 <w:sz w:val="14"/>
                 <w:szCs w:val="14"/>
@@ -3051,6 +3139,7 @@
               <w:rPr>
                 <w:rFonts w:ascii="Arial" w:hAnsi="Arial"/>
                 <w:bCs/>
+                <w:color w:val="000000" w:themeColor="text1"/>
                 <w:sz w:val="14"/>
                 <w:szCs w:val="14"/>
               </w:rPr>
@@ -3060,6 +3149,7 @@
               <w:rPr>
                 <w:rFonts w:ascii="Arial" w:hAnsi="Arial"/>
                 <w:bCs/>
+                <w:color w:val="000000" w:themeColor="text1"/>
                 <w:sz w:val="14"/>
                 <w:szCs w:val="14"/>
               </w:rPr>
@@ -3069,6 +3159,7 @@
               <w:rPr>
                 <w:rFonts w:ascii="Arial" w:hAnsi="Arial"/>
                 <w:bCs/>
+                <w:color w:val="000000" w:themeColor="text1"/>
                 <w:sz w:val="14"/>
                 <w:szCs w:val="14"/>
               </w:rPr>
@@ -3079,6 +3170,7 @@
                 <w:rFonts w:ascii="Arial" w:hAnsi="Arial"/>
                 <w:bCs/>
                 <w:noProof/>
+                <w:color w:val="000000" w:themeColor="text1"/>
                 <w:sz w:val="14"/>
                 <w:szCs w:val="14"/>
               </w:rPr>
@@ -3088,6 +3180,7 @@
               <w:rPr>
                 <w:rFonts w:ascii="Arial" w:hAnsi="Arial"/>
                 <w:bCs/>
+                <w:color w:val="000000" w:themeColor="text1"/>
                 <w:sz w:val="14"/>
                 <w:szCs w:val="14"/>
               </w:rPr>
@@ -3109,6 +3202,7 @@
               <w:rPr>
                 <w:rFonts w:ascii="Arial" w:hAnsi="Arial"/>
                 <w:b/>
+                <w:color w:val="000000" w:themeColor="text1"/>
                 <w:w w:val="96"/>
                 <w:sz w:val="14"/>
                 <w:szCs w:val="14"/>
@@ -3118,6 +3212,7 @@
               <w:rPr>
                 <w:rFonts w:ascii="Arial" w:hAnsi="Arial"/>
                 <w:bCs/>
+                <w:color w:val="000000" w:themeColor="text1"/>
                 <w:sz w:val="14"/>
                 <w:szCs w:val="14"/>
               </w:rPr>
@@ -3127,6 +3222,7 @@
               <w:rPr>
                 <w:rFonts w:ascii="Arial" w:hAnsi="Arial"/>
                 <w:bCs/>
+                <w:color w:val="000000" w:themeColor="text1"/>
                 <w:sz w:val="14"/>
                 <w:szCs w:val="14"/>
               </w:rPr>
@@ -3136,6 +3232,7 @@
               <w:rPr>
                 <w:rFonts w:ascii="Arial" w:hAnsi="Arial"/>
                 <w:bCs/>
+                <w:color w:val="000000" w:themeColor="text1"/>
                 <w:sz w:val="14"/>
                 <w:szCs w:val="14"/>
               </w:rPr>
@@ -3146,6 +3243,7 @@
                 <w:rFonts w:ascii="Arial" w:hAnsi="Arial"/>
                 <w:bCs/>
                 <w:noProof/>
+                <w:color w:val="000000" w:themeColor="text1"/>
                 <w:sz w:val="14"/>
                 <w:szCs w:val="14"/>
               </w:rPr>
@@ -3155,6 +3253,7 @@
               <w:rPr>
                 <w:rFonts w:ascii="Arial" w:hAnsi="Arial"/>
                 <w:bCs/>
+                <w:color w:val="000000" w:themeColor="text1"/>
                 <w:sz w:val="14"/>
                 <w:szCs w:val="14"/>
               </w:rPr>
@@ -3176,6 +3275,7 @@
               <w:rPr>
                 <w:rFonts w:ascii="Arial" w:hAnsi="Arial"/>
                 <w:b/>
+                <w:color w:val="000000" w:themeColor="text1"/>
                 <w:w w:val="96"/>
                 <w:sz w:val="14"/>
                 <w:szCs w:val="14"/>
@@ -3185,6 +3285,7 @@
               <w:rPr>
                 <w:rFonts w:ascii="Arial" w:hAnsi="Arial"/>
                 <w:bCs/>
+                <w:color w:val="000000" w:themeColor="text1"/>
                 <w:sz w:val="14"/>
                 <w:szCs w:val="14"/>
               </w:rPr>
@@ -3194,6 +3295,7 @@
               <w:rPr>
                 <w:rFonts w:ascii="Arial" w:hAnsi="Arial"/>
                 <w:bCs/>
+                <w:color w:val="000000" w:themeColor="text1"/>
                 <w:sz w:val="14"/>
                 <w:szCs w:val="14"/>
               </w:rPr>
@@ -3204,6 +3306,7 @@
                 <w:rFonts w:ascii="Arial" w:hAnsi="Arial"/>
                 <w:bCs/>
                 <w:noProof/>
+                <w:color w:val="000000" w:themeColor="text1"/>
                 <w:sz w:val="14"/>
                 <w:szCs w:val="14"/>
               </w:rPr>
@@ -3213,6 +3316,7 @@
               <w:rPr>
                 <w:rFonts w:ascii="Arial" w:hAnsi="Arial"/>
                 <w:bCs/>
+                <w:color w:val="000000" w:themeColor="text1"/>
                 <w:sz w:val="14"/>
                 <w:szCs w:val="14"/>
               </w:rPr>
@@ -3222,6 +3326,7 @@
               <w:rPr>
                 <w:rFonts w:ascii="Arial" w:hAnsi="Arial"/>
                 <w:bCs/>
+                <w:color w:val="000000" w:themeColor="text1"/>
                 <w:sz w:val="14"/>
                 <w:szCs w:val="14"/>
               </w:rPr>
@@ -3232,6 +3337,7 @@
                 <w:rFonts w:ascii="Arial" w:hAnsi="Arial"/>
                 <w:bCs/>
                 <w:noProof/>
+                <w:color w:val="000000" w:themeColor="text1"/>
                 <w:sz w:val="14"/>
                 <w:szCs w:val="14"/>
               </w:rPr>
@@ -3241,6 +3347,7 @@
               <w:rPr>
                 <w:rFonts w:ascii="Arial" w:hAnsi="Arial"/>
                 <w:bCs/>
+                <w:color w:val="000000" w:themeColor="text1"/>
                 <w:sz w:val="14"/>
                 <w:szCs w:val="14"/>
               </w:rPr>
@@ -3311,7 +3418,7 @@
                 <w:rFonts w:ascii="Arial" w:hAnsi="Arial"/>
                 <w:b/>
                 <w:bCs/>
-                <w:color w:val="auto"/>
+                <w:color w:val="000000" w:themeColor="text1"/>
                 <w:sz w:val="16"/>
                 <w:szCs w:val="16"/>
                 <w:lang w:val="es-PE"/>
@@ -3322,7 +3429,7 @@
                 <w:rFonts w:ascii="Arial" w:hAnsi="Arial"/>
                 <w:b/>
                 <w:bCs/>
-                <w:color w:val="auto"/>
+                <w:color w:val="000000" w:themeColor="text1"/>
                 <w:sz w:val="16"/>
                 <w:szCs w:val="16"/>
                 <w:lang w:val="es-PE"/>
@@ -3339,7 +3446,7 @@
             <w:pPr>
               <w:rPr>
                 <w:rFonts w:ascii="Arial" w:hAnsi="Arial"/>
-                <w:color w:val="auto"/>
+                <w:color w:val="000000" w:themeColor="text1"/>
                 <w:sz w:val="16"/>
                 <w:szCs w:val="16"/>
               </w:rPr>
@@ -3354,7 +3461,7 @@
             <w:pPr>
               <w:rPr>
                 <w:rFonts w:ascii="Arial" w:hAnsi="Arial"/>
-                <w:color w:val="auto"/>
+                <w:color w:val="000000" w:themeColor="text1"/>
                 <w:sz w:val="16"/>
                 <w:szCs w:val="16"/>
                 <w:lang w:val="es-PE"/>
@@ -3372,7 +3479,7 @@
                 <w:rFonts w:ascii="Arial" w:hAnsi="Arial"/>
                 <w:b/>
                 <w:bCs/>
-                <w:color w:val="auto"/>
+                <w:color w:val="000000" w:themeColor="text1"/>
                 <w:sz w:val="16"/>
                 <w:szCs w:val="16"/>
                 <w:lang w:val="es-PE"/>
@@ -3383,7 +3490,7 @@
                 <w:rFonts w:ascii="Arial" w:hAnsi="Arial"/>
                 <w:b/>
                 <w:bCs/>
-                <w:color w:val="auto"/>
+                <w:color w:val="000000" w:themeColor="text1"/>
                 <w:sz w:val="16"/>
                 <w:szCs w:val="16"/>
                 <w:lang w:val="es-PE"/>
@@ -3395,7 +3502,7 @@
                 <w:rFonts w:ascii="Arial" w:hAnsi="Arial"/>
                 <w:b/>
                 <w:bCs/>
-                <w:color w:val="auto"/>
+                <w:color w:val="000000" w:themeColor="text1"/>
                 <w:sz w:val="16"/>
                 <w:szCs w:val="16"/>
                 <w:lang w:val="es-PE"/>
@@ -3412,14 +3519,15 @@
             <w:pPr>
               <w:rPr>
                 <w:rFonts w:ascii="Arial" w:hAnsi="Arial"/>
-                <w:color w:val="auto"/>
-                <w:sz w:val="16"/>
-                <w:szCs w:val="16"/>
-              </w:rPr>
-            </w:pPr>
-            <w:r>
-              <w:rPr>
-                <w:rFonts w:ascii="Arial" w:hAnsi="Arial"/>
+                <w:color w:val="000000" w:themeColor="text1"/>
+                <w:sz w:val="16"/>
+                <w:szCs w:val="16"/>
+              </w:rPr>
+            </w:pPr>
+            <w:r>
+              <w:rPr>
+                <w:rFonts w:ascii="Arial" w:hAnsi="Arial"/>
+                <w:color w:val="000000" w:themeColor="text1"/>
                 <w:sz w:val="16"/>
                 <w:szCs w:val="16"/>
               </w:rPr>
@@ -3428,7 +3536,7 @@
             <w:r>
               <w:rPr>
                 <w:rFonts w:ascii="Arial" w:hAnsi="Arial"/>
-                <w:color w:val="auto"/>
+                <w:color w:val="000000" w:themeColor="text1"/>
                 <w:sz w:val="16"/>
                 <w:szCs w:val="16"/>
               </w:rPr>
@@ -3437,6 +3545,7 @@
             <w:r>
               <w:rPr>
                 <w:rFonts w:ascii="Arial" w:hAnsi="Arial"/>
+                <w:color w:val="000000" w:themeColor="text1"/>
                 <w:sz w:val="16"/>
                 <w:szCs w:val="16"/>
               </w:rPr>
@@ -3445,7 +3554,7 @@
             <w:r>
               <w:rPr>
                 <w:rFonts w:ascii="Arial" w:hAnsi="Arial"/>
-                <w:color w:val="auto"/>
+                <w:color w:val="000000" w:themeColor="text1"/>
                 <w:sz w:val="16"/>
                 <w:szCs w:val="16"/>
               </w:rPr>
@@ -3454,6 +3563,7 @@
             <w:r>
               <w:rPr>
                 <w:rFonts w:ascii="Arial" w:hAnsi="Arial"/>
+                <w:color w:val="000000" w:themeColor="text1"/>
                 <w:sz w:val="16"/>
                 <w:szCs w:val="16"/>
               </w:rPr>
@@ -3476,17 +3586,17 @@
                 <w:rFonts w:ascii="Arial" w:hAnsi="Arial"/>
                 <w:b/>
                 <w:bCs/>
-                <w:color w:val="auto"/>
-                <w:sz w:val="16"/>
-                <w:szCs w:val="16"/>
-              </w:rPr>
-            </w:pPr>
-            <w:r>
-              <w:rPr>
-                <w:rFonts w:ascii="Arial" w:hAnsi="Arial"/>
-                <w:b/>
-                <w:bCs/>
-                <w:color w:val="auto"/>
+                <w:color w:val="000000" w:themeColor="text1"/>
+                <w:sz w:val="16"/>
+                <w:szCs w:val="16"/>
+              </w:rPr>
+            </w:pPr>
+            <w:r>
+              <w:rPr>
+                <w:rFonts w:ascii="Arial" w:hAnsi="Arial"/>
+                <w:b/>
+                <w:bCs/>
+                <w:color w:val="000000" w:themeColor="text1"/>
                 <w:sz w:val="16"/>
                 <w:szCs w:val="16"/>
                 <w:lang w:val="es-PE"/>
@@ -3503,14 +3613,15 @@
             <w:pPr>
               <w:rPr>
                 <w:rFonts w:ascii="Arial" w:hAnsi="Arial"/>
-                <w:color w:val="auto"/>
-                <w:sz w:val="16"/>
-                <w:szCs w:val="16"/>
-              </w:rPr>
-            </w:pPr>
-            <w:r>
-              <w:rPr>
-                <w:rFonts w:ascii="Arial" w:hAnsi="Arial"/>
+                <w:color w:val="000000" w:themeColor="text1"/>
+                <w:sz w:val="16"/>
+                <w:szCs w:val="16"/>
+              </w:rPr>
+            </w:pPr>
+            <w:r>
+              <w:rPr>
+                <w:rFonts w:ascii="Arial" w:hAnsi="Arial"/>
+                <w:color w:val="000000" w:themeColor="text1"/>
                 <w:sz w:val="16"/>
                 <w:szCs w:val="16"/>
               </w:rPr>
@@ -3519,7 +3630,7 @@
             <w:r>
               <w:rPr>
                 <w:rFonts w:ascii="Arial" w:hAnsi="Arial"/>
-                <w:color w:val="auto"/>
+                <w:color w:val="000000" w:themeColor="text1"/>
                 <w:sz w:val="16"/>
                 <w:szCs w:val="16"/>
               </w:rPr>
@@ -3528,6 +3639,7 @@
             <w:r>
               <w:rPr>
                 <w:rFonts w:ascii="Arial" w:hAnsi="Arial"/>
+                <w:color w:val="000000" w:themeColor="text1"/>
                 <w:sz w:val="16"/>
                 <w:szCs w:val="16"/>
               </w:rPr>
@@ -3536,7 +3648,7 @@
             <w:r>
               <w:rPr>
                 <w:rFonts w:ascii="Arial" w:hAnsi="Arial"/>
-                <w:color w:val="auto"/>
+                <w:color w:val="000000" w:themeColor="text1"/>
                 <w:sz w:val="16"/>
                 <w:szCs w:val="16"/>
               </w:rPr>
@@ -3545,6 +3657,7 @@
             <w:r>
               <w:rPr>
                 <w:rFonts w:ascii="Arial" w:hAnsi="Arial"/>
+                <w:color w:val="000000" w:themeColor="text1"/>
                 <w:sz w:val="16"/>
                 <w:szCs w:val="16"/>
               </w:rPr>
@@ -3553,7 +3666,7 @@
             <w:r>
               <w:rPr>
                 <w:rFonts w:ascii="Arial" w:hAnsi="Arial"/>
-                <w:color w:val="auto"/>
+                <w:color w:val="000000" w:themeColor="text1"/>
                 <w:sz w:val="16"/>
                 <w:szCs w:val="16"/>
               </w:rPr>
@@ -3562,7 +3675,7 @@
             <w:r>
               <w:rPr>
                 <w:rFonts w:ascii="Arial" w:hAnsi="Arial"/>
-                <w:color w:val="auto"/>
+                <w:color w:val="000000" w:themeColor="text1"/>
                 <w:sz w:val="14"/>
                 <w:szCs w:val="14"/>
               </w:rPr>
@@ -3578,7 +3691,7 @@
             <w:pPr>
               <w:rPr>
                 <w:rFonts w:ascii="Arial" w:hAnsi="Arial"/>
-                <w:color w:val="auto"/>
+                <w:color w:val="000000" w:themeColor="text1"/>
                 <w:sz w:val="16"/>
                 <w:szCs w:val="16"/>
                 <w:lang w:val="es-PE"/>
@@ -3587,7 +3700,7 @@
             <w:r>
               <w:rPr>
                 <w:rFonts w:ascii="Arial" w:hAnsi="Arial"/>
-                <w:color w:val="auto"/>
+                <w:color w:val="000000" w:themeColor="text1"/>
                 <w:sz w:val="16"/>
                 <w:szCs w:val="16"/>
               </w:rPr>
@@ -3596,6 +3709,7 @@
             <w:r>
               <w:rPr>
                 <w:rFonts w:ascii="Arial" w:hAnsi="Arial"/>
+                <w:color w:val="000000" w:themeColor="text1"/>
                 <w:sz w:val="16"/>
                 <w:szCs w:val="16"/>
               </w:rPr>
@@ -3604,7 +3718,7 @@
             <w:r>
               <w:rPr>
                 <w:rFonts w:ascii="Arial" w:hAnsi="Arial"/>
-                <w:color w:val="auto"/>
+                <w:color w:val="000000" w:themeColor="text1"/>
                 <w:sz w:val="16"/>
                 <w:szCs w:val="16"/>
               </w:rPr>
@@ -3613,6 +3727,7 @@
             <w:r>
               <w:rPr>
                 <w:rFonts w:ascii="Arial" w:hAnsi="Arial"/>
+                <w:color w:val="000000" w:themeColor="text1"/>
                 <w:sz w:val="16"/>
                 <w:szCs w:val="16"/>
               </w:rPr>
@@ -3621,7 +3736,7 @@
             <w:r>
               <w:rPr>
                 <w:rFonts w:ascii="Arial" w:hAnsi="Arial"/>
-                <w:color w:val="auto"/>
+                <w:color w:val="000000" w:themeColor="text1"/>
                 <w:sz w:val="16"/>
                 <w:szCs w:val="16"/>
               </w:rPr>
@@ -3630,6 +3745,7 @@
             <w:r>
               <w:rPr>
                 <w:rFonts w:ascii="Arial" w:hAnsi="Arial"/>
+                <w:color w:val="000000" w:themeColor="text1"/>
                 <w:sz w:val="16"/>
                 <w:szCs w:val="16"/>
               </w:rPr>
@@ -3647,17 +3763,17 @@
                 <w:rFonts w:ascii="Arial" w:hAnsi="Arial"/>
                 <w:b/>
                 <w:bCs/>
-                <w:color w:val="auto"/>
-                <w:sz w:val="16"/>
-                <w:szCs w:val="16"/>
-              </w:rPr>
-            </w:pPr>
-            <w:r>
-              <w:rPr>
-                <w:rFonts w:ascii="Arial" w:hAnsi="Arial"/>
-                <w:b/>
-                <w:bCs/>
-                <w:color w:val="auto"/>
+                <w:color w:val="000000" w:themeColor="text1"/>
+                <w:sz w:val="16"/>
+                <w:szCs w:val="16"/>
+              </w:rPr>
+            </w:pPr>
+            <w:r>
+              <w:rPr>
+                <w:rFonts w:ascii="Arial" w:hAnsi="Arial"/>
+                <w:b/>
+                <w:bCs/>
+                <w:color w:val="000000" w:themeColor="text1"/>
                 <w:sz w:val="16"/>
                 <w:szCs w:val="16"/>
                 <w:lang w:val="es-PE"/>
@@ -3674,14 +3790,15 @@
             <w:pPr>
               <w:rPr>
                 <w:rFonts w:ascii="Arial" w:hAnsi="Arial"/>
-                <w:color w:val="auto"/>
-                <w:sz w:val="16"/>
-                <w:szCs w:val="16"/>
-              </w:rPr>
-            </w:pPr>
-            <w:r>
-              <w:rPr>
-                <w:rFonts w:ascii="Arial" w:hAnsi="Arial"/>
+                <w:color w:val="000000" w:themeColor="text1"/>
+                <w:sz w:val="16"/>
+                <w:szCs w:val="16"/>
+              </w:rPr>
+            </w:pPr>
+            <w:r>
+              <w:rPr>
+                <w:rFonts w:ascii="Arial" w:hAnsi="Arial"/>
+                <w:color w:val="000000" w:themeColor="text1"/>
                 <w:sz w:val="16"/>
                 <w:szCs w:val="16"/>
               </w:rPr>
@@ -3690,7 +3807,7 @@
             <w:r>
               <w:rPr>
                 <w:rFonts w:ascii="Arial" w:hAnsi="Arial"/>
-                <w:color w:val="auto"/>
+                <w:color w:val="000000" w:themeColor="text1"/>
                 <w:sz w:val="16"/>
                 <w:szCs w:val="16"/>
               </w:rPr>
@@ -3699,6 +3816,7 @@
             <w:r>
               <w:rPr>
                 <w:rFonts w:ascii="Arial" w:hAnsi="Arial"/>
+                <w:color w:val="000000" w:themeColor="text1"/>
                 <w:sz w:val="16"/>
                 <w:szCs w:val="16"/>
               </w:rPr>
@@ -3707,7 +3825,7 @@
             <w:r>
               <w:rPr>
                 <w:rFonts w:ascii="Arial" w:hAnsi="Arial"/>
-                <w:color w:val="auto"/>
+                <w:color w:val="000000" w:themeColor="text1"/>
                 <w:sz w:val="16"/>
                 <w:szCs w:val="16"/>
               </w:rPr>
@@ -3716,6 +3834,7 @@
             <w:r>
               <w:rPr>
                 <w:rFonts w:ascii="Arial" w:hAnsi="Arial"/>
+                <w:color w:val="000000" w:themeColor="text1"/>
                 <w:sz w:val="16"/>
                 <w:szCs w:val="16"/>
               </w:rPr>
@@ -3738,17 +3857,17 @@
                 <w:rFonts w:ascii="Arial" w:hAnsi="Arial"/>
                 <w:b/>
                 <w:bCs/>
-                <w:color w:val="auto"/>
-                <w:sz w:val="16"/>
-                <w:szCs w:val="16"/>
-              </w:rPr>
-            </w:pPr>
-            <w:r>
-              <w:rPr>
-                <w:rFonts w:ascii="Arial" w:hAnsi="Arial"/>
-                <w:b/>
-                <w:bCs/>
-                <w:color w:val="auto"/>
+                <w:color w:val="000000" w:themeColor="text1"/>
+                <w:sz w:val="16"/>
+                <w:szCs w:val="16"/>
+              </w:rPr>
+            </w:pPr>
+            <w:r>
+              <w:rPr>
+                <w:rFonts w:ascii="Arial" w:hAnsi="Arial"/>
+                <w:b/>
+                <w:bCs/>
+                <w:color w:val="000000" w:themeColor="text1"/>
                 <w:sz w:val="16"/>
                 <w:szCs w:val="16"/>
                 <w:lang w:val="es-PE"/>
@@ -3765,14 +3884,15 @@
             <w:pPr>
               <w:rPr>
                 <w:rFonts w:ascii="Arial" w:hAnsi="Arial"/>
-                <w:color w:val="auto"/>
-                <w:sz w:val="16"/>
-                <w:szCs w:val="16"/>
-              </w:rPr>
-            </w:pPr>
-            <w:r>
-              <w:rPr>
-                <w:rFonts w:ascii="Arial" w:hAnsi="Arial"/>
+                <w:color w:val="000000" w:themeColor="text1"/>
+                <w:sz w:val="16"/>
+                <w:szCs w:val="16"/>
+              </w:rPr>
+            </w:pPr>
+            <w:r>
+              <w:rPr>
+                <w:rFonts w:ascii="Arial" w:hAnsi="Arial"/>
+                <w:color w:val="000000" w:themeColor="text1"/>
                 <w:sz w:val="16"/>
                 <w:szCs w:val="16"/>
               </w:rPr>
@@ -3781,7 +3901,7 @@
             <w:r>
               <w:rPr>
                 <w:rFonts w:ascii="Arial" w:hAnsi="Arial"/>
-                <w:color w:val="auto"/>
+                <w:color w:val="000000" w:themeColor="text1"/>
                 <w:sz w:val="16"/>
                 <w:szCs w:val="16"/>
               </w:rPr>
@@ -3790,6 +3910,7 @@
             <w:r>
               <w:rPr>
                 <w:rFonts w:ascii="Arial" w:hAnsi="Arial"/>
+                <w:color w:val="000000" w:themeColor="text1"/>
                 <w:sz w:val="16"/>
                 <w:szCs w:val="16"/>
               </w:rPr>
@@ -3798,7 +3919,7 @@
             <w:r>
               <w:rPr>
                 <w:rFonts w:ascii="Arial" w:hAnsi="Arial"/>
-                <w:color w:val="auto"/>
+                <w:color w:val="000000" w:themeColor="text1"/>
                 <w:sz w:val="16"/>
                 <w:szCs w:val="16"/>
               </w:rPr>
@@ -3807,6 +3928,7 @@
             <w:r>
               <w:rPr>
                 <w:rFonts w:ascii="Arial" w:hAnsi="Arial"/>
+                <w:color w:val="000000" w:themeColor="text1"/>
                 <w:sz w:val="16"/>
                 <w:szCs w:val="16"/>
               </w:rPr>
@@ -3815,7 +3937,7 @@
             <w:r>
               <w:rPr>
                 <w:rFonts w:ascii="Arial" w:hAnsi="Arial"/>
-                <w:color w:val="auto"/>
+                <w:color w:val="000000" w:themeColor="text1"/>
                 <w:sz w:val="16"/>
                 <w:szCs w:val="16"/>
               </w:rPr>
@@ -3824,7 +3946,7 @@
             <w:r>
               <w:rPr>
                 <w:rFonts w:ascii="Arial" w:hAnsi="Arial"/>
-                <w:color w:val="auto"/>
+                <w:color w:val="000000" w:themeColor="text1"/>
                 <w:sz w:val="14"/>
                 <w:szCs w:val="14"/>
               </w:rPr>
@@ -3840,15 +3962,15 @@
             <w:pPr>
               <w:rPr>
                 <w:rFonts w:ascii="Arial" w:hAnsi="Arial"/>
-                <w:color w:val="auto"/>
-                <w:sz w:val="16"/>
-                <w:szCs w:val="16"/>
-              </w:rPr>
-            </w:pPr>
-            <w:r>
-              <w:rPr>
-                <w:rFonts w:ascii="Arial" w:hAnsi="Arial"/>
-                <w:color w:val="auto"/>
+                <w:color w:val="000000" w:themeColor="text1"/>
+                <w:sz w:val="16"/>
+                <w:szCs w:val="16"/>
+              </w:rPr>
+            </w:pPr>
+            <w:r>
+              <w:rPr>
+                <w:rFonts w:ascii="Arial" w:hAnsi="Arial"/>
+                <w:color w:val="000000" w:themeColor="text1"/>
                 <w:sz w:val="16"/>
                 <w:szCs w:val="16"/>
               </w:rPr>
@@ -3857,6 +3979,7 @@
             <w:r>
               <w:rPr>
                 <w:rFonts w:ascii="Arial" w:hAnsi="Arial"/>
+                <w:color w:val="000000" w:themeColor="text1"/>
                 <w:sz w:val="16"/>
                 <w:szCs w:val="16"/>
               </w:rPr>
@@ -3865,7 +3988,7 @@
             <w:r>
               <w:rPr>
                 <w:rFonts w:ascii="Arial" w:hAnsi="Arial"/>
-                <w:color w:val="auto"/>
+                <w:color w:val="000000" w:themeColor="text1"/>
                 <w:sz w:val="16"/>
                 <w:szCs w:val="16"/>
               </w:rPr>
@@ -3874,6 +3997,7 @@
             <w:r>
               <w:rPr>
                 <w:rFonts w:ascii="Arial" w:hAnsi="Arial"/>
+                <w:color w:val="000000" w:themeColor="text1"/>
                 <w:sz w:val="16"/>
                 <w:szCs w:val="16"/>
               </w:rPr>
@@ -3882,7 +4006,7 @@
             <w:r>
               <w:rPr>
                 <w:rFonts w:ascii="Arial" w:hAnsi="Arial"/>
-                <w:color w:val="auto"/>
+                <w:color w:val="000000" w:themeColor="text1"/>
                 <w:sz w:val="16"/>
                 <w:szCs w:val="16"/>
               </w:rPr>
@@ -3891,6 +4015,7 @@
             <w:r>
               <w:rPr>
                 <w:rFonts w:ascii="Arial" w:hAnsi="Arial"/>
+                <w:color w:val="000000" w:themeColor="text1"/>
                 <w:sz w:val="16"/>
                 <w:szCs w:val="16"/>
               </w:rPr>
@@ -3908,17 +4033,17 @@
                 <w:rFonts w:ascii="Arial" w:hAnsi="Arial"/>
                 <w:b/>
                 <w:bCs/>
-                <w:color w:val="auto"/>
-                <w:sz w:val="16"/>
-                <w:szCs w:val="16"/>
-              </w:rPr>
-            </w:pPr>
-            <w:r>
-              <w:rPr>
-                <w:rFonts w:ascii="Arial" w:hAnsi="Arial"/>
-                <w:b/>
-                <w:bCs/>
-                <w:color w:val="auto"/>
+                <w:color w:val="000000" w:themeColor="text1"/>
+                <w:sz w:val="16"/>
+                <w:szCs w:val="16"/>
+              </w:rPr>
+            </w:pPr>
+            <w:r>
+              <w:rPr>
+                <w:rFonts w:ascii="Arial" w:hAnsi="Arial"/>
+                <w:b/>
+                <w:bCs/>
+                <w:color w:val="000000" w:themeColor="text1"/>
                 <w:sz w:val="16"/>
                 <w:szCs w:val="16"/>
               </w:rPr>
@@ -3934,14 +4059,15 @@
             <w:pPr>
               <w:rPr>
                 <w:rFonts w:ascii="Arial" w:hAnsi="Arial"/>
-                <w:color w:val="auto"/>
-                <w:sz w:val="16"/>
-                <w:szCs w:val="16"/>
-              </w:rPr>
-            </w:pPr>
-            <w:r>
-              <w:rPr>
-                <w:rFonts w:ascii="Arial" w:hAnsi="Arial"/>
+                <w:color w:val="000000" w:themeColor="text1"/>
+                <w:sz w:val="16"/>
+                <w:szCs w:val="16"/>
+              </w:rPr>
+            </w:pPr>
+            <w:r>
+              <w:rPr>
+                <w:rFonts w:ascii="Arial" w:hAnsi="Arial"/>
+                <w:color w:val="000000" w:themeColor="text1"/>
                 <w:sz w:val="16"/>
                 <w:szCs w:val="16"/>
               </w:rPr>
@@ -3950,7 +4076,7 @@
             <w:r>
               <w:rPr>
                 <w:rFonts w:ascii="Arial" w:hAnsi="Arial"/>
-                <w:color w:val="auto"/>
+                <w:color w:val="000000" w:themeColor="text1"/>
                 <w:sz w:val="16"/>
                 <w:szCs w:val="16"/>
               </w:rPr>
@@ -3959,6 +4085,7 @@
             <w:r>
               <w:rPr>
                 <w:rFonts w:ascii="Arial" w:hAnsi="Arial"/>
+                <w:color w:val="000000" w:themeColor="text1"/>
                 <w:sz w:val="16"/>
                 <w:szCs w:val="16"/>
               </w:rPr>
@@ -3967,7 +4094,7 @@
             <w:r>
               <w:rPr>
                 <w:rFonts w:ascii="Arial" w:hAnsi="Arial"/>
-                <w:color w:val="auto"/>
+                <w:color w:val="000000" w:themeColor="text1"/>
                 <w:sz w:val="16"/>
                 <w:szCs w:val="16"/>
               </w:rPr>
@@ -3976,6 +4103,7 @@
             <w:r>
               <w:rPr>
                 <w:rFonts w:ascii="Arial" w:hAnsi="Arial"/>
+                <w:color w:val="000000" w:themeColor="text1"/>
                 <w:sz w:val="16"/>
                 <w:szCs w:val="16"/>
               </w:rPr>
@@ -3998,17 +4126,17 @@
                 <w:rFonts w:ascii="Arial" w:hAnsi="Arial"/>
                 <w:b/>
                 <w:bCs/>
-                <w:color w:val="auto"/>
-                <w:sz w:val="16"/>
-                <w:szCs w:val="16"/>
-              </w:rPr>
-            </w:pPr>
-            <w:r>
-              <w:rPr>
-                <w:rFonts w:ascii="Arial" w:hAnsi="Arial"/>
-                <w:b/>
-                <w:bCs/>
-                <w:color w:val="auto"/>
+                <w:color w:val="000000" w:themeColor="text1"/>
+                <w:sz w:val="16"/>
+                <w:szCs w:val="16"/>
+              </w:rPr>
+            </w:pPr>
+            <w:r>
+              <w:rPr>
+                <w:rFonts w:ascii="Arial" w:hAnsi="Arial"/>
+                <w:b/>
+                <w:bCs/>
+                <w:color w:val="000000" w:themeColor="text1"/>
                 <w:sz w:val="16"/>
                 <w:szCs w:val="16"/>
                 <w:lang w:val="es-PE"/>
@@ -4025,14 +4153,15 @@
             <w:pPr>
               <w:rPr>
                 <w:rFonts w:ascii="Arial" w:hAnsi="Arial"/>
-                <w:color w:val="auto"/>
-                <w:sz w:val="16"/>
-                <w:szCs w:val="16"/>
-              </w:rPr>
-            </w:pPr>
-            <w:r>
-              <w:rPr>
-                <w:rFonts w:ascii="Arial" w:hAnsi="Arial"/>
+                <w:color w:val="000000" w:themeColor="text1"/>
+                <w:sz w:val="16"/>
+                <w:szCs w:val="16"/>
+              </w:rPr>
+            </w:pPr>
+            <w:r>
+              <w:rPr>
+                <w:rFonts w:ascii="Arial" w:hAnsi="Arial"/>
+                <w:color w:val="000000" w:themeColor="text1"/>
                 <w:sz w:val="16"/>
                 <w:szCs w:val="16"/>
               </w:rPr>
@@ -4041,7 +4170,7 @@
             <w:r>
               <w:rPr>
                 <w:rFonts w:ascii="Arial" w:hAnsi="Arial"/>
-                <w:color w:val="auto"/>
+                <w:color w:val="000000" w:themeColor="text1"/>
                 <w:sz w:val="16"/>
                 <w:szCs w:val="16"/>
               </w:rPr>
@@ -4050,6 +4179,7 @@
             <w:r>
               <w:rPr>
                 <w:rFonts w:ascii="Arial" w:hAnsi="Arial"/>
+                <w:color w:val="000000" w:themeColor="text1"/>
                 <w:sz w:val="16"/>
                 <w:szCs w:val="16"/>
               </w:rPr>
@@ -4058,7 +4188,7 @@
             <w:r>
               <w:rPr>
                 <w:rFonts w:ascii="Arial" w:hAnsi="Arial"/>
-                <w:color w:val="auto"/>
+                <w:color w:val="000000" w:themeColor="text1"/>
                 <w:sz w:val="16"/>
                 <w:szCs w:val="16"/>
               </w:rPr>
@@ -4067,6 +4197,7 @@
             <w:r>
               <w:rPr>
                 <w:rFonts w:ascii="Arial" w:hAnsi="Arial"/>
+                <w:color w:val="000000" w:themeColor="text1"/>
                 <w:sz w:val="16"/>
                 <w:szCs w:val="16"/>
               </w:rPr>
@@ -4075,7 +4206,7 @@
             <w:r>
               <w:rPr>
                 <w:rFonts w:ascii="Arial" w:hAnsi="Arial"/>
-                <w:color w:val="auto"/>
+                <w:color w:val="000000" w:themeColor="text1"/>
                 <w:sz w:val="16"/>
                 <w:szCs w:val="16"/>
               </w:rPr>
@@ -4084,7 +4215,7 @@
             <w:r>
               <w:rPr>
                 <w:rFonts w:ascii="Arial" w:hAnsi="Arial"/>
-                <w:color w:val="auto"/>
+                <w:color w:val="000000" w:themeColor="text1"/>
                 <w:sz w:val="14"/>
                 <w:szCs w:val="14"/>
               </w:rPr>
@@ -4100,7 +4231,7 @@
             <w:pPr>
               <w:rPr>
                 <w:rFonts w:ascii="Arial" w:hAnsi="Arial"/>
-                <w:color w:val="auto"/>
+                <w:color w:val="000000" w:themeColor="text1"/>
                 <w:sz w:val="16"/>
                 <w:szCs w:val="16"/>
                 <w:lang w:val="es-PE"/>
@@ -4118,17 +4249,17 @@
                 <w:rFonts w:ascii="Arial" w:hAnsi="Arial"/>
                 <w:b/>
                 <w:bCs/>
-                <w:color w:val="auto"/>
-                <w:sz w:val="16"/>
-                <w:szCs w:val="16"/>
-              </w:rPr>
-            </w:pPr>
-            <w:r>
-              <w:rPr>
-                <w:rFonts w:ascii="Arial" w:hAnsi="Arial"/>
-                <w:b/>
-                <w:bCs/>
-                <w:color w:val="auto"/>
+                <w:color w:val="000000" w:themeColor="text1"/>
+                <w:sz w:val="16"/>
+                <w:szCs w:val="16"/>
+              </w:rPr>
+            </w:pPr>
+            <w:r>
+              <w:rPr>
+                <w:rFonts w:ascii="Arial" w:hAnsi="Arial"/>
+                <w:b/>
+                <w:bCs/>
+                <w:color w:val="000000" w:themeColor="text1"/>
                 <w:sz w:val="16"/>
                 <w:szCs w:val="16"/>
                 <w:lang w:val="es-PE"/>
@@ -4145,14 +4276,15 @@
             <w:pPr>
               <w:rPr>
                 <w:rFonts w:ascii="Arial" w:hAnsi="Arial"/>
-                <w:color w:val="auto"/>
-                <w:sz w:val="16"/>
-                <w:szCs w:val="16"/>
-              </w:rPr>
-            </w:pPr>
-            <w:r>
-              <w:rPr>
-                <w:rFonts w:ascii="Arial" w:hAnsi="Arial"/>
+                <w:color w:val="000000" w:themeColor="text1"/>
+                <w:sz w:val="16"/>
+                <w:szCs w:val="16"/>
+              </w:rPr>
+            </w:pPr>
+            <w:r>
+              <w:rPr>
+                <w:rFonts w:ascii="Arial" w:hAnsi="Arial"/>
+                <w:color w:val="000000" w:themeColor="text1"/>
                 <w:sz w:val="16"/>
                 <w:szCs w:val="16"/>
               </w:rPr>
@@ -4161,7 +4293,7 @@
             <w:r>
               <w:rPr>
                 <w:rFonts w:ascii="Arial" w:hAnsi="Arial"/>
-                <w:color w:val="auto"/>
+                <w:color w:val="000000" w:themeColor="text1"/>
                 <w:sz w:val="16"/>
                 <w:szCs w:val="16"/>
               </w:rPr>
@@ -4170,6 +4302,7 @@
             <w:r>
               <w:rPr>
                 <w:rFonts w:ascii="Arial" w:hAnsi="Arial"/>
+                <w:color w:val="000000" w:themeColor="text1"/>
                 <w:sz w:val="16"/>
                 <w:szCs w:val="16"/>
               </w:rPr>
@@ -4178,7 +4311,7 @@
             <w:r>
               <w:rPr>
                 <w:rFonts w:ascii="Arial" w:hAnsi="Arial"/>
-                <w:color w:val="auto"/>
+                <w:color w:val="000000" w:themeColor="text1"/>
                 <w:sz w:val="16"/>
                 <w:szCs w:val="16"/>
               </w:rPr>
@@ -4187,6 +4320,7 @@
             <w:r>
               <w:rPr>
                 <w:rFonts w:ascii="Arial" w:hAnsi="Arial"/>
+                <w:color w:val="000000" w:themeColor="text1"/>
                 <w:sz w:val="16"/>
                 <w:szCs w:val="16"/>
               </w:rPr>

</xml_diff>

<commit_message>
feat: actualizar plantillas de guias lotes y recepcion
</commit_message>
<xml_diff>
--- a/pesaje/analytica/Report/PrintRecepcionGuiaRecepcionV2.docx
+++ b/pesaje/analytica/Report/PrintRecepcionGuiaRecepcionV2.docx
@@ -1,6 +1,6 @@
 
 <file path=word/document.xml><?xml version="1.0" encoding="utf-8"?>
-<w:document xmlns:wpc="http://schemas.microsoft.com/office/word/2010/wordprocessingCanvas" xmlns:cx="http://schemas.microsoft.com/office/drawing/2014/chartex" xmlns:cx1="http://schemas.microsoft.com/office/drawing/2015/9/8/chartex" xmlns:cx2="http://schemas.microsoft.com/office/drawing/2015/10/21/chartex" xmlns:cx3="http://schemas.microsoft.com/office/drawing/2016/5/9/chartex" xmlns:cx4="http://schemas.microsoft.com/office/drawing/2016/5/10/chartex" xmlns:cx5="http://schemas.microsoft.com/office/drawing/2016/5/11/chartex" xmlns:cx6="http://schemas.microsoft.com/office/drawing/2016/5/12/chartex" xmlns:cx7="http://schemas.microsoft.com/office/drawing/2016/5/13/chartex" xmlns:cx8="http://schemas.microsoft.com/office/drawing/2016/5/14/chartex" xmlns:mc="http://schemas.openxmlformats.org/markup-compatibility/2006" xmlns:aink="http://schemas.microsoft.com/office/drawing/2016/ink" xmlns:am3d="http://schemas.microsoft.com/office/drawing/2017/model3d" xmlns:o="urn:schemas-microsoft-com:office:office" xmlns:oel="http://schemas.microsoft.com/office/2019/extlst" xmlns:r="http://schemas.openxmlformats.org/officeDocument/2006/relationships" xmlns:m="http://schemas.openxmlformats.org/officeDocument/2006/math" xmlns:v="urn:schemas-microsoft-com:vml" xmlns:wp14="http://schemas.microsoft.com/office/word/2010/wordprocessingDrawing" xmlns:wp="http://schemas.openxmlformats.org/drawingml/2006/wordprocessingDrawing" xmlns:w10="urn:schemas-microsoft-com:office:word" xmlns:w="http://schemas.openxmlformats.org/wordprocessingml/2006/main" xmlns:w14="http://schemas.microsoft.com/office/word/2010/wordml" xmlns:w15="http://schemas.microsoft.com/office/word/2012/wordml" xmlns:w16cex="http://schemas.microsoft.com/office/word/2018/wordml/cex" xmlns:w16cid="http://schemas.microsoft.com/office/word/2016/wordml/cid" xmlns:w16="http://schemas.microsoft.com/office/word/2018/wordml" xmlns:w16du="http://schemas.microsoft.com/office/word/2023/wordml/word16du" xmlns:w16sdtdh="http://schemas.microsoft.com/office/word/2020/wordml/sdtdatahash" xmlns:w16sdtfl="http://schemas.microsoft.com/office/word/2024/wordml/sdtformatlock" xmlns:w16se="http://schemas.microsoft.com/office/word/2015/wordml/symex" xmlns:wpg="http://schemas.microsoft.com/office/word/2010/wordprocessingGroup" xmlns:wpi="http://schemas.microsoft.com/office/word/2010/wordprocessingInk" xmlns:wne="http://schemas.microsoft.com/office/word/2006/wordml" xmlns:wps="http://schemas.microsoft.com/office/word/2010/wordprocessingShape" mc:Ignorable="w14 w15 w16se w16cid w16 w16cex w16sdtdh w16sdtfl w16du wp14">
+<w:document xmlns:wpc="http://schemas.microsoft.com/office/word/2010/wordprocessingCanvas" xmlns:cx="http://schemas.microsoft.com/office/drawing/2014/chartex" xmlns:cx1="http://schemas.microsoft.com/office/drawing/2015/9/8/chartex" xmlns:cx2="http://schemas.microsoft.com/office/drawing/2015/10/21/chartex" xmlns:cx3="http://schemas.microsoft.com/office/drawing/2016/5/9/chartex" xmlns:cx4="http://schemas.microsoft.com/office/drawing/2016/5/10/chartex" xmlns:cx5="http://schemas.microsoft.com/office/drawing/2016/5/11/chartex" xmlns:cx6="http://schemas.microsoft.com/office/drawing/2016/5/12/chartex" xmlns:cx7="http://schemas.microsoft.com/office/drawing/2016/5/13/chartex" xmlns:cx8="http://schemas.microsoft.com/office/drawing/2016/5/14/chartex" xmlns:mc="http://schemas.openxmlformats.org/markup-compatibility/2006" xmlns:aink="http://schemas.microsoft.com/office/drawing/2016/ink" xmlns:am3d="http://schemas.microsoft.com/office/drawing/2017/model3d" xmlns:o="urn:schemas-microsoft-com:office:office" xmlns:oel="http://schemas.microsoft.com/office/2019/extlst" xmlns:r="http://schemas.openxmlformats.org/officeDocument/2006/relationships" xmlns:m="http://schemas.openxmlformats.org/officeDocument/2006/math" xmlns:v="urn:schemas-microsoft-com:vml" xmlns:wp14="http://schemas.microsoft.com/office/word/2010/wordprocessingDrawing" xmlns:wp="http://schemas.openxmlformats.org/drawingml/2006/wordprocessingDrawing" xmlns:w10="urn:schemas-microsoft-com:office:word" xmlns:w="http://schemas.openxmlformats.org/wordprocessingml/2006/main" xmlns:w14="http://schemas.microsoft.com/office/word/2010/wordml" xmlns:w15="http://schemas.microsoft.com/office/word/2012/wordml" xmlns:w16cei="http://schemas.microsoft.com/office/word/2026/wordml/cei" xmlns:w16cex="http://schemas.microsoft.com/office/word/2018/wordml/cex" xmlns:w16cid="http://schemas.microsoft.com/office/word/2016/wordml/cid" xmlns:w16="http://schemas.microsoft.com/office/word/2018/wordml" xmlns:w16du="http://schemas.microsoft.com/office/word/2023/wordml/word16du" xmlns:w16sdtdh="http://schemas.microsoft.com/office/word/2020/wordml/sdtdatahash" xmlns:w16sdtfl="http://schemas.microsoft.com/office/word/2024/wordml/sdtformatlock" xmlns:w16se="http://schemas.microsoft.com/office/word/2015/wordml/symex" xmlns:wpg="http://schemas.microsoft.com/office/word/2010/wordprocessingGroup" xmlns:wpi="http://schemas.microsoft.com/office/word/2010/wordprocessingInk" xmlns:wne="http://schemas.microsoft.com/office/word/2006/wordml" xmlns:wps="http://schemas.microsoft.com/office/word/2010/wordprocessingShape" mc:Ignorable="w14 w15 w16se w16cid w16 w16cex w16sdtdh w16sdtfl w16du wp14">
   <w:body>
     <w:tbl>
       <w:tblPr>
@@ -578,17 +578,17 @@
                 <w:rFonts w:ascii="Arial" w:hAnsi="Arial"/>
                 <w:b/>
                 <w:bCs/>
-                <w:color w:val="000000" w:themeColor="text1"/>
-                <w:sz w:val="16"/>
-                <w:szCs w:val="16"/>
-              </w:rPr>
-            </w:pPr>
-            <w:r>
-              <w:rPr>
-                <w:rFonts w:ascii="Arial" w:hAnsi="Arial"/>
-                <w:b/>
-                <w:bCs/>
-                <w:color w:val="000000" w:themeColor="text1"/>
+                <w:color w:val="auto"/>
+                <w:sz w:val="16"/>
+                <w:szCs w:val="16"/>
+              </w:rPr>
+            </w:pPr>
+            <w:r>
+              <w:rPr>
+                <w:rFonts w:ascii="Arial" w:hAnsi="Arial"/>
+                <w:b/>
+                <w:bCs/>
+                <w:color w:val="auto"/>
                 <w:sz w:val="16"/>
                 <w:szCs w:val="16"/>
                 <w:lang w:val="es-PE"/>
@@ -605,15 +605,15 @@
             <w:pPr>
               <w:rPr>
                 <w:rFonts w:ascii="Arial" w:hAnsi="Arial"/>
-                <w:color w:val="000000" w:themeColor="text1"/>
-                <w:sz w:val="16"/>
-                <w:szCs w:val="16"/>
-              </w:rPr>
-            </w:pPr>
-            <w:r>
-              <w:rPr>
-                <w:rFonts w:ascii="Arial" w:hAnsi="Arial"/>
-                <w:color w:val="000000" w:themeColor="text1"/>
+                <w:color w:val="auto"/>
+                <w:sz w:val="16"/>
+                <w:szCs w:val="16"/>
+              </w:rPr>
+            </w:pPr>
+            <w:r>
+              <w:rPr>
+                <w:rFonts w:ascii="Arial" w:hAnsi="Arial"/>
+                <w:color w:val="auto"/>
                 <w:sz w:val="16"/>
                 <w:szCs w:val="16"/>
               </w:rPr>
@@ -622,7 +622,7 @@
             <w:r>
               <w:rPr>
                 <w:rFonts w:ascii="Arial" w:hAnsi="Arial"/>
-                <w:color w:val="000000" w:themeColor="text1"/>
+                <w:color w:val="auto"/>
                 <w:sz w:val="16"/>
                 <w:szCs w:val="16"/>
               </w:rPr>
@@ -631,7 +631,7 @@
             <w:r>
               <w:rPr>
                 <w:rFonts w:ascii="Arial" w:hAnsi="Arial"/>
-                <w:color w:val="000000" w:themeColor="text1"/>
+                <w:color w:val="auto"/>
                 <w:sz w:val="16"/>
                 <w:szCs w:val="16"/>
               </w:rPr>
@@ -640,7 +640,7 @@
             <w:r>
               <w:rPr>
                 <w:rFonts w:ascii="Arial" w:hAnsi="Arial"/>
-                <w:color w:val="000000" w:themeColor="text1"/>
+                <w:color w:val="auto"/>
                 <w:sz w:val="16"/>
                 <w:szCs w:val="16"/>
               </w:rPr>
@@ -649,7 +649,7 @@
             <w:r>
               <w:rPr>
                 <w:rFonts w:ascii="Arial" w:hAnsi="Arial"/>
-                <w:color w:val="000000" w:themeColor="text1"/>
+                <w:color w:val="auto"/>
                 <w:sz w:val="16"/>
                 <w:szCs w:val="16"/>
               </w:rPr>
@@ -658,7 +658,7 @@
             <w:r>
               <w:rPr>
                 <w:rFonts w:ascii="Arial" w:hAnsi="Arial"/>
-                <w:color w:val="000000" w:themeColor="text1"/>
+                <w:color w:val="auto"/>
                 <w:sz w:val="16"/>
                 <w:szCs w:val="16"/>
               </w:rPr>
@@ -667,7 +667,7 @@
             <w:r>
               <w:rPr>
                 <w:rFonts w:ascii="Arial" w:hAnsi="Arial"/>
-                <w:color w:val="000000" w:themeColor="text1"/>
+                <w:color w:val="auto"/>
                 <w:sz w:val="16"/>
                 <w:szCs w:val="16"/>
               </w:rPr>
@@ -685,7 +685,7 @@
                 <w:rFonts w:ascii="Arial" w:hAnsi="Arial"/>
                 <w:b/>
                 <w:bCs/>
-                <w:color w:val="000000" w:themeColor="text1"/>
+                <w:color w:val="auto"/>
                 <w:sz w:val="16"/>
                 <w:szCs w:val="16"/>
               </w:rPr>
@@ -696,7 +696,7 @@
                 <w:rFonts w:ascii="Arial" w:hAnsi="Arial"/>
                 <w:b/>
                 <w:bCs/>
-                <w:color w:val="000000" w:themeColor="text1"/>
+                <w:color w:val="auto"/>
                 <w:sz w:val="16"/>
                 <w:szCs w:val="16"/>
                 <w:lang w:val="es-PE"/>
@@ -709,7 +709,7 @@
                 <w:rFonts w:ascii="Arial" w:hAnsi="Arial"/>
                 <w:b/>
                 <w:bCs/>
-                <w:color w:val="000000" w:themeColor="text1"/>
+                <w:color w:val="auto"/>
                 <w:sz w:val="16"/>
                 <w:szCs w:val="16"/>
                 <w:lang w:val="es-PE"/>
@@ -721,7 +721,7 @@
                 <w:rFonts w:ascii="Arial" w:hAnsi="Arial"/>
                 <w:b/>
                 <w:bCs/>
-                <w:color w:val="000000" w:themeColor="text1"/>
+                <w:color w:val="auto"/>
                 <w:sz w:val="16"/>
                 <w:szCs w:val="16"/>
                 <w:lang w:val="es-PE"/>
@@ -733,7 +733,7 @@
                 <w:rFonts w:ascii="Arial" w:hAnsi="Arial"/>
                 <w:b/>
                 <w:bCs/>
-                <w:color w:val="000000" w:themeColor="text1"/>
+                <w:color w:val="auto"/>
                 <w:sz w:val="16"/>
                 <w:szCs w:val="16"/>
                 <w:lang w:val="es-PE"/>
@@ -746,7 +746,7 @@
                 <w:rFonts w:ascii="Arial" w:hAnsi="Arial"/>
                 <w:b/>
                 <w:bCs/>
-                <w:color w:val="000000" w:themeColor="text1"/>
+                <w:color w:val="auto"/>
                 <w:sz w:val="16"/>
                 <w:szCs w:val="16"/>
                 <w:lang w:val="es-PE"/>
@@ -764,15 +764,15 @@
             <w:pPr>
               <w:rPr>
                 <w:rFonts w:ascii="Arial" w:hAnsi="Arial"/>
-                <w:color w:val="000000" w:themeColor="text1"/>
-                <w:sz w:val="16"/>
-                <w:szCs w:val="16"/>
-              </w:rPr>
-            </w:pPr>
-            <w:r>
-              <w:rPr>
-                <w:rFonts w:ascii="Arial" w:hAnsi="Arial"/>
-                <w:color w:val="000000" w:themeColor="text1"/>
+                <w:color w:val="auto"/>
+                <w:sz w:val="16"/>
+                <w:szCs w:val="16"/>
+              </w:rPr>
+            </w:pPr>
+            <w:r>
+              <w:rPr>
+                <w:rFonts w:ascii="Arial" w:hAnsi="Arial"/>
+                <w:color w:val="auto"/>
                 <w:sz w:val="16"/>
                 <w:szCs w:val="16"/>
               </w:rPr>
@@ -781,7 +781,7 @@
             <w:r>
               <w:rPr>
                 <w:rFonts w:ascii="Arial" w:hAnsi="Arial"/>
-                <w:color w:val="000000" w:themeColor="text1"/>
+                <w:color w:val="auto"/>
                 <w:sz w:val="16"/>
                 <w:szCs w:val="16"/>
               </w:rPr>
@@ -790,7 +790,7 @@
             <w:r>
               <w:rPr>
                 <w:rFonts w:ascii="Arial" w:hAnsi="Arial"/>
-                <w:color w:val="000000" w:themeColor="text1"/>
+                <w:color w:val="auto"/>
                 <w:sz w:val="16"/>
                 <w:szCs w:val="16"/>
               </w:rPr>
@@ -799,7 +799,7 @@
             <w:r>
               <w:rPr>
                 <w:rFonts w:ascii="Arial" w:hAnsi="Arial"/>
-                <w:color w:val="000000" w:themeColor="text1"/>
+                <w:color w:val="auto"/>
                 <w:sz w:val="16"/>
                 <w:szCs w:val="16"/>
               </w:rPr>
@@ -808,7 +808,7 @@
             <w:r>
               <w:rPr>
                 <w:rFonts w:ascii="Arial" w:hAnsi="Arial"/>
-                <w:color w:val="000000" w:themeColor="text1"/>
+                <w:color w:val="auto"/>
                 <w:sz w:val="16"/>
                 <w:szCs w:val="16"/>
               </w:rPr>
@@ -831,17 +831,17 @@
                 <w:rFonts w:ascii="Arial" w:hAnsi="Arial"/>
                 <w:b/>
                 <w:bCs/>
-                <w:color w:val="000000" w:themeColor="text1"/>
-                <w:sz w:val="16"/>
-                <w:szCs w:val="16"/>
-              </w:rPr>
-            </w:pPr>
-            <w:r>
-              <w:rPr>
-                <w:rFonts w:ascii="Arial" w:hAnsi="Arial"/>
-                <w:b/>
-                <w:bCs/>
-                <w:color w:val="000000" w:themeColor="text1"/>
+                <w:color w:val="auto"/>
+                <w:sz w:val="16"/>
+                <w:szCs w:val="16"/>
+              </w:rPr>
+            </w:pPr>
+            <w:r>
+              <w:rPr>
+                <w:rFonts w:ascii="Arial" w:hAnsi="Arial"/>
+                <w:b/>
+                <w:bCs/>
+                <w:color w:val="auto"/>
                 <w:sz w:val="16"/>
                 <w:szCs w:val="16"/>
                 <w:lang w:val="es-PE"/>
@@ -858,15 +858,15 @@
             <w:pPr>
               <w:rPr>
                 <w:rFonts w:ascii="Arial" w:hAnsi="Arial"/>
-                <w:color w:val="000000" w:themeColor="text1"/>
-                <w:sz w:val="16"/>
-                <w:szCs w:val="16"/>
-              </w:rPr>
-            </w:pPr>
-            <w:r>
-              <w:rPr>
-                <w:rFonts w:ascii="Arial" w:hAnsi="Arial"/>
-                <w:color w:val="000000" w:themeColor="text1"/>
+                <w:color w:val="auto"/>
+                <w:sz w:val="16"/>
+                <w:szCs w:val="16"/>
+              </w:rPr>
+            </w:pPr>
+            <w:r>
+              <w:rPr>
+                <w:rFonts w:ascii="Arial" w:hAnsi="Arial"/>
+                <w:color w:val="auto"/>
                 <w:sz w:val="16"/>
                 <w:szCs w:val="16"/>
               </w:rPr>
@@ -875,7 +875,7 @@
             <w:r>
               <w:rPr>
                 <w:rFonts w:ascii="Arial" w:hAnsi="Arial"/>
-                <w:color w:val="000000" w:themeColor="text1"/>
+                <w:color w:val="auto"/>
                 <w:sz w:val="16"/>
                 <w:szCs w:val="16"/>
               </w:rPr>
@@ -884,7 +884,7 @@
             <w:r>
               <w:rPr>
                 <w:rFonts w:ascii="Arial" w:hAnsi="Arial"/>
-                <w:color w:val="000000" w:themeColor="text1"/>
+                <w:color w:val="auto"/>
                 <w:sz w:val="16"/>
                 <w:szCs w:val="16"/>
               </w:rPr>
@@ -893,7 +893,7 @@
             <w:r>
               <w:rPr>
                 <w:rFonts w:ascii="Arial" w:hAnsi="Arial"/>
-                <w:color w:val="000000" w:themeColor="text1"/>
+                <w:color w:val="auto"/>
                 <w:sz w:val="16"/>
                 <w:szCs w:val="16"/>
               </w:rPr>
@@ -902,7 +902,7 @@
             <w:r>
               <w:rPr>
                 <w:rFonts w:ascii="Arial" w:hAnsi="Arial"/>
-                <w:color w:val="000000" w:themeColor="text1"/>
+                <w:color w:val="auto"/>
                 <w:sz w:val="16"/>
                 <w:szCs w:val="16"/>
               </w:rPr>
@@ -920,17 +920,17 @@
                 <w:rFonts w:ascii="Arial" w:hAnsi="Arial"/>
                 <w:b/>
                 <w:bCs/>
-                <w:color w:val="000000" w:themeColor="text1"/>
-                <w:sz w:val="16"/>
-                <w:szCs w:val="16"/>
-              </w:rPr>
-            </w:pPr>
-            <w:r>
-              <w:rPr>
-                <w:rFonts w:ascii="Arial" w:hAnsi="Arial"/>
-                <w:b/>
-                <w:bCs/>
-                <w:color w:val="000000" w:themeColor="text1"/>
+                <w:color w:val="auto"/>
+                <w:sz w:val="16"/>
+                <w:szCs w:val="16"/>
+              </w:rPr>
+            </w:pPr>
+            <w:r>
+              <w:rPr>
+                <w:rFonts w:ascii="Arial" w:hAnsi="Arial"/>
+                <w:b/>
+                <w:bCs/>
+                <w:color w:val="auto"/>
                 <w:sz w:val="16"/>
                 <w:szCs w:val="16"/>
                 <w:lang w:val="es-PE"/>
@@ -947,15 +947,15 @@
             <w:pPr>
               <w:rPr>
                 <w:rFonts w:ascii="Arial" w:hAnsi="Arial"/>
-                <w:color w:val="000000" w:themeColor="text1"/>
-                <w:sz w:val="16"/>
-                <w:szCs w:val="16"/>
-              </w:rPr>
-            </w:pPr>
-            <w:r>
-              <w:rPr>
-                <w:rFonts w:ascii="Arial" w:hAnsi="Arial"/>
-                <w:color w:val="000000" w:themeColor="text1"/>
+                <w:color w:val="auto"/>
+                <w:sz w:val="16"/>
+                <w:szCs w:val="16"/>
+              </w:rPr>
+            </w:pPr>
+            <w:r>
+              <w:rPr>
+                <w:rFonts w:ascii="Arial" w:hAnsi="Arial"/>
+                <w:color w:val="auto"/>
                 <w:sz w:val="16"/>
                 <w:szCs w:val="16"/>
               </w:rPr>
@@ -964,7 +964,7 @@
             <w:r>
               <w:rPr>
                 <w:rFonts w:ascii="Arial" w:hAnsi="Arial"/>
-                <w:color w:val="000000" w:themeColor="text1"/>
+                <w:color w:val="auto"/>
                 <w:sz w:val="16"/>
                 <w:szCs w:val="16"/>
               </w:rPr>
@@ -973,7 +973,7 @@
             <w:r>
               <w:rPr>
                 <w:rFonts w:ascii="Arial" w:hAnsi="Arial"/>
-                <w:color w:val="000000" w:themeColor="text1"/>
+                <w:color w:val="auto"/>
                 <w:sz w:val="16"/>
                 <w:szCs w:val="16"/>
               </w:rPr>
@@ -982,7 +982,7 @@
             <w:r>
               <w:rPr>
                 <w:rFonts w:ascii="Arial" w:hAnsi="Arial"/>
-                <w:color w:val="000000" w:themeColor="text1"/>
+                <w:color w:val="auto"/>
                 <w:sz w:val="16"/>
                 <w:szCs w:val="16"/>
               </w:rPr>
@@ -991,7 +991,7 @@
             <w:r>
               <w:rPr>
                 <w:rFonts w:ascii="Arial" w:hAnsi="Arial"/>
-                <w:color w:val="000000" w:themeColor="text1"/>
+                <w:color w:val="auto"/>
                 <w:sz w:val="16"/>
                 <w:szCs w:val="16"/>
               </w:rPr>
@@ -1000,7 +1000,7 @@
             <w:r>
               <w:rPr>
                 <w:rFonts w:ascii="Arial" w:hAnsi="Arial"/>
-                <w:color w:val="000000" w:themeColor="text1"/>
+                <w:color w:val="auto"/>
                 <w:sz w:val="16"/>
                 <w:szCs w:val="16"/>
               </w:rPr>
@@ -1009,7 +1009,7 @@
             <w:r>
               <w:rPr>
                 <w:rFonts w:ascii="Arial" w:hAnsi="Arial"/>
-                <w:color w:val="000000" w:themeColor="text1"/>
+                <w:color w:val="auto"/>
                 <w:sz w:val="16"/>
                 <w:szCs w:val="16"/>
               </w:rPr>
@@ -1032,7 +1032,7 @@
                 <w:rFonts w:ascii="Arial" w:hAnsi="Arial"/>
                 <w:b/>
                 <w:bCs/>
-                <w:color w:val="000000" w:themeColor="text1"/>
+                <w:color w:val="auto"/>
                 <w:sz w:val="16"/>
                 <w:szCs w:val="16"/>
                 <w:lang w:val="es-PE"/>
@@ -1043,7 +1043,7 @@
                 <w:rFonts w:ascii="Arial" w:hAnsi="Arial"/>
                 <w:b/>
                 <w:bCs/>
-                <w:color w:val="000000" w:themeColor="text1"/>
+                <w:color w:val="auto"/>
                 <w:sz w:val="16"/>
                 <w:szCs w:val="16"/>
                 <w:lang w:val="es-PE"/>
@@ -1060,15 +1060,15 @@
             <w:pPr>
               <w:rPr>
                 <w:rFonts w:ascii="Arial" w:hAnsi="Arial"/>
-                <w:color w:val="000000" w:themeColor="text1"/>
-                <w:sz w:val="16"/>
-                <w:szCs w:val="16"/>
-              </w:rPr>
-            </w:pPr>
-            <w:r>
-              <w:rPr>
-                <w:rFonts w:ascii="Arial" w:hAnsi="Arial"/>
-                <w:color w:val="000000" w:themeColor="text1"/>
+                <w:color w:val="auto"/>
+                <w:sz w:val="16"/>
+                <w:szCs w:val="16"/>
+              </w:rPr>
+            </w:pPr>
+            <w:r>
+              <w:rPr>
+                <w:rFonts w:ascii="Arial" w:hAnsi="Arial"/>
+                <w:color w:val="auto"/>
                 <w:sz w:val="16"/>
                 <w:szCs w:val="16"/>
               </w:rPr>
@@ -1077,7 +1077,7 @@
             <w:r>
               <w:rPr>
                 <w:rFonts w:ascii="Arial" w:hAnsi="Arial"/>
-                <w:color w:val="000000" w:themeColor="text1"/>
+                <w:color w:val="auto"/>
                 <w:sz w:val="16"/>
                 <w:szCs w:val="16"/>
               </w:rPr>
@@ -1086,7 +1086,7 @@
             <w:r>
               <w:rPr>
                 <w:rFonts w:ascii="Arial" w:hAnsi="Arial"/>
-                <w:color w:val="000000" w:themeColor="text1"/>
+                <w:color w:val="auto"/>
                 <w:sz w:val="16"/>
                 <w:szCs w:val="16"/>
               </w:rPr>
@@ -1095,7 +1095,7 @@
             <w:r>
               <w:rPr>
                 <w:rFonts w:ascii="Arial" w:hAnsi="Arial"/>
-                <w:color w:val="000000" w:themeColor="text1"/>
+                <w:color w:val="auto"/>
                 <w:sz w:val="16"/>
                 <w:szCs w:val="16"/>
               </w:rPr>
@@ -1104,7 +1104,7 @@
             <w:r>
               <w:rPr>
                 <w:rFonts w:ascii="Arial" w:hAnsi="Arial"/>
-                <w:color w:val="000000" w:themeColor="text1"/>
+                <w:color w:val="auto"/>
                 <w:sz w:val="16"/>
                 <w:szCs w:val="16"/>
               </w:rPr>
@@ -1122,7 +1122,7 @@
                 <w:rFonts w:ascii="Arial" w:hAnsi="Arial"/>
                 <w:b/>
                 <w:bCs/>
-                <w:color w:val="000000" w:themeColor="text1"/>
+                <w:color w:val="auto"/>
                 <w:sz w:val="16"/>
                 <w:szCs w:val="16"/>
                 <w:lang w:val="es-PE"/>
@@ -1133,7 +1133,7 @@
                 <w:rFonts w:ascii="Arial" w:hAnsi="Arial"/>
                 <w:b/>
                 <w:bCs/>
-                <w:color w:val="000000" w:themeColor="text1"/>
+                <w:color w:val="auto"/>
                 <w:sz w:val="16"/>
                 <w:szCs w:val="16"/>
                 <w:lang w:val="es-PE"/>
@@ -1150,15 +1150,15 @@
             <w:pPr>
               <w:rPr>
                 <w:rFonts w:ascii="Arial" w:hAnsi="Arial"/>
-                <w:color w:val="000000" w:themeColor="text1"/>
-                <w:sz w:val="16"/>
-                <w:szCs w:val="16"/>
-              </w:rPr>
-            </w:pPr>
-            <w:r>
-              <w:rPr>
-                <w:rFonts w:ascii="Arial" w:hAnsi="Arial"/>
-                <w:color w:val="000000" w:themeColor="text1"/>
+                <w:color w:val="auto"/>
+                <w:sz w:val="16"/>
+                <w:szCs w:val="16"/>
+              </w:rPr>
+            </w:pPr>
+            <w:r>
+              <w:rPr>
+                <w:rFonts w:ascii="Arial" w:hAnsi="Arial"/>
+                <w:color w:val="auto"/>
                 <w:sz w:val="16"/>
                 <w:szCs w:val="16"/>
               </w:rPr>
@@ -1167,7 +1167,7 @@
             <w:r>
               <w:rPr>
                 <w:rFonts w:ascii="Arial" w:hAnsi="Arial"/>
-                <w:color w:val="000000" w:themeColor="text1"/>
+                <w:color w:val="auto"/>
                 <w:sz w:val="16"/>
                 <w:szCs w:val="16"/>
               </w:rPr>
@@ -1176,7 +1176,7 @@
             <w:r>
               <w:rPr>
                 <w:rFonts w:ascii="Arial" w:hAnsi="Arial"/>
-                <w:color w:val="000000" w:themeColor="text1"/>
+                <w:color w:val="auto"/>
                 <w:sz w:val="16"/>
                 <w:szCs w:val="16"/>
               </w:rPr>
@@ -1185,7 +1185,7 @@
             <w:r>
               <w:rPr>
                 <w:rFonts w:ascii="Arial" w:hAnsi="Arial"/>
-                <w:color w:val="000000" w:themeColor="text1"/>
+                <w:color w:val="auto"/>
                 <w:sz w:val="16"/>
                 <w:szCs w:val="16"/>
               </w:rPr>
@@ -1194,7 +1194,7 @@
             <w:r>
               <w:rPr>
                 <w:rFonts w:ascii="Arial" w:hAnsi="Arial"/>
-                <w:color w:val="000000" w:themeColor="text1"/>
+                <w:color w:val="auto"/>
                 <w:sz w:val="16"/>
                 <w:szCs w:val="16"/>
               </w:rPr>
@@ -1203,7 +1203,7 @@
             <w:r>
               <w:rPr>
                 <w:rFonts w:ascii="Arial" w:hAnsi="Arial"/>
-                <w:color w:val="000000" w:themeColor="text1"/>
+                <w:color w:val="auto"/>
                 <w:sz w:val="16"/>
                 <w:szCs w:val="16"/>
               </w:rPr>
@@ -1212,7 +1212,7 @@
             <w:r>
               <w:rPr>
                 <w:rFonts w:ascii="Arial" w:hAnsi="Arial"/>
-                <w:color w:val="000000" w:themeColor="text1"/>
+                <w:color w:val="auto"/>
                 <w:sz w:val="16"/>
                 <w:szCs w:val="16"/>
               </w:rPr>
@@ -1221,7 +1221,7 @@
             <w:r>
               <w:rPr>
                 <w:rFonts w:ascii="Arial" w:hAnsi="Arial"/>
-                <w:color w:val="000000" w:themeColor="text1"/>
+                <w:color w:val="auto"/>
                 <w:sz w:val="16"/>
                 <w:szCs w:val="16"/>
               </w:rPr>
@@ -1244,7 +1244,7 @@
                 <w:rFonts w:ascii="Arial" w:hAnsi="Arial"/>
                 <w:b/>
                 <w:bCs/>
-                <w:color w:val="000000" w:themeColor="text1"/>
+                <w:color w:val="auto"/>
                 <w:sz w:val="16"/>
                 <w:szCs w:val="16"/>
                 <w:lang w:val="es-PE"/>
@@ -1255,7 +1255,7 @@
                 <w:rFonts w:ascii="Arial" w:hAnsi="Arial"/>
                 <w:b/>
                 <w:bCs/>
-                <w:color w:val="000000" w:themeColor="text1"/>
+                <w:color w:val="auto"/>
                 <w:sz w:val="16"/>
                 <w:szCs w:val="16"/>
                 <w:lang w:val="es-PE"/>
@@ -1272,15 +1272,15 @@
             <w:pPr>
               <w:rPr>
                 <w:rFonts w:ascii="Arial" w:hAnsi="Arial"/>
-                <w:color w:val="000000" w:themeColor="text1"/>
-                <w:sz w:val="16"/>
-                <w:szCs w:val="16"/>
-              </w:rPr>
-            </w:pPr>
-            <w:r>
-              <w:rPr>
-                <w:rFonts w:ascii="Arial" w:hAnsi="Arial"/>
-                <w:color w:val="000000" w:themeColor="text1"/>
+                <w:color w:val="auto"/>
+                <w:sz w:val="16"/>
+                <w:szCs w:val="16"/>
+              </w:rPr>
+            </w:pPr>
+            <w:r>
+              <w:rPr>
+                <w:rFonts w:ascii="Arial" w:hAnsi="Arial"/>
+                <w:color w:val="auto"/>
                 <w:sz w:val="16"/>
                 <w:szCs w:val="16"/>
               </w:rPr>
@@ -1289,7 +1289,7 @@
             <w:r>
               <w:rPr>
                 <w:rFonts w:ascii="Arial" w:hAnsi="Arial"/>
-                <w:color w:val="000000" w:themeColor="text1"/>
+                <w:color w:val="auto"/>
                 <w:sz w:val="16"/>
                 <w:szCs w:val="16"/>
               </w:rPr>
@@ -1298,7 +1298,7 @@
             <w:r>
               <w:rPr>
                 <w:rFonts w:ascii="Arial" w:hAnsi="Arial"/>
-                <w:color w:val="000000" w:themeColor="text1"/>
+                <w:color w:val="auto"/>
                 <w:sz w:val="16"/>
                 <w:szCs w:val="16"/>
               </w:rPr>
@@ -1307,7 +1307,7 @@
             <w:r>
               <w:rPr>
                 <w:rFonts w:ascii="Arial" w:hAnsi="Arial"/>
-                <w:color w:val="000000" w:themeColor="text1"/>
+                <w:color w:val="auto"/>
                 <w:sz w:val="16"/>
                 <w:szCs w:val="16"/>
               </w:rPr>
@@ -1316,7 +1316,7 @@
             <w:r>
               <w:rPr>
                 <w:rFonts w:ascii="Arial" w:hAnsi="Arial"/>
-                <w:color w:val="000000" w:themeColor="text1"/>
+                <w:color w:val="auto"/>
                 <w:sz w:val="16"/>
                 <w:szCs w:val="16"/>
               </w:rPr>
@@ -1332,7 +1332,7 @@
             <w:pPr>
               <w:rPr>
                 <w:rFonts w:ascii="Arial" w:hAnsi="Arial"/>
-                <w:color w:val="000000" w:themeColor="text1"/>
+                <w:color w:val="auto"/>
                 <w:sz w:val="16"/>
                 <w:szCs w:val="16"/>
                 <w:lang w:val="es-PE"/>
@@ -1348,7 +1348,7 @@
             <w:pPr>
               <w:rPr>
                 <w:rFonts w:ascii="Arial" w:hAnsi="Arial"/>
-                <w:color w:val="000000" w:themeColor="text1"/>
+                <w:color w:val="auto"/>
                 <w:sz w:val="16"/>
                 <w:szCs w:val="16"/>
               </w:rPr>
@@ -1372,7 +1372,7 @@
               <w:rPr>
                 <w:rFonts w:ascii="Arial" w:hAnsi="Arial"/>
                 <w:b/>
-                <w:color w:val="000000" w:themeColor="text1"/>
+                <w:color w:val="auto"/>
                 <w:sz w:val="16"/>
                 <w:szCs w:val="16"/>
                 <w:lang w:val="es-PE"/>
@@ -1392,7 +1392,7 @@
               <w:rPr>
                 <w:rFonts w:ascii="Arial" w:hAnsi="Arial"/>
                 <w:bCs/>
-                <w:color w:val="000000" w:themeColor="text1"/>
+                <w:color w:val="auto"/>
                 <w:sz w:val="16"/>
                 <w:szCs w:val="16"/>
               </w:rPr>
@@ -1411,7 +1411,7 @@
               <w:rPr>
                 <w:rFonts w:ascii="Arial" w:hAnsi="Arial"/>
                 <w:b/>
-                <w:color w:val="000000" w:themeColor="text1"/>
+                <w:color w:val="auto"/>
                 <w:sz w:val="16"/>
                 <w:szCs w:val="16"/>
                 <w:lang w:val="es-PE"/>
@@ -1431,7 +1431,7 @@
               <w:rPr>
                 <w:rFonts w:ascii="Arial" w:hAnsi="Arial"/>
                 <w:bCs/>
-                <w:color w:val="000000" w:themeColor="text1"/>
+                <w:color w:val="auto"/>
                 <w:sz w:val="16"/>
                 <w:szCs w:val="16"/>
               </w:rPr>
@@ -1457,7 +1457,7 @@
                 <w:rFonts w:ascii="Arial" w:hAnsi="Arial"/>
                 <w:b/>
                 <w:bCs/>
-                <w:color w:val="000000" w:themeColor="text1"/>
+                <w:color w:val="auto"/>
                 <w:sz w:val="16"/>
                 <w:szCs w:val="16"/>
                 <w:u w:val="single"/>
@@ -1479,7 +1479,7 @@
               <w:rPr>
                 <w:rFonts w:ascii="Arial" w:hAnsi="Arial"/>
                 <w:b/>
-                <w:color w:val="000000" w:themeColor="text1"/>
+                <w:color w:val="auto"/>
                 <w:sz w:val="16"/>
                 <w:szCs w:val="16"/>
                 <w:u w:val="single"/>
@@ -1502,17 +1502,17 @@
               <w:rPr>
                 <w:rFonts w:ascii="Arial" w:hAnsi="Arial"/>
                 <w:bCs/>
-                <w:color w:val="000000" w:themeColor="text1"/>
-                <w:sz w:val="16"/>
-                <w:szCs w:val="16"/>
-              </w:rPr>
-            </w:pPr>
-            <w:r>
-              <w:rPr>
-                <w:rFonts w:ascii="Arial" w:hAnsi="Arial"/>
-                <w:b/>
-                <w:bCs/>
-                <w:color w:val="000000" w:themeColor="text1"/>
+                <w:color w:val="auto"/>
+                <w:sz w:val="16"/>
+                <w:szCs w:val="16"/>
+              </w:rPr>
+            </w:pPr>
+            <w:r>
+              <w:rPr>
+                <w:rFonts w:ascii="Arial" w:hAnsi="Arial"/>
+                <w:b/>
+                <w:bCs/>
+                <w:color w:val="auto"/>
                 <w:sz w:val="16"/>
                 <w:szCs w:val="16"/>
                 <w:u w:val="single"/>
@@ -1525,7 +1525,7 @@
                 <w:rFonts w:ascii="Arial" w:hAnsi="Arial"/>
                 <w:b/>
                 <w:bCs/>
-                <w:color w:val="000000" w:themeColor="text1"/>
+                <w:color w:val="auto"/>
                 <w:sz w:val="16"/>
                 <w:szCs w:val="16"/>
                 <w:u w:val="single"/>
@@ -1545,7 +1545,7 @@
               <w:rPr>
                 <w:rFonts w:ascii="Arial" w:hAnsi="Arial"/>
                 <w:b/>
-                <w:color w:val="000000" w:themeColor="text1"/>
+                <w:color w:val="auto"/>
                 <w:sz w:val="16"/>
                 <w:szCs w:val="16"/>
                 <w:u w:val="single"/>
@@ -1555,7 +1555,7 @@
               <w:rPr>
                 <w:rFonts w:ascii="Arial" w:hAnsi="Arial"/>
                 <w:b/>
-                <w:color w:val="000000" w:themeColor="text1"/>
+                <w:color w:val="auto"/>
                 <w:sz w:val="16"/>
                 <w:szCs w:val="16"/>
                 <w:u w:val="single"/>
@@ -1566,7 +1566,7 @@
               <w:rPr>
                 <w:rFonts w:ascii="Arial" w:hAnsi="Arial"/>
                 <w:b/>
-                <w:color w:val="000000" w:themeColor="text1"/>
+                <w:color w:val="auto"/>
                 <w:sz w:val="16"/>
                 <w:szCs w:val="16"/>
                 <w:u w:val="single"/>
@@ -1590,17 +1590,17 @@
                 <w:rFonts w:ascii="Arial" w:hAnsi="Arial"/>
                 <w:b/>
                 <w:bCs/>
-                <w:color w:val="000000" w:themeColor="text1"/>
-                <w:sz w:val="16"/>
-                <w:szCs w:val="16"/>
-              </w:rPr>
-            </w:pPr>
-            <w:r>
-              <w:rPr>
-                <w:rFonts w:ascii="Arial" w:hAnsi="Arial"/>
-                <w:b/>
-                <w:bCs/>
-                <w:color w:val="000000" w:themeColor="text1"/>
+                <w:color w:val="auto"/>
+                <w:sz w:val="16"/>
+                <w:szCs w:val="16"/>
+              </w:rPr>
+            </w:pPr>
+            <w:r>
+              <w:rPr>
+                <w:rFonts w:ascii="Arial" w:hAnsi="Arial"/>
+                <w:b/>
+                <w:bCs/>
+                <w:color w:val="auto"/>
                 <w:sz w:val="16"/>
                 <w:szCs w:val="16"/>
                 <w:lang w:val="es-PE"/>
@@ -1612,7 +1612,7 @@
                 <w:rFonts w:ascii="Arial" w:hAnsi="Arial"/>
                 <w:b/>
                 <w:bCs/>
-                <w:color w:val="000000" w:themeColor="text1"/>
+                <w:color w:val="auto"/>
                 <w:sz w:val="16"/>
                 <w:szCs w:val="16"/>
                 <w:lang w:val="es-PE"/>
@@ -1629,15 +1629,15 @@
             <w:pPr>
               <w:rPr>
                 <w:rFonts w:ascii="Arial" w:hAnsi="Arial"/>
-                <w:color w:val="000000" w:themeColor="text1"/>
-                <w:sz w:val="16"/>
-                <w:szCs w:val="16"/>
-              </w:rPr>
-            </w:pPr>
-            <w:r>
-              <w:rPr>
-                <w:rFonts w:ascii="Arial" w:hAnsi="Arial"/>
-                <w:color w:val="000000" w:themeColor="text1"/>
+                <w:color w:val="auto"/>
+                <w:sz w:val="16"/>
+                <w:szCs w:val="16"/>
+              </w:rPr>
+            </w:pPr>
+            <w:r>
+              <w:rPr>
+                <w:rFonts w:ascii="Arial" w:hAnsi="Arial"/>
+                <w:color w:val="auto"/>
                 <w:sz w:val="16"/>
                 <w:szCs w:val="16"/>
               </w:rPr>
@@ -1646,7 +1646,7 @@
             <w:r>
               <w:rPr>
                 <w:rFonts w:ascii="Arial" w:hAnsi="Arial"/>
-                <w:color w:val="000000" w:themeColor="text1"/>
+                <w:color w:val="auto"/>
                 <w:sz w:val="16"/>
                 <w:szCs w:val="16"/>
               </w:rPr>
@@ -1655,7 +1655,7 @@
             <w:r>
               <w:rPr>
                 <w:rFonts w:ascii="Arial" w:hAnsi="Arial"/>
-                <w:color w:val="000000" w:themeColor="text1"/>
+                <w:color w:val="auto"/>
                 <w:sz w:val="16"/>
                 <w:szCs w:val="16"/>
               </w:rPr>
@@ -1664,7 +1664,7 @@
             <w:r>
               <w:rPr>
                 <w:rFonts w:ascii="Arial" w:hAnsi="Arial"/>
-                <w:color w:val="000000" w:themeColor="text1"/>
+                <w:color w:val="auto"/>
                 <w:sz w:val="16"/>
                 <w:szCs w:val="16"/>
               </w:rPr>
@@ -1673,7 +1673,7 @@
             <w:r>
               <w:rPr>
                 <w:rFonts w:ascii="Arial" w:hAnsi="Arial"/>
-                <w:color w:val="000000" w:themeColor="text1"/>
+                <w:color w:val="auto"/>
                 <w:sz w:val="16"/>
                 <w:szCs w:val="16"/>
               </w:rPr>
@@ -1691,17 +1691,17 @@
                 <w:rFonts w:ascii="Arial" w:hAnsi="Arial"/>
                 <w:b/>
                 <w:bCs/>
-                <w:color w:val="000000" w:themeColor="text1"/>
-                <w:sz w:val="16"/>
-                <w:szCs w:val="16"/>
-              </w:rPr>
-            </w:pPr>
-            <w:r>
-              <w:rPr>
-                <w:rFonts w:ascii="Arial" w:hAnsi="Arial"/>
-                <w:b/>
-                <w:bCs/>
-                <w:color w:val="000000" w:themeColor="text1"/>
+                <w:color w:val="auto"/>
+                <w:sz w:val="16"/>
+                <w:szCs w:val="16"/>
+              </w:rPr>
+            </w:pPr>
+            <w:r>
+              <w:rPr>
+                <w:rFonts w:ascii="Arial" w:hAnsi="Arial"/>
+                <w:b/>
+                <w:bCs/>
+                <w:color w:val="auto"/>
                 <w:sz w:val="16"/>
                 <w:szCs w:val="16"/>
                 <w:lang w:val="es-PE"/>
@@ -1718,15 +1718,15 @@
             <w:pPr>
               <w:rPr>
                 <w:rFonts w:ascii="Arial" w:hAnsi="Arial"/>
-                <w:color w:val="000000" w:themeColor="text1"/>
-                <w:sz w:val="16"/>
-                <w:szCs w:val="16"/>
-              </w:rPr>
-            </w:pPr>
-            <w:r>
-              <w:rPr>
-                <w:rFonts w:ascii="Arial" w:hAnsi="Arial"/>
-                <w:color w:val="000000" w:themeColor="text1"/>
+                <w:color w:val="auto"/>
+                <w:sz w:val="16"/>
+                <w:szCs w:val="16"/>
+              </w:rPr>
+            </w:pPr>
+            <w:r>
+              <w:rPr>
+                <w:rFonts w:ascii="Arial" w:hAnsi="Arial"/>
+                <w:color w:val="auto"/>
                 <w:sz w:val="16"/>
                 <w:szCs w:val="16"/>
               </w:rPr>
@@ -1735,7 +1735,7 @@
             <w:r>
               <w:rPr>
                 <w:rFonts w:ascii="Arial" w:hAnsi="Arial"/>
-                <w:color w:val="000000" w:themeColor="text1"/>
+                <w:color w:val="auto"/>
                 <w:sz w:val="16"/>
                 <w:szCs w:val="16"/>
               </w:rPr>
@@ -1744,7 +1744,7 @@
             <w:r>
               <w:rPr>
                 <w:rFonts w:ascii="Arial" w:hAnsi="Arial"/>
-                <w:color w:val="000000" w:themeColor="text1"/>
+                <w:color w:val="auto"/>
                 <w:sz w:val="16"/>
                 <w:szCs w:val="16"/>
               </w:rPr>
@@ -1753,7 +1753,7 @@
             <w:r>
               <w:rPr>
                 <w:rFonts w:ascii="Arial" w:hAnsi="Arial"/>
-                <w:color w:val="000000" w:themeColor="text1"/>
+                <w:color w:val="auto"/>
                 <w:sz w:val="16"/>
                 <w:szCs w:val="16"/>
               </w:rPr>
@@ -1762,7 +1762,7 @@
             <w:r>
               <w:rPr>
                 <w:rFonts w:ascii="Arial" w:hAnsi="Arial"/>
-                <w:color w:val="000000" w:themeColor="text1"/>
+                <w:color w:val="auto"/>
                 <w:sz w:val="16"/>
                 <w:szCs w:val="16"/>
               </w:rPr>
@@ -1785,17 +1785,17 @@
                 <w:rFonts w:ascii="Arial" w:hAnsi="Arial"/>
                 <w:b/>
                 <w:bCs/>
-                <w:color w:val="000000" w:themeColor="text1"/>
-                <w:sz w:val="16"/>
-                <w:szCs w:val="16"/>
-              </w:rPr>
-            </w:pPr>
-            <w:r>
-              <w:rPr>
-                <w:rFonts w:ascii="Arial" w:hAnsi="Arial"/>
-                <w:b/>
-                <w:bCs/>
-                <w:color w:val="000000" w:themeColor="text1"/>
+                <w:color w:val="auto"/>
+                <w:sz w:val="16"/>
+                <w:szCs w:val="16"/>
+              </w:rPr>
+            </w:pPr>
+            <w:r>
+              <w:rPr>
+                <w:rFonts w:ascii="Arial" w:hAnsi="Arial"/>
+                <w:b/>
+                <w:bCs/>
+                <w:color w:val="auto"/>
                 <w:sz w:val="16"/>
                 <w:szCs w:val="16"/>
                 <w:lang w:val="es-PE"/>
@@ -1807,7 +1807,7 @@
                 <w:rFonts w:ascii="Arial" w:hAnsi="Arial"/>
                 <w:b/>
                 <w:bCs/>
-                <w:color w:val="000000" w:themeColor="text1"/>
+                <w:color w:val="auto"/>
                 <w:sz w:val="16"/>
                 <w:szCs w:val="16"/>
                 <w:lang w:val="es-PE"/>
@@ -1824,15 +1824,15 @@
             <w:pPr>
               <w:rPr>
                 <w:rFonts w:ascii="Arial" w:hAnsi="Arial"/>
-                <w:color w:val="000000" w:themeColor="text1"/>
-                <w:sz w:val="16"/>
-                <w:szCs w:val="16"/>
-              </w:rPr>
-            </w:pPr>
-            <w:r>
-              <w:rPr>
-                <w:rFonts w:ascii="Arial" w:hAnsi="Arial"/>
-                <w:color w:val="000000" w:themeColor="text1"/>
+                <w:color w:val="auto"/>
+                <w:sz w:val="16"/>
+                <w:szCs w:val="16"/>
+              </w:rPr>
+            </w:pPr>
+            <w:r>
+              <w:rPr>
+                <w:rFonts w:ascii="Arial" w:hAnsi="Arial"/>
+                <w:color w:val="auto"/>
                 <w:sz w:val="16"/>
                 <w:szCs w:val="16"/>
               </w:rPr>
@@ -1841,7 +1841,7 @@
             <w:r>
               <w:rPr>
                 <w:rFonts w:ascii="Arial" w:hAnsi="Arial"/>
-                <w:color w:val="000000" w:themeColor="text1"/>
+                <w:color w:val="auto"/>
                 <w:sz w:val="16"/>
                 <w:szCs w:val="16"/>
               </w:rPr>
@@ -1850,7 +1850,7 @@
             <w:r>
               <w:rPr>
                 <w:rFonts w:ascii="Arial" w:hAnsi="Arial"/>
-                <w:color w:val="000000" w:themeColor="text1"/>
+                <w:color w:val="auto"/>
                 <w:sz w:val="16"/>
                 <w:szCs w:val="16"/>
               </w:rPr>
@@ -1859,7 +1859,7 @@
             <w:r>
               <w:rPr>
                 <w:rFonts w:ascii="Arial" w:hAnsi="Arial"/>
-                <w:color w:val="000000" w:themeColor="text1"/>
+                <w:color w:val="auto"/>
                 <w:sz w:val="16"/>
                 <w:szCs w:val="16"/>
               </w:rPr>
@@ -1868,7 +1868,7 @@
             <w:r>
               <w:rPr>
                 <w:rFonts w:ascii="Arial" w:hAnsi="Arial"/>
-                <w:color w:val="000000" w:themeColor="text1"/>
+                <w:color w:val="auto"/>
                 <w:sz w:val="16"/>
                 <w:szCs w:val="16"/>
               </w:rPr>
@@ -1886,17 +1886,17 @@
                 <w:rFonts w:ascii="Arial" w:hAnsi="Arial"/>
                 <w:b/>
                 <w:bCs/>
-                <w:color w:val="000000" w:themeColor="text1"/>
-                <w:sz w:val="16"/>
-                <w:szCs w:val="16"/>
-              </w:rPr>
-            </w:pPr>
-            <w:r>
-              <w:rPr>
-                <w:rFonts w:ascii="Arial" w:hAnsi="Arial"/>
-                <w:b/>
-                <w:bCs/>
-                <w:color w:val="000000" w:themeColor="text1"/>
+                <w:color w:val="auto"/>
+                <w:sz w:val="16"/>
+                <w:szCs w:val="16"/>
+              </w:rPr>
+            </w:pPr>
+            <w:r>
+              <w:rPr>
+                <w:rFonts w:ascii="Arial" w:hAnsi="Arial"/>
+                <w:b/>
+                <w:bCs/>
+                <w:color w:val="auto"/>
                 <w:sz w:val="16"/>
                 <w:szCs w:val="16"/>
                 <w:lang w:val="es-PE"/>
@@ -1913,15 +1913,15 @@
             <w:pPr>
               <w:rPr>
                 <w:rFonts w:ascii="Arial" w:hAnsi="Arial"/>
-                <w:color w:val="000000" w:themeColor="text1"/>
-                <w:sz w:val="16"/>
-                <w:szCs w:val="16"/>
-              </w:rPr>
-            </w:pPr>
-            <w:r>
-              <w:rPr>
-                <w:rFonts w:ascii="Arial" w:hAnsi="Arial"/>
-                <w:color w:val="000000" w:themeColor="text1"/>
+                <w:color w:val="auto"/>
+                <w:sz w:val="16"/>
+                <w:szCs w:val="16"/>
+              </w:rPr>
+            </w:pPr>
+            <w:r>
+              <w:rPr>
+                <w:rFonts w:ascii="Arial" w:hAnsi="Arial"/>
+                <w:color w:val="auto"/>
                 <w:sz w:val="16"/>
                 <w:szCs w:val="16"/>
               </w:rPr>
@@ -1930,7 +1930,7 @@
             <w:r>
               <w:rPr>
                 <w:rFonts w:ascii="Arial" w:hAnsi="Arial"/>
-                <w:color w:val="000000" w:themeColor="text1"/>
+                <w:color w:val="auto"/>
                 <w:sz w:val="16"/>
                 <w:szCs w:val="16"/>
               </w:rPr>
@@ -1939,7 +1939,7 @@
             <w:r>
               <w:rPr>
                 <w:rFonts w:ascii="Arial" w:hAnsi="Arial"/>
-                <w:color w:val="000000" w:themeColor="text1"/>
+                <w:color w:val="auto"/>
                 <w:sz w:val="16"/>
                 <w:szCs w:val="16"/>
               </w:rPr>
@@ -1948,7 +1948,7 @@
             <w:r>
               <w:rPr>
                 <w:rFonts w:ascii="Arial" w:hAnsi="Arial"/>
-                <w:color w:val="000000" w:themeColor="text1"/>
+                <w:color w:val="auto"/>
                 <w:sz w:val="16"/>
                 <w:szCs w:val="16"/>
               </w:rPr>
@@ -1957,7 +1957,7 @@
             <w:r>
               <w:rPr>
                 <w:rFonts w:ascii="Arial" w:hAnsi="Arial"/>
-                <w:color w:val="000000" w:themeColor="text1"/>
+                <w:color w:val="auto"/>
                 <w:sz w:val="16"/>
                 <w:szCs w:val="16"/>
               </w:rPr>
@@ -1980,7 +1980,7 @@
                 <w:rFonts w:ascii="Arial" w:hAnsi="Arial"/>
                 <w:b/>
                 <w:bCs/>
-                <w:color w:val="000000" w:themeColor="text1"/>
+                <w:color w:val="auto"/>
                 <w:sz w:val="16"/>
                 <w:szCs w:val="16"/>
               </w:rPr>
@@ -1991,7 +1991,7 @@
                 <w:rFonts w:ascii="Arial" w:hAnsi="Arial"/>
                 <w:b/>
                 <w:bCs/>
-                <w:color w:val="000000" w:themeColor="text1"/>
+                <w:color w:val="auto"/>
                 <w:sz w:val="16"/>
                 <w:szCs w:val="16"/>
                 <w:lang w:val="es-PE"/>
@@ -2004,7 +2004,7 @@
                 <w:rFonts w:ascii="Arial" w:hAnsi="Arial"/>
                 <w:b/>
                 <w:bCs/>
-                <w:color w:val="000000" w:themeColor="text1"/>
+                <w:color w:val="auto"/>
                 <w:sz w:val="16"/>
                 <w:szCs w:val="16"/>
                 <w:lang w:val="es-PE"/>
@@ -2016,7 +2016,7 @@
                 <w:rFonts w:ascii="Arial" w:hAnsi="Arial"/>
                 <w:b/>
                 <w:bCs/>
-                <w:color w:val="000000" w:themeColor="text1"/>
+                <w:color w:val="auto"/>
                 <w:sz w:val="16"/>
                 <w:szCs w:val="16"/>
                 <w:lang w:val="es-PE"/>
@@ -2028,7 +2028,7 @@
                 <w:rFonts w:ascii="Arial" w:hAnsi="Arial"/>
                 <w:b/>
                 <w:bCs/>
-                <w:color w:val="000000" w:themeColor="text1"/>
+                <w:color w:val="auto"/>
                 <w:sz w:val="16"/>
                 <w:szCs w:val="16"/>
                 <w:lang w:val="es-PE"/>
@@ -2045,15 +2045,15 @@
             <w:pPr>
               <w:rPr>
                 <w:rFonts w:ascii="Arial" w:hAnsi="Arial"/>
-                <w:color w:val="000000" w:themeColor="text1"/>
-                <w:sz w:val="16"/>
-                <w:szCs w:val="16"/>
-              </w:rPr>
-            </w:pPr>
-            <w:r>
-              <w:rPr>
-                <w:rFonts w:ascii="Arial" w:hAnsi="Arial"/>
-                <w:color w:val="000000" w:themeColor="text1"/>
+                <w:color w:val="auto"/>
+                <w:sz w:val="16"/>
+                <w:szCs w:val="16"/>
+              </w:rPr>
+            </w:pPr>
+            <w:r>
+              <w:rPr>
+                <w:rFonts w:ascii="Arial" w:hAnsi="Arial"/>
+                <w:color w:val="auto"/>
                 <w:sz w:val="16"/>
                 <w:szCs w:val="16"/>
               </w:rPr>
@@ -2062,7 +2062,7 @@
             <w:r>
               <w:rPr>
                 <w:rFonts w:ascii="Arial" w:hAnsi="Arial"/>
-                <w:color w:val="000000" w:themeColor="text1"/>
+                <w:color w:val="auto"/>
                 <w:sz w:val="16"/>
                 <w:szCs w:val="16"/>
               </w:rPr>
@@ -2071,7 +2071,7 @@
             <w:r>
               <w:rPr>
                 <w:rFonts w:ascii="Arial" w:hAnsi="Arial"/>
-                <w:color w:val="000000" w:themeColor="text1"/>
+                <w:color w:val="auto"/>
                 <w:sz w:val="16"/>
                 <w:szCs w:val="16"/>
               </w:rPr>
@@ -2080,7 +2080,7 @@
             <w:r>
               <w:rPr>
                 <w:rFonts w:ascii="Arial" w:hAnsi="Arial"/>
-                <w:color w:val="000000" w:themeColor="text1"/>
+                <w:color w:val="auto"/>
                 <w:sz w:val="16"/>
                 <w:szCs w:val="16"/>
               </w:rPr>
@@ -2089,7 +2089,7 @@
             <w:r>
               <w:rPr>
                 <w:rFonts w:ascii="Arial" w:hAnsi="Arial"/>
-                <w:color w:val="000000" w:themeColor="text1"/>
+                <w:color w:val="auto"/>
                 <w:sz w:val="16"/>
                 <w:szCs w:val="16"/>
               </w:rPr>
@@ -2107,17 +2107,17 @@
                 <w:rFonts w:ascii="Arial" w:hAnsi="Arial"/>
                 <w:b/>
                 <w:bCs/>
-                <w:color w:val="000000" w:themeColor="text1"/>
-                <w:sz w:val="16"/>
-                <w:szCs w:val="16"/>
-              </w:rPr>
-            </w:pPr>
-            <w:r>
-              <w:rPr>
-                <w:rFonts w:ascii="Arial" w:hAnsi="Arial"/>
-                <w:b/>
-                <w:bCs/>
-                <w:color w:val="000000" w:themeColor="text1"/>
+                <w:color w:val="auto"/>
+                <w:sz w:val="16"/>
+                <w:szCs w:val="16"/>
+              </w:rPr>
+            </w:pPr>
+            <w:r>
+              <w:rPr>
+                <w:rFonts w:ascii="Arial" w:hAnsi="Arial"/>
+                <w:b/>
+                <w:bCs/>
+                <w:color w:val="auto"/>
                 <w:sz w:val="16"/>
                 <w:szCs w:val="16"/>
                 <w:lang w:val="es-PE"/>
@@ -2134,15 +2134,15 @@
             <w:pPr>
               <w:rPr>
                 <w:rFonts w:ascii="Arial" w:hAnsi="Arial"/>
-                <w:color w:val="000000" w:themeColor="text1"/>
-                <w:sz w:val="16"/>
-                <w:szCs w:val="16"/>
-              </w:rPr>
-            </w:pPr>
-            <w:r>
-              <w:rPr>
-                <w:rFonts w:ascii="Arial" w:hAnsi="Arial"/>
-                <w:color w:val="000000" w:themeColor="text1"/>
+                <w:color w:val="auto"/>
+                <w:sz w:val="16"/>
+                <w:szCs w:val="16"/>
+              </w:rPr>
+            </w:pPr>
+            <w:r>
+              <w:rPr>
+                <w:rFonts w:ascii="Arial" w:hAnsi="Arial"/>
+                <w:color w:val="auto"/>
                 <w:sz w:val="16"/>
                 <w:szCs w:val="16"/>
               </w:rPr>
@@ -2151,7 +2151,7 @@
             <w:r>
               <w:rPr>
                 <w:rFonts w:ascii="Arial" w:hAnsi="Arial"/>
-                <w:color w:val="000000" w:themeColor="text1"/>
+                <w:color w:val="auto"/>
                 <w:sz w:val="16"/>
                 <w:szCs w:val="16"/>
               </w:rPr>
@@ -2160,7 +2160,7 @@
             <w:r>
               <w:rPr>
                 <w:rFonts w:ascii="Arial" w:hAnsi="Arial"/>
-                <w:color w:val="000000" w:themeColor="text1"/>
+                <w:color w:val="auto"/>
                 <w:sz w:val="16"/>
                 <w:szCs w:val="16"/>
               </w:rPr>
@@ -2169,7 +2169,7 @@
             <w:r>
               <w:rPr>
                 <w:rFonts w:ascii="Arial" w:hAnsi="Arial"/>
-                <w:color w:val="000000" w:themeColor="text1"/>
+                <w:color w:val="auto"/>
                 <w:sz w:val="16"/>
                 <w:szCs w:val="16"/>
               </w:rPr>
@@ -2178,7 +2178,7 @@
             <w:r>
               <w:rPr>
                 <w:rFonts w:ascii="Arial" w:hAnsi="Arial"/>
-                <w:color w:val="000000" w:themeColor="text1"/>
+                <w:color w:val="auto"/>
                 <w:sz w:val="16"/>
                 <w:szCs w:val="16"/>
               </w:rPr>
@@ -2201,7 +2201,7 @@
                 <w:rFonts w:ascii="Arial" w:hAnsi="Arial"/>
                 <w:b/>
                 <w:bCs/>
-                <w:color w:val="000000" w:themeColor="text1"/>
+                <w:color w:val="auto"/>
                 <w:sz w:val="16"/>
                 <w:szCs w:val="16"/>
                 <w:lang w:val="es-PE"/>
@@ -2213,7 +2213,7 @@
                 <w:rFonts w:ascii="Arial" w:hAnsi="Arial"/>
                 <w:b/>
                 <w:bCs/>
-                <w:color w:val="000000" w:themeColor="text1"/>
+                <w:color w:val="auto"/>
                 <w:sz w:val="16"/>
                 <w:szCs w:val="16"/>
                 <w:lang w:val="es-PE"/>
@@ -2226,7 +2226,7 @@
                 <w:rFonts w:ascii="Arial" w:hAnsi="Arial"/>
                 <w:b/>
                 <w:bCs/>
-                <w:color w:val="000000" w:themeColor="text1"/>
+                <w:color w:val="auto"/>
                 <w:sz w:val="16"/>
                 <w:szCs w:val="16"/>
                 <w:lang w:val="es-PE"/>
@@ -2243,15 +2243,15 @@
             <w:pPr>
               <w:rPr>
                 <w:rFonts w:ascii="Arial" w:hAnsi="Arial"/>
-                <w:color w:val="000000" w:themeColor="text1"/>
-                <w:sz w:val="16"/>
-                <w:szCs w:val="16"/>
-              </w:rPr>
-            </w:pPr>
-            <w:r>
-              <w:rPr>
-                <w:rFonts w:ascii="Arial" w:hAnsi="Arial"/>
-                <w:color w:val="000000" w:themeColor="text1"/>
+                <w:color w:val="auto"/>
+                <w:sz w:val="16"/>
+                <w:szCs w:val="16"/>
+              </w:rPr>
+            </w:pPr>
+            <w:r>
+              <w:rPr>
+                <w:rFonts w:ascii="Arial" w:hAnsi="Arial"/>
+                <w:color w:val="auto"/>
                 <w:sz w:val="16"/>
                 <w:szCs w:val="16"/>
               </w:rPr>
@@ -2260,7 +2260,7 @@
             <w:r>
               <w:rPr>
                 <w:rFonts w:ascii="Arial" w:hAnsi="Arial"/>
-                <w:color w:val="000000" w:themeColor="text1"/>
+                <w:color w:val="auto"/>
                 <w:sz w:val="16"/>
                 <w:szCs w:val="16"/>
               </w:rPr>
@@ -2269,7 +2269,7 @@
             <w:r>
               <w:rPr>
                 <w:rFonts w:ascii="Arial" w:hAnsi="Arial"/>
-                <w:color w:val="000000" w:themeColor="text1"/>
+                <w:color w:val="auto"/>
                 <w:sz w:val="16"/>
                 <w:szCs w:val="16"/>
               </w:rPr>
@@ -2278,7 +2278,7 @@
             <w:r>
               <w:rPr>
                 <w:rFonts w:ascii="Arial" w:hAnsi="Arial"/>
-                <w:color w:val="000000" w:themeColor="text1"/>
+                <w:color w:val="auto"/>
                 <w:sz w:val="16"/>
                 <w:szCs w:val="16"/>
               </w:rPr>
@@ -2287,7 +2287,7 @@
             <w:r>
               <w:rPr>
                 <w:rFonts w:ascii="Arial" w:hAnsi="Arial"/>
-                <w:color w:val="000000" w:themeColor="text1"/>
+                <w:color w:val="auto"/>
                 <w:sz w:val="16"/>
                 <w:szCs w:val="16"/>
               </w:rPr>
@@ -2305,7 +2305,7 @@
                 <w:rFonts w:ascii="Arial" w:hAnsi="Arial"/>
                 <w:b/>
                 <w:bCs/>
-                <w:color w:val="000000" w:themeColor="text1"/>
+                <w:color w:val="auto"/>
                 <w:sz w:val="16"/>
                 <w:szCs w:val="16"/>
                 <w:lang w:val="es-PE"/>
@@ -2316,7 +2316,7 @@
                 <w:rFonts w:ascii="Arial" w:hAnsi="Arial"/>
                 <w:b/>
                 <w:bCs/>
-                <w:color w:val="000000" w:themeColor="text1"/>
+                <w:color w:val="auto"/>
                 <w:sz w:val="16"/>
                 <w:szCs w:val="16"/>
                 <w:lang w:val="es-PE"/>
@@ -2333,15 +2333,15 @@
             <w:pPr>
               <w:rPr>
                 <w:rFonts w:ascii="Arial" w:hAnsi="Arial"/>
-                <w:color w:val="000000" w:themeColor="text1"/>
-                <w:sz w:val="16"/>
-                <w:szCs w:val="16"/>
-              </w:rPr>
-            </w:pPr>
-            <w:r>
-              <w:rPr>
-                <w:rFonts w:ascii="Arial" w:hAnsi="Arial"/>
-                <w:color w:val="000000" w:themeColor="text1"/>
+                <w:color w:val="auto"/>
+                <w:sz w:val="16"/>
+                <w:szCs w:val="16"/>
+              </w:rPr>
+            </w:pPr>
+            <w:r>
+              <w:rPr>
+                <w:rFonts w:ascii="Arial" w:hAnsi="Arial"/>
+                <w:color w:val="auto"/>
                 <w:sz w:val="16"/>
                 <w:szCs w:val="16"/>
               </w:rPr>
@@ -2350,7 +2350,7 @@
             <w:r>
               <w:rPr>
                 <w:rFonts w:ascii="Arial" w:hAnsi="Arial"/>
-                <w:color w:val="000000" w:themeColor="text1"/>
+                <w:color w:val="auto"/>
                 <w:sz w:val="16"/>
                 <w:szCs w:val="16"/>
               </w:rPr>
@@ -2359,7 +2359,7 @@
             <w:r>
               <w:rPr>
                 <w:rFonts w:ascii="Arial" w:hAnsi="Arial"/>
-                <w:color w:val="000000" w:themeColor="text1"/>
+                <w:color w:val="auto"/>
                 <w:sz w:val="16"/>
                 <w:szCs w:val="16"/>
               </w:rPr>
@@ -2368,7 +2368,7 @@
             <w:r>
               <w:rPr>
                 <w:rFonts w:ascii="Arial" w:hAnsi="Arial"/>
-                <w:color w:val="000000" w:themeColor="text1"/>
+                <w:color w:val="auto"/>
                 <w:sz w:val="16"/>
                 <w:szCs w:val="16"/>
               </w:rPr>
@@ -2377,7 +2377,7 @@
             <w:r>
               <w:rPr>
                 <w:rFonts w:ascii="Arial" w:hAnsi="Arial"/>
-                <w:color w:val="000000" w:themeColor="text1"/>
+                <w:color w:val="auto"/>
                 <w:sz w:val="16"/>
                 <w:szCs w:val="16"/>
               </w:rPr>
@@ -2386,7 +2386,7 @@
             <w:r>
               <w:rPr>
                 <w:rFonts w:ascii="Arial" w:hAnsi="Arial"/>
-                <w:color w:val="000000" w:themeColor="text1"/>
+                <w:color w:val="auto"/>
                 <w:sz w:val="16"/>
                 <w:szCs w:val="16"/>
               </w:rPr>
@@ -2408,7 +2408,7 @@
               <w:rPr>
                 <w:rFonts w:ascii="Arial" w:hAnsi="Arial"/>
                 <w:b/>
-                <w:color w:val="000000" w:themeColor="text1"/>
+                <w:color w:val="auto"/>
                 <w:sz w:val="16"/>
                 <w:szCs w:val="16"/>
                 <w:lang w:val="es-PE"/>
@@ -2425,7 +2425,7 @@
               <w:rPr>
                 <w:rFonts w:ascii="Arial" w:hAnsi="Arial"/>
                 <w:bCs/>
-                <w:color w:val="000000" w:themeColor="text1"/>
+                <w:color w:val="auto"/>
                 <w:sz w:val="16"/>
                 <w:szCs w:val="16"/>
               </w:rPr>
@@ -2441,7 +2441,7 @@
               <w:rPr>
                 <w:rFonts w:ascii="Arial" w:hAnsi="Arial"/>
                 <w:b/>
-                <w:color w:val="000000" w:themeColor="text1"/>
+                <w:color w:val="auto"/>
                 <w:sz w:val="16"/>
                 <w:szCs w:val="16"/>
                 <w:lang w:val="es-PE"/>
@@ -2458,7 +2458,7 @@
               <w:rPr>
                 <w:rFonts w:ascii="Arial" w:hAnsi="Arial"/>
                 <w:bCs/>
-                <w:color w:val="000000" w:themeColor="text1"/>
+                <w:color w:val="auto"/>
                 <w:sz w:val="16"/>
                 <w:szCs w:val="16"/>
               </w:rPr>
@@ -2479,7 +2479,7 @@
               <w:rPr>
                 <w:rFonts w:ascii="Arial" w:hAnsi="Arial"/>
                 <w:b/>
-                <w:color w:val="000000" w:themeColor="text1"/>
+                <w:color w:val="auto"/>
                 <w:sz w:val="16"/>
                 <w:szCs w:val="16"/>
                 <w:lang w:val="es-PE"/>
@@ -2489,7 +2489,7 @@
               <w:rPr>
                 <w:rFonts w:ascii="Arial" w:hAnsi="Arial"/>
                 <w:b/>
-                <w:color w:val="000000" w:themeColor="text1"/>
+                <w:color w:val="auto"/>
                 <w:sz w:val="16"/>
                 <w:szCs w:val="16"/>
                 <w:lang w:val="es-PE"/>
@@ -2507,7 +2507,7 @@
               <w:rPr>
                 <w:rFonts w:ascii="Arial" w:hAnsi="Arial"/>
                 <w:bCs/>
-                <w:color w:val="000000" w:themeColor="text1"/>
+                <w:color w:val="auto"/>
                 <w:sz w:val="16"/>
                 <w:szCs w:val="16"/>
               </w:rPr>
@@ -2523,7 +2523,7 @@
               <w:rPr>
                 <w:rFonts w:ascii="Arial" w:hAnsi="Arial"/>
                 <w:b/>
-                <w:color w:val="000000" w:themeColor="text1"/>
+                <w:color w:val="auto"/>
                 <w:sz w:val="16"/>
                 <w:szCs w:val="16"/>
                 <w:lang w:val="es-PE"/>
@@ -2540,7 +2540,7 @@
               <w:rPr>
                 <w:rFonts w:ascii="Arial" w:hAnsi="Arial"/>
                 <w:bCs/>
-                <w:color w:val="000000" w:themeColor="text1"/>
+                <w:color w:val="auto"/>
                 <w:sz w:val="16"/>
                 <w:szCs w:val="16"/>
               </w:rPr>
@@ -2590,7 +2590,6 @@
               <w:rPr>
                 <w:rFonts w:ascii="Arial" w:hAnsi="Arial"/>
                 <w:b/>
-                <w:color w:val="000000" w:themeColor="text1"/>
                 <w:w w:val="96"/>
                 <w:sz w:val="16"/>
                 <w:szCs w:val="16"/>
@@ -2601,7 +2600,6 @@
               <w:rPr>
                 <w:rFonts w:ascii="Arial" w:hAnsi="Arial"/>
                 <w:b/>
-                <w:color w:val="000000" w:themeColor="text1"/>
                 <w:w w:val="96"/>
                 <w:sz w:val="16"/>
                 <w:szCs w:val="16"/>
@@ -2626,7 +2624,6 @@
               <w:rPr>
                 <w:rFonts w:ascii="Arial" w:hAnsi="Arial"/>
                 <w:b/>
-                <w:color w:val="000000" w:themeColor="text1"/>
                 <w:w w:val="96"/>
                 <w:sz w:val="16"/>
                 <w:szCs w:val="16"/>
@@ -2636,7 +2633,6 @@
               <w:rPr>
                 <w:rFonts w:ascii="Arial" w:hAnsi="Arial"/>
                 <w:b/>
-                <w:color w:val="000000" w:themeColor="text1"/>
                 <w:w w:val="96"/>
                 <w:sz w:val="16"/>
                 <w:szCs w:val="16"/>
@@ -2660,7 +2656,6 @@
               <w:rPr>
                 <w:rFonts w:ascii="Arial" w:hAnsi="Arial"/>
                 <w:b/>
-                <w:color w:val="000000" w:themeColor="text1"/>
                 <w:w w:val="96"/>
                 <w:sz w:val="16"/>
                 <w:szCs w:val="16"/>
@@ -2670,7 +2665,6 @@
               <w:rPr>
                 <w:rFonts w:ascii="Arial" w:hAnsi="Arial"/>
                 <w:b/>
-                <w:color w:val="000000" w:themeColor="text1"/>
                 <w:w w:val="96"/>
                 <w:sz w:val="16"/>
                 <w:szCs w:val="16"/>
@@ -2694,7 +2688,6 @@
               <w:rPr>
                 <w:rFonts w:ascii="Arial" w:hAnsi="Arial"/>
                 <w:b/>
-                <w:color w:val="000000" w:themeColor="text1"/>
                 <w:w w:val="96"/>
                 <w:sz w:val="16"/>
                 <w:szCs w:val="16"/>
@@ -2704,7 +2697,6 @@
               <w:rPr>
                 <w:rFonts w:ascii="Arial" w:hAnsi="Arial"/>
                 <w:b/>
-                <w:color w:val="000000" w:themeColor="text1"/>
                 <w:w w:val="96"/>
                 <w:sz w:val="16"/>
                 <w:szCs w:val="16"/>
@@ -2728,7 +2720,6 @@
               <w:rPr>
                 <w:rFonts w:ascii="Arial" w:hAnsi="Arial"/>
                 <w:b/>
-                <w:color w:val="000000" w:themeColor="text1"/>
                 <w:w w:val="96"/>
                 <w:sz w:val="16"/>
                 <w:szCs w:val="16"/>
@@ -2739,7 +2730,6 @@
               <w:rPr>
                 <w:rFonts w:ascii="Arial" w:hAnsi="Arial"/>
                 <w:b/>
-                <w:color w:val="000000" w:themeColor="text1"/>
                 <w:w w:val="96"/>
                 <w:sz w:val="16"/>
                 <w:szCs w:val="16"/>
@@ -2764,7 +2754,6 @@
               <w:rPr>
                 <w:rFonts w:ascii="Arial" w:hAnsi="Arial"/>
                 <w:b/>
-                <w:color w:val="000000" w:themeColor="text1"/>
                 <w:w w:val="96"/>
                 <w:sz w:val="16"/>
                 <w:szCs w:val="16"/>
@@ -2775,7 +2764,6 @@
               <w:rPr>
                 <w:rFonts w:ascii="Arial" w:hAnsi="Arial"/>
                 <w:b/>
-                <w:color w:val="000000" w:themeColor="text1"/>
                 <w:w w:val="96"/>
                 <w:sz w:val="16"/>
                 <w:szCs w:val="16"/>
@@ -2801,7 +2789,6 @@
               <w:rPr>
                 <w:rFonts w:ascii="Arial" w:hAnsi="Arial"/>
                 <w:b/>
-                <w:color w:val="000000" w:themeColor="text1"/>
                 <w:w w:val="96"/>
                 <w:sz w:val="16"/>
                 <w:szCs w:val="16"/>
@@ -2811,7 +2798,6 @@
               <w:rPr>
                 <w:rFonts w:ascii="Arial" w:hAnsi="Arial"/>
                 <w:b/>
-                <w:color w:val="000000" w:themeColor="text1"/>
                 <w:w w:val="96"/>
                 <w:sz w:val="16"/>
                 <w:szCs w:val="16"/>
@@ -2839,7 +2825,6 @@
               <w:rPr>
                 <w:rFonts w:ascii="Arial" w:hAnsi="Arial"/>
                 <w:b/>
-                <w:color w:val="000000" w:themeColor="text1"/>
                 <w:w w:val="96"/>
                 <w:sz w:val="14"/>
                 <w:szCs w:val="14"/>
@@ -2849,7 +2834,6 @@
               <w:rPr>
                 <w:rFonts w:ascii="Arial" w:hAnsi="Arial"/>
                 <w:bCs/>
-                <w:color w:val="000000" w:themeColor="text1"/>
                 <w:sz w:val="14"/>
                 <w:szCs w:val="14"/>
               </w:rPr>
@@ -2859,7 +2843,6 @@
               <w:rPr>
                 <w:rFonts w:ascii="Arial" w:hAnsi="Arial"/>
                 <w:bCs/>
-                <w:color w:val="000000" w:themeColor="text1"/>
                 <w:sz w:val="14"/>
                 <w:szCs w:val="14"/>
               </w:rPr>
@@ -2869,7 +2852,6 @@
               <w:rPr>
                 <w:rFonts w:ascii="Arial" w:hAnsi="Arial"/>
                 <w:bCs/>
-                <w:color w:val="000000" w:themeColor="text1"/>
                 <w:sz w:val="14"/>
                 <w:szCs w:val="14"/>
               </w:rPr>
@@ -2880,7 +2862,6 @@
                 <w:rFonts w:ascii="Arial" w:hAnsi="Arial"/>
                 <w:bCs/>
                 <w:noProof/>
-                <w:color w:val="000000" w:themeColor="text1"/>
                 <w:sz w:val="14"/>
                 <w:szCs w:val="14"/>
               </w:rPr>
@@ -2890,7 +2871,6 @@
               <w:rPr>
                 <w:rFonts w:ascii="Arial" w:hAnsi="Arial"/>
                 <w:bCs/>
-                <w:color w:val="000000" w:themeColor="text1"/>
                 <w:sz w:val="14"/>
                 <w:szCs w:val="14"/>
               </w:rPr>
@@ -2912,7 +2892,6 @@
               <w:rPr>
                 <w:rFonts w:ascii="Arial" w:hAnsi="Arial"/>
                 <w:bCs/>
-                <w:color w:val="000000" w:themeColor="text1"/>
                 <w:sz w:val="14"/>
                 <w:szCs w:val="14"/>
               </w:rPr>
@@ -2921,7 +2900,6 @@
               <w:rPr>
                 <w:rFonts w:ascii="Arial" w:hAnsi="Arial"/>
                 <w:bCs/>
-                <w:color w:val="000000" w:themeColor="text1"/>
                 <w:sz w:val="14"/>
                 <w:szCs w:val="14"/>
               </w:rPr>
@@ -2931,7 +2909,6 @@
               <w:rPr>
                 <w:rFonts w:ascii="Arial" w:hAnsi="Arial"/>
                 <w:bCs/>
-                <w:color w:val="000000" w:themeColor="text1"/>
                 <w:sz w:val="14"/>
                 <w:szCs w:val="14"/>
               </w:rPr>
@@ -2941,7 +2918,6 @@
               <w:rPr>
                 <w:rFonts w:ascii="Arial" w:hAnsi="Arial"/>
                 <w:bCs/>
-                <w:color w:val="000000" w:themeColor="text1"/>
                 <w:sz w:val="14"/>
                 <w:szCs w:val="14"/>
               </w:rPr>
@@ -2952,7 +2928,6 @@
                 <w:rFonts w:ascii="Arial" w:hAnsi="Arial"/>
                 <w:bCs/>
                 <w:noProof/>
-                <w:color w:val="000000" w:themeColor="text1"/>
                 <w:sz w:val="14"/>
                 <w:szCs w:val="14"/>
               </w:rPr>
@@ -2962,7 +2937,6 @@
               <w:rPr>
                 <w:rFonts w:ascii="Arial" w:hAnsi="Arial"/>
                 <w:bCs/>
-                <w:color w:val="000000" w:themeColor="text1"/>
                 <w:sz w:val="14"/>
                 <w:szCs w:val="14"/>
               </w:rPr>
@@ -2984,7 +2958,6 @@
               <w:rPr>
                 <w:rFonts w:ascii="Arial" w:hAnsi="Arial"/>
                 <w:bCs/>
-                <w:color w:val="000000" w:themeColor="text1"/>
                 <w:sz w:val="14"/>
                 <w:szCs w:val="14"/>
               </w:rPr>
@@ -2993,7 +2966,6 @@
               <w:rPr>
                 <w:rFonts w:ascii="Arial" w:hAnsi="Arial"/>
                 <w:bCs/>
-                <w:color w:val="000000" w:themeColor="text1"/>
                 <w:sz w:val="14"/>
                 <w:szCs w:val="14"/>
               </w:rPr>
@@ -3003,7 +2975,6 @@
               <w:rPr>
                 <w:rFonts w:ascii="Arial" w:hAnsi="Arial"/>
                 <w:bCs/>
-                <w:color w:val="000000" w:themeColor="text1"/>
                 <w:sz w:val="14"/>
                 <w:szCs w:val="14"/>
               </w:rPr>
@@ -3013,7 +2984,6 @@
               <w:rPr>
                 <w:rFonts w:ascii="Arial" w:hAnsi="Arial"/>
                 <w:bCs/>
-                <w:color w:val="000000" w:themeColor="text1"/>
                 <w:sz w:val="14"/>
                 <w:szCs w:val="14"/>
               </w:rPr>
@@ -3024,7 +2994,6 @@
                 <w:rFonts w:ascii="Arial" w:hAnsi="Arial"/>
                 <w:bCs/>
                 <w:noProof/>
-                <w:color w:val="000000" w:themeColor="text1"/>
                 <w:sz w:val="14"/>
                 <w:szCs w:val="14"/>
               </w:rPr>
@@ -3034,7 +3003,6 @@
               <w:rPr>
                 <w:rFonts w:ascii="Arial" w:hAnsi="Arial"/>
                 <w:bCs/>
-                <w:color w:val="000000" w:themeColor="text1"/>
                 <w:sz w:val="14"/>
                 <w:szCs w:val="14"/>
               </w:rPr>
@@ -3056,7 +3024,6 @@
               <w:rPr>
                 <w:rFonts w:ascii="Arial" w:hAnsi="Arial"/>
                 <w:b/>
-                <w:color w:val="000000" w:themeColor="text1"/>
                 <w:w w:val="96"/>
                 <w:sz w:val="14"/>
                 <w:szCs w:val="14"/>
@@ -3066,7 +3033,6 @@
               <w:rPr>
                 <w:rFonts w:ascii="Arial" w:hAnsi="Arial"/>
                 <w:bCs/>
-                <w:color w:val="000000" w:themeColor="text1"/>
                 <w:sz w:val="14"/>
                 <w:szCs w:val="14"/>
               </w:rPr>
@@ -3076,7 +3042,6 @@
               <w:rPr>
                 <w:rFonts w:ascii="Arial" w:hAnsi="Arial"/>
                 <w:bCs/>
-                <w:color w:val="000000" w:themeColor="text1"/>
                 <w:sz w:val="14"/>
                 <w:szCs w:val="14"/>
               </w:rPr>
@@ -3086,7 +3051,6 @@
               <w:rPr>
                 <w:rFonts w:ascii="Arial" w:hAnsi="Arial"/>
                 <w:bCs/>
-                <w:color w:val="000000" w:themeColor="text1"/>
                 <w:sz w:val="14"/>
                 <w:szCs w:val="14"/>
               </w:rPr>
@@ -3097,7 +3061,6 @@
                 <w:rFonts w:ascii="Arial" w:hAnsi="Arial"/>
                 <w:bCs/>
                 <w:noProof/>
-                <w:color w:val="000000" w:themeColor="text1"/>
                 <w:sz w:val="14"/>
                 <w:szCs w:val="14"/>
               </w:rPr>
@@ -3107,7 +3070,6 @@
               <w:rPr>
                 <w:rFonts w:ascii="Arial" w:hAnsi="Arial"/>
                 <w:bCs/>
-                <w:color w:val="000000" w:themeColor="text1"/>
                 <w:sz w:val="14"/>
                 <w:szCs w:val="14"/>
               </w:rPr>
@@ -3129,7 +3091,6 @@
               <w:rPr>
                 <w:rFonts w:ascii="Arial" w:hAnsi="Arial"/>
                 <w:b/>
-                <w:color w:val="000000" w:themeColor="text1"/>
                 <w:w w:val="96"/>
                 <w:sz w:val="14"/>
                 <w:szCs w:val="14"/>
@@ -3139,7 +3100,6 @@
               <w:rPr>
                 <w:rFonts w:ascii="Arial" w:hAnsi="Arial"/>
                 <w:bCs/>
-                <w:color w:val="000000" w:themeColor="text1"/>
                 <w:sz w:val="14"/>
                 <w:szCs w:val="14"/>
               </w:rPr>
@@ -3149,7 +3109,6 @@
               <w:rPr>
                 <w:rFonts w:ascii="Arial" w:hAnsi="Arial"/>
                 <w:bCs/>
-                <w:color w:val="000000" w:themeColor="text1"/>
                 <w:sz w:val="14"/>
                 <w:szCs w:val="14"/>
               </w:rPr>
@@ -3159,7 +3118,6 @@
               <w:rPr>
                 <w:rFonts w:ascii="Arial" w:hAnsi="Arial"/>
                 <w:bCs/>
-                <w:color w:val="000000" w:themeColor="text1"/>
                 <w:sz w:val="14"/>
                 <w:szCs w:val="14"/>
               </w:rPr>
@@ -3170,7 +3128,6 @@
                 <w:rFonts w:ascii="Arial" w:hAnsi="Arial"/>
                 <w:bCs/>
                 <w:noProof/>
-                <w:color w:val="000000" w:themeColor="text1"/>
                 <w:sz w:val="14"/>
                 <w:szCs w:val="14"/>
               </w:rPr>
@@ -3180,7 +3137,6 @@
               <w:rPr>
                 <w:rFonts w:ascii="Arial" w:hAnsi="Arial"/>
                 <w:bCs/>
-                <w:color w:val="000000" w:themeColor="text1"/>
                 <w:sz w:val="14"/>
                 <w:szCs w:val="14"/>
               </w:rPr>
@@ -3202,7 +3158,6 @@
               <w:rPr>
                 <w:rFonts w:ascii="Arial" w:hAnsi="Arial"/>
                 <w:b/>
-                <w:color w:val="000000" w:themeColor="text1"/>
                 <w:w w:val="96"/>
                 <w:sz w:val="14"/>
                 <w:szCs w:val="14"/>
@@ -3212,7 +3167,6 @@
               <w:rPr>
                 <w:rFonts w:ascii="Arial" w:hAnsi="Arial"/>
                 <w:bCs/>
-                <w:color w:val="000000" w:themeColor="text1"/>
                 <w:sz w:val="14"/>
                 <w:szCs w:val="14"/>
               </w:rPr>
@@ -3222,7 +3176,6 @@
               <w:rPr>
                 <w:rFonts w:ascii="Arial" w:hAnsi="Arial"/>
                 <w:bCs/>
-                <w:color w:val="000000" w:themeColor="text1"/>
                 <w:sz w:val="14"/>
                 <w:szCs w:val="14"/>
               </w:rPr>
@@ -3232,7 +3185,6 @@
               <w:rPr>
                 <w:rFonts w:ascii="Arial" w:hAnsi="Arial"/>
                 <w:bCs/>
-                <w:color w:val="000000" w:themeColor="text1"/>
                 <w:sz w:val="14"/>
                 <w:szCs w:val="14"/>
               </w:rPr>
@@ -3243,7 +3195,6 @@
                 <w:rFonts w:ascii="Arial" w:hAnsi="Arial"/>
                 <w:bCs/>
                 <w:noProof/>
-                <w:color w:val="000000" w:themeColor="text1"/>
                 <w:sz w:val="14"/>
                 <w:szCs w:val="14"/>
               </w:rPr>
@@ -3253,7 +3204,6 @@
               <w:rPr>
                 <w:rFonts w:ascii="Arial" w:hAnsi="Arial"/>
                 <w:bCs/>
-                <w:color w:val="000000" w:themeColor="text1"/>
                 <w:sz w:val="14"/>
                 <w:szCs w:val="14"/>
               </w:rPr>
@@ -3275,7 +3225,6 @@
               <w:rPr>
                 <w:rFonts w:ascii="Arial" w:hAnsi="Arial"/>
                 <w:b/>
-                <w:color w:val="000000" w:themeColor="text1"/>
                 <w:w w:val="96"/>
                 <w:sz w:val="14"/>
                 <w:szCs w:val="14"/>
@@ -3285,7 +3234,6 @@
               <w:rPr>
                 <w:rFonts w:ascii="Arial" w:hAnsi="Arial"/>
                 <w:bCs/>
-                <w:color w:val="000000" w:themeColor="text1"/>
                 <w:sz w:val="14"/>
                 <w:szCs w:val="14"/>
               </w:rPr>
@@ -3295,7 +3243,6 @@
               <w:rPr>
                 <w:rFonts w:ascii="Arial" w:hAnsi="Arial"/>
                 <w:bCs/>
-                <w:color w:val="000000" w:themeColor="text1"/>
                 <w:sz w:val="14"/>
                 <w:szCs w:val="14"/>
               </w:rPr>
@@ -3306,7 +3253,6 @@
                 <w:rFonts w:ascii="Arial" w:hAnsi="Arial"/>
                 <w:bCs/>
                 <w:noProof/>
-                <w:color w:val="000000" w:themeColor="text1"/>
                 <w:sz w:val="14"/>
                 <w:szCs w:val="14"/>
               </w:rPr>
@@ -3316,7 +3262,6 @@
               <w:rPr>
                 <w:rFonts w:ascii="Arial" w:hAnsi="Arial"/>
                 <w:bCs/>
-                <w:color w:val="000000" w:themeColor="text1"/>
                 <w:sz w:val="14"/>
                 <w:szCs w:val="14"/>
               </w:rPr>
@@ -3326,7 +3271,6 @@
               <w:rPr>
                 <w:rFonts w:ascii="Arial" w:hAnsi="Arial"/>
                 <w:bCs/>
-                <w:color w:val="000000" w:themeColor="text1"/>
                 <w:sz w:val="14"/>
                 <w:szCs w:val="14"/>
               </w:rPr>
@@ -3337,7 +3281,6 @@
                 <w:rFonts w:ascii="Arial" w:hAnsi="Arial"/>
                 <w:bCs/>
                 <w:noProof/>
-                <w:color w:val="000000" w:themeColor="text1"/>
                 <w:sz w:val="14"/>
                 <w:szCs w:val="14"/>
               </w:rPr>
@@ -3347,7 +3290,6 @@
               <w:rPr>
                 <w:rFonts w:ascii="Arial" w:hAnsi="Arial"/>
                 <w:bCs/>
-                <w:color w:val="000000" w:themeColor="text1"/>
                 <w:sz w:val="14"/>
                 <w:szCs w:val="14"/>
               </w:rPr>
@@ -3418,7 +3360,7 @@
                 <w:rFonts w:ascii="Arial" w:hAnsi="Arial"/>
                 <w:b/>
                 <w:bCs/>
-                <w:color w:val="000000" w:themeColor="text1"/>
+                <w:color w:val="auto"/>
                 <w:sz w:val="16"/>
                 <w:szCs w:val="16"/>
                 <w:lang w:val="es-PE"/>
@@ -3429,7 +3371,7 @@
                 <w:rFonts w:ascii="Arial" w:hAnsi="Arial"/>
                 <w:b/>
                 <w:bCs/>
-                <w:color w:val="000000" w:themeColor="text1"/>
+                <w:color w:val="auto"/>
                 <w:sz w:val="16"/>
                 <w:szCs w:val="16"/>
                 <w:lang w:val="es-PE"/>
@@ -3446,7 +3388,7 @@
             <w:pPr>
               <w:rPr>
                 <w:rFonts w:ascii="Arial" w:hAnsi="Arial"/>
-                <w:color w:val="000000" w:themeColor="text1"/>
+                <w:color w:val="auto"/>
                 <w:sz w:val="16"/>
                 <w:szCs w:val="16"/>
               </w:rPr>
@@ -3461,7 +3403,7 @@
             <w:pPr>
               <w:rPr>
                 <w:rFonts w:ascii="Arial" w:hAnsi="Arial"/>
-                <w:color w:val="000000" w:themeColor="text1"/>
+                <w:color w:val="auto"/>
                 <w:sz w:val="16"/>
                 <w:szCs w:val="16"/>
                 <w:lang w:val="es-PE"/>
@@ -3479,7 +3421,7 @@
                 <w:rFonts w:ascii="Arial" w:hAnsi="Arial"/>
                 <w:b/>
                 <w:bCs/>
-                <w:color w:val="000000" w:themeColor="text1"/>
+                <w:color w:val="auto"/>
                 <w:sz w:val="16"/>
                 <w:szCs w:val="16"/>
                 <w:lang w:val="es-PE"/>
@@ -3490,7 +3432,7 @@
                 <w:rFonts w:ascii="Arial" w:hAnsi="Arial"/>
                 <w:b/>
                 <w:bCs/>
-                <w:color w:val="000000" w:themeColor="text1"/>
+                <w:color w:val="auto"/>
                 <w:sz w:val="16"/>
                 <w:szCs w:val="16"/>
                 <w:lang w:val="es-PE"/>
@@ -3502,7 +3444,7 @@
                 <w:rFonts w:ascii="Arial" w:hAnsi="Arial"/>
                 <w:b/>
                 <w:bCs/>
-                <w:color w:val="000000" w:themeColor="text1"/>
+                <w:color w:val="auto"/>
                 <w:sz w:val="16"/>
                 <w:szCs w:val="16"/>
                 <w:lang w:val="es-PE"/>
@@ -3519,15 +3461,15 @@
             <w:pPr>
               <w:rPr>
                 <w:rFonts w:ascii="Arial" w:hAnsi="Arial"/>
-                <w:color w:val="000000" w:themeColor="text1"/>
-                <w:sz w:val="16"/>
-                <w:szCs w:val="16"/>
-              </w:rPr>
-            </w:pPr>
-            <w:r>
-              <w:rPr>
-                <w:rFonts w:ascii="Arial" w:hAnsi="Arial"/>
-                <w:color w:val="000000" w:themeColor="text1"/>
+                <w:color w:val="auto"/>
+                <w:sz w:val="16"/>
+                <w:szCs w:val="16"/>
+              </w:rPr>
+            </w:pPr>
+            <w:r>
+              <w:rPr>
+                <w:rFonts w:ascii="Arial" w:hAnsi="Arial"/>
+                <w:color w:val="auto"/>
                 <w:sz w:val="16"/>
                 <w:szCs w:val="16"/>
               </w:rPr>
@@ -3536,7 +3478,7 @@
             <w:r>
               <w:rPr>
                 <w:rFonts w:ascii="Arial" w:hAnsi="Arial"/>
-                <w:color w:val="000000" w:themeColor="text1"/>
+                <w:color w:val="auto"/>
                 <w:sz w:val="16"/>
                 <w:szCs w:val="16"/>
               </w:rPr>
@@ -3545,7 +3487,7 @@
             <w:r>
               <w:rPr>
                 <w:rFonts w:ascii="Arial" w:hAnsi="Arial"/>
-                <w:color w:val="000000" w:themeColor="text1"/>
+                <w:color w:val="auto"/>
                 <w:sz w:val="16"/>
                 <w:szCs w:val="16"/>
               </w:rPr>
@@ -3554,7 +3496,7 @@
             <w:r>
               <w:rPr>
                 <w:rFonts w:ascii="Arial" w:hAnsi="Arial"/>
-                <w:color w:val="000000" w:themeColor="text1"/>
+                <w:color w:val="auto"/>
                 <w:sz w:val="16"/>
                 <w:szCs w:val="16"/>
               </w:rPr>
@@ -3563,7 +3505,7 @@
             <w:r>
               <w:rPr>
                 <w:rFonts w:ascii="Arial" w:hAnsi="Arial"/>
-                <w:color w:val="000000" w:themeColor="text1"/>
+                <w:color w:val="auto"/>
                 <w:sz w:val="16"/>
                 <w:szCs w:val="16"/>
               </w:rPr>
@@ -3586,17 +3528,17 @@
                 <w:rFonts w:ascii="Arial" w:hAnsi="Arial"/>
                 <w:b/>
                 <w:bCs/>
-                <w:color w:val="000000" w:themeColor="text1"/>
-                <w:sz w:val="16"/>
-                <w:szCs w:val="16"/>
-              </w:rPr>
-            </w:pPr>
-            <w:r>
-              <w:rPr>
-                <w:rFonts w:ascii="Arial" w:hAnsi="Arial"/>
-                <w:b/>
-                <w:bCs/>
-                <w:color w:val="000000" w:themeColor="text1"/>
+                <w:color w:val="auto"/>
+                <w:sz w:val="16"/>
+                <w:szCs w:val="16"/>
+              </w:rPr>
+            </w:pPr>
+            <w:r>
+              <w:rPr>
+                <w:rFonts w:ascii="Arial" w:hAnsi="Arial"/>
+                <w:b/>
+                <w:bCs/>
+                <w:color w:val="auto"/>
                 <w:sz w:val="16"/>
                 <w:szCs w:val="16"/>
                 <w:lang w:val="es-PE"/>
@@ -3613,15 +3555,15 @@
             <w:pPr>
               <w:rPr>
                 <w:rFonts w:ascii="Arial" w:hAnsi="Arial"/>
-                <w:color w:val="000000" w:themeColor="text1"/>
-                <w:sz w:val="16"/>
-                <w:szCs w:val="16"/>
-              </w:rPr>
-            </w:pPr>
-            <w:r>
-              <w:rPr>
-                <w:rFonts w:ascii="Arial" w:hAnsi="Arial"/>
-                <w:color w:val="000000" w:themeColor="text1"/>
+                <w:color w:val="auto"/>
+                <w:sz w:val="16"/>
+                <w:szCs w:val="16"/>
+              </w:rPr>
+            </w:pPr>
+            <w:r>
+              <w:rPr>
+                <w:rFonts w:ascii="Arial" w:hAnsi="Arial"/>
+                <w:color w:val="auto"/>
                 <w:sz w:val="16"/>
                 <w:szCs w:val="16"/>
               </w:rPr>
@@ -3630,7 +3572,7 @@
             <w:r>
               <w:rPr>
                 <w:rFonts w:ascii="Arial" w:hAnsi="Arial"/>
-                <w:color w:val="000000" w:themeColor="text1"/>
+                <w:color w:val="auto"/>
                 <w:sz w:val="16"/>
                 <w:szCs w:val="16"/>
               </w:rPr>
@@ -3639,7 +3581,7 @@
             <w:r>
               <w:rPr>
                 <w:rFonts w:ascii="Arial" w:hAnsi="Arial"/>
-                <w:color w:val="000000" w:themeColor="text1"/>
+                <w:color w:val="auto"/>
                 <w:sz w:val="16"/>
                 <w:szCs w:val="16"/>
               </w:rPr>
@@ -3648,7 +3590,7 @@
             <w:r>
               <w:rPr>
                 <w:rFonts w:ascii="Arial" w:hAnsi="Arial"/>
-                <w:color w:val="000000" w:themeColor="text1"/>
+                <w:color w:val="auto"/>
                 <w:sz w:val="16"/>
                 <w:szCs w:val="16"/>
               </w:rPr>
@@ -3657,7 +3599,7 @@
             <w:r>
               <w:rPr>
                 <w:rFonts w:ascii="Arial" w:hAnsi="Arial"/>
-                <w:color w:val="000000" w:themeColor="text1"/>
+                <w:color w:val="auto"/>
                 <w:sz w:val="16"/>
                 <w:szCs w:val="16"/>
               </w:rPr>
@@ -3666,7 +3608,7 @@
             <w:r>
               <w:rPr>
                 <w:rFonts w:ascii="Arial" w:hAnsi="Arial"/>
-                <w:color w:val="000000" w:themeColor="text1"/>
+                <w:color w:val="auto"/>
                 <w:sz w:val="16"/>
                 <w:szCs w:val="16"/>
               </w:rPr>
@@ -3675,7 +3617,7 @@
             <w:r>
               <w:rPr>
                 <w:rFonts w:ascii="Arial" w:hAnsi="Arial"/>
-                <w:color w:val="000000" w:themeColor="text1"/>
+                <w:color w:val="auto"/>
                 <w:sz w:val="14"/>
                 <w:szCs w:val="14"/>
               </w:rPr>
@@ -3691,7 +3633,7 @@
             <w:pPr>
               <w:rPr>
                 <w:rFonts w:ascii="Arial" w:hAnsi="Arial"/>
-                <w:color w:val="000000" w:themeColor="text1"/>
+                <w:color w:val="auto"/>
                 <w:sz w:val="16"/>
                 <w:szCs w:val="16"/>
                 <w:lang w:val="es-PE"/>
@@ -3700,7 +3642,7 @@
             <w:r>
               <w:rPr>
                 <w:rFonts w:ascii="Arial" w:hAnsi="Arial"/>
-                <w:color w:val="000000" w:themeColor="text1"/>
+                <w:color w:val="auto"/>
                 <w:sz w:val="16"/>
                 <w:szCs w:val="16"/>
               </w:rPr>
@@ -3709,7 +3651,7 @@
             <w:r>
               <w:rPr>
                 <w:rFonts w:ascii="Arial" w:hAnsi="Arial"/>
-                <w:color w:val="000000" w:themeColor="text1"/>
+                <w:color w:val="auto"/>
                 <w:sz w:val="16"/>
                 <w:szCs w:val="16"/>
               </w:rPr>
@@ -3718,7 +3660,7 @@
             <w:r>
               <w:rPr>
                 <w:rFonts w:ascii="Arial" w:hAnsi="Arial"/>
-                <w:color w:val="000000" w:themeColor="text1"/>
+                <w:color w:val="auto"/>
                 <w:sz w:val="16"/>
                 <w:szCs w:val="16"/>
               </w:rPr>
@@ -3727,7 +3669,7 @@
             <w:r>
               <w:rPr>
                 <w:rFonts w:ascii="Arial" w:hAnsi="Arial"/>
-                <w:color w:val="000000" w:themeColor="text1"/>
+                <w:color w:val="auto"/>
                 <w:sz w:val="16"/>
                 <w:szCs w:val="16"/>
               </w:rPr>
@@ -3736,7 +3678,7 @@
             <w:r>
               <w:rPr>
                 <w:rFonts w:ascii="Arial" w:hAnsi="Arial"/>
-                <w:color w:val="000000" w:themeColor="text1"/>
+                <w:color w:val="auto"/>
                 <w:sz w:val="16"/>
                 <w:szCs w:val="16"/>
               </w:rPr>
@@ -3745,7 +3687,7 @@
             <w:r>
               <w:rPr>
                 <w:rFonts w:ascii="Arial" w:hAnsi="Arial"/>
-                <w:color w:val="000000" w:themeColor="text1"/>
+                <w:color w:val="auto"/>
                 <w:sz w:val="16"/>
                 <w:szCs w:val="16"/>
               </w:rPr>
@@ -3763,17 +3705,17 @@
                 <w:rFonts w:ascii="Arial" w:hAnsi="Arial"/>
                 <w:b/>
                 <w:bCs/>
-                <w:color w:val="000000" w:themeColor="text1"/>
-                <w:sz w:val="16"/>
-                <w:szCs w:val="16"/>
-              </w:rPr>
-            </w:pPr>
-            <w:r>
-              <w:rPr>
-                <w:rFonts w:ascii="Arial" w:hAnsi="Arial"/>
-                <w:b/>
-                <w:bCs/>
-                <w:color w:val="000000" w:themeColor="text1"/>
+                <w:color w:val="auto"/>
+                <w:sz w:val="16"/>
+                <w:szCs w:val="16"/>
+              </w:rPr>
+            </w:pPr>
+            <w:r>
+              <w:rPr>
+                <w:rFonts w:ascii="Arial" w:hAnsi="Arial"/>
+                <w:b/>
+                <w:bCs/>
+                <w:color w:val="auto"/>
                 <w:sz w:val="16"/>
                 <w:szCs w:val="16"/>
                 <w:lang w:val="es-PE"/>
@@ -3790,15 +3732,15 @@
             <w:pPr>
               <w:rPr>
                 <w:rFonts w:ascii="Arial" w:hAnsi="Arial"/>
-                <w:color w:val="000000" w:themeColor="text1"/>
-                <w:sz w:val="16"/>
-                <w:szCs w:val="16"/>
-              </w:rPr>
-            </w:pPr>
-            <w:r>
-              <w:rPr>
-                <w:rFonts w:ascii="Arial" w:hAnsi="Arial"/>
-                <w:color w:val="000000" w:themeColor="text1"/>
+                <w:color w:val="auto"/>
+                <w:sz w:val="16"/>
+                <w:szCs w:val="16"/>
+              </w:rPr>
+            </w:pPr>
+            <w:r>
+              <w:rPr>
+                <w:rFonts w:ascii="Arial" w:hAnsi="Arial"/>
+                <w:color w:val="auto"/>
                 <w:sz w:val="16"/>
                 <w:szCs w:val="16"/>
               </w:rPr>
@@ -3807,7 +3749,7 @@
             <w:r>
               <w:rPr>
                 <w:rFonts w:ascii="Arial" w:hAnsi="Arial"/>
-                <w:color w:val="000000" w:themeColor="text1"/>
+                <w:color w:val="auto"/>
                 <w:sz w:val="16"/>
                 <w:szCs w:val="16"/>
               </w:rPr>
@@ -3816,7 +3758,7 @@
             <w:r>
               <w:rPr>
                 <w:rFonts w:ascii="Arial" w:hAnsi="Arial"/>
-                <w:color w:val="000000" w:themeColor="text1"/>
+                <w:color w:val="auto"/>
                 <w:sz w:val="16"/>
                 <w:szCs w:val="16"/>
               </w:rPr>
@@ -3825,7 +3767,7 @@
             <w:r>
               <w:rPr>
                 <w:rFonts w:ascii="Arial" w:hAnsi="Arial"/>
-                <w:color w:val="000000" w:themeColor="text1"/>
+                <w:color w:val="auto"/>
                 <w:sz w:val="16"/>
                 <w:szCs w:val="16"/>
               </w:rPr>
@@ -3834,7 +3776,7 @@
             <w:r>
               <w:rPr>
                 <w:rFonts w:ascii="Arial" w:hAnsi="Arial"/>
-                <w:color w:val="000000" w:themeColor="text1"/>
+                <w:color w:val="auto"/>
                 <w:sz w:val="16"/>
                 <w:szCs w:val="16"/>
               </w:rPr>
@@ -3857,17 +3799,17 @@
                 <w:rFonts w:ascii="Arial" w:hAnsi="Arial"/>
                 <w:b/>
                 <w:bCs/>
-                <w:color w:val="000000" w:themeColor="text1"/>
-                <w:sz w:val="16"/>
-                <w:szCs w:val="16"/>
-              </w:rPr>
-            </w:pPr>
-            <w:r>
-              <w:rPr>
-                <w:rFonts w:ascii="Arial" w:hAnsi="Arial"/>
-                <w:b/>
-                <w:bCs/>
-                <w:color w:val="000000" w:themeColor="text1"/>
+                <w:color w:val="auto"/>
+                <w:sz w:val="16"/>
+                <w:szCs w:val="16"/>
+              </w:rPr>
+            </w:pPr>
+            <w:r>
+              <w:rPr>
+                <w:rFonts w:ascii="Arial" w:hAnsi="Arial"/>
+                <w:b/>
+                <w:bCs/>
+                <w:color w:val="auto"/>
                 <w:sz w:val="16"/>
                 <w:szCs w:val="16"/>
                 <w:lang w:val="es-PE"/>
@@ -3884,15 +3826,15 @@
             <w:pPr>
               <w:rPr>
                 <w:rFonts w:ascii="Arial" w:hAnsi="Arial"/>
-                <w:color w:val="000000" w:themeColor="text1"/>
-                <w:sz w:val="16"/>
-                <w:szCs w:val="16"/>
-              </w:rPr>
-            </w:pPr>
-            <w:r>
-              <w:rPr>
-                <w:rFonts w:ascii="Arial" w:hAnsi="Arial"/>
-                <w:color w:val="000000" w:themeColor="text1"/>
+                <w:color w:val="auto"/>
+                <w:sz w:val="16"/>
+                <w:szCs w:val="16"/>
+              </w:rPr>
+            </w:pPr>
+            <w:r>
+              <w:rPr>
+                <w:rFonts w:ascii="Arial" w:hAnsi="Arial"/>
+                <w:color w:val="auto"/>
                 <w:sz w:val="16"/>
                 <w:szCs w:val="16"/>
               </w:rPr>
@@ -3901,7 +3843,7 @@
             <w:r>
               <w:rPr>
                 <w:rFonts w:ascii="Arial" w:hAnsi="Arial"/>
-                <w:color w:val="000000" w:themeColor="text1"/>
+                <w:color w:val="auto"/>
                 <w:sz w:val="16"/>
                 <w:szCs w:val="16"/>
               </w:rPr>
@@ -3910,7 +3852,7 @@
             <w:r>
               <w:rPr>
                 <w:rFonts w:ascii="Arial" w:hAnsi="Arial"/>
-                <w:color w:val="000000" w:themeColor="text1"/>
+                <w:color w:val="auto"/>
                 <w:sz w:val="16"/>
                 <w:szCs w:val="16"/>
               </w:rPr>
@@ -3919,7 +3861,7 @@
             <w:r>
               <w:rPr>
                 <w:rFonts w:ascii="Arial" w:hAnsi="Arial"/>
-                <w:color w:val="000000" w:themeColor="text1"/>
+                <w:color w:val="auto"/>
                 <w:sz w:val="16"/>
                 <w:szCs w:val="16"/>
               </w:rPr>
@@ -3928,7 +3870,7 @@
             <w:r>
               <w:rPr>
                 <w:rFonts w:ascii="Arial" w:hAnsi="Arial"/>
-                <w:color w:val="000000" w:themeColor="text1"/>
+                <w:color w:val="auto"/>
                 <w:sz w:val="16"/>
                 <w:szCs w:val="16"/>
               </w:rPr>
@@ -3937,7 +3879,7 @@
             <w:r>
               <w:rPr>
                 <w:rFonts w:ascii="Arial" w:hAnsi="Arial"/>
-                <w:color w:val="000000" w:themeColor="text1"/>
+                <w:color w:val="auto"/>
                 <w:sz w:val="16"/>
                 <w:szCs w:val="16"/>
               </w:rPr>
@@ -3946,7 +3888,7 @@
             <w:r>
               <w:rPr>
                 <w:rFonts w:ascii="Arial" w:hAnsi="Arial"/>
-                <w:color w:val="000000" w:themeColor="text1"/>
+                <w:color w:val="auto"/>
                 <w:sz w:val="14"/>
                 <w:szCs w:val="14"/>
               </w:rPr>
@@ -3962,15 +3904,15 @@
             <w:pPr>
               <w:rPr>
                 <w:rFonts w:ascii="Arial" w:hAnsi="Arial"/>
-                <w:color w:val="000000" w:themeColor="text1"/>
-                <w:sz w:val="16"/>
-                <w:szCs w:val="16"/>
-              </w:rPr>
-            </w:pPr>
-            <w:r>
-              <w:rPr>
-                <w:rFonts w:ascii="Arial" w:hAnsi="Arial"/>
-                <w:color w:val="000000" w:themeColor="text1"/>
+                <w:color w:val="auto"/>
+                <w:sz w:val="16"/>
+                <w:szCs w:val="16"/>
+              </w:rPr>
+            </w:pPr>
+            <w:r>
+              <w:rPr>
+                <w:rFonts w:ascii="Arial" w:hAnsi="Arial"/>
+                <w:color w:val="auto"/>
                 <w:sz w:val="16"/>
                 <w:szCs w:val="16"/>
               </w:rPr>
@@ -3979,7 +3921,7 @@
             <w:r>
               <w:rPr>
                 <w:rFonts w:ascii="Arial" w:hAnsi="Arial"/>
-                <w:color w:val="000000" w:themeColor="text1"/>
+                <w:color w:val="auto"/>
                 <w:sz w:val="16"/>
                 <w:szCs w:val="16"/>
               </w:rPr>
@@ -3988,7 +3930,7 @@
             <w:r>
               <w:rPr>
                 <w:rFonts w:ascii="Arial" w:hAnsi="Arial"/>
-                <w:color w:val="000000" w:themeColor="text1"/>
+                <w:color w:val="auto"/>
                 <w:sz w:val="16"/>
                 <w:szCs w:val="16"/>
               </w:rPr>
@@ -3997,7 +3939,7 @@
             <w:r>
               <w:rPr>
                 <w:rFonts w:ascii="Arial" w:hAnsi="Arial"/>
-                <w:color w:val="000000" w:themeColor="text1"/>
+                <w:color w:val="auto"/>
                 <w:sz w:val="16"/>
                 <w:szCs w:val="16"/>
               </w:rPr>
@@ -4006,7 +3948,7 @@
             <w:r>
               <w:rPr>
                 <w:rFonts w:ascii="Arial" w:hAnsi="Arial"/>
-                <w:color w:val="000000" w:themeColor="text1"/>
+                <w:color w:val="auto"/>
                 <w:sz w:val="16"/>
                 <w:szCs w:val="16"/>
               </w:rPr>
@@ -4015,7 +3957,7 @@
             <w:r>
               <w:rPr>
                 <w:rFonts w:ascii="Arial" w:hAnsi="Arial"/>
-                <w:color w:val="000000" w:themeColor="text1"/>
+                <w:color w:val="auto"/>
                 <w:sz w:val="16"/>
                 <w:szCs w:val="16"/>
               </w:rPr>
@@ -4033,17 +3975,17 @@
                 <w:rFonts w:ascii="Arial" w:hAnsi="Arial"/>
                 <w:b/>
                 <w:bCs/>
-                <w:color w:val="000000" w:themeColor="text1"/>
-                <w:sz w:val="16"/>
-                <w:szCs w:val="16"/>
-              </w:rPr>
-            </w:pPr>
-            <w:r>
-              <w:rPr>
-                <w:rFonts w:ascii="Arial" w:hAnsi="Arial"/>
-                <w:b/>
-                <w:bCs/>
-                <w:color w:val="000000" w:themeColor="text1"/>
+                <w:color w:val="auto"/>
+                <w:sz w:val="16"/>
+                <w:szCs w:val="16"/>
+              </w:rPr>
+            </w:pPr>
+            <w:r>
+              <w:rPr>
+                <w:rFonts w:ascii="Arial" w:hAnsi="Arial"/>
+                <w:b/>
+                <w:bCs/>
+                <w:color w:val="auto"/>
                 <w:sz w:val="16"/>
                 <w:szCs w:val="16"/>
               </w:rPr>
@@ -4059,15 +4001,15 @@
             <w:pPr>
               <w:rPr>
                 <w:rFonts w:ascii="Arial" w:hAnsi="Arial"/>
-                <w:color w:val="000000" w:themeColor="text1"/>
-                <w:sz w:val="16"/>
-                <w:szCs w:val="16"/>
-              </w:rPr>
-            </w:pPr>
-            <w:r>
-              <w:rPr>
-                <w:rFonts w:ascii="Arial" w:hAnsi="Arial"/>
-                <w:color w:val="000000" w:themeColor="text1"/>
+                <w:color w:val="auto"/>
+                <w:sz w:val="16"/>
+                <w:szCs w:val="16"/>
+              </w:rPr>
+            </w:pPr>
+            <w:r>
+              <w:rPr>
+                <w:rFonts w:ascii="Arial" w:hAnsi="Arial"/>
+                <w:color w:val="auto"/>
                 <w:sz w:val="16"/>
                 <w:szCs w:val="16"/>
               </w:rPr>
@@ -4076,7 +4018,7 @@
             <w:r>
               <w:rPr>
                 <w:rFonts w:ascii="Arial" w:hAnsi="Arial"/>
-                <w:color w:val="000000" w:themeColor="text1"/>
+                <w:color w:val="auto"/>
                 <w:sz w:val="16"/>
                 <w:szCs w:val="16"/>
               </w:rPr>
@@ -4085,7 +4027,7 @@
             <w:r>
               <w:rPr>
                 <w:rFonts w:ascii="Arial" w:hAnsi="Arial"/>
-                <w:color w:val="000000" w:themeColor="text1"/>
+                <w:color w:val="auto"/>
                 <w:sz w:val="16"/>
                 <w:szCs w:val="16"/>
               </w:rPr>
@@ -4094,7 +4036,7 @@
             <w:r>
               <w:rPr>
                 <w:rFonts w:ascii="Arial" w:hAnsi="Arial"/>
-                <w:color w:val="000000" w:themeColor="text1"/>
+                <w:color w:val="auto"/>
                 <w:sz w:val="16"/>
                 <w:szCs w:val="16"/>
               </w:rPr>
@@ -4103,7 +4045,7 @@
             <w:r>
               <w:rPr>
                 <w:rFonts w:ascii="Arial" w:hAnsi="Arial"/>
-                <w:color w:val="000000" w:themeColor="text1"/>
+                <w:color w:val="auto"/>
                 <w:sz w:val="16"/>
                 <w:szCs w:val="16"/>
               </w:rPr>
@@ -4126,17 +4068,17 @@
                 <w:rFonts w:ascii="Arial" w:hAnsi="Arial"/>
                 <w:b/>
                 <w:bCs/>
-                <w:color w:val="000000" w:themeColor="text1"/>
-                <w:sz w:val="16"/>
-                <w:szCs w:val="16"/>
-              </w:rPr>
-            </w:pPr>
-            <w:r>
-              <w:rPr>
-                <w:rFonts w:ascii="Arial" w:hAnsi="Arial"/>
-                <w:b/>
-                <w:bCs/>
-                <w:color w:val="000000" w:themeColor="text1"/>
+                <w:color w:val="auto"/>
+                <w:sz w:val="16"/>
+                <w:szCs w:val="16"/>
+              </w:rPr>
+            </w:pPr>
+            <w:r>
+              <w:rPr>
+                <w:rFonts w:ascii="Arial" w:hAnsi="Arial"/>
+                <w:b/>
+                <w:bCs/>
+                <w:color w:val="auto"/>
                 <w:sz w:val="16"/>
                 <w:szCs w:val="16"/>
                 <w:lang w:val="es-PE"/>
@@ -4153,15 +4095,15 @@
             <w:pPr>
               <w:rPr>
                 <w:rFonts w:ascii="Arial" w:hAnsi="Arial"/>
-                <w:color w:val="000000" w:themeColor="text1"/>
-                <w:sz w:val="16"/>
-                <w:szCs w:val="16"/>
-              </w:rPr>
-            </w:pPr>
-            <w:r>
-              <w:rPr>
-                <w:rFonts w:ascii="Arial" w:hAnsi="Arial"/>
-                <w:color w:val="000000" w:themeColor="text1"/>
+                <w:color w:val="auto"/>
+                <w:sz w:val="16"/>
+                <w:szCs w:val="16"/>
+              </w:rPr>
+            </w:pPr>
+            <w:r>
+              <w:rPr>
+                <w:rFonts w:ascii="Arial" w:hAnsi="Arial"/>
+                <w:color w:val="auto"/>
                 <w:sz w:val="16"/>
                 <w:szCs w:val="16"/>
               </w:rPr>
@@ -4170,7 +4112,7 @@
             <w:r>
               <w:rPr>
                 <w:rFonts w:ascii="Arial" w:hAnsi="Arial"/>
-                <w:color w:val="000000" w:themeColor="text1"/>
+                <w:color w:val="auto"/>
                 <w:sz w:val="16"/>
                 <w:szCs w:val="16"/>
               </w:rPr>
@@ -4179,7 +4121,7 @@
             <w:r>
               <w:rPr>
                 <w:rFonts w:ascii="Arial" w:hAnsi="Arial"/>
-                <w:color w:val="000000" w:themeColor="text1"/>
+                <w:color w:val="auto"/>
                 <w:sz w:val="16"/>
                 <w:szCs w:val="16"/>
               </w:rPr>
@@ -4189,7 +4131,7 @@
               <w:rPr>
                 <w:rFonts w:ascii="Arial" w:hAnsi="Arial"/>
                 <w:noProof/>
-                <w:color w:val="000000" w:themeColor="text1"/>
+                <w:color w:val="auto"/>
                 <w:sz w:val="16"/>
                 <w:szCs w:val="16"/>
               </w:rPr>
@@ -4198,7 +4140,7 @@
             <w:r>
               <w:rPr>
                 <w:rFonts w:ascii="Arial" w:hAnsi="Arial"/>
-                <w:color w:val="000000" w:themeColor="text1"/>
+                <w:color w:val="auto"/>
                 <w:sz w:val="16"/>
                 <w:szCs w:val="16"/>
               </w:rPr>
@@ -4207,7 +4149,7 @@
             <w:r>
               <w:rPr>
                 <w:rFonts w:ascii="Arial" w:hAnsi="Arial"/>
-                <w:color w:val="000000" w:themeColor="text1"/>
+                <w:color w:val="auto"/>
                 <w:sz w:val="16"/>
                 <w:szCs w:val="16"/>
               </w:rPr>
@@ -4216,7 +4158,7 @@
             <w:r>
               <w:rPr>
                 <w:rFonts w:ascii="Arial" w:hAnsi="Arial"/>
-                <w:color w:val="000000" w:themeColor="text1"/>
+                <w:color w:val="auto"/>
                 <w:sz w:val="14"/>
                 <w:szCs w:val="14"/>
               </w:rPr>
@@ -4232,7 +4174,7 @@
             <w:pPr>
               <w:rPr>
                 <w:rFonts w:ascii="Arial" w:hAnsi="Arial"/>
-                <w:color w:val="000000" w:themeColor="text1"/>
+                <w:color w:val="auto"/>
                 <w:sz w:val="16"/>
                 <w:szCs w:val="16"/>
                 <w:lang w:val="es-PE"/>
@@ -4250,17 +4192,17 @@
                 <w:rFonts w:ascii="Arial" w:hAnsi="Arial"/>
                 <w:b/>
                 <w:bCs/>
-                <w:color w:val="000000" w:themeColor="text1"/>
-                <w:sz w:val="16"/>
-                <w:szCs w:val="16"/>
-              </w:rPr>
-            </w:pPr>
-            <w:r>
-              <w:rPr>
-                <w:rFonts w:ascii="Arial" w:hAnsi="Arial"/>
-                <w:b/>
-                <w:bCs/>
-                <w:color w:val="000000" w:themeColor="text1"/>
+                <w:color w:val="auto"/>
+                <w:sz w:val="16"/>
+                <w:szCs w:val="16"/>
+              </w:rPr>
+            </w:pPr>
+            <w:r>
+              <w:rPr>
+                <w:rFonts w:ascii="Arial" w:hAnsi="Arial"/>
+                <w:b/>
+                <w:bCs/>
+                <w:color w:val="auto"/>
                 <w:sz w:val="16"/>
                 <w:szCs w:val="16"/>
                 <w:lang w:val="es-PE"/>
@@ -4277,15 +4219,15 @@
             <w:pPr>
               <w:rPr>
                 <w:rFonts w:ascii="Arial" w:hAnsi="Arial"/>
-                <w:color w:val="000000" w:themeColor="text1"/>
-                <w:sz w:val="16"/>
-                <w:szCs w:val="16"/>
-              </w:rPr>
-            </w:pPr>
-            <w:r>
-              <w:rPr>
-                <w:rFonts w:ascii="Arial" w:hAnsi="Arial"/>
-                <w:color w:val="000000" w:themeColor="text1"/>
+                <w:color w:val="auto"/>
+                <w:sz w:val="16"/>
+                <w:szCs w:val="16"/>
+              </w:rPr>
+            </w:pPr>
+            <w:r>
+              <w:rPr>
+                <w:rFonts w:ascii="Arial" w:hAnsi="Arial"/>
+                <w:color w:val="auto"/>
                 <w:sz w:val="16"/>
                 <w:szCs w:val="16"/>
               </w:rPr>
@@ -4294,7 +4236,7 @@
             <w:r>
               <w:rPr>
                 <w:rFonts w:ascii="Arial" w:hAnsi="Arial"/>
-                <w:color w:val="000000" w:themeColor="text1"/>
+                <w:color w:val="auto"/>
                 <w:sz w:val="16"/>
                 <w:szCs w:val="16"/>
               </w:rPr>
@@ -4303,7 +4245,7 @@
             <w:r>
               <w:rPr>
                 <w:rFonts w:ascii="Arial" w:hAnsi="Arial"/>
-                <w:color w:val="000000" w:themeColor="text1"/>
+                <w:color w:val="auto"/>
                 <w:sz w:val="16"/>
                 <w:szCs w:val="16"/>
               </w:rPr>
@@ -4312,7 +4254,7 @@
             <w:r>
               <w:rPr>
                 <w:rFonts w:ascii="Arial" w:hAnsi="Arial"/>
-                <w:color w:val="000000" w:themeColor="text1"/>
+                <w:color w:val="auto"/>
                 <w:sz w:val="16"/>
                 <w:szCs w:val="16"/>
               </w:rPr>
@@ -4321,7 +4263,7 @@
             <w:r>
               <w:rPr>
                 <w:rFonts w:ascii="Arial" w:hAnsi="Arial"/>
-                <w:color w:val="000000" w:themeColor="text1"/>
+                <w:color w:val="auto"/>
                 <w:sz w:val="16"/>
                 <w:szCs w:val="16"/>
               </w:rPr>
@@ -4363,7 +4305,7 @@
 </file>
 
 <file path=word/endnotes.xml><?xml version="1.0" encoding="utf-8"?>
-<w:endnotes xmlns:wpc="http://schemas.microsoft.com/office/word/2010/wordprocessingCanvas" xmlns:cx="http://schemas.microsoft.com/office/drawing/2014/chartex" xmlns:cx1="http://schemas.microsoft.com/office/drawing/2015/9/8/chartex" xmlns:cx2="http://schemas.microsoft.com/office/drawing/2015/10/21/chartex" xmlns:cx3="http://schemas.microsoft.com/office/drawing/2016/5/9/chartex" xmlns:cx4="http://schemas.microsoft.com/office/drawing/2016/5/10/chartex" xmlns:cx5="http://schemas.microsoft.com/office/drawing/2016/5/11/chartex" xmlns:cx6="http://schemas.microsoft.com/office/drawing/2016/5/12/chartex" xmlns:cx7="http://schemas.microsoft.com/office/drawing/2016/5/13/chartex" xmlns:cx8="http://schemas.microsoft.com/office/drawing/2016/5/14/chartex" xmlns:mc="http://schemas.openxmlformats.org/markup-compatibility/2006" xmlns:aink="http://schemas.microsoft.com/office/drawing/2016/ink" xmlns:am3d="http://schemas.microsoft.com/office/drawing/2017/model3d" xmlns:o="urn:schemas-microsoft-com:office:office" xmlns:oel="http://schemas.microsoft.com/office/2019/extlst" xmlns:r="http://schemas.openxmlformats.org/officeDocument/2006/relationships" xmlns:m="http://schemas.openxmlformats.org/officeDocument/2006/math" xmlns:v="urn:schemas-microsoft-com:vml" xmlns:wp14="http://schemas.microsoft.com/office/word/2010/wordprocessingDrawing" xmlns:wp="http://schemas.openxmlformats.org/drawingml/2006/wordprocessingDrawing" xmlns:w10="urn:schemas-microsoft-com:office:word" xmlns:w="http://schemas.openxmlformats.org/wordprocessingml/2006/main" xmlns:w14="http://schemas.microsoft.com/office/word/2010/wordml" xmlns:w15="http://schemas.microsoft.com/office/word/2012/wordml" xmlns:w16cex="http://schemas.microsoft.com/office/word/2018/wordml/cex" xmlns:w16cid="http://schemas.microsoft.com/office/word/2016/wordml/cid" xmlns:w16="http://schemas.microsoft.com/office/word/2018/wordml" xmlns:w16du="http://schemas.microsoft.com/office/word/2023/wordml/word16du" xmlns:w16sdtdh="http://schemas.microsoft.com/office/word/2020/wordml/sdtdatahash" xmlns:w16sdtfl="http://schemas.microsoft.com/office/word/2024/wordml/sdtformatlock" xmlns:w16se="http://schemas.microsoft.com/office/word/2015/wordml/symex" xmlns:wpg="http://schemas.microsoft.com/office/word/2010/wordprocessingGroup" xmlns:wpi="http://schemas.microsoft.com/office/word/2010/wordprocessingInk" xmlns:wne="http://schemas.microsoft.com/office/word/2006/wordml" xmlns:wps="http://schemas.microsoft.com/office/word/2010/wordprocessingShape" mc:Ignorable="w14 w15 w16se w16cid w16 w16cex w16sdtdh w16sdtfl w16du wp14">
+<w:endnotes xmlns:wpc="http://schemas.microsoft.com/office/word/2010/wordprocessingCanvas" xmlns:cx="http://schemas.microsoft.com/office/drawing/2014/chartex" xmlns:cx1="http://schemas.microsoft.com/office/drawing/2015/9/8/chartex" xmlns:cx2="http://schemas.microsoft.com/office/drawing/2015/10/21/chartex" xmlns:cx3="http://schemas.microsoft.com/office/drawing/2016/5/9/chartex" xmlns:cx4="http://schemas.microsoft.com/office/drawing/2016/5/10/chartex" xmlns:cx5="http://schemas.microsoft.com/office/drawing/2016/5/11/chartex" xmlns:cx6="http://schemas.microsoft.com/office/drawing/2016/5/12/chartex" xmlns:cx7="http://schemas.microsoft.com/office/drawing/2016/5/13/chartex" xmlns:cx8="http://schemas.microsoft.com/office/drawing/2016/5/14/chartex" xmlns:mc="http://schemas.openxmlformats.org/markup-compatibility/2006" xmlns:aink="http://schemas.microsoft.com/office/drawing/2016/ink" xmlns:am3d="http://schemas.microsoft.com/office/drawing/2017/model3d" xmlns:o="urn:schemas-microsoft-com:office:office" xmlns:oel="http://schemas.microsoft.com/office/2019/extlst" xmlns:r="http://schemas.openxmlformats.org/officeDocument/2006/relationships" xmlns:m="http://schemas.openxmlformats.org/officeDocument/2006/math" xmlns:v="urn:schemas-microsoft-com:vml" xmlns:wp14="http://schemas.microsoft.com/office/word/2010/wordprocessingDrawing" xmlns:wp="http://schemas.openxmlformats.org/drawingml/2006/wordprocessingDrawing" xmlns:w10="urn:schemas-microsoft-com:office:word" xmlns:w="http://schemas.openxmlformats.org/wordprocessingml/2006/main" xmlns:w14="http://schemas.microsoft.com/office/word/2010/wordml" xmlns:w15="http://schemas.microsoft.com/office/word/2012/wordml" xmlns:w16cei="http://schemas.microsoft.com/office/word/2026/wordml/cei" xmlns:w16cex="http://schemas.microsoft.com/office/word/2018/wordml/cex" xmlns:w16cid="http://schemas.microsoft.com/office/word/2016/wordml/cid" xmlns:w16="http://schemas.microsoft.com/office/word/2018/wordml" xmlns:w16du="http://schemas.microsoft.com/office/word/2023/wordml/word16du" xmlns:w16sdtdh="http://schemas.microsoft.com/office/word/2020/wordml/sdtdatahash" xmlns:w16sdtfl="http://schemas.microsoft.com/office/word/2024/wordml/sdtformatlock" xmlns:w16se="http://schemas.microsoft.com/office/word/2015/wordml/symex" xmlns:wpg="http://schemas.microsoft.com/office/word/2010/wordprocessingGroup" xmlns:wpi="http://schemas.microsoft.com/office/word/2010/wordprocessingInk" xmlns:wne="http://schemas.microsoft.com/office/word/2006/wordml" xmlns:wps="http://schemas.microsoft.com/office/word/2010/wordprocessingShape" mc:Ignorable="w14 w15 w16se w16cid w16 w16cex w16sdtdh w16sdtfl w16du wp14">
   <w:endnote w:type="separator" w:id="-1">
     <w:p>
       <w:r>
@@ -4382,7 +4324,7 @@
 </file>
 
 <file path=word/footer1.xml><?xml version="1.0" encoding="utf-8"?>
-<w:ftr xmlns:wpc="http://schemas.microsoft.com/office/word/2010/wordprocessingCanvas" xmlns:cx="http://schemas.microsoft.com/office/drawing/2014/chartex" xmlns:cx1="http://schemas.microsoft.com/office/drawing/2015/9/8/chartex" xmlns:cx2="http://schemas.microsoft.com/office/drawing/2015/10/21/chartex" xmlns:cx3="http://schemas.microsoft.com/office/drawing/2016/5/9/chartex" xmlns:cx4="http://schemas.microsoft.com/office/drawing/2016/5/10/chartex" xmlns:cx5="http://schemas.microsoft.com/office/drawing/2016/5/11/chartex" xmlns:cx6="http://schemas.microsoft.com/office/drawing/2016/5/12/chartex" xmlns:cx7="http://schemas.microsoft.com/office/drawing/2016/5/13/chartex" xmlns:cx8="http://schemas.microsoft.com/office/drawing/2016/5/14/chartex" xmlns:mc="http://schemas.openxmlformats.org/markup-compatibility/2006" xmlns:aink="http://schemas.microsoft.com/office/drawing/2016/ink" xmlns:am3d="http://schemas.microsoft.com/office/drawing/2017/model3d" xmlns:o="urn:schemas-microsoft-com:office:office" xmlns:oel="http://schemas.microsoft.com/office/2019/extlst" xmlns:r="http://schemas.openxmlformats.org/officeDocument/2006/relationships" xmlns:m="http://schemas.openxmlformats.org/officeDocument/2006/math" xmlns:v="urn:schemas-microsoft-com:vml" xmlns:wp14="http://schemas.microsoft.com/office/word/2010/wordprocessingDrawing" xmlns:wp="http://schemas.openxmlformats.org/drawingml/2006/wordprocessingDrawing" xmlns:w10="urn:schemas-microsoft-com:office:word" xmlns:w="http://schemas.openxmlformats.org/wordprocessingml/2006/main" xmlns:w14="http://schemas.microsoft.com/office/word/2010/wordml" xmlns:w15="http://schemas.microsoft.com/office/word/2012/wordml" xmlns:w16cex="http://schemas.microsoft.com/office/word/2018/wordml/cex" xmlns:w16cid="http://schemas.microsoft.com/office/word/2016/wordml/cid" xmlns:w16="http://schemas.microsoft.com/office/word/2018/wordml" xmlns:w16du="http://schemas.microsoft.com/office/word/2023/wordml/word16du" xmlns:w16sdtdh="http://schemas.microsoft.com/office/word/2020/wordml/sdtdatahash" xmlns:w16sdtfl="http://schemas.microsoft.com/office/word/2024/wordml/sdtformatlock" xmlns:w16se="http://schemas.microsoft.com/office/word/2015/wordml/symex" xmlns:wpg="http://schemas.microsoft.com/office/word/2010/wordprocessingGroup" xmlns:wpi="http://schemas.microsoft.com/office/word/2010/wordprocessingInk" xmlns:wne="http://schemas.microsoft.com/office/word/2006/wordml" xmlns:wps="http://schemas.microsoft.com/office/word/2010/wordprocessingShape" mc:Ignorable="w14 w15 w16se w16cid w16 w16cex w16sdtdh w16sdtfl w16du wp14">
+<w:ftr xmlns:wpc="http://schemas.microsoft.com/office/word/2010/wordprocessingCanvas" xmlns:cx="http://schemas.microsoft.com/office/drawing/2014/chartex" xmlns:cx1="http://schemas.microsoft.com/office/drawing/2015/9/8/chartex" xmlns:cx2="http://schemas.microsoft.com/office/drawing/2015/10/21/chartex" xmlns:cx3="http://schemas.microsoft.com/office/drawing/2016/5/9/chartex" xmlns:cx4="http://schemas.microsoft.com/office/drawing/2016/5/10/chartex" xmlns:cx5="http://schemas.microsoft.com/office/drawing/2016/5/11/chartex" xmlns:cx6="http://schemas.microsoft.com/office/drawing/2016/5/12/chartex" xmlns:cx7="http://schemas.microsoft.com/office/drawing/2016/5/13/chartex" xmlns:cx8="http://schemas.microsoft.com/office/drawing/2016/5/14/chartex" xmlns:mc="http://schemas.openxmlformats.org/markup-compatibility/2006" xmlns:aink="http://schemas.microsoft.com/office/drawing/2016/ink" xmlns:am3d="http://schemas.microsoft.com/office/drawing/2017/model3d" xmlns:o="urn:schemas-microsoft-com:office:office" xmlns:oel="http://schemas.microsoft.com/office/2019/extlst" xmlns:r="http://schemas.openxmlformats.org/officeDocument/2006/relationships" xmlns:m="http://schemas.openxmlformats.org/officeDocument/2006/math" xmlns:v="urn:schemas-microsoft-com:vml" xmlns:wp14="http://schemas.microsoft.com/office/word/2010/wordprocessingDrawing" xmlns:wp="http://schemas.openxmlformats.org/drawingml/2006/wordprocessingDrawing" xmlns:w10="urn:schemas-microsoft-com:office:word" xmlns:w="http://schemas.openxmlformats.org/wordprocessingml/2006/main" xmlns:w14="http://schemas.microsoft.com/office/word/2010/wordml" xmlns:w15="http://schemas.microsoft.com/office/word/2012/wordml" xmlns:w16cei="http://schemas.microsoft.com/office/word/2026/wordml/cei" xmlns:w16cex="http://schemas.microsoft.com/office/word/2018/wordml/cex" xmlns:w16cid="http://schemas.microsoft.com/office/word/2016/wordml/cid" xmlns:w16="http://schemas.microsoft.com/office/word/2018/wordml" xmlns:w16du="http://schemas.microsoft.com/office/word/2023/wordml/word16du" xmlns:w16sdtdh="http://schemas.microsoft.com/office/word/2020/wordml/sdtdatahash" xmlns:w16sdtfl="http://schemas.microsoft.com/office/word/2024/wordml/sdtformatlock" xmlns:w16se="http://schemas.microsoft.com/office/word/2015/wordml/symex" xmlns:wpg="http://schemas.microsoft.com/office/word/2010/wordprocessingGroup" xmlns:wpi="http://schemas.microsoft.com/office/word/2010/wordprocessingInk" xmlns:wne="http://schemas.microsoft.com/office/word/2006/wordml" xmlns:wps="http://schemas.microsoft.com/office/word/2010/wordprocessingShape" mc:Ignorable="w14 w15 w16se w16cid w16 w16cex w16sdtdh w16sdtfl w16du wp14">
   <w:p>
     <w:pPr>
       <w:tabs>
@@ -4680,7 +4622,7 @@
 </file>
 
 <file path=word/footnotes.xml><?xml version="1.0" encoding="utf-8"?>
-<w:footnotes xmlns:wpc="http://schemas.microsoft.com/office/word/2010/wordprocessingCanvas" xmlns:cx="http://schemas.microsoft.com/office/drawing/2014/chartex" xmlns:cx1="http://schemas.microsoft.com/office/drawing/2015/9/8/chartex" xmlns:cx2="http://schemas.microsoft.com/office/drawing/2015/10/21/chartex" xmlns:cx3="http://schemas.microsoft.com/office/drawing/2016/5/9/chartex" xmlns:cx4="http://schemas.microsoft.com/office/drawing/2016/5/10/chartex" xmlns:cx5="http://schemas.microsoft.com/office/drawing/2016/5/11/chartex" xmlns:cx6="http://schemas.microsoft.com/office/drawing/2016/5/12/chartex" xmlns:cx7="http://schemas.microsoft.com/office/drawing/2016/5/13/chartex" xmlns:cx8="http://schemas.microsoft.com/office/drawing/2016/5/14/chartex" xmlns:mc="http://schemas.openxmlformats.org/markup-compatibility/2006" xmlns:aink="http://schemas.microsoft.com/office/drawing/2016/ink" xmlns:am3d="http://schemas.microsoft.com/office/drawing/2017/model3d" xmlns:o="urn:schemas-microsoft-com:office:office" xmlns:oel="http://schemas.microsoft.com/office/2019/extlst" xmlns:r="http://schemas.openxmlformats.org/officeDocument/2006/relationships" xmlns:m="http://schemas.openxmlformats.org/officeDocument/2006/math" xmlns:v="urn:schemas-microsoft-com:vml" xmlns:wp14="http://schemas.microsoft.com/office/word/2010/wordprocessingDrawing" xmlns:wp="http://schemas.openxmlformats.org/drawingml/2006/wordprocessingDrawing" xmlns:w10="urn:schemas-microsoft-com:office:word" xmlns:w="http://schemas.openxmlformats.org/wordprocessingml/2006/main" xmlns:w14="http://schemas.microsoft.com/office/word/2010/wordml" xmlns:w15="http://schemas.microsoft.com/office/word/2012/wordml" xmlns:w16cex="http://schemas.microsoft.com/office/word/2018/wordml/cex" xmlns:w16cid="http://schemas.microsoft.com/office/word/2016/wordml/cid" xmlns:w16="http://schemas.microsoft.com/office/word/2018/wordml" xmlns:w16du="http://schemas.microsoft.com/office/word/2023/wordml/word16du" xmlns:w16sdtdh="http://schemas.microsoft.com/office/word/2020/wordml/sdtdatahash" xmlns:w16sdtfl="http://schemas.microsoft.com/office/word/2024/wordml/sdtformatlock" xmlns:w16se="http://schemas.microsoft.com/office/word/2015/wordml/symex" xmlns:wpg="http://schemas.microsoft.com/office/word/2010/wordprocessingGroup" xmlns:wpi="http://schemas.microsoft.com/office/word/2010/wordprocessingInk" xmlns:wne="http://schemas.microsoft.com/office/word/2006/wordml" xmlns:wps="http://schemas.microsoft.com/office/word/2010/wordprocessingShape" mc:Ignorable="w14 w15 w16se w16cid w16 w16cex w16sdtdh w16sdtfl w16du wp14">
+<w:footnotes xmlns:wpc="http://schemas.microsoft.com/office/word/2010/wordprocessingCanvas" xmlns:cx="http://schemas.microsoft.com/office/drawing/2014/chartex" xmlns:cx1="http://schemas.microsoft.com/office/drawing/2015/9/8/chartex" xmlns:cx2="http://schemas.microsoft.com/office/drawing/2015/10/21/chartex" xmlns:cx3="http://schemas.microsoft.com/office/drawing/2016/5/9/chartex" xmlns:cx4="http://schemas.microsoft.com/office/drawing/2016/5/10/chartex" xmlns:cx5="http://schemas.microsoft.com/office/drawing/2016/5/11/chartex" xmlns:cx6="http://schemas.microsoft.com/office/drawing/2016/5/12/chartex" xmlns:cx7="http://schemas.microsoft.com/office/drawing/2016/5/13/chartex" xmlns:cx8="http://schemas.microsoft.com/office/drawing/2016/5/14/chartex" xmlns:mc="http://schemas.openxmlformats.org/markup-compatibility/2006" xmlns:aink="http://schemas.microsoft.com/office/drawing/2016/ink" xmlns:am3d="http://schemas.microsoft.com/office/drawing/2017/model3d" xmlns:o="urn:schemas-microsoft-com:office:office" xmlns:oel="http://schemas.microsoft.com/office/2019/extlst" xmlns:r="http://schemas.openxmlformats.org/officeDocument/2006/relationships" xmlns:m="http://schemas.openxmlformats.org/officeDocument/2006/math" xmlns:v="urn:schemas-microsoft-com:vml" xmlns:wp14="http://schemas.microsoft.com/office/word/2010/wordprocessingDrawing" xmlns:wp="http://schemas.openxmlformats.org/drawingml/2006/wordprocessingDrawing" xmlns:w10="urn:schemas-microsoft-com:office:word" xmlns:w="http://schemas.openxmlformats.org/wordprocessingml/2006/main" xmlns:w14="http://schemas.microsoft.com/office/word/2010/wordml" xmlns:w15="http://schemas.microsoft.com/office/word/2012/wordml" xmlns:w16cei="http://schemas.microsoft.com/office/word/2026/wordml/cei" xmlns:w16cex="http://schemas.microsoft.com/office/word/2018/wordml/cex" xmlns:w16cid="http://schemas.microsoft.com/office/word/2016/wordml/cid" xmlns:w16="http://schemas.microsoft.com/office/word/2018/wordml" xmlns:w16du="http://schemas.microsoft.com/office/word/2023/wordml/word16du" xmlns:w16sdtdh="http://schemas.microsoft.com/office/word/2020/wordml/sdtdatahash" xmlns:w16sdtfl="http://schemas.microsoft.com/office/word/2024/wordml/sdtformatlock" xmlns:w16se="http://schemas.microsoft.com/office/word/2015/wordml/symex" xmlns:wpg="http://schemas.microsoft.com/office/word/2010/wordprocessingGroup" xmlns:wpi="http://schemas.microsoft.com/office/word/2010/wordprocessingInk" xmlns:wne="http://schemas.microsoft.com/office/word/2006/wordml" xmlns:wps="http://schemas.microsoft.com/office/word/2010/wordprocessingShape" mc:Ignorable="w14 w15 w16se w16cid w16 w16cex w16sdtdh w16sdtfl w16du wp14">
   <w:footnote w:type="separator" w:id="-1">
     <w:p>
       <w:r>

</xml_diff>

<commit_message>
cambiar de sucursal a destino en ticket
</commit_message>
<xml_diff>
--- a/pesaje/analytica/Report/PrintRecepcionGuiaRecepcionV2.docx
+++ b/pesaje/analytica/Report/PrintRecepcionGuiaRecepcionV2.docx
@@ -613,7 +613,6 @@
             <w:r>
               <w:rPr>
                 <w:rFonts w:ascii="Arial" w:hAnsi="Arial"/>
-                <w:color w:val="auto"/>
                 <w:sz w:val="16"/>
                 <w:szCs w:val="16"/>
               </w:rPr>
@@ -649,7 +648,6 @@
             <w:r>
               <w:rPr>
                 <w:rFonts w:ascii="Arial" w:hAnsi="Arial"/>
-                <w:color w:val="auto"/>
                 <w:sz w:val="16"/>
                 <w:szCs w:val="16"/>
               </w:rPr>
@@ -667,7 +665,6 @@
             <w:r>
               <w:rPr>
                 <w:rFonts w:ascii="Arial" w:hAnsi="Arial"/>
-                <w:color w:val="auto"/>
                 <w:sz w:val="16"/>
                 <w:szCs w:val="16"/>
               </w:rPr>
@@ -772,7 +769,6 @@
             <w:r>
               <w:rPr>
                 <w:rFonts w:ascii="Arial" w:hAnsi="Arial"/>
-                <w:color w:val="auto"/>
                 <w:sz w:val="16"/>
                 <w:szCs w:val="16"/>
               </w:rPr>
@@ -790,7 +786,6 @@
             <w:r>
               <w:rPr>
                 <w:rFonts w:ascii="Arial" w:hAnsi="Arial"/>
-                <w:color w:val="auto"/>
                 <w:sz w:val="16"/>
                 <w:szCs w:val="16"/>
               </w:rPr>
@@ -808,7 +803,6 @@
             <w:r>
               <w:rPr>
                 <w:rFonts w:ascii="Arial" w:hAnsi="Arial"/>
-                <w:color w:val="auto"/>
                 <w:sz w:val="16"/>
                 <w:szCs w:val="16"/>
               </w:rPr>
@@ -866,7 +860,6 @@
             <w:r>
               <w:rPr>
                 <w:rFonts w:ascii="Arial" w:hAnsi="Arial"/>
-                <w:color w:val="auto"/>
                 <w:sz w:val="16"/>
                 <w:szCs w:val="16"/>
               </w:rPr>
@@ -884,7 +877,6 @@
             <w:r>
               <w:rPr>
                 <w:rFonts w:ascii="Arial" w:hAnsi="Arial"/>
-                <w:color w:val="auto"/>
                 <w:sz w:val="16"/>
                 <w:szCs w:val="16"/>
               </w:rPr>
@@ -902,7 +894,6 @@
             <w:r>
               <w:rPr>
                 <w:rFonts w:ascii="Arial" w:hAnsi="Arial"/>
-                <w:color w:val="auto"/>
                 <w:sz w:val="16"/>
                 <w:szCs w:val="16"/>
               </w:rPr>
@@ -955,7 +946,6 @@
             <w:r>
               <w:rPr>
                 <w:rFonts w:ascii="Arial" w:hAnsi="Arial"/>
-                <w:color w:val="auto"/>
                 <w:sz w:val="16"/>
                 <w:szCs w:val="16"/>
               </w:rPr>
@@ -991,7 +981,6 @@
             <w:r>
               <w:rPr>
                 <w:rFonts w:ascii="Arial" w:hAnsi="Arial"/>
-                <w:color w:val="auto"/>
                 <w:sz w:val="16"/>
                 <w:szCs w:val="16"/>
               </w:rPr>
@@ -1009,7 +998,6 @@
             <w:r>
               <w:rPr>
                 <w:rFonts w:ascii="Arial" w:hAnsi="Arial"/>
-                <w:color w:val="auto"/>
                 <w:sz w:val="16"/>
                 <w:szCs w:val="16"/>
               </w:rPr>
@@ -1068,7 +1056,6 @@
             <w:r>
               <w:rPr>
                 <w:rFonts w:ascii="Arial" w:hAnsi="Arial"/>
-                <w:color w:val="auto"/>
                 <w:sz w:val="16"/>
                 <w:szCs w:val="16"/>
               </w:rPr>
@@ -1086,7 +1073,6 @@
             <w:r>
               <w:rPr>
                 <w:rFonts w:ascii="Arial" w:hAnsi="Arial"/>
-                <w:color w:val="auto"/>
                 <w:sz w:val="16"/>
                 <w:szCs w:val="16"/>
               </w:rPr>
@@ -1104,7 +1090,6 @@
             <w:r>
               <w:rPr>
                 <w:rFonts w:ascii="Arial" w:hAnsi="Arial"/>
-                <w:color w:val="auto"/>
                 <w:sz w:val="16"/>
                 <w:szCs w:val="16"/>
               </w:rPr>
@@ -1158,7 +1143,6 @@
             <w:r>
               <w:rPr>
                 <w:rFonts w:ascii="Arial" w:hAnsi="Arial"/>
-                <w:color w:val="auto"/>
                 <w:sz w:val="16"/>
                 <w:szCs w:val="16"/>
               </w:rPr>
@@ -1194,7 +1178,6 @@
             <w:r>
               <w:rPr>
                 <w:rFonts w:ascii="Arial" w:hAnsi="Arial"/>
-                <w:color w:val="auto"/>
                 <w:sz w:val="16"/>
                 <w:szCs w:val="16"/>
               </w:rPr>
@@ -1212,7 +1195,6 @@
             <w:r>
               <w:rPr>
                 <w:rFonts w:ascii="Arial" w:hAnsi="Arial"/>
-                <w:color w:val="auto"/>
                 <w:sz w:val="16"/>
                 <w:szCs w:val="16"/>
               </w:rPr>
@@ -1280,7 +1262,6 @@
             <w:r>
               <w:rPr>
                 <w:rFonts w:ascii="Arial" w:hAnsi="Arial"/>
-                <w:color w:val="auto"/>
                 <w:sz w:val="16"/>
                 <w:szCs w:val="16"/>
               </w:rPr>
@@ -1298,7 +1279,6 @@
             <w:r>
               <w:rPr>
                 <w:rFonts w:ascii="Arial" w:hAnsi="Arial"/>
-                <w:color w:val="auto"/>
                 <w:sz w:val="16"/>
                 <w:szCs w:val="16"/>
               </w:rPr>
@@ -1316,7 +1296,6 @@
             <w:r>
               <w:rPr>
                 <w:rFonts w:ascii="Arial" w:hAnsi="Arial"/>
-                <w:color w:val="auto"/>
                 <w:sz w:val="16"/>
                 <w:szCs w:val="16"/>
               </w:rPr>
@@ -1637,7 +1616,6 @@
             <w:r>
               <w:rPr>
                 <w:rFonts w:ascii="Arial" w:hAnsi="Arial"/>
-                <w:color w:val="auto"/>
                 <w:sz w:val="16"/>
                 <w:szCs w:val="16"/>
               </w:rPr>
@@ -1655,7 +1633,6 @@
             <w:r>
               <w:rPr>
                 <w:rFonts w:ascii="Arial" w:hAnsi="Arial"/>
-                <w:color w:val="auto"/>
                 <w:sz w:val="16"/>
                 <w:szCs w:val="16"/>
               </w:rPr>
@@ -1673,7 +1650,6 @@
             <w:r>
               <w:rPr>
                 <w:rFonts w:ascii="Arial" w:hAnsi="Arial"/>
-                <w:color w:val="auto"/>
                 <w:sz w:val="16"/>
                 <w:szCs w:val="16"/>
               </w:rPr>
@@ -1726,7 +1702,6 @@
             <w:r>
               <w:rPr>
                 <w:rFonts w:ascii="Arial" w:hAnsi="Arial"/>
-                <w:color w:val="auto"/>
                 <w:sz w:val="16"/>
                 <w:szCs w:val="16"/>
               </w:rPr>
@@ -1744,7 +1719,6 @@
             <w:r>
               <w:rPr>
                 <w:rFonts w:ascii="Arial" w:hAnsi="Arial"/>
-                <w:color w:val="auto"/>
                 <w:sz w:val="16"/>
                 <w:szCs w:val="16"/>
               </w:rPr>
@@ -1762,7 +1736,6 @@
             <w:r>
               <w:rPr>
                 <w:rFonts w:ascii="Arial" w:hAnsi="Arial"/>
-                <w:color w:val="auto"/>
                 <w:sz w:val="16"/>
                 <w:szCs w:val="16"/>
               </w:rPr>
@@ -1832,7 +1805,6 @@
             <w:r>
               <w:rPr>
                 <w:rFonts w:ascii="Arial" w:hAnsi="Arial"/>
-                <w:color w:val="auto"/>
                 <w:sz w:val="16"/>
                 <w:szCs w:val="16"/>
               </w:rPr>
@@ -1850,7 +1822,6 @@
             <w:r>
               <w:rPr>
                 <w:rFonts w:ascii="Arial" w:hAnsi="Arial"/>
-                <w:color w:val="auto"/>
                 <w:sz w:val="16"/>
                 <w:szCs w:val="16"/>
               </w:rPr>
@@ -1868,7 +1839,6 @@
             <w:r>
               <w:rPr>
                 <w:rFonts w:ascii="Arial" w:hAnsi="Arial"/>
-                <w:color w:val="auto"/>
                 <w:sz w:val="16"/>
                 <w:szCs w:val="16"/>
               </w:rPr>
@@ -1921,7 +1891,6 @@
             <w:r>
               <w:rPr>
                 <w:rFonts w:ascii="Arial" w:hAnsi="Arial"/>
-                <w:color w:val="auto"/>
                 <w:sz w:val="16"/>
                 <w:szCs w:val="16"/>
               </w:rPr>
@@ -1939,7 +1908,6 @@
             <w:r>
               <w:rPr>
                 <w:rFonts w:ascii="Arial" w:hAnsi="Arial"/>
-                <w:color w:val="auto"/>
                 <w:sz w:val="16"/>
                 <w:szCs w:val="16"/>
               </w:rPr>
@@ -1957,7 +1925,6 @@
             <w:r>
               <w:rPr>
                 <w:rFonts w:ascii="Arial" w:hAnsi="Arial"/>
-                <w:color w:val="auto"/>
                 <w:sz w:val="16"/>
                 <w:szCs w:val="16"/>
               </w:rPr>
@@ -2053,7 +2020,6 @@
             <w:r>
               <w:rPr>
                 <w:rFonts w:ascii="Arial" w:hAnsi="Arial"/>
-                <w:color w:val="auto"/>
                 <w:sz w:val="16"/>
                 <w:szCs w:val="16"/>
               </w:rPr>
@@ -2071,7 +2037,6 @@
             <w:r>
               <w:rPr>
                 <w:rFonts w:ascii="Arial" w:hAnsi="Arial"/>
-                <w:color w:val="auto"/>
                 <w:sz w:val="16"/>
                 <w:szCs w:val="16"/>
               </w:rPr>
@@ -2089,7 +2054,6 @@
             <w:r>
               <w:rPr>
                 <w:rFonts w:ascii="Arial" w:hAnsi="Arial"/>
-                <w:color w:val="auto"/>
                 <w:sz w:val="16"/>
                 <w:szCs w:val="16"/>
               </w:rPr>
@@ -2142,7 +2106,6 @@
             <w:r>
               <w:rPr>
                 <w:rFonts w:ascii="Arial" w:hAnsi="Arial"/>
-                <w:color w:val="auto"/>
                 <w:sz w:val="16"/>
                 <w:szCs w:val="16"/>
               </w:rPr>
@@ -2160,7 +2123,6 @@
             <w:r>
               <w:rPr>
                 <w:rFonts w:ascii="Arial" w:hAnsi="Arial"/>
-                <w:color w:val="auto"/>
                 <w:sz w:val="16"/>
                 <w:szCs w:val="16"/>
               </w:rPr>
@@ -2178,7 +2140,6 @@
             <w:r>
               <w:rPr>
                 <w:rFonts w:ascii="Arial" w:hAnsi="Arial"/>
-                <w:color w:val="auto"/>
                 <w:sz w:val="16"/>
                 <w:szCs w:val="16"/>
               </w:rPr>
@@ -2251,7 +2212,6 @@
             <w:r>
               <w:rPr>
                 <w:rFonts w:ascii="Arial" w:hAnsi="Arial"/>
-                <w:color w:val="auto"/>
                 <w:sz w:val="16"/>
                 <w:szCs w:val="16"/>
               </w:rPr>
@@ -2269,7 +2229,6 @@
             <w:r>
               <w:rPr>
                 <w:rFonts w:ascii="Arial" w:hAnsi="Arial"/>
-                <w:color w:val="auto"/>
                 <w:sz w:val="16"/>
                 <w:szCs w:val="16"/>
               </w:rPr>
@@ -2287,7 +2246,6 @@
             <w:r>
               <w:rPr>
                 <w:rFonts w:ascii="Arial" w:hAnsi="Arial"/>
-                <w:color w:val="auto"/>
                 <w:sz w:val="16"/>
                 <w:szCs w:val="16"/>
               </w:rPr>
@@ -2341,7 +2299,6 @@
             <w:r>
               <w:rPr>
                 <w:rFonts w:ascii="Arial" w:hAnsi="Arial"/>
-                <w:color w:val="auto"/>
                 <w:sz w:val="16"/>
                 <w:szCs w:val="16"/>
               </w:rPr>
@@ -2359,7 +2316,6 @@
             <w:r>
               <w:rPr>
                 <w:rFonts w:ascii="Arial" w:hAnsi="Arial"/>
-                <w:color w:val="auto"/>
                 <w:sz w:val="16"/>
                 <w:szCs w:val="16"/>
               </w:rPr>
@@ -2377,7 +2333,6 @@
             <w:r>
               <w:rPr>
                 <w:rFonts w:ascii="Arial" w:hAnsi="Arial"/>
-                <w:color w:val="auto"/>
                 <w:sz w:val="16"/>
                 <w:szCs w:val="16"/>
               </w:rPr>
@@ -3246,7 +3201,16 @@
                 <w:sz w:val="14"/>
                 <w:szCs w:val="14"/>
               </w:rPr>
-              <w:instrText xml:space="preserve"> MERGEFIELD  </w:instrText>
+              <w:instrText xml:space="preserve"> MERGEFIELD  destino  \* MERGEFORMAT </w:instrText>
+            </w:r>
+            <w:r>
+              <w:rPr>
+                <w:rFonts w:ascii="Arial" w:hAnsi="Arial"/>
+                <w:bCs/>
+                <w:sz w:val="14"/>
+                <w:szCs w:val="14"/>
+              </w:rPr>
+              <w:fldChar w:fldCharType="separate"/>
             </w:r>
             <w:r>
               <w:rPr>
@@ -3256,35 +3220,7 @@
                 <w:sz w:val="14"/>
                 <w:szCs w:val="14"/>
               </w:rPr>
-              <w:instrText>sucursal_empresa</w:instrText>
-            </w:r>
-            <w:r>
-              <w:rPr>
-                <w:rFonts w:ascii="Arial" w:hAnsi="Arial"/>
-                <w:bCs/>
-                <w:sz w:val="14"/>
-                <w:szCs w:val="14"/>
-              </w:rPr>
-              <w:instrText xml:space="preserve">  \* MERGEFORMAT </w:instrText>
-            </w:r>
-            <w:r>
-              <w:rPr>
-                <w:rFonts w:ascii="Arial" w:hAnsi="Arial"/>
-                <w:bCs/>
-                <w:sz w:val="14"/>
-                <w:szCs w:val="14"/>
-              </w:rPr>
-              <w:fldChar w:fldCharType="separate"/>
-            </w:r>
-            <w:r>
-              <w:rPr>
-                <w:rFonts w:ascii="Arial" w:hAnsi="Arial"/>
-                <w:bCs/>
-                <w:noProof/>
-                <w:sz w:val="14"/>
-                <w:szCs w:val="14"/>
-              </w:rPr>
-              <w:t>«sucursal_empresa»</w:t>
+              <w:t>«destino»</w:t>
             </w:r>
             <w:r>
               <w:rPr>
@@ -3469,7 +3405,6 @@
             <w:r>
               <w:rPr>
                 <w:rFonts w:ascii="Arial" w:hAnsi="Arial"/>
-                <w:color w:val="auto"/>
                 <w:sz w:val="16"/>
                 <w:szCs w:val="16"/>
               </w:rPr>
@@ -3487,7 +3422,6 @@
             <w:r>
               <w:rPr>
                 <w:rFonts w:ascii="Arial" w:hAnsi="Arial"/>
-                <w:color w:val="auto"/>
                 <w:sz w:val="16"/>
                 <w:szCs w:val="16"/>
               </w:rPr>
@@ -3505,7 +3439,6 @@
             <w:r>
               <w:rPr>
                 <w:rFonts w:ascii="Arial" w:hAnsi="Arial"/>
-                <w:color w:val="auto"/>
                 <w:sz w:val="16"/>
                 <w:szCs w:val="16"/>
               </w:rPr>
@@ -3563,7 +3496,6 @@
             <w:r>
               <w:rPr>
                 <w:rFonts w:ascii="Arial" w:hAnsi="Arial"/>
-                <w:color w:val="auto"/>
                 <w:sz w:val="16"/>
                 <w:szCs w:val="16"/>
               </w:rPr>
@@ -3581,7 +3513,6 @@
             <w:r>
               <w:rPr>
                 <w:rFonts w:ascii="Arial" w:hAnsi="Arial"/>
-                <w:color w:val="auto"/>
                 <w:sz w:val="16"/>
                 <w:szCs w:val="16"/>
               </w:rPr>
@@ -3599,7 +3530,6 @@
             <w:r>
               <w:rPr>
                 <w:rFonts w:ascii="Arial" w:hAnsi="Arial"/>
-                <w:color w:val="auto"/>
                 <w:sz w:val="16"/>
                 <w:szCs w:val="16"/>
               </w:rPr>
@@ -3651,7 +3581,6 @@
             <w:r>
               <w:rPr>
                 <w:rFonts w:ascii="Arial" w:hAnsi="Arial"/>
-                <w:color w:val="auto"/>
                 <w:sz w:val="16"/>
                 <w:szCs w:val="16"/>
               </w:rPr>
@@ -3669,7 +3598,6 @@
             <w:r>
               <w:rPr>
                 <w:rFonts w:ascii="Arial" w:hAnsi="Arial"/>
-                <w:color w:val="auto"/>
                 <w:sz w:val="16"/>
                 <w:szCs w:val="16"/>
               </w:rPr>
@@ -3687,7 +3615,6 @@
             <w:r>
               <w:rPr>
                 <w:rFonts w:ascii="Arial" w:hAnsi="Arial"/>
-                <w:color w:val="auto"/>
                 <w:sz w:val="16"/>
                 <w:szCs w:val="16"/>
               </w:rPr>
@@ -3740,7 +3667,6 @@
             <w:r>
               <w:rPr>
                 <w:rFonts w:ascii="Arial" w:hAnsi="Arial"/>
-                <w:color w:val="auto"/>
                 <w:sz w:val="16"/>
                 <w:szCs w:val="16"/>
               </w:rPr>
@@ -3758,7 +3684,6 @@
             <w:r>
               <w:rPr>
                 <w:rFonts w:ascii="Arial" w:hAnsi="Arial"/>
-                <w:color w:val="auto"/>
                 <w:sz w:val="16"/>
                 <w:szCs w:val="16"/>
               </w:rPr>
@@ -3776,7 +3701,6 @@
             <w:r>
               <w:rPr>
                 <w:rFonts w:ascii="Arial" w:hAnsi="Arial"/>
-                <w:color w:val="auto"/>
                 <w:sz w:val="16"/>
                 <w:szCs w:val="16"/>
               </w:rPr>
@@ -3834,7 +3758,6 @@
             <w:r>
               <w:rPr>
                 <w:rFonts w:ascii="Arial" w:hAnsi="Arial"/>
-                <w:color w:val="auto"/>
                 <w:sz w:val="16"/>
                 <w:szCs w:val="16"/>
               </w:rPr>
@@ -3852,7 +3775,6 @@
             <w:r>
               <w:rPr>
                 <w:rFonts w:ascii="Arial" w:hAnsi="Arial"/>
-                <w:color w:val="auto"/>
                 <w:sz w:val="16"/>
                 <w:szCs w:val="16"/>
               </w:rPr>
@@ -3870,7 +3792,6 @@
             <w:r>
               <w:rPr>
                 <w:rFonts w:ascii="Arial" w:hAnsi="Arial"/>
-                <w:color w:val="auto"/>
                 <w:sz w:val="16"/>
                 <w:szCs w:val="16"/>
               </w:rPr>
@@ -3921,7 +3842,6 @@
             <w:r>
               <w:rPr>
                 <w:rFonts w:ascii="Arial" w:hAnsi="Arial"/>
-                <w:color w:val="auto"/>
                 <w:sz w:val="16"/>
                 <w:szCs w:val="16"/>
               </w:rPr>
@@ -3939,7 +3859,6 @@
             <w:r>
               <w:rPr>
                 <w:rFonts w:ascii="Arial" w:hAnsi="Arial"/>
-                <w:color w:val="auto"/>
                 <w:sz w:val="16"/>
                 <w:szCs w:val="16"/>
               </w:rPr>
@@ -3957,7 +3876,6 @@
             <w:r>
               <w:rPr>
                 <w:rFonts w:ascii="Arial" w:hAnsi="Arial"/>
-                <w:color w:val="auto"/>
                 <w:sz w:val="16"/>
                 <w:szCs w:val="16"/>
               </w:rPr>
@@ -4009,7 +3927,6 @@
             <w:r>
               <w:rPr>
                 <w:rFonts w:ascii="Arial" w:hAnsi="Arial"/>
-                <w:color w:val="auto"/>
                 <w:sz w:val="16"/>
                 <w:szCs w:val="16"/>
               </w:rPr>
@@ -4027,7 +3944,6 @@
             <w:r>
               <w:rPr>
                 <w:rFonts w:ascii="Arial" w:hAnsi="Arial"/>
-                <w:color w:val="auto"/>
                 <w:sz w:val="16"/>
                 <w:szCs w:val="16"/>
               </w:rPr>
@@ -4045,7 +3961,6 @@
             <w:r>
               <w:rPr>
                 <w:rFonts w:ascii="Arial" w:hAnsi="Arial"/>
-                <w:color w:val="auto"/>
                 <w:sz w:val="16"/>
                 <w:szCs w:val="16"/>
               </w:rPr>
@@ -4103,7 +4018,6 @@
             <w:r>
               <w:rPr>
                 <w:rFonts w:ascii="Arial" w:hAnsi="Arial"/>
-                <w:color w:val="auto"/>
                 <w:sz w:val="16"/>
                 <w:szCs w:val="16"/>
               </w:rPr>
@@ -4121,7 +4035,6 @@
             <w:r>
               <w:rPr>
                 <w:rFonts w:ascii="Arial" w:hAnsi="Arial"/>
-                <w:color w:val="auto"/>
                 <w:sz w:val="16"/>
                 <w:szCs w:val="16"/>
               </w:rPr>
@@ -4140,7 +4053,6 @@
             <w:r>
               <w:rPr>
                 <w:rFonts w:ascii="Arial" w:hAnsi="Arial"/>
-                <w:color w:val="auto"/>
                 <w:sz w:val="16"/>
                 <w:szCs w:val="16"/>
               </w:rPr>
@@ -4227,7 +4139,6 @@
             <w:r>
               <w:rPr>
                 <w:rFonts w:ascii="Arial" w:hAnsi="Arial"/>
-                <w:color w:val="auto"/>
                 <w:sz w:val="16"/>
                 <w:szCs w:val="16"/>
               </w:rPr>
@@ -4245,7 +4156,6 @@
             <w:r>
               <w:rPr>
                 <w:rFonts w:ascii="Arial" w:hAnsi="Arial"/>
-                <w:color w:val="auto"/>
                 <w:sz w:val="16"/>
                 <w:szCs w:val="16"/>
               </w:rPr>
@@ -4263,7 +4173,6 @@
             <w:r>
               <w:rPr>
                 <w:rFonts w:ascii="Arial" w:hAnsi="Arial"/>
-                <w:color w:val="auto"/>
                 <w:sz w:val="16"/>
                 <w:szCs w:val="16"/>
               </w:rPr>

</xml_diff>

<commit_message>
feat: actualizar plantilla de ticket
</commit_message>
<xml_diff>
--- a/pesaje/analytica/Report/PrintRecepcionGuiaRecepcionV2.docx
+++ b/pesaje/analytica/Report/PrintRecepcionGuiaRecepcionV2.docx
@@ -26,6 +26,9 @@
               <w:pStyle w:val="Encabezado"/>
               <w:ind w:left="142"/>
               <w:jc w:val="center"/>
+              <w:rPr>
+                <w:color w:val="000000" w:themeColor="text1"/>
+              </w:rPr>
             </w:pPr>
           </w:p>
         </w:tc>
@@ -40,6 +43,7 @@
                 <w:rFonts w:ascii="Arial" w:hAnsi="Arial"/>
                 <w:b/>
                 <w:bCs/>
+                <w:color w:val="000000" w:themeColor="text1"/>
                 <w:sz w:val="28"/>
                 <w:szCs w:val="28"/>
                 <w:lang w:val="it-IT"/>
@@ -49,6 +53,7 @@
               <w:rPr>
                 <w:rFonts w:ascii="Times New Roman" w:hAnsi="Times New Roman" w:cs="Times New Roman"/>
                 <w:noProof/>
+                <w:color w:val="000000" w:themeColor="text1"/>
                 <w:sz w:val="24"/>
                 <w:szCs w:val="24"/>
                 <w:lang w:val="es-PE" w:eastAsia="es-PE"/>
@@ -225,6 +230,7 @@
                 <w:rFonts w:ascii="Arial" w:hAnsi="Arial"/>
                 <w:b/>
                 <w:bCs/>
+                <w:color w:val="000000" w:themeColor="text1"/>
                 <w:sz w:val="28"/>
                 <w:szCs w:val="28"/>
                 <w:lang w:val="it-IT"/>
@@ -236,6 +242,7 @@
                 <w:rFonts w:ascii="Arial" w:hAnsi="Arial"/>
                 <w:b/>
                 <w:bCs/>
+                <w:color w:val="000000" w:themeColor="text1"/>
                 <w:sz w:val="28"/>
                 <w:szCs w:val="28"/>
                 <w:lang w:val="it-IT"/>
@@ -247,6 +254,7 @@
                 <w:rFonts w:ascii="Arial" w:hAnsi="Arial"/>
                 <w:b/>
                 <w:bCs/>
+                <w:color w:val="000000" w:themeColor="text1"/>
                 <w:sz w:val="28"/>
                 <w:szCs w:val="28"/>
                 <w:lang w:val="it-IT"/>
@@ -259,6 +267,7 @@
                 <w:b/>
                 <w:bCs/>
                 <w:noProof/>
+                <w:color w:val="000000" w:themeColor="text1"/>
                 <w:sz w:val="28"/>
                 <w:szCs w:val="28"/>
                 <w:lang w:val="it-IT"/>
@@ -270,6 +279,7 @@
                 <w:rFonts w:ascii="Arial" w:hAnsi="Arial"/>
                 <w:b/>
                 <w:bCs/>
+                <w:color w:val="000000" w:themeColor="text1"/>
                 <w:sz w:val="28"/>
                 <w:szCs w:val="28"/>
                 <w:lang w:val="it-IT"/>
@@ -286,6 +296,7 @@
                 <w:rFonts w:ascii="Arial" w:hAnsi="Arial"/>
                 <w:b/>
                 <w:bCs/>
+                <w:color w:val="000000" w:themeColor="text1"/>
                 <w:sz w:val="24"/>
                 <w:szCs w:val="24"/>
                 <w:lang w:val="it-IT"/>
@@ -296,6 +307,7 @@
                 <w:rFonts w:ascii="Arial" w:hAnsi="Arial"/>
                 <w:b/>
                 <w:bCs/>
+                <w:color w:val="000000" w:themeColor="text1"/>
                 <w:lang w:val="it-IT"/>
               </w:rPr>
               <w:fldChar w:fldCharType="begin"/>
@@ -305,6 +317,7 @@
                 <w:rFonts w:ascii="Arial" w:hAnsi="Arial"/>
                 <w:b/>
                 <w:bCs/>
+                <w:color w:val="000000" w:themeColor="text1"/>
                 <w:lang w:val="it-IT"/>
               </w:rPr>
               <w:instrText xml:space="preserve"> MERGEFIELD  </w:instrText>
@@ -315,6 +328,7 @@
                 <w:b/>
                 <w:bCs/>
                 <w:noProof/>
+                <w:color w:val="000000" w:themeColor="text1"/>
                 <w:lang w:val="it-IT"/>
               </w:rPr>
               <w:instrText>direc_empresa</w:instrText>
@@ -324,6 +338,7 @@
                 <w:rFonts w:ascii="Arial" w:hAnsi="Arial"/>
                 <w:b/>
                 <w:bCs/>
+                <w:color w:val="000000" w:themeColor="text1"/>
                 <w:lang w:val="it-IT"/>
               </w:rPr>
               <w:instrText xml:space="preserve">  \* MERGEFORMAT </w:instrText>
@@ -333,6 +348,7 @@
                 <w:rFonts w:ascii="Arial" w:hAnsi="Arial"/>
                 <w:b/>
                 <w:bCs/>
+                <w:color w:val="000000" w:themeColor="text1"/>
                 <w:lang w:val="it-IT"/>
               </w:rPr>
               <w:fldChar w:fldCharType="separate"/>
@@ -343,6 +359,7 @@
                 <w:b/>
                 <w:bCs/>
                 <w:noProof/>
+                <w:color w:val="000000" w:themeColor="text1"/>
                 <w:lang w:val="it-IT"/>
               </w:rPr>
               <w:t>«direc_empresa»</w:t>
@@ -352,6 +369,7 @@
                 <w:rFonts w:ascii="Arial" w:hAnsi="Arial"/>
                 <w:b/>
                 <w:bCs/>
+                <w:color w:val="000000" w:themeColor="text1"/>
                 <w:lang w:val="it-IT"/>
               </w:rPr>
               <w:fldChar w:fldCharType="end"/>
@@ -364,6 +382,7 @@
                 <w:rFonts w:ascii="Arial" w:hAnsi="Arial"/>
                 <w:b/>
                 <w:bCs/>
+                <w:color w:val="000000" w:themeColor="text1"/>
                 <w:sz w:val="28"/>
                 <w:szCs w:val="28"/>
                 <w:lang w:val="it-IT"/>
@@ -384,6 +403,7 @@
                 <w:b/>
                 <w:bCs/>
                 <w:noProof/>
+                <w:color w:val="000000" w:themeColor="text1"/>
                 <w:lang w:val="es-PE" w:eastAsia="es-PE"/>
               </w:rPr>
             </w:pPr>
@@ -392,6 +412,7 @@
                 <w:rFonts w:ascii="Arial" w:hAnsi="Arial"/>
                 <w:b/>
                 <w:noProof/>
+                <w:color w:val="000000" w:themeColor="text1"/>
                 <w:sz w:val="36"/>
                 <w:szCs w:val="36"/>
               </w:rPr>
@@ -402,6 +423,7 @@
                 <w:rFonts w:ascii="Arial" w:hAnsi="Arial"/>
                 <w:b/>
                 <w:noProof/>
+                <w:color w:val="000000" w:themeColor="text1"/>
                 <w:sz w:val="36"/>
                 <w:szCs w:val="36"/>
               </w:rPr>
@@ -412,6 +434,7 @@
                 <w:rFonts w:ascii="Arial" w:hAnsi="Arial"/>
                 <w:b/>
                 <w:noProof/>
+                <w:color w:val="000000" w:themeColor="text1"/>
                 <w:sz w:val="36"/>
                 <w:szCs w:val="36"/>
               </w:rPr>
@@ -422,6 +445,7 @@
                 <w:rFonts w:ascii="Arial" w:hAnsi="Arial"/>
                 <w:b/>
                 <w:noProof/>
+                <w:color w:val="000000" w:themeColor="text1"/>
                 <w:sz w:val="36"/>
                 <w:szCs w:val="36"/>
               </w:rPr>
@@ -432,6 +456,7 @@
                 <w:rFonts w:ascii="Arial" w:hAnsi="Arial"/>
                 <w:b/>
                 <w:noProof/>
+                <w:color w:val="000000" w:themeColor="text1"/>
                 <w:sz w:val="36"/>
                 <w:szCs w:val="36"/>
               </w:rPr>
@@ -578,17 +603,17 @@
                 <w:rFonts w:ascii="Arial" w:hAnsi="Arial"/>
                 <w:b/>
                 <w:bCs/>
-                <w:color w:val="auto"/>
-                <w:sz w:val="16"/>
-                <w:szCs w:val="16"/>
-              </w:rPr>
-            </w:pPr>
-            <w:r>
-              <w:rPr>
-                <w:rFonts w:ascii="Arial" w:hAnsi="Arial"/>
-                <w:b/>
-                <w:bCs/>
-                <w:color w:val="auto"/>
+                <w:color w:val="000000" w:themeColor="text1"/>
+                <w:sz w:val="16"/>
+                <w:szCs w:val="16"/>
+              </w:rPr>
+            </w:pPr>
+            <w:r>
+              <w:rPr>
+                <w:rFonts w:ascii="Arial" w:hAnsi="Arial"/>
+                <w:b/>
+                <w:bCs/>
+                <w:color w:val="000000" w:themeColor="text1"/>
                 <w:sz w:val="16"/>
                 <w:szCs w:val="16"/>
                 <w:lang w:val="es-PE"/>
@@ -605,14 +630,15 @@
             <w:pPr>
               <w:rPr>
                 <w:rFonts w:ascii="Arial" w:hAnsi="Arial"/>
-                <w:color w:val="auto"/>
-                <w:sz w:val="16"/>
-                <w:szCs w:val="16"/>
-              </w:rPr>
-            </w:pPr>
-            <w:r>
-              <w:rPr>
-                <w:rFonts w:ascii="Arial" w:hAnsi="Arial"/>
+                <w:color w:val="000000" w:themeColor="text1"/>
+                <w:sz w:val="16"/>
+                <w:szCs w:val="16"/>
+              </w:rPr>
+            </w:pPr>
+            <w:r>
+              <w:rPr>
+                <w:rFonts w:ascii="Arial" w:hAnsi="Arial"/>
+                <w:color w:val="000000" w:themeColor="text1"/>
                 <w:sz w:val="16"/>
                 <w:szCs w:val="16"/>
               </w:rPr>
@@ -621,7 +647,7 @@
             <w:r>
               <w:rPr>
                 <w:rFonts w:ascii="Arial" w:hAnsi="Arial"/>
-                <w:color w:val="auto"/>
+                <w:color w:val="000000" w:themeColor="text1"/>
                 <w:sz w:val="16"/>
                 <w:szCs w:val="16"/>
               </w:rPr>
@@ -630,7 +656,7 @@
             <w:r>
               <w:rPr>
                 <w:rFonts w:ascii="Arial" w:hAnsi="Arial"/>
-                <w:color w:val="auto"/>
+                <w:color w:val="000000" w:themeColor="text1"/>
                 <w:sz w:val="16"/>
                 <w:szCs w:val="16"/>
               </w:rPr>
@@ -639,7 +665,7 @@
             <w:r>
               <w:rPr>
                 <w:rFonts w:ascii="Arial" w:hAnsi="Arial"/>
-                <w:color w:val="auto"/>
+                <w:color w:val="000000" w:themeColor="text1"/>
                 <w:sz w:val="16"/>
                 <w:szCs w:val="16"/>
               </w:rPr>
@@ -648,6 +674,7 @@
             <w:r>
               <w:rPr>
                 <w:rFonts w:ascii="Arial" w:hAnsi="Arial"/>
+                <w:color w:val="000000" w:themeColor="text1"/>
                 <w:sz w:val="16"/>
                 <w:szCs w:val="16"/>
               </w:rPr>
@@ -656,7 +683,7 @@
             <w:r>
               <w:rPr>
                 <w:rFonts w:ascii="Arial" w:hAnsi="Arial"/>
-                <w:color w:val="auto"/>
+                <w:color w:val="000000" w:themeColor="text1"/>
                 <w:sz w:val="16"/>
                 <w:szCs w:val="16"/>
               </w:rPr>
@@ -665,6 +692,7 @@
             <w:r>
               <w:rPr>
                 <w:rFonts w:ascii="Arial" w:hAnsi="Arial"/>
+                <w:color w:val="000000" w:themeColor="text1"/>
                 <w:sz w:val="16"/>
                 <w:szCs w:val="16"/>
               </w:rPr>
@@ -682,7 +710,7 @@
                 <w:rFonts w:ascii="Arial" w:hAnsi="Arial"/>
                 <w:b/>
                 <w:bCs/>
-                <w:color w:val="auto"/>
+                <w:color w:val="000000" w:themeColor="text1"/>
                 <w:sz w:val="16"/>
                 <w:szCs w:val="16"/>
               </w:rPr>
@@ -693,7 +721,7 @@
                 <w:rFonts w:ascii="Arial" w:hAnsi="Arial"/>
                 <w:b/>
                 <w:bCs/>
-                <w:color w:val="auto"/>
+                <w:color w:val="000000" w:themeColor="text1"/>
                 <w:sz w:val="16"/>
                 <w:szCs w:val="16"/>
                 <w:lang w:val="es-PE"/>
@@ -706,7 +734,7 @@
                 <w:rFonts w:ascii="Arial" w:hAnsi="Arial"/>
                 <w:b/>
                 <w:bCs/>
-                <w:color w:val="auto"/>
+                <w:color w:val="000000" w:themeColor="text1"/>
                 <w:sz w:val="16"/>
                 <w:szCs w:val="16"/>
                 <w:lang w:val="es-PE"/>
@@ -718,7 +746,7 @@
                 <w:rFonts w:ascii="Arial" w:hAnsi="Arial"/>
                 <w:b/>
                 <w:bCs/>
-                <w:color w:val="auto"/>
+                <w:color w:val="000000" w:themeColor="text1"/>
                 <w:sz w:val="16"/>
                 <w:szCs w:val="16"/>
                 <w:lang w:val="es-PE"/>
@@ -730,7 +758,7 @@
                 <w:rFonts w:ascii="Arial" w:hAnsi="Arial"/>
                 <w:b/>
                 <w:bCs/>
-                <w:color w:val="auto"/>
+                <w:color w:val="000000" w:themeColor="text1"/>
                 <w:sz w:val="16"/>
                 <w:szCs w:val="16"/>
                 <w:lang w:val="es-PE"/>
@@ -743,7 +771,7 @@
                 <w:rFonts w:ascii="Arial" w:hAnsi="Arial"/>
                 <w:b/>
                 <w:bCs/>
-                <w:color w:val="auto"/>
+                <w:color w:val="000000" w:themeColor="text1"/>
                 <w:sz w:val="16"/>
                 <w:szCs w:val="16"/>
                 <w:lang w:val="es-PE"/>
@@ -761,14 +789,15 @@
             <w:pPr>
               <w:rPr>
                 <w:rFonts w:ascii="Arial" w:hAnsi="Arial"/>
-                <w:color w:val="auto"/>
-                <w:sz w:val="16"/>
-                <w:szCs w:val="16"/>
-              </w:rPr>
-            </w:pPr>
-            <w:r>
-              <w:rPr>
-                <w:rFonts w:ascii="Arial" w:hAnsi="Arial"/>
+                <w:color w:val="000000" w:themeColor="text1"/>
+                <w:sz w:val="16"/>
+                <w:szCs w:val="16"/>
+              </w:rPr>
+            </w:pPr>
+            <w:r>
+              <w:rPr>
+                <w:rFonts w:ascii="Arial" w:hAnsi="Arial"/>
+                <w:color w:val="000000" w:themeColor="text1"/>
                 <w:sz w:val="16"/>
                 <w:szCs w:val="16"/>
               </w:rPr>
@@ -777,7 +806,7 @@
             <w:r>
               <w:rPr>
                 <w:rFonts w:ascii="Arial" w:hAnsi="Arial"/>
-                <w:color w:val="auto"/>
+                <w:color w:val="000000" w:themeColor="text1"/>
                 <w:sz w:val="16"/>
                 <w:szCs w:val="16"/>
               </w:rPr>
@@ -786,6 +815,7 @@
             <w:r>
               <w:rPr>
                 <w:rFonts w:ascii="Arial" w:hAnsi="Arial"/>
+                <w:color w:val="000000" w:themeColor="text1"/>
                 <w:sz w:val="16"/>
                 <w:szCs w:val="16"/>
               </w:rPr>
@@ -794,7 +824,7 @@
             <w:r>
               <w:rPr>
                 <w:rFonts w:ascii="Arial" w:hAnsi="Arial"/>
-                <w:color w:val="auto"/>
+                <w:color w:val="000000" w:themeColor="text1"/>
                 <w:sz w:val="16"/>
                 <w:szCs w:val="16"/>
               </w:rPr>
@@ -803,6 +833,7 @@
             <w:r>
               <w:rPr>
                 <w:rFonts w:ascii="Arial" w:hAnsi="Arial"/>
+                <w:color w:val="000000" w:themeColor="text1"/>
                 <w:sz w:val="16"/>
                 <w:szCs w:val="16"/>
               </w:rPr>
@@ -825,17 +856,17 @@
                 <w:rFonts w:ascii="Arial" w:hAnsi="Arial"/>
                 <w:b/>
                 <w:bCs/>
-                <w:color w:val="auto"/>
-                <w:sz w:val="16"/>
-                <w:szCs w:val="16"/>
-              </w:rPr>
-            </w:pPr>
-            <w:r>
-              <w:rPr>
-                <w:rFonts w:ascii="Arial" w:hAnsi="Arial"/>
-                <w:b/>
-                <w:bCs/>
-                <w:color w:val="auto"/>
+                <w:color w:val="000000" w:themeColor="text1"/>
+                <w:sz w:val="16"/>
+                <w:szCs w:val="16"/>
+              </w:rPr>
+            </w:pPr>
+            <w:r>
+              <w:rPr>
+                <w:rFonts w:ascii="Arial" w:hAnsi="Arial"/>
+                <w:b/>
+                <w:bCs/>
+                <w:color w:val="000000" w:themeColor="text1"/>
                 <w:sz w:val="16"/>
                 <w:szCs w:val="16"/>
                 <w:lang w:val="es-PE"/>
@@ -852,14 +883,15 @@
             <w:pPr>
               <w:rPr>
                 <w:rFonts w:ascii="Arial" w:hAnsi="Arial"/>
-                <w:color w:val="auto"/>
-                <w:sz w:val="16"/>
-                <w:szCs w:val="16"/>
-              </w:rPr>
-            </w:pPr>
-            <w:r>
-              <w:rPr>
-                <w:rFonts w:ascii="Arial" w:hAnsi="Arial"/>
+                <w:color w:val="000000" w:themeColor="text1"/>
+                <w:sz w:val="16"/>
+                <w:szCs w:val="16"/>
+              </w:rPr>
+            </w:pPr>
+            <w:r>
+              <w:rPr>
+                <w:rFonts w:ascii="Arial" w:hAnsi="Arial"/>
+                <w:color w:val="000000" w:themeColor="text1"/>
                 <w:sz w:val="16"/>
                 <w:szCs w:val="16"/>
               </w:rPr>
@@ -868,7 +900,7 @@
             <w:r>
               <w:rPr>
                 <w:rFonts w:ascii="Arial" w:hAnsi="Arial"/>
-                <w:color w:val="auto"/>
+                <w:color w:val="000000" w:themeColor="text1"/>
                 <w:sz w:val="16"/>
                 <w:szCs w:val="16"/>
               </w:rPr>
@@ -877,6 +909,7 @@
             <w:r>
               <w:rPr>
                 <w:rFonts w:ascii="Arial" w:hAnsi="Arial"/>
+                <w:color w:val="000000" w:themeColor="text1"/>
                 <w:sz w:val="16"/>
                 <w:szCs w:val="16"/>
               </w:rPr>
@@ -885,7 +918,7 @@
             <w:r>
               <w:rPr>
                 <w:rFonts w:ascii="Arial" w:hAnsi="Arial"/>
-                <w:color w:val="auto"/>
+                <w:color w:val="000000" w:themeColor="text1"/>
                 <w:sz w:val="16"/>
                 <w:szCs w:val="16"/>
               </w:rPr>
@@ -894,6 +927,7 @@
             <w:r>
               <w:rPr>
                 <w:rFonts w:ascii="Arial" w:hAnsi="Arial"/>
+                <w:color w:val="000000" w:themeColor="text1"/>
                 <w:sz w:val="16"/>
                 <w:szCs w:val="16"/>
               </w:rPr>
@@ -911,17 +945,17 @@
                 <w:rFonts w:ascii="Arial" w:hAnsi="Arial"/>
                 <w:b/>
                 <w:bCs/>
-                <w:color w:val="auto"/>
-                <w:sz w:val="16"/>
-                <w:szCs w:val="16"/>
-              </w:rPr>
-            </w:pPr>
-            <w:r>
-              <w:rPr>
-                <w:rFonts w:ascii="Arial" w:hAnsi="Arial"/>
-                <w:b/>
-                <w:bCs/>
-                <w:color w:val="auto"/>
+                <w:color w:val="000000" w:themeColor="text1"/>
+                <w:sz w:val="16"/>
+                <w:szCs w:val="16"/>
+              </w:rPr>
+            </w:pPr>
+            <w:r>
+              <w:rPr>
+                <w:rFonts w:ascii="Arial" w:hAnsi="Arial"/>
+                <w:b/>
+                <w:bCs/>
+                <w:color w:val="000000" w:themeColor="text1"/>
                 <w:sz w:val="16"/>
                 <w:szCs w:val="16"/>
                 <w:lang w:val="es-PE"/>
@@ -938,14 +972,15 @@
             <w:pPr>
               <w:rPr>
                 <w:rFonts w:ascii="Arial" w:hAnsi="Arial"/>
-                <w:color w:val="auto"/>
-                <w:sz w:val="16"/>
-                <w:szCs w:val="16"/>
-              </w:rPr>
-            </w:pPr>
-            <w:r>
-              <w:rPr>
-                <w:rFonts w:ascii="Arial" w:hAnsi="Arial"/>
+                <w:color w:val="000000" w:themeColor="text1"/>
+                <w:sz w:val="16"/>
+                <w:szCs w:val="16"/>
+              </w:rPr>
+            </w:pPr>
+            <w:r>
+              <w:rPr>
+                <w:rFonts w:ascii="Arial" w:hAnsi="Arial"/>
+                <w:color w:val="000000" w:themeColor="text1"/>
                 <w:sz w:val="16"/>
                 <w:szCs w:val="16"/>
               </w:rPr>
@@ -954,7 +989,7 @@
             <w:r>
               <w:rPr>
                 <w:rFonts w:ascii="Arial" w:hAnsi="Arial"/>
-                <w:color w:val="auto"/>
+                <w:color w:val="000000" w:themeColor="text1"/>
                 <w:sz w:val="16"/>
                 <w:szCs w:val="16"/>
               </w:rPr>
@@ -963,7 +998,7 @@
             <w:r>
               <w:rPr>
                 <w:rFonts w:ascii="Arial" w:hAnsi="Arial"/>
-                <w:color w:val="auto"/>
+                <w:color w:val="000000" w:themeColor="text1"/>
                 <w:sz w:val="16"/>
                 <w:szCs w:val="16"/>
               </w:rPr>
@@ -972,7 +1007,7 @@
             <w:r>
               <w:rPr>
                 <w:rFonts w:ascii="Arial" w:hAnsi="Arial"/>
-                <w:color w:val="auto"/>
+                <w:color w:val="000000" w:themeColor="text1"/>
                 <w:sz w:val="16"/>
                 <w:szCs w:val="16"/>
               </w:rPr>
@@ -981,6 +1016,7 @@
             <w:r>
               <w:rPr>
                 <w:rFonts w:ascii="Arial" w:hAnsi="Arial"/>
+                <w:color w:val="000000" w:themeColor="text1"/>
                 <w:sz w:val="16"/>
                 <w:szCs w:val="16"/>
               </w:rPr>
@@ -989,7 +1025,7 @@
             <w:r>
               <w:rPr>
                 <w:rFonts w:ascii="Arial" w:hAnsi="Arial"/>
-                <w:color w:val="auto"/>
+                <w:color w:val="000000" w:themeColor="text1"/>
                 <w:sz w:val="16"/>
                 <w:szCs w:val="16"/>
               </w:rPr>
@@ -998,6 +1034,7 @@
             <w:r>
               <w:rPr>
                 <w:rFonts w:ascii="Arial" w:hAnsi="Arial"/>
+                <w:color w:val="000000" w:themeColor="text1"/>
                 <w:sz w:val="16"/>
                 <w:szCs w:val="16"/>
               </w:rPr>
@@ -1020,7 +1057,7 @@
                 <w:rFonts w:ascii="Arial" w:hAnsi="Arial"/>
                 <w:b/>
                 <w:bCs/>
-                <w:color w:val="auto"/>
+                <w:color w:val="000000" w:themeColor="text1"/>
                 <w:sz w:val="16"/>
                 <w:szCs w:val="16"/>
                 <w:lang w:val="es-PE"/>
@@ -1031,7 +1068,7 @@
                 <w:rFonts w:ascii="Arial" w:hAnsi="Arial"/>
                 <w:b/>
                 <w:bCs/>
-                <w:color w:val="auto"/>
+                <w:color w:val="000000" w:themeColor="text1"/>
                 <w:sz w:val="16"/>
                 <w:szCs w:val="16"/>
                 <w:lang w:val="es-PE"/>
@@ -1048,14 +1085,15 @@
             <w:pPr>
               <w:rPr>
                 <w:rFonts w:ascii="Arial" w:hAnsi="Arial"/>
-                <w:color w:val="auto"/>
-                <w:sz w:val="16"/>
-                <w:szCs w:val="16"/>
-              </w:rPr>
-            </w:pPr>
-            <w:r>
-              <w:rPr>
-                <w:rFonts w:ascii="Arial" w:hAnsi="Arial"/>
+                <w:color w:val="000000" w:themeColor="text1"/>
+                <w:sz w:val="16"/>
+                <w:szCs w:val="16"/>
+              </w:rPr>
+            </w:pPr>
+            <w:r>
+              <w:rPr>
+                <w:rFonts w:ascii="Arial" w:hAnsi="Arial"/>
+                <w:color w:val="000000" w:themeColor="text1"/>
                 <w:sz w:val="16"/>
                 <w:szCs w:val="16"/>
               </w:rPr>
@@ -1064,7 +1102,7 @@
             <w:r>
               <w:rPr>
                 <w:rFonts w:ascii="Arial" w:hAnsi="Arial"/>
-                <w:color w:val="auto"/>
+                <w:color w:val="000000" w:themeColor="text1"/>
                 <w:sz w:val="16"/>
                 <w:szCs w:val="16"/>
               </w:rPr>
@@ -1073,6 +1111,7 @@
             <w:r>
               <w:rPr>
                 <w:rFonts w:ascii="Arial" w:hAnsi="Arial"/>
+                <w:color w:val="000000" w:themeColor="text1"/>
                 <w:sz w:val="16"/>
                 <w:szCs w:val="16"/>
               </w:rPr>
@@ -1081,7 +1120,7 @@
             <w:r>
               <w:rPr>
                 <w:rFonts w:ascii="Arial" w:hAnsi="Arial"/>
-                <w:color w:val="auto"/>
+                <w:color w:val="000000" w:themeColor="text1"/>
                 <w:sz w:val="16"/>
                 <w:szCs w:val="16"/>
               </w:rPr>
@@ -1090,6 +1129,7 @@
             <w:r>
               <w:rPr>
                 <w:rFonts w:ascii="Arial" w:hAnsi="Arial"/>
+                <w:color w:val="000000" w:themeColor="text1"/>
                 <w:sz w:val="16"/>
                 <w:szCs w:val="16"/>
               </w:rPr>
@@ -1107,7 +1147,7 @@
                 <w:rFonts w:ascii="Arial" w:hAnsi="Arial"/>
                 <w:b/>
                 <w:bCs/>
-                <w:color w:val="auto"/>
+                <w:color w:val="000000" w:themeColor="text1"/>
                 <w:sz w:val="16"/>
                 <w:szCs w:val="16"/>
                 <w:lang w:val="es-PE"/>
@@ -1118,7 +1158,7 @@
                 <w:rFonts w:ascii="Arial" w:hAnsi="Arial"/>
                 <w:b/>
                 <w:bCs/>
-                <w:color w:val="auto"/>
+                <w:color w:val="000000" w:themeColor="text1"/>
                 <w:sz w:val="16"/>
                 <w:szCs w:val="16"/>
                 <w:lang w:val="es-PE"/>
@@ -1135,14 +1175,15 @@
             <w:pPr>
               <w:rPr>
                 <w:rFonts w:ascii="Arial" w:hAnsi="Arial"/>
-                <w:color w:val="auto"/>
-                <w:sz w:val="16"/>
-                <w:szCs w:val="16"/>
-              </w:rPr>
-            </w:pPr>
-            <w:r>
-              <w:rPr>
-                <w:rFonts w:ascii="Arial" w:hAnsi="Arial"/>
+                <w:color w:val="000000" w:themeColor="text1"/>
+                <w:sz w:val="16"/>
+                <w:szCs w:val="16"/>
+              </w:rPr>
+            </w:pPr>
+            <w:r>
+              <w:rPr>
+                <w:rFonts w:ascii="Arial" w:hAnsi="Arial"/>
+                <w:color w:val="000000" w:themeColor="text1"/>
                 <w:sz w:val="16"/>
                 <w:szCs w:val="16"/>
               </w:rPr>
@@ -1151,7 +1192,7 @@
             <w:r>
               <w:rPr>
                 <w:rFonts w:ascii="Arial" w:hAnsi="Arial"/>
-                <w:color w:val="auto"/>
+                <w:color w:val="000000" w:themeColor="text1"/>
                 <w:sz w:val="16"/>
                 <w:szCs w:val="16"/>
               </w:rPr>
@@ -1160,7 +1201,7 @@
             <w:r>
               <w:rPr>
                 <w:rFonts w:ascii="Arial" w:hAnsi="Arial"/>
-                <w:color w:val="auto"/>
+                <w:color w:val="000000" w:themeColor="text1"/>
                 <w:sz w:val="16"/>
                 <w:szCs w:val="16"/>
               </w:rPr>
@@ -1169,7 +1210,7 @@
             <w:r>
               <w:rPr>
                 <w:rFonts w:ascii="Arial" w:hAnsi="Arial"/>
-                <w:color w:val="auto"/>
+                <w:color w:val="000000" w:themeColor="text1"/>
                 <w:sz w:val="16"/>
                 <w:szCs w:val="16"/>
               </w:rPr>
@@ -1178,6 +1219,7 @@
             <w:r>
               <w:rPr>
                 <w:rFonts w:ascii="Arial" w:hAnsi="Arial"/>
+                <w:color w:val="000000" w:themeColor="text1"/>
                 <w:sz w:val="16"/>
                 <w:szCs w:val="16"/>
               </w:rPr>
@@ -1186,7 +1228,7 @@
             <w:r>
               <w:rPr>
                 <w:rFonts w:ascii="Arial" w:hAnsi="Arial"/>
-                <w:color w:val="auto"/>
+                <w:color w:val="000000" w:themeColor="text1"/>
                 <w:sz w:val="16"/>
                 <w:szCs w:val="16"/>
               </w:rPr>
@@ -1195,6 +1237,7 @@
             <w:r>
               <w:rPr>
                 <w:rFonts w:ascii="Arial" w:hAnsi="Arial"/>
+                <w:color w:val="000000" w:themeColor="text1"/>
                 <w:sz w:val="16"/>
                 <w:szCs w:val="16"/>
               </w:rPr>
@@ -1203,7 +1246,7 @@
             <w:r>
               <w:rPr>
                 <w:rFonts w:ascii="Arial" w:hAnsi="Arial"/>
-                <w:color w:val="auto"/>
+                <w:color w:val="000000" w:themeColor="text1"/>
                 <w:sz w:val="16"/>
                 <w:szCs w:val="16"/>
               </w:rPr>
@@ -1226,7 +1269,7 @@
                 <w:rFonts w:ascii="Arial" w:hAnsi="Arial"/>
                 <w:b/>
                 <w:bCs/>
-                <w:color w:val="auto"/>
+                <w:color w:val="000000" w:themeColor="text1"/>
                 <w:sz w:val="16"/>
                 <w:szCs w:val="16"/>
                 <w:lang w:val="es-PE"/>
@@ -1237,7 +1280,7 @@
                 <w:rFonts w:ascii="Arial" w:hAnsi="Arial"/>
                 <w:b/>
                 <w:bCs/>
-                <w:color w:val="auto"/>
+                <w:color w:val="000000" w:themeColor="text1"/>
                 <w:sz w:val="16"/>
                 <w:szCs w:val="16"/>
                 <w:lang w:val="es-PE"/>
@@ -1254,14 +1297,15 @@
             <w:pPr>
               <w:rPr>
                 <w:rFonts w:ascii="Arial" w:hAnsi="Arial"/>
-                <w:color w:val="auto"/>
-                <w:sz w:val="16"/>
-                <w:szCs w:val="16"/>
-              </w:rPr>
-            </w:pPr>
-            <w:r>
-              <w:rPr>
-                <w:rFonts w:ascii="Arial" w:hAnsi="Arial"/>
+                <w:color w:val="000000" w:themeColor="text1"/>
+                <w:sz w:val="16"/>
+                <w:szCs w:val="16"/>
+              </w:rPr>
+            </w:pPr>
+            <w:r>
+              <w:rPr>
+                <w:rFonts w:ascii="Arial" w:hAnsi="Arial"/>
+                <w:color w:val="000000" w:themeColor="text1"/>
                 <w:sz w:val="16"/>
                 <w:szCs w:val="16"/>
               </w:rPr>
@@ -1270,7 +1314,7 @@
             <w:r>
               <w:rPr>
                 <w:rFonts w:ascii="Arial" w:hAnsi="Arial"/>
-                <w:color w:val="auto"/>
+                <w:color w:val="000000" w:themeColor="text1"/>
                 <w:sz w:val="16"/>
                 <w:szCs w:val="16"/>
               </w:rPr>
@@ -1279,6 +1323,7 @@
             <w:r>
               <w:rPr>
                 <w:rFonts w:ascii="Arial" w:hAnsi="Arial"/>
+                <w:color w:val="000000" w:themeColor="text1"/>
                 <w:sz w:val="16"/>
                 <w:szCs w:val="16"/>
               </w:rPr>
@@ -1287,7 +1332,7 @@
             <w:r>
               <w:rPr>
                 <w:rFonts w:ascii="Arial" w:hAnsi="Arial"/>
-                <w:color w:val="auto"/>
+                <w:color w:val="000000" w:themeColor="text1"/>
                 <w:sz w:val="16"/>
                 <w:szCs w:val="16"/>
               </w:rPr>
@@ -1296,6 +1341,7 @@
             <w:r>
               <w:rPr>
                 <w:rFonts w:ascii="Arial" w:hAnsi="Arial"/>
+                <w:color w:val="000000" w:themeColor="text1"/>
                 <w:sz w:val="16"/>
                 <w:szCs w:val="16"/>
               </w:rPr>
@@ -1311,7 +1357,7 @@
             <w:pPr>
               <w:rPr>
                 <w:rFonts w:ascii="Arial" w:hAnsi="Arial"/>
-                <w:color w:val="auto"/>
+                <w:color w:val="000000" w:themeColor="text1"/>
                 <w:sz w:val="16"/>
                 <w:szCs w:val="16"/>
                 <w:lang w:val="es-PE"/>
@@ -1327,7 +1373,7 @@
             <w:pPr>
               <w:rPr>
                 <w:rFonts w:ascii="Arial" w:hAnsi="Arial"/>
-                <w:color w:val="auto"/>
+                <w:color w:val="000000" w:themeColor="text1"/>
                 <w:sz w:val="16"/>
                 <w:szCs w:val="16"/>
               </w:rPr>
@@ -1351,7 +1397,7 @@
               <w:rPr>
                 <w:rFonts w:ascii="Arial" w:hAnsi="Arial"/>
                 <w:b/>
-                <w:color w:val="auto"/>
+                <w:color w:val="000000" w:themeColor="text1"/>
                 <w:sz w:val="16"/>
                 <w:szCs w:val="16"/>
                 <w:lang w:val="es-PE"/>
@@ -1371,7 +1417,7 @@
               <w:rPr>
                 <w:rFonts w:ascii="Arial" w:hAnsi="Arial"/>
                 <w:bCs/>
-                <w:color w:val="auto"/>
+                <w:color w:val="000000" w:themeColor="text1"/>
                 <w:sz w:val="16"/>
                 <w:szCs w:val="16"/>
               </w:rPr>
@@ -1390,7 +1436,7 @@
               <w:rPr>
                 <w:rFonts w:ascii="Arial" w:hAnsi="Arial"/>
                 <w:b/>
-                <w:color w:val="auto"/>
+                <w:color w:val="000000" w:themeColor="text1"/>
                 <w:sz w:val="16"/>
                 <w:szCs w:val="16"/>
                 <w:lang w:val="es-PE"/>
@@ -1410,7 +1456,7 @@
               <w:rPr>
                 <w:rFonts w:ascii="Arial" w:hAnsi="Arial"/>
                 <w:bCs/>
-                <w:color w:val="auto"/>
+                <w:color w:val="000000" w:themeColor="text1"/>
                 <w:sz w:val="16"/>
                 <w:szCs w:val="16"/>
               </w:rPr>
@@ -1436,7 +1482,7 @@
                 <w:rFonts w:ascii="Arial" w:hAnsi="Arial"/>
                 <w:b/>
                 <w:bCs/>
-                <w:color w:val="auto"/>
+                <w:color w:val="000000" w:themeColor="text1"/>
                 <w:sz w:val="16"/>
                 <w:szCs w:val="16"/>
                 <w:u w:val="single"/>
@@ -1458,7 +1504,7 @@
               <w:rPr>
                 <w:rFonts w:ascii="Arial" w:hAnsi="Arial"/>
                 <w:b/>
-                <w:color w:val="auto"/>
+                <w:color w:val="000000" w:themeColor="text1"/>
                 <w:sz w:val="16"/>
                 <w:szCs w:val="16"/>
                 <w:u w:val="single"/>
@@ -1481,17 +1527,17 @@
               <w:rPr>
                 <w:rFonts w:ascii="Arial" w:hAnsi="Arial"/>
                 <w:bCs/>
-                <w:color w:val="auto"/>
-                <w:sz w:val="16"/>
-                <w:szCs w:val="16"/>
-              </w:rPr>
-            </w:pPr>
-            <w:r>
-              <w:rPr>
-                <w:rFonts w:ascii="Arial" w:hAnsi="Arial"/>
-                <w:b/>
-                <w:bCs/>
-                <w:color w:val="auto"/>
+                <w:color w:val="000000" w:themeColor="text1"/>
+                <w:sz w:val="16"/>
+                <w:szCs w:val="16"/>
+              </w:rPr>
+            </w:pPr>
+            <w:r>
+              <w:rPr>
+                <w:rFonts w:ascii="Arial" w:hAnsi="Arial"/>
+                <w:b/>
+                <w:bCs/>
+                <w:color w:val="000000" w:themeColor="text1"/>
                 <w:sz w:val="16"/>
                 <w:szCs w:val="16"/>
                 <w:u w:val="single"/>
@@ -1504,7 +1550,7 @@
                 <w:rFonts w:ascii="Arial" w:hAnsi="Arial"/>
                 <w:b/>
                 <w:bCs/>
-                <w:color w:val="auto"/>
+                <w:color w:val="000000" w:themeColor="text1"/>
                 <w:sz w:val="16"/>
                 <w:szCs w:val="16"/>
                 <w:u w:val="single"/>
@@ -1524,7 +1570,7 @@
               <w:rPr>
                 <w:rFonts w:ascii="Arial" w:hAnsi="Arial"/>
                 <w:b/>
-                <w:color w:val="auto"/>
+                <w:color w:val="000000" w:themeColor="text1"/>
                 <w:sz w:val="16"/>
                 <w:szCs w:val="16"/>
                 <w:u w:val="single"/>
@@ -1534,7 +1580,7 @@
               <w:rPr>
                 <w:rFonts w:ascii="Arial" w:hAnsi="Arial"/>
                 <w:b/>
-                <w:color w:val="auto"/>
+                <w:color w:val="000000" w:themeColor="text1"/>
                 <w:sz w:val="16"/>
                 <w:szCs w:val="16"/>
                 <w:u w:val="single"/>
@@ -1545,7 +1591,7 @@
               <w:rPr>
                 <w:rFonts w:ascii="Arial" w:hAnsi="Arial"/>
                 <w:b/>
-                <w:color w:val="auto"/>
+                <w:color w:val="000000" w:themeColor="text1"/>
                 <w:sz w:val="16"/>
                 <w:szCs w:val="16"/>
                 <w:u w:val="single"/>
@@ -1569,17 +1615,17 @@
                 <w:rFonts w:ascii="Arial" w:hAnsi="Arial"/>
                 <w:b/>
                 <w:bCs/>
-                <w:color w:val="auto"/>
-                <w:sz w:val="16"/>
-                <w:szCs w:val="16"/>
-              </w:rPr>
-            </w:pPr>
-            <w:r>
-              <w:rPr>
-                <w:rFonts w:ascii="Arial" w:hAnsi="Arial"/>
-                <w:b/>
-                <w:bCs/>
-                <w:color w:val="auto"/>
+                <w:color w:val="000000" w:themeColor="text1"/>
+                <w:sz w:val="16"/>
+                <w:szCs w:val="16"/>
+              </w:rPr>
+            </w:pPr>
+            <w:r>
+              <w:rPr>
+                <w:rFonts w:ascii="Arial" w:hAnsi="Arial"/>
+                <w:b/>
+                <w:bCs/>
+                <w:color w:val="000000" w:themeColor="text1"/>
                 <w:sz w:val="16"/>
                 <w:szCs w:val="16"/>
                 <w:lang w:val="es-PE"/>
@@ -1591,7 +1637,7 @@
                 <w:rFonts w:ascii="Arial" w:hAnsi="Arial"/>
                 <w:b/>
                 <w:bCs/>
-                <w:color w:val="auto"/>
+                <w:color w:val="000000" w:themeColor="text1"/>
                 <w:sz w:val="16"/>
                 <w:szCs w:val="16"/>
                 <w:lang w:val="es-PE"/>
@@ -1608,14 +1654,15 @@
             <w:pPr>
               <w:rPr>
                 <w:rFonts w:ascii="Arial" w:hAnsi="Arial"/>
-                <w:color w:val="auto"/>
-                <w:sz w:val="16"/>
-                <w:szCs w:val="16"/>
-              </w:rPr>
-            </w:pPr>
-            <w:r>
-              <w:rPr>
-                <w:rFonts w:ascii="Arial" w:hAnsi="Arial"/>
+                <w:color w:val="000000" w:themeColor="text1"/>
+                <w:sz w:val="16"/>
+                <w:szCs w:val="16"/>
+              </w:rPr>
+            </w:pPr>
+            <w:r>
+              <w:rPr>
+                <w:rFonts w:ascii="Arial" w:hAnsi="Arial"/>
+                <w:color w:val="000000" w:themeColor="text1"/>
                 <w:sz w:val="16"/>
                 <w:szCs w:val="16"/>
               </w:rPr>
@@ -1624,7 +1671,7 @@
             <w:r>
               <w:rPr>
                 <w:rFonts w:ascii="Arial" w:hAnsi="Arial"/>
-                <w:color w:val="auto"/>
+                <w:color w:val="000000" w:themeColor="text1"/>
                 <w:sz w:val="16"/>
                 <w:szCs w:val="16"/>
               </w:rPr>
@@ -1633,6 +1680,7 @@
             <w:r>
               <w:rPr>
                 <w:rFonts w:ascii="Arial" w:hAnsi="Arial"/>
+                <w:color w:val="000000" w:themeColor="text1"/>
                 <w:sz w:val="16"/>
                 <w:szCs w:val="16"/>
               </w:rPr>
@@ -1641,7 +1689,7 @@
             <w:r>
               <w:rPr>
                 <w:rFonts w:ascii="Arial" w:hAnsi="Arial"/>
-                <w:color w:val="auto"/>
+                <w:color w:val="000000" w:themeColor="text1"/>
                 <w:sz w:val="16"/>
                 <w:szCs w:val="16"/>
               </w:rPr>
@@ -1650,6 +1698,7 @@
             <w:r>
               <w:rPr>
                 <w:rFonts w:ascii="Arial" w:hAnsi="Arial"/>
+                <w:color w:val="000000" w:themeColor="text1"/>
                 <w:sz w:val="16"/>
                 <w:szCs w:val="16"/>
               </w:rPr>
@@ -1667,17 +1716,17 @@
                 <w:rFonts w:ascii="Arial" w:hAnsi="Arial"/>
                 <w:b/>
                 <w:bCs/>
-                <w:color w:val="auto"/>
-                <w:sz w:val="16"/>
-                <w:szCs w:val="16"/>
-              </w:rPr>
-            </w:pPr>
-            <w:r>
-              <w:rPr>
-                <w:rFonts w:ascii="Arial" w:hAnsi="Arial"/>
-                <w:b/>
-                <w:bCs/>
-                <w:color w:val="auto"/>
+                <w:color w:val="000000" w:themeColor="text1"/>
+                <w:sz w:val="16"/>
+                <w:szCs w:val="16"/>
+              </w:rPr>
+            </w:pPr>
+            <w:r>
+              <w:rPr>
+                <w:rFonts w:ascii="Arial" w:hAnsi="Arial"/>
+                <w:b/>
+                <w:bCs/>
+                <w:color w:val="000000" w:themeColor="text1"/>
                 <w:sz w:val="16"/>
                 <w:szCs w:val="16"/>
                 <w:lang w:val="es-PE"/>
@@ -1694,14 +1743,15 @@
             <w:pPr>
               <w:rPr>
                 <w:rFonts w:ascii="Arial" w:hAnsi="Arial"/>
-                <w:color w:val="auto"/>
-                <w:sz w:val="16"/>
-                <w:szCs w:val="16"/>
-              </w:rPr>
-            </w:pPr>
-            <w:r>
-              <w:rPr>
-                <w:rFonts w:ascii="Arial" w:hAnsi="Arial"/>
+                <w:color w:val="000000" w:themeColor="text1"/>
+                <w:sz w:val="16"/>
+                <w:szCs w:val="16"/>
+              </w:rPr>
+            </w:pPr>
+            <w:r>
+              <w:rPr>
+                <w:rFonts w:ascii="Arial" w:hAnsi="Arial"/>
+                <w:color w:val="000000" w:themeColor="text1"/>
                 <w:sz w:val="16"/>
                 <w:szCs w:val="16"/>
               </w:rPr>
@@ -1710,7 +1760,7 @@
             <w:r>
               <w:rPr>
                 <w:rFonts w:ascii="Arial" w:hAnsi="Arial"/>
-                <w:color w:val="auto"/>
+                <w:color w:val="000000" w:themeColor="text1"/>
                 <w:sz w:val="16"/>
                 <w:szCs w:val="16"/>
               </w:rPr>
@@ -1719,6 +1769,7 @@
             <w:r>
               <w:rPr>
                 <w:rFonts w:ascii="Arial" w:hAnsi="Arial"/>
+                <w:color w:val="000000" w:themeColor="text1"/>
                 <w:sz w:val="16"/>
                 <w:szCs w:val="16"/>
               </w:rPr>
@@ -1727,7 +1778,7 @@
             <w:r>
               <w:rPr>
                 <w:rFonts w:ascii="Arial" w:hAnsi="Arial"/>
-                <w:color w:val="auto"/>
+                <w:color w:val="000000" w:themeColor="text1"/>
                 <w:sz w:val="16"/>
                 <w:szCs w:val="16"/>
               </w:rPr>
@@ -1736,6 +1787,7 @@
             <w:r>
               <w:rPr>
                 <w:rFonts w:ascii="Arial" w:hAnsi="Arial"/>
+                <w:color w:val="000000" w:themeColor="text1"/>
                 <w:sz w:val="16"/>
                 <w:szCs w:val="16"/>
               </w:rPr>
@@ -1758,17 +1810,17 @@
                 <w:rFonts w:ascii="Arial" w:hAnsi="Arial"/>
                 <w:b/>
                 <w:bCs/>
-                <w:color w:val="auto"/>
-                <w:sz w:val="16"/>
-                <w:szCs w:val="16"/>
-              </w:rPr>
-            </w:pPr>
-            <w:r>
-              <w:rPr>
-                <w:rFonts w:ascii="Arial" w:hAnsi="Arial"/>
-                <w:b/>
-                <w:bCs/>
-                <w:color w:val="auto"/>
+                <w:color w:val="000000" w:themeColor="text1"/>
+                <w:sz w:val="16"/>
+                <w:szCs w:val="16"/>
+              </w:rPr>
+            </w:pPr>
+            <w:r>
+              <w:rPr>
+                <w:rFonts w:ascii="Arial" w:hAnsi="Arial"/>
+                <w:b/>
+                <w:bCs/>
+                <w:color w:val="000000" w:themeColor="text1"/>
                 <w:sz w:val="16"/>
                 <w:szCs w:val="16"/>
                 <w:lang w:val="es-PE"/>
@@ -1780,7 +1832,7 @@
                 <w:rFonts w:ascii="Arial" w:hAnsi="Arial"/>
                 <w:b/>
                 <w:bCs/>
-                <w:color w:val="auto"/>
+                <w:color w:val="000000" w:themeColor="text1"/>
                 <w:sz w:val="16"/>
                 <w:szCs w:val="16"/>
                 <w:lang w:val="es-PE"/>
@@ -1797,14 +1849,15 @@
             <w:pPr>
               <w:rPr>
                 <w:rFonts w:ascii="Arial" w:hAnsi="Arial"/>
-                <w:color w:val="auto"/>
-                <w:sz w:val="16"/>
-                <w:szCs w:val="16"/>
-              </w:rPr>
-            </w:pPr>
-            <w:r>
-              <w:rPr>
-                <w:rFonts w:ascii="Arial" w:hAnsi="Arial"/>
+                <w:color w:val="000000" w:themeColor="text1"/>
+                <w:sz w:val="16"/>
+                <w:szCs w:val="16"/>
+              </w:rPr>
+            </w:pPr>
+            <w:r>
+              <w:rPr>
+                <w:rFonts w:ascii="Arial" w:hAnsi="Arial"/>
+                <w:color w:val="000000" w:themeColor="text1"/>
                 <w:sz w:val="16"/>
                 <w:szCs w:val="16"/>
               </w:rPr>
@@ -1813,7 +1866,7 @@
             <w:r>
               <w:rPr>
                 <w:rFonts w:ascii="Arial" w:hAnsi="Arial"/>
-                <w:color w:val="auto"/>
+                <w:color w:val="000000" w:themeColor="text1"/>
                 <w:sz w:val="16"/>
                 <w:szCs w:val="16"/>
               </w:rPr>
@@ -1822,6 +1875,7 @@
             <w:r>
               <w:rPr>
                 <w:rFonts w:ascii="Arial" w:hAnsi="Arial"/>
+                <w:color w:val="000000" w:themeColor="text1"/>
                 <w:sz w:val="16"/>
                 <w:szCs w:val="16"/>
               </w:rPr>
@@ -1830,7 +1884,7 @@
             <w:r>
               <w:rPr>
                 <w:rFonts w:ascii="Arial" w:hAnsi="Arial"/>
-                <w:color w:val="auto"/>
+                <w:color w:val="000000" w:themeColor="text1"/>
                 <w:sz w:val="16"/>
                 <w:szCs w:val="16"/>
               </w:rPr>
@@ -1839,6 +1893,7 @@
             <w:r>
               <w:rPr>
                 <w:rFonts w:ascii="Arial" w:hAnsi="Arial"/>
+                <w:color w:val="000000" w:themeColor="text1"/>
                 <w:sz w:val="16"/>
                 <w:szCs w:val="16"/>
               </w:rPr>
@@ -1856,17 +1911,17 @@
                 <w:rFonts w:ascii="Arial" w:hAnsi="Arial"/>
                 <w:b/>
                 <w:bCs/>
-                <w:color w:val="auto"/>
-                <w:sz w:val="16"/>
-                <w:szCs w:val="16"/>
-              </w:rPr>
-            </w:pPr>
-            <w:r>
-              <w:rPr>
-                <w:rFonts w:ascii="Arial" w:hAnsi="Arial"/>
-                <w:b/>
-                <w:bCs/>
-                <w:color w:val="auto"/>
+                <w:color w:val="000000" w:themeColor="text1"/>
+                <w:sz w:val="16"/>
+                <w:szCs w:val="16"/>
+              </w:rPr>
+            </w:pPr>
+            <w:r>
+              <w:rPr>
+                <w:rFonts w:ascii="Arial" w:hAnsi="Arial"/>
+                <w:b/>
+                <w:bCs/>
+                <w:color w:val="000000" w:themeColor="text1"/>
                 <w:sz w:val="16"/>
                 <w:szCs w:val="16"/>
                 <w:lang w:val="es-PE"/>
@@ -1883,14 +1938,15 @@
             <w:pPr>
               <w:rPr>
                 <w:rFonts w:ascii="Arial" w:hAnsi="Arial"/>
-                <w:color w:val="auto"/>
-                <w:sz w:val="16"/>
-                <w:szCs w:val="16"/>
-              </w:rPr>
-            </w:pPr>
-            <w:r>
-              <w:rPr>
-                <w:rFonts w:ascii="Arial" w:hAnsi="Arial"/>
+                <w:color w:val="000000" w:themeColor="text1"/>
+                <w:sz w:val="16"/>
+                <w:szCs w:val="16"/>
+              </w:rPr>
+            </w:pPr>
+            <w:r>
+              <w:rPr>
+                <w:rFonts w:ascii="Arial" w:hAnsi="Arial"/>
+                <w:color w:val="000000" w:themeColor="text1"/>
                 <w:sz w:val="16"/>
                 <w:szCs w:val="16"/>
               </w:rPr>
@@ -1899,7 +1955,7 @@
             <w:r>
               <w:rPr>
                 <w:rFonts w:ascii="Arial" w:hAnsi="Arial"/>
-                <w:color w:val="auto"/>
+                <w:color w:val="000000" w:themeColor="text1"/>
                 <w:sz w:val="16"/>
                 <w:szCs w:val="16"/>
               </w:rPr>
@@ -1908,6 +1964,7 @@
             <w:r>
               <w:rPr>
                 <w:rFonts w:ascii="Arial" w:hAnsi="Arial"/>
+                <w:color w:val="000000" w:themeColor="text1"/>
                 <w:sz w:val="16"/>
                 <w:szCs w:val="16"/>
               </w:rPr>
@@ -1916,7 +1973,7 @@
             <w:r>
               <w:rPr>
                 <w:rFonts w:ascii="Arial" w:hAnsi="Arial"/>
-                <w:color w:val="auto"/>
+                <w:color w:val="000000" w:themeColor="text1"/>
                 <w:sz w:val="16"/>
                 <w:szCs w:val="16"/>
               </w:rPr>
@@ -1925,6 +1982,7 @@
             <w:r>
               <w:rPr>
                 <w:rFonts w:ascii="Arial" w:hAnsi="Arial"/>
+                <w:color w:val="000000" w:themeColor="text1"/>
                 <w:sz w:val="16"/>
                 <w:szCs w:val="16"/>
               </w:rPr>
@@ -1947,7 +2005,7 @@
                 <w:rFonts w:ascii="Arial" w:hAnsi="Arial"/>
                 <w:b/>
                 <w:bCs/>
-                <w:color w:val="auto"/>
+                <w:color w:val="000000" w:themeColor="text1"/>
                 <w:sz w:val="16"/>
                 <w:szCs w:val="16"/>
               </w:rPr>
@@ -1958,7 +2016,7 @@
                 <w:rFonts w:ascii="Arial" w:hAnsi="Arial"/>
                 <w:b/>
                 <w:bCs/>
-                <w:color w:val="auto"/>
+                <w:color w:val="000000" w:themeColor="text1"/>
                 <w:sz w:val="16"/>
                 <w:szCs w:val="16"/>
                 <w:lang w:val="es-PE"/>
@@ -1971,7 +2029,7 @@
                 <w:rFonts w:ascii="Arial" w:hAnsi="Arial"/>
                 <w:b/>
                 <w:bCs/>
-                <w:color w:val="auto"/>
+                <w:color w:val="000000" w:themeColor="text1"/>
                 <w:sz w:val="16"/>
                 <w:szCs w:val="16"/>
                 <w:lang w:val="es-PE"/>
@@ -1983,7 +2041,7 @@
                 <w:rFonts w:ascii="Arial" w:hAnsi="Arial"/>
                 <w:b/>
                 <w:bCs/>
-                <w:color w:val="auto"/>
+                <w:color w:val="000000" w:themeColor="text1"/>
                 <w:sz w:val="16"/>
                 <w:szCs w:val="16"/>
                 <w:lang w:val="es-PE"/>
@@ -1995,7 +2053,7 @@
                 <w:rFonts w:ascii="Arial" w:hAnsi="Arial"/>
                 <w:b/>
                 <w:bCs/>
-                <w:color w:val="auto"/>
+                <w:color w:val="000000" w:themeColor="text1"/>
                 <w:sz w:val="16"/>
                 <w:szCs w:val="16"/>
                 <w:lang w:val="es-PE"/>
@@ -2012,14 +2070,15 @@
             <w:pPr>
               <w:rPr>
                 <w:rFonts w:ascii="Arial" w:hAnsi="Arial"/>
-                <w:color w:val="auto"/>
-                <w:sz w:val="16"/>
-                <w:szCs w:val="16"/>
-              </w:rPr>
-            </w:pPr>
-            <w:r>
-              <w:rPr>
-                <w:rFonts w:ascii="Arial" w:hAnsi="Arial"/>
+                <w:color w:val="000000" w:themeColor="text1"/>
+                <w:sz w:val="16"/>
+                <w:szCs w:val="16"/>
+              </w:rPr>
+            </w:pPr>
+            <w:r>
+              <w:rPr>
+                <w:rFonts w:ascii="Arial" w:hAnsi="Arial"/>
+                <w:color w:val="000000" w:themeColor="text1"/>
                 <w:sz w:val="16"/>
                 <w:szCs w:val="16"/>
               </w:rPr>
@@ -2028,7 +2087,7 @@
             <w:r>
               <w:rPr>
                 <w:rFonts w:ascii="Arial" w:hAnsi="Arial"/>
-                <w:color w:val="auto"/>
+                <w:color w:val="000000" w:themeColor="text1"/>
                 <w:sz w:val="16"/>
                 <w:szCs w:val="16"/>
               </w:rPr>
@@ -2037,6 +2096,7 @@
             <w:r>
               <w:rPr>
                 <w:rFonts w:ascii="Arial" w:hAnsi="Arial"/>
+                <w:color w:val="000000" w:themeColor="text1"/>
                 <w:sz w:val="16"/>
                 <w:szCs w:val="16"/>
               </w:rPr>
@@ -2045,7 +2105,7 @@
             <w:r>
               <w:rPr>
                 <w:rFonts w:ascii="Arial" w:hAnsi="Arial"/>
-                <w:color w:val="auto"/>
+                <w:color w:val="000000" w:themeColor="text1"/>
                 <w:sz w:val="16"/>
                 <w:szCs w:val="16"/>
               </w:rPr>
@@ -2054,6 +2114,7 @@
             <w:r>
               <w:rPr>
                 <w:rFonts w:ascii="Arial" w:hAnsi="Arial"/>
+                <w:color w:val="000000" w:themeColor="text1"/>
                 <w:sz w:val="16"/>
                 <w:szCs w:val="16"/>
               </w:rPr>
@@ -2071,17 +2132,17 @@
                 <w:rFonts w:ascii="Arial" w:hAnsi="Arial"/>
                 <w:b/>
                 <w:bCs/>
-                <w:color w:val="auto"/>
-                <w:sz w:val="16"/>
-                <w:szCs w:val="16"/>
-              </w:rPr>
-            </w:pPr>
-            <w:r>
-              <w:rPr>
-                <w:rFonts w:ascii="Arial" w:hAnsi="Arial"/>
-                <w:b/>
-                <w:bCs/>
-                <w:color w:val="auto"/>
+                <w:color w:val="000000" w:themeColor="text1"/>
+                <w:sz w:val="16"/>
+                <w:szCs w:val="16"/>
+              </w:rPr>
+            </w:pPr>
+            <w:r>
+              <w:rPr>
+                <w:rFonts w:ascii="Arial" w:hAnsi="Arial"/>
+                <w:b/>
+                <w:bCs/>
+                <w:color w:val="000000" w:themeColor="text1"/>
                 <w:sz w:val="16"/>
                 <w:szCs w:val="16"/>
                 <w:lang w:val="es-PE"/>
@@ -2098,14 +2159,15 @@
             <w:pPr>
               <w:rPr>
                 <w:rFonts w:ascii="Arial" w:hAnsi="Arial"/>
-                <w:color w:val="auto"/>
-                <w:sz w:val="16"/>
-                <w:szCs w:val="16"/>
-              </w:rPr>
-            </w:pPr>
-            <w:r>
-              <w:rPr>
-                <w:rFonts w:ascii="Arial" w:hAnsi="Arial"/>
+                <w:color w:val="000000" w:themeColor="text1"/>
+                <w:sz w:val="16"/>
+                <w:szCs w:val="16"/>
+              </w:rPr>
+            </w:pPr>
+            <w:r>
+              <w:rPr>
+                <w:rFonts w:ascii="Arial" w:hAnsi="Arial"/>
+                <w:color w:val="000000" w:themeColor="text1"/>
                 <w:sz w:val="16"/>
                 <w:szCs w:val="16"/>
               </w:rPr>
@@ -2114,7 +2176,7 @@
             <w:r>
               <w:rPr>
                 <w:rFonts w:ascii="Arial" w:hAnsi="Arial"/>
-                <w:color w:val="auto"/>
+                <w:color w:val="000000" w:themeColor="text1"/>
                 <w:sz w:val="16"/>
                 <w:szCs w:val="16"/>
               </w:rPr>
@@ -2123,6 +2185,7 @@
             <w:r>
               <w:rPr>
                 <w:rFonts w:ascii="Arial" w:hAnsi="Arial"/>
+                <w:color w:val="000000" w:themeColor="text1"/>
                 <w:sz w:val="16"/>
                 <w:szCs w:val="16"/>
               </w:rPr>
@@ -2131,7 +2194,7 @@
             <w:r>
               <w:rPr>
                 <w:rFonts w:ascii="Arial" w:hAnsi="Arial"/>
-                <w:color w:val="auto"/>
+                <w:color w:val="000000" w:themeColor="text1"/>
                 <w:sz w:val="16"/>
                 <w:szCs w:val="16"/>
               </w:rPr>
@@ -2140,6 +2203,7 @@
             <w:r>
               <w:rPr>
                 <w:rFonts w:ascii="Arial" w:hAnsi="Arial"/>
+                <w:color w:val="000000" w:themeColor="text1"/>
                 <w:sz w:val="16"/>
                 <w:szCs w:val="16"/>
               </w:rPr>
@@ -2162,7 +2226,7 @@
                 <w:rFonts w:ascii="Arial" w:hAnsi="Arial"/>
                 <w:b/>
                 <w:bCs/>
-                <w:color w:val="auto"/>
+                <w:color w:val="000000" w:themeColor="text1"/>
                 <w:sz w:val="16"/>
                 <w:szCs w:val="16"/>
                 <w:lang w:val="es-PE"/>
@@ -2174,7 +2238,7 @@
                 <w:rFonts w:ascii="Arial" w:hAnsi="Arial"/>
                 <w:b/>
                 <w:bCs/>
-                <w:color w:val="auto"/>
+                <w:color w:val="000000" w:themeColor="text1"/>
                 <w:sz w:val="16"/>
                 <w:szCs w:val="16"/>
                 <w:lang w:val="es-PE"/>
@@ -2187,7 +2251,7 @@
                 <w:rFonts w:ascii="Arial" w:hAnsi="Arial"/>
                 <w:b/>
                 <w:bCs/>
-                <w:color w:val="auto"/>
+                <w:color w:val="000000" w:themeColor="text1"/>
                 <w:sz w:val="16"/>
                 <w:szCs w:val="16"/>
                 <w:lang w:val="es-PE"/>
@@ -2204,14 +2268,15 @@
             <w:pPr>
               <w:rPr>
                 <w:rFonts w:ascii="Arial" w:hAnsi="Arial"/>
-                <w:color w:val="auto"/>
-                <w:sz w:val="16"/>
-                <w:szCs w:val="16"/>
-              </w:rPr>
-            </w:pPr>
-            <w:r>
-              <w:rPr>
-                <w:rFonts w:ascii="Arial" w:hAnsi="Arial"/>
+                <w:color w:val="000000" w:themeColor="text1"/>
+                <w:sz w:val="16"/>
+                <w:szCs w:val="16"/>
+              </w:rPr>
+            </w:pPr>
+            <w:r>
+              <w:rPr>
+                <w:rFonts w:ascii="Arial" w:hAnsi="Arial"/>
+                <w:color w:val="000000" w:themeColor="text1"/>
                 <w:sz w:val="16"/>
                 <w:szCs w:val="16"/>
               </w:rPr>
@@ -2220,7 +2285,7 @@
             <w:r>
               <w:rPr>
                 <w:rFonts w:ascii="Arial" w:hAnsi="Arial"/>
-                <w:color w:val="auto"/>
+                <w:color w:val="000000" w:themeColor="text1"/>
                 <w:sz w:val="16"/>
                 <w:szCs w:val="16"/>
               </w:rPr>
@@ -2229,6 +2294,7 @@
             <w:r>
               <w:rPr>
                 <w:rFonts w:ascii="Arial" w:hAnsi="Arial"/>
+                <w:color w:val="000000" w:themeColor="text1"/>
                 <w:sz w:val="16"/>
                 <w:szCs w:val="16"/>
               </w:rPr>
@@ -2237,7 +2303,7 @@
             <w:r>
               <w:rPr>
                 <w:rFonts w:ascii="Arial" w:hAnsi="Arial"/>
-                <w:color w:val="auto"/>
+                <w:color w:val="000000" w:themeColor="text1"/>
                 <w:sz w:val="16"/>
                 <w:szCs w:val="16"/>
               </w:rPr>
@@ -2246,6 +2312,7 @@
             <w:r>
               <w:rPr>
                 <w:rFonts w:ascii="Arial" w:hAnsi="Arial"/>
+                <w:color w:val="000000" w:themeColor="text1"/>
                 <w:sz w:val="16"/>
                 <w:szCs w:val="16"/>
               </w:rPr>
@@ -2263,7 +2330,7 @@
                 <w:rFonts w:ascii="Arial" w:hAnsi="Arial"/>
                 <w:b/>
                 <w:bCs/>
-                <w:color w:val="auto"/>
+                <w:color w:val="000000" w:themeColor="text1"/>
                 <w:sz w:val="16"/>
                 <w:szCs w:val="16"/>
                 <w:lang w:val="es-PE"/>
@@ -2274,7 +2341,7 @@
                 <w:rFonts w:ascii="Arial" w:hAnsi="Arial"/>
                 <w:b/>
                 <w:bCs/>
-                <w:color w:val="auto"/>
+                <w:color w:val="000000" w:themeColor="text1"/>
                 <w:sz w:val="16"/>
                 <w:szCs w:val="16"/>
                 <w:lang w:val="es-PE"/>
@@ -2291,14 +2358,15 @@
             <w:pPr>
               <w:rPr>
                 <w:rFonts w:ascii="Arial" w:hAnsi="Arial"/>
-                <w:color w:val="auto"/>
-                <w:sz w:val="16"/>
-                <w:szCs w:val="16"/>
-              </w:rPr>
-            </w:pPr>
-            <w:r>
-              <w:rPr>
-                <w:rFonts w:ascii="Arial" w:hAnsi="Arial"/>
+                <w:color w:val="000000" w:themeColor="text1"/>
+                <w:sz w:val="16"/>
+                <w:szCs w:val="16"/>
+              </w:rPr>
+            </w:pPr>
+            <w:r>
+              <w:rPr>
+                <w:rFonts w:ascii="Arial" w:hAnsi="Arial"/>
+                <w:color w:val="000000" w:themeColor="text1"/>
                 <w:sz w:val="16"/>
                 <w:szCs w:val="16"/>
               </w:rPr>
@@ -2307,7 +2375,7 @@
             <w:r>
               <w:rPr>
                 <w:rFonts w:ascii="Arial" w:hAnsi="Arial"/>
-                <w:color w:val="auto"/>
+                <w:color w:val="000000" w:themeColor="text1"/>
                 <w:sz w:val="16"/>
                 <w:szCs w:val="16"/>
               </w:rPr>
@@ -2316,6 +2384,7 @@
             <w:r>
               <w:rPr>
                 <w:rFonts w:ascii="Arial" w:hAnsi="Arial"/>
+                <w:color w:val="000000" w:themeColor="text1"/>
                 <w:sz w:val="16"/>
                 <w:szCs w:val="16"/>
               </w:rPr>
@@ -2324,7 +2393,7 @@
             <w:r>
               <w:rPr>
                 <w:rFonts w:ascii="Arial" w:hAnsi="Arial"/>
-                <w:color w:val="auto"/>
+                <w:color w:val="000000" w:themeColor="text1"/>
                 <w:sz w:val="16"/>
                 <w:szCs w:val="16"/>
               </w:rPr>
@@ -2333,6 +2402,7 @@
             <w:r>
               <w:rPr>
                 <w:rFonts w:ascii="Arial" w:hAnsi="Arial"/>
+                <w:color w:val="000000" w:themeColor="text1"/>
                 <w:sz w:val="16"/>
                 <w:szCs w:val="16"/>
               </w:rPr>
@@ -2341,7 +2411,7 @@
             <w:r>
               <w:rPr>
                 <w:rFonts w:ascii="Arial" w:hAnsi="Arial"/>
-                <w:color w:val="auto"/>
+                <w:color w:val="000000" w:themeColor="text1"/>
                 <w:sz w:val="16"/>
                 <w:szCs w:val="16"/>
               </w:rPr>
@@ -2363,7 +2433,7 @@
               <w:rPr>
                 <w:rFonts w:ascii="Arial" w:hAnsi="Arial"/>
                 <w:b/>
-                <w:color w:val="auto"/>
+                <w:color w:val="000000" w:themeColor="text1"/>
                 <w:sz w:val="16"/>
                 <w:szCs w:val="16"/>
                 <w:lang w:val="es-PE"/>
@@ -2380,7 +2450,7 @@
               <w:rPr>
                 <w:rFonts w:ascii="Arial" w:hAnsi="Arial"/>
                 <w:bCs/>
-                <w:color w:val="auto"/>
+                <w:color w:val="000000" w:themeColor="text1"/>
                 <w:sz w:val="16"/>
                 <w:szCs w:val="16"/>
               </w:rPr>
@@ -2396,7 +2466,7 @@
               <w:rPr>
                 <w:rFonts w:ascii="Arial" w:hAnsi="Arial"/>
                 <w:b/>
-                <w:color w:val="auto"/>
+                <w:color w:val="000000" w:themeColor="text1"/>
                 <w:sz w:val="16"/>
                 <w:szCs w:val="16"/>
                 <w:lang w:val="es-PE"/>
@@ -2413,7 +2483,7 @@
               <w:rPr>
                 <w:rFonts w:ascii="Arial" w:hAnsi="Arial"/>
                 <w:bCs/>
-                <w:color w:val="auto"/>
+                <w:color w:val="000000" w:themeColor="text1"/>
                 <w:sz w:val="16"/>
                 <w:szCs w:val="16"/>
               </w:rPr>
@@ -2434,7 +2504,7 @@
               <w:rPr>
                 <w:rFonts w:ascii="Arial" w:hAnsi="Arial"/>
                 <w:b/>
-                <w:color w:val="auto"/>
+                <w:color w:val="000000" w:themeColor="text1"/>
                 <w:sz w:val="16"/>
                 <w:szCs w:val="16"/>
                 <w:lang w:val="es-PE"/>
@@ -2444,7 +2514,7 @@
               <w:rPr>
                 <w:rFonts w:ascii="Arial" w:hAnsi="Arial"/>
                 <w:b/>
-                <w:color w:val="auto"/>
+                <w:color w:val="000000" w:themeColor="text1"/>
                 <w:sz w:val="16"/>
                 <w:szCs w:val="16"/>
                 <w:lang w:val="es-PE"/>
@@ -2462,7 +2532,7 @@
               <w:rPr>
                 <w:rFonts w:ascii="Arial" w:hAnsi="Arial"/>
                 <w:bCs/>
-                <w:color w:val="auto"/>
+                <w:color w:val="000000" w:themeColor="text1"/>
                 <w:sz w:val="16"/>
                 <w:szCs w:val="16"/>
               </w:rPr>
@@ -2478,7 +2548,7 @@
               <w:rPr>
                 <w:rFonts w:ascii="Arial" w:hAnsi="Arial"/>
                 <w:b/>
-                <w:color w:val="auto"/>
+                <w:color w:val="000000" w:themeColor="text1"/>
                 <w:sz w:val="16"/>
                 <w:szCs w:val="16"/>
                 <w:lang w:val="es-PE"/>
@@ -2495,7 +2565,7 @@
               <w:rPr>
                 <w:rFonts w:ascii="Arial" w:hAnsi="Arial"/>
                 <w:bCs/>
-                <w:color w:val="auto"/>
+                <w:color w:val="000000" w:themeColor="text1"/>
                 <w:sz w:val="16"/>
                 <w:szCs w:val="16"/>
               </w:rPr>
@@ -2545,6 +2615,7 @@
               <w:rPr>
                 <w:rFonts w:ascii="Arial" w:hAnsi="Arial"/>
                 <w:b/>
+                <w:color w:val="000000" w:themeColor="text1"/>
                 <w:w w:val="96"/>
                 <w:sz w:val="16"/>
                 <w:szCs w:val="16"/>
@@ -2555,6 +2626,7 @@
               <w:rPr>
                 <w:rFonts w:ascii="Arial" w:hAnsi="Arial"/>
                 <w:b/>
+                <w:color w:val="000000" w:themeColor="text1"/>
                 <w:w w:val="96"/>
                 <w:sz w:val="16"/>
                 <w:szCs w:val="16"/>
@@ -2579,6 +2651,7 @@
               <w:rPr>
                 <w:rFonts w:ascii="Arial" w:hAnsi="Arial"/>
                 <w:b/>
+                <w:color w:val="000000" w:themeColor="text1"/>
                 <w:w w:val="96"/>
                 <w:sz w:val="16"/>
                 <w:szCs w:val="16"/>
@@ -2588,6 +2661,7 @@
               <w:rPr>
                 <w:rFonts w:ascii="Arial" w:hAnsi="Arial"/>
                 <w:b/>
+                <w:color w:val="000000" w:themeColor="text1"/>
                 <w:w w:val="96"/>
                 <w:sz w:val="16"/>
                 <w:szCs w:val="16"/>
@@ -2611,6 +2685,7 @@
               <w:rPr>
                 <w:rFonts w:ascii="Arial" w:hAnsi="Arial"/>
                 <w:b/>
+                <w:color w:val="000000" w:themeColor="text1"/>
                 <w:w w:val="96"/>
                 <w:sz w:val="16"/>
                 <w:szCs w:val="16"/>
@@ -2620,6 +2695,7 @@
               <w:rPr>
                 <w:rFonts w:ascii="Arial" w:hAnsi="Arial"/>
                 <w:b/>
+                <w:color w:val="000000" w:themeColor="text1"/>
                 <w:w w:val="96"/>
                 <w:sz w:val="16"/>
                 <w:szCs w:val="16"/>
@@ -2643,6 +2719,7 @@
               <w:rPr>
                 <w:rFonts w:ascii="Arial" w:hAnsi="Arial"/>
                 <w:b/>
+                <w:color w:val="000000" w:themeColor="text1"/>
                 <w:w w:val="96"/>
                 <w:sz w:val="16"/>
                 <w:szCs w:val="16"/>
@@ -2652,6 +2729,7 @@
               <w:rPr>
                 <w:rFonts w:ascii="Arial" w:hAnsi="Arial"/>
                 <w:b/>
+                <w:color w:val="000000" w:themeColor="text1"/>
                 <w:w w:val="96"/>
                 <w:sz w:val="16"/>
                 <w:szCs w:val="16"/>
@@ -2675,6 +2753,7 @@
               <w:rPr>
                 <w:rFonts w:ascii="Arial" w:hAnsi="Arial"/>
                 <w:b/>
+                <w:color w:val="000000" w:themeColor="text1"/>
                 <w:w w:val="96"/>
                 <w:sz w:val="16"/>
                 <w:szCs w:val="16"/>
@@ -2685,6 +2764,7 @@
               <w:rPr>
                 <w:rFonts w:ascii="Arial" w:hAnsi="Arial"/>
                 <w:b/>
+                <w:color w:val="000000" w:themeColor="text1"/>
                 <w:w w:val="96"/>
                 <w:sz w:val="16"/>
                 <w:szCs w:val="16"/>
@@ -2709,6 +2789,7 @@
               <w:rPr>
                 <w:rFonts w:ascii="Arial" w:hAnsi="Arial"/>
                 <w:b/>
+                <w:color w:val="000000" w:themeColor="text1"/>
                 <w:w w:val="96"/>
                 <w:sz w:val="16"/>
                 <w:szCs w:val="16"/>
@@ -2719,6 +2800,7 @@
               <w:rPr>
                 <w:rFonts w:ascii="Arial" w:hAnsi="Arial"/>
                 <w:b/>
+                <w:color w:val="000000" w:themeColor="text1"/>
                 <w:w w:val="96"/>
                 <w:sz w:val="16"/>
                 <w:szCs w:val="16"/>
@@ -2744,6 +2826,7 @@
               <w:rPr>
                 <w:rFonts w:ascii="Arial" w:hAnsi="Arial"/>
                 <w:b/>
+                <w:color w:val="000000" w:themeColor="text1"/>
                 <w:w w:val="96"/>
                 <w:sz w:val="16"/>
                 <w:szCs w:val="16"/>
@@ -2753,6 +2836,7 @@
               <w:rPr>
                 <w:rFonts w:ascii="Arial" w:hAnsi="Arial"/>
                 <w:b/>
+                <w:color w:val="000000" w:themeColor="text1"/>
                 <w:w w:val="96"/>
                 <w:sz w:val="16"/>
                 <w:szCs w:val="16"/>
@@ -2780,6 +2864,7 @@
               <w:rPr>
                 <w:rFonts w:ascii="Arial" w:hAnsi="Arial"/>
                 <w:b/>
+                <w:color w:val="000000" w:themeColor="text1"/>
                 <w:w w:val="96"/>
                 <w:sz w:val="14"/>
                 <w:szCs w:val="14"/>
@@ -2789,6 +2874,7 @@
               <w:rPr>
                 <w:rFonts w:ascii="Arial" w:hAnsi="Arial"/>
                 <w:bCs/>
+                <w:color w:val="000000" w:themeColor="text1"/>
                 <w:sz w:val="14"/>
                 <w:szCs w:val="14"/>
               </w:rPr>
@@ -2798,6 +2884,7 @@
               <w:rPr>
                 <w:rFonts w:ascii="Arial" w:hAnsi="Arial"/>
                 <w:bCs/>
+                <w:color w:val="000000" w:themeColor="text1"/>
                 <w:sz w:val="14"/>
                 <w:szCs w:val="14"/>
               </w:rPr>
@@ -2807,6 +2894,7 @@
               <w:rPr>
                 <w:rFonts w:ascii="Arial" w:hAnsi="Arial"/>
                 <w:bCs/>
+                <w:color w:val="000000" w:themeColor="text1"/>
                 <w:sz w:val="14"/>
                 <w:szCs w:val="14"/>
               </w:rPr>
@@ -2817,6 +2905,7 @@
                 <w:rFonts w:ascii="Arial" w:hAnsi="Arial"/>
                 <w:bCs/>
                 <w:noProof/>
+                <w:color w:val="000000" w:themeColor="text1"/>
                 <w:sz w:val="14"/>
                 <w:szCs w:val="14"/>
               </w:rPr>
@@ -2826,6 +2915,7 @@
               <w:rPr>
                 <w:rFonts w:ascii="Arial" w:hAnsi="Arial"/>
                 <w:bCs/>
+                <w:color w:val="000000" w:themeColor="text1"/>
                 <w:sz w:val="14"/>
                 <w:szCs w:val="14"/>
               </w:rPr>
@@ -2847,6 +2937,7 @@
               <w:rPr>
                 <w:rFonts w:ascii="Arial" w:hAnsi="Arial"/>
                 <w:bCs/>
+                <w:color w:val="000000" w:themeColor="text1"/>
                 <w:sz w:val="14"/>
                 <w:szCs w:val="14"/>
               </w:rPr>
@@ -2855,6 +2946,7 @@
               <w:rPr>
                 <w:rFonts w:ascii="Arial" w:hAnsi="Arial"/>
                 <w:bCs/>
+                <w:color w:val="000000" w:themeColor="text1"/>
                 <w:sz w:val="14"/>
                 <w:szCs w:val="14"/>
               </w:rPr>
@@ -2864,6 +2956,7 @@
               <w:rPr>
                 <w:rFonts w:ascii="Arial" w:hAnsi="Arial"/>
                 <w:bCs/>
+                <w:color w:val="000000" w:themeColor="text1"/>
                 <w:sz w:val="14"/>
                 <w:szCs w:val="14"/>
               </w:rPr>
@@ -2873,6 +2966,7 @@
               <w:rPr>
                 <w:rFonts w:ascii="Arial" w:hAnsi="Arial"/>
                 <w:bCs/>
+                <w:color w:val="000000" w:themeColor="text1"/>
                 <w:sz w:val="14"/>
                 <w:szCs w:val="14"/>
               </w:rPr>
@@ -2883,6 +2977,7 @@
                 <w:rFonts w:ascii="Arial" w:hAnsi="Arial"/>
                 <w:bCs/>
                 <w:noProof/>
+                <w:color w:val="000000" w:themeColor="text1"/>
                 <w:sz w:val="14"/>
                 <w:szCs w:val="14"/>
               </w:rPr>
@@ -2892,6 +2987,7 @@
               <w:rPr>
                 <w:rFonts w:ascii="Arial" w:hAnsi="Arial"/>
                 <w:bCs/>
+                <w:color w:val="000000" w:themeColor="text1"/>
                 <w:sz w:val="14"/>
                 <w:szCs w:val="14"/>
               </w:rPr>
@@ -2913,6 +3009,7 @@
               <w:rPr>
                 <w:rFonts w:ascii="Arial" w:hAnsi="Arial"/>
                 <w:bCs/>
+                <w:color w:val="000000" w:themeColor="text1"/>
                 <w:sz w:val="14"/>
                 <w:szCs w:val="14"/>
               </w:rPr>
@@ -2921,6 +3018,7 @@
               <w:rPr>
                 <w:rFonts w:ascii="Arial" w:hAnsi="Arial"/>
                 <w:bCs/>
+                <w:color w:val="000000" w:themeColor="text1"/>
                 <w:sz w:val="14"/>
                 <w:szCs w:val="14"/>
               </w:rPr>
@@ -2930,6 +3028,7 @@
               <w:rPr>
                 <w:rFonts w:ascii="Arial" w:hAnsi="Arial"/>
                 <w:bCs/>
+                <w:color w:val="000000" w:themeColor="text1"/>
                 <w:sz w:val="14"/>
                 <w:szCs w:val="14"/>
               </w:rPr>
@@ -2939,6 +3038,7 @@
               <w:rPr>
                 <w:rFonts w:ascii="Arial" w:hAnsi="Arial"/>
                 <w:bCs/>
+                <w:color w:val="000000" w:themeColor="text1"/>
                 <w:sz w:val="14"/>
                 <w:szCs w:val="14"/>
               </w:rPr>
@@ -2949,6 +3049,7 @@
                 <w:rFonts w:ascii="Arial" w:hAnsi="Arial"/>
                 <w:bCs/>
                 <w:noProof/>
+                <w:color w:val="000000" w:themeColor="text1"/>
                 <w:sz w:val="14"/>
                 <w:szCs w:val="14"/>
               </w:rPr>
@@ -2958,6 +3059,7 @@
               <w:rPr>
                 <w:rFonts w:ascii="Arial" w:hAnsi="Arial"/>
                 <w:bCs/>
+                <w:color w:val="000000" w:themeColor="text1"/>
                 <w:sz w:val="14"/>
                 <w:szCs w:val="14"/>
               </w:rPr>
@@ -2979,6 +3081,7 @@
               <w:rPr>
                 <w:rFonts w:ascii="Arial" w:hAnsi="Arial"/>
                 <w:b/>
+                <w:color w:val="000000" w:themeColor="text1"/>
                 <w:w w:val="96"/>
                 <w:sz w:val="14"/>
                 <w:szCs w:val="14"/>
@@ -2988,6 +3091,7 @@
               <w:rPr>
                 <w:rFonts w:ascii="Arial" w:hAnsi="Arial"/>
                 <w:bCs/>
+                <w:color w:val="000000" w:themeColor="text1"/>
                 <w:sz w:val="14"/>
                 <w:szCs w:val="14"/>
               </w:rPr>
@@ -2997,6 +3101,7 @@
               <w:rPr>
                 <w:rFonts w:ascii="Arial" w:hAnsi="Arial"/>
                 <w:bCs/>
+                <w:color w:val="000000" w:themeColor="text1"/>
                 <w:sz w:val="14"/>
                 <w:szCs w:val="14"/>
               </w:rPr>
@@ -3006,6 +3111,7 @@
               <w:rPr>
                 <w:rFonts w:ascii="Arial" w:hAnsi="Arial"/>
                 <w:bCs/>
+                <w:color w:val="000000" w:themeColor="text1"/>
                 <w:sz w:val="14"/>
                 <w:szCs w:val="14"/>
               </w:rPr>
@@ -3016,6 +3122,7 @@
                 <w:rFonts w:ascii="Arial" w:hAnsi="Arial"/>
                 <w:bCs/>
                 <w:noProof/>
+                <w:color w:val="000000" w:themeColor="text1"/>
                 <w:sz w:val="14"/>
                 <w:szCs w:val="14"/>
               </w:rPr>
@@ -3025,6 +3132,7 @@
               <w:rPr>
                 <w:rFonts w:ascii="Arial" w:hAnsi="Arial"/>
                 <w:bCs/>
+                <w:color w:val="000000" w:themeColor="text1"/>
                 <w:sz w:val="14"/>
                 <w:szCs w:val="14"/>
               </w:rPr>
@@ -3046,6 +3154,7 @@
               <w:rPr>
                 <w:rFonts w:ascii="Arial" w:hAnsi="Arial"/>
                 <w:b/>
+                <w:color w:val="000000" w:themeColor="text1"/>
                 <w:w w:val="96"/>
                 <w:sz w:val="14"/>
                 <w:szCs w:val="14"/>
@@ -3055,6 +3164,7 @@
               <w:rPr>
                 <w:rFonts w:ascii="Arial" w:hAnsi="Arial"/>
                 <w:bCs/>
+                <w:color w:val="000000" w:themeColor="text1"/>
                 <w:sz w:val="14"/>
                 <w:szCs w:val="14"/>
               </w:rPr>
@@ -3064,6 +3174,7 @@
               <w:rPr>
                 <w:rFonts w:ascii="Arial" w:hAnsi="Arial"/>
                 <w:bCs/>
+                <w:color w:val="000000" w:themeColor="text1"/>
                 <w:sz w:val="14"/>
                 <w:szCs w:val="14"/>
               </w:rPr>
@@ -3073,6 +3184,7 @@
               <w:rPr>
                 <w:rFonts w:ascii="Arial" w:hAnsi="Arial"/>
                 <w:bCs/>
+                <w:color w:val="000000" w:themeColor="text1"/>
                 <w:sz w:val="14"/>
                 <w:szCs w:val="14"/>
               </w:rPr>
@@ -3083,6 +3195,7 @@
                 <w:rFonts w:ascii="Arial" w:hAnsi="Arial"/>
                 <w:bCs/>
                 <w:noProof/>
+                <w:color w:val="000000" w:themeColor="text1"/>
                 <w:sz w:val="14"/>
                 <w:szCs w:val="14"/>
               </w:rPr>
@@ -3092,6 +3205,7 @@
               <w:rPr>
                 <w:rFonts w:ascii="Arial" w:hAnsi="Arial"/>
                 <w:bCs/>
+                <w:color w:val="000000" w:themeColor="text1"/>
                 <w:sz w:val="14"/>
                 <w:szCs w:val="14"/>
               </w:rPr>
@@ -3113,6 +3227,7 @@
               <w:rPr>
                 <w:rFonts w:ascii="Arial" w:hAnsi="Arial"/>
                 <w:b/>
+                <w:color w:val="000000" w:themeColor="text1"/>
                 <w:w w:val="96"/>
                 <w:sz w:val="14"/>
                 <w:szCs w:val="14"/>
@@ -3122,6 +3237,7 @@
               <w:rPr>
                 <w:rFonts w:ascii="Arial" w:hAnsi="Arial"/>
                 <w:bCs/>
+                <w:color w:val="000000" w:themeColor="text1"/>
                 <w:sz w:val="14"/>
                 <w:szCs w:val="14"/>
               </w:rPr>
@@ -3131,6 +3247,7 @@
               <w:rPr>
                 <w:rFonts w:ascii="Arial" w:hAnsi="Arial"/>
                 <w:bCs/>
+                <w:color w:val="000000" w:themeColor="text1"/>
                 <w:sz w:val="14"/>
                 <w:szCs w:val="14"/>
               </w:rPr>
@@ -3140,6 +3257,7 @@
               <w:rPr>
                 <w:rFonts w:ascii="Arial" w:hAnsi="Arial"/>
                 <w:bCs/>
+                <w:color w:val="000000" w:themeColor="text1"/>
                 <w:sz w:val="14"/>
                 <w:szCs w:val="14"/>
               </w:rPr>
@@ -3150,6 +3268,7 @@
                 <w:rFonts w:ascii="Arial" w:hAnsi="Arial"/>
                 <w:bCs/>
                 <w:noProof/>
+                <w:color w:val="000000" w:themeColor="text1"/>
                 <w:sz w:val="14"/>
                 <w:szCs w:val="14"/>
               </w:rPr>
@@ -3159,6 +3278,7 @@
               <w:rPr>
                 <w:rFonts w:ascii="Arial" w:hAnsi="Arial"/>
                 <w:bCs/>
+                <w:color w:val="000000" w:themeColor="text1"/>
                 <w:sz w:val="14"/>
                 <w:szCs w:val="14"/>
               </w:rPr>
@@ -3180,6 +3300,7 @@
               <w:rPr>
                 <w:rFonts w:ascii="Arial" w:hAnsi="Arial"/>
                 <w:b/>
+                <w:color w:val="000000" w:themeColor="text1"/>
                 <w:w w:val="96"/>
                 <w:sz w:val="14"/>
                 <w:szCs w:val="14"/>
@@ -3189,6 +3310,7 @@
               <w:rPr>
                 <w:rFonts w:ascii="Arial" w:hAnsi="Arial"/>
                 <w:bCs/>
+                <w:color w:val="000000" w:themeColor="text1"/>
                 <w:sz w:val="14"/>
                 <w:szCs w:val="14"/>
               </w:rPr>
@@ -3198,6 +3320,7 @@
               <w:rPr>
                 <w:rFonts w:ascii="Arial" w:hAnsi="Arial"/>
                 <w:bCs/>
+                <w:color w:val="000000" w:themeColor="text1"/>
                 <w:sz w:val="14"/>
                 <w:szCs w:val="14"/>
               </w:rPr>
@@ -3207,6 +3330,7 @@
               <w:rPr>
                 <w:rFonts w:ascii="Arial" w:hAnsi="Arial"/>
                 <w:bCs/>
+                <w:color w:val="000000" w:themeColor="text1"/>
                 <w:sz w:val="14"/>
                 <w:szCs w:val="14"/>
               </w:rPr>
@@ -3217,6 +3341,7 @@
                 <w:rFonts w:ascii="Arial" w:hAnsi="Arial"/>
                 <w:bCs/>
                 <w:noProof/>
+                <w:color w:val="000000" w:themeColor="text1"/>
                 <w:sz w:val="14"/>
                 <w:szCs w:val="14"/>
               </w:rPr>
@@ -3226,6 +3351,7 @@
               <w:rPr>
                 <w:rFonts w:ascii="Arial" w:hAnsi="Arial"/>
                 <w:bCs/>
+                <w:color w:val="000000" w:themeColor="text1"/>
                 <w:sz w:val="14"/>
                 <w:szCs w:val="14"/>
               </w:rPr>
@@ -3239,6 +3365,7 @@
       <w:pPr>
         <w:rPr>
           <w:rFonts w:ascii="Arial" w:hAnsi="Arial"/>
+          <w:color w:val="000000" w:themeColor="text1"/>
           <w:sz w:val="16"/>
           <w:szCs w:val="16"/>
         </w:rPr>
@@ -3247,6 +3374,7 @@
         <w:rPr>
           <w:rFonts w:ascii="Arial" w:eastAsia="Times New Roman" w:hAnsi="Arial"/>
           <w:vanish/>
+          <w:color w:val="000000" w:themeColor="text1"/>
           <w:sz w:val="16"/>
           <w:szCs w:val="16"/>
           <w:lang w:eastAsia="es-PE"/>
@@ -3296,7 +3424,7 @@
                 <w:rFonts w:ascii="Arial" w:hAnsi="Arial"/>
                 <w:b/>
                 <w:bCs/>
-                <w:color w:val="auto"/>
+                <w:color w:val="000000" w:themeColor="text1"/>
                 <w:sz w:val="16"/>
                 <w:szCs w:val="16"/>
                 <w:lang w:val="es-PE"/>
@@ -3307,7 +3435,7 @@
                 <w:rFonts w:ascii="Arial" w:hAnsi="Arial"/>
                 <w:b/>
                 <w:bCs/>
-                <w:color w:val="auto"/>
+                <w:color w:val="000000" w:themeColor="text1"/>
                 <w:sz w:val="16"/>
                 <w:szCs w:val="16"/>
                 <w:lang w:val="es-PE"/>
@@ -3324,7 +3452,7 @@
             <w:pPr>
               <w:rPr>
                 <w:rFonts w:ascii="Arial" w:hAnsi="Arial"/>
-                <w:color w:val="auto"/>
+                <w:color w:val="000000" w:themeColor="text1"/>
                 <w:sz w:val="16"/>
                 <w:szCs w:val="16"/>
               </w:rPr>
@@ -3339,7 +3467,7 @@
             <w:pPr>
               <w:rPr>
                 <w:rFonts w:ascii="Arial" w:hAnsi="Arial"/>
-                <w:color w:val="auto"/>
+                <w:color w:val="000000" w:themeColor="text1"/>
                 <w:sz w:val="16"/>
                 <w:szCs w:val="16"/>
                 <w:lang w:val="es-PE"/>
@@ -3357,7 +3485,7 @@
                 <w:rFonts w:ascii="Arial" w:hAnsi="Arial"/>
                 <w:b/>
                 <w:bCs/>
-                <w:color w:val="auto"/>
+                <w:color w:val="000000" w:themeColor="text1"/>
                 <w:sz w:val="16"/>
                 <w:szCs w:val="16"/>
                 <w:lang w:val="es-PE"/>
@@ -3368,7 +3496,7 @@
                 <w:rFonts w:ascii="Arial" w:hAnsi="Arial"/>
                 <w:b/>
                 <w:bCs/>
-                <w:color w:val="auto"/>
+                <w:color w:val="000000" w:themeColor="text1"/>
                 <w:sz w:val="16"/>
                 <w:szCs w:val="16"/>
                 <w:lang w:val="es-PE"/>
@@ -3380,7 +3508,7 @@
                 <w:rFonts w:ascii="Arial" w:hAnsi="Arial"/>
                 <w:b/>
                 <w:bCs/>
-                <w:color w:val="auto"/>
+                <w:color w:val="000000" w:themeColor="text1"/>
                 <w:sz w:val="16"/>
                 <w:szCs w:val="16"/>
                 <w:lang w:val="es-PE"/>
@@ -3397,14 +3525,15 @@
             <w:pPr>
               <w:rPr>
                 <w:rFonts w:ascii="Arial" w:hAnsi="Arial"/>
-                <w:color w:val="auto"/>
-                <w:sz w:val="16"/>
-                <w:szCs w:val="16"/>
-              </w:rPr>
-            </w:pPr>
-            <w:r>
-              <w:rPr>
-                <w:rFonts w:ascii="Arial" w:hAnsi="Arial"/>
+                <w:color w:val="000000" w:themeColor="text1"/>
+                <w:sz w:val="16"/>
+                <w:szCs w:val="16"/>
+              </w:rPr>
+            </w:pPr>
+            <w:r>
+              <w:rPr>
+                <w:rFonts w:ascii="Arial" w:hAnsi="Arial"/>
+                <w:color w:val="000000" w:themeColor="text1"/>
                 <w:sz w:val="16"/>
                 <w:szCs w:val="16"/>
               </w:rPr>
@@ -3413,7 +3542,7 @@
             <w:r>
               <w:rPr>
                 <w:rFonts w:ascii="Arial" w:hAnsi="Arial"/>
-                <w:color w:val="auto"/>
+                <w:color w:val="000000" w:themeColor="text1"/>
                 <w:sz w:val="16"/>
                 <w:szCs w:val="16"/>
               </w:rPr>
@@ -3422,6 +3551,7 @@
             <w:r>
               <w:rPr>
                 <w:rFonts w:ascii="Arial" w:hAnsi="Arial"/>
+                <w:color w:val="000000" w:themeColor="text1"/>
                 <w:sz w:val="16"/>
                 <w:szCs w:val="16"/>
               </w:rPr>
@@ -3430,7 +3560,7 @@
             <w:r>
               <w:rPr>
                 <w:rFonts w:ascii="Arial" w:hAnsi="Arial"/>
-                <w:color w:val="auto"/>
+                <w:color w:val="000000" w:themeColor="text1"/>
                 <w:sz w:val="16"/>
                 <w:szCs w:val="16"/>
               </w:rPr>
@@ -3439,6 +3569,7 @@
             <w:r>
               <w:rPr>
                 <w:rFonts w:ascii="Arial" w:hAnsi="Arial"/>
+                <w:color w:val="000000" w:themeColor="text1"/>
                 <w:sz w:val="16"/>
                 <w:szCs w:val="16"/>
               </w:rPr>
@@ -3461,17 +3592,17 @@
                 <w:rFonts w:ascii="Arial" w:hAnsi="Arial"/>
                 <w:b/>
                 <w:bCs/>
-                <w:color w:val="auto"/>
-                <w:sz w:val="16"/>
-                <w:szCs w:val="16"/>
-              </w:rPr>
-            </w:pPr>
-            <w:r>
-              <w:rPr>
-                <w:rFonts w:ascii="Arial" w:hAnsi="Arial"/>
-                <w:b/>
-                <w:bCs/>
-                <w:color w:val="auto"/>
+                <w:color w:val="000000" w:themeColor="text1"/>
+                <w:sz w:val="16"/>
+                <w:szCs w:val="16"/>
+              </w:rPr>
+            </w:pPr>
+            <w:r>
+              <w:rPr>
+                <w:rFonts w:ascii="Arial" w:hAnsi="Arial"/>
+                <w:b/>
+                <w:bCs/>
+                <w:color w:val="000000" w:themeColor="text1"/>
                 <w:sz w:val="16"/>
                 <w:szCs w:val="16"/>
                 <w:lang w:val="es-PE"/>
@@ -3488,14 +3619,15 @@
             <w:pPr>
               <w:rPr>
                 <w:rFonts w:ascii="Arial" w:hAnsi="Arial"/>
-                <w:color w:val="auto"/>
-                <w:sz w:val="16"/>
-                <w:szCs w:val="16"/>
-              </w:rPr>
-            </w:pPr>
-            <w:r>
-              <w:rPr>
-                <w:rFonts w:ascii="Arial" w:hAnsi="Arial"/>
+                <w:color w:val="000000" w:themeColor="text1"/>
+                <w:sz w:val="16"/>
+                <w:szCs w:val="16"/>
+              </w:rPr>
+            </w:pPr>
+            <w:r>
+              <w:rPr>
+                <w:rFonts w:ascii="Arial" w:hAnsi="Arial"/>
+                <w:color w:val="000000" w:themeColor="text1"/>
                 <w:sz w:val="16"/>
                 <w:szCs w:val="16"/>
               </w:rPr>
@@ -3504,7 +3636,7 @@
             <w:r>
               <w:rPr>
                 <w:rFonts w:ascii="Arial" w:hAnsi="Arial"/>
-                <w:color w:val="auto"/>
+                <w:color w:val="000000" w:themeColor="text1"/>
                 <w:sz w:val="16"/>
                 <w:szCs w:val="16"/>
               </w:rPr>
@@ -3513,6 +3645,7 @@
             <w:r>
               <w:rPr>
                 <w:rFonts w:ascii="Arial" w:hAnsi="Arial"/>
+                <w:color w:val="000000" w:themeColor="text1"/>
                 <w:sz w:val="16"/>
                 <w:szCs w:val="16"/>
               </w:rPr>
@@ -3521,7 +3654,7 @@
             <w:r>
               <w:rPr>
                 <w:rFonts w:ascii="Arial" w:hAnsi="Arial"/>
-                <w:color w:val="auto"/>
+                <w:color w:val="000000" w:themeColor="text1"/>
                 <w:sz w:val="16"/>
                 <w:szCs w:val="16"/>
               </w:rPr>
@@ -3530,6 +3663,7 @@
             <w:r>
               <w:rPr>
                 <w:rFonts w:ascii="Arial" w:hAnsi="Arial"/>
+                <w:color w:val="000000" w:themeColor="text1"/>
                 <w:sz w:val="16"/>
                 <w:szCs w:val="16"/>
               </w:rPr>
@@ -3538,7 +3672,7 @@
             <w:r>
               <w:rPr>
                 <w:rFonts w:ascii="Arial" w:hAnsi="Arial"/>
-                <w:color w:val="auto"/>
+                <w:color w:val="000000" w:themeColor="text1"/>
                 <w:sz w:val="16"/>
                 <w:szCs w:val="16"/>
               </w:rPr>
@@ -3547,7 +3681,7 @@
             <w:r>
               <w:rPr>
                 <w:rFonts w:ascii="Arial" w:hAnsi="Arial"/>
-                <w:color w:val="auto"/>
+                <w:color w:val="000000" w:themeColor="text1"/>
                 <w:sz w:val="14"/>
                 <w:szCs w:val="14"/>
               </w:rPr>
@@ -3563,7 +3697,7 @@
             <w:pPr>
               <w:rPr>
                 <w:rFonts w:ascii="Arial" w:hAnsi="Arial"/>
-                <w:color w:val="auto"/>
+                <w:color w:val="000000" w:themeColor="text1"/>
                 <w:sz w:val="16"/>
                 <w:szCs w:val="16"/>
                 <w:lang w:val="es-PE"/>
@@ -3572,7 +3706,7 @@
             <w:r>
               <w:rPr>
                 <w:rFonts w:ascii="Arial" w:hAnsi="Arial"/>
-                <w:color w:val="auto"/>
+                <w:color w:val="000000" w:themeColor="text1"/>
                 <w:sz w:val="16"/>
                 <w:szCs w:val="16"/>
               </w:rPr>
@@ -3581,6 +3715,7 @@
             <w:r>
               <w:rPr>
                 <w:rFonts w:ascii="Arial" w:hAnsi="Arial"/>
+                <w:color w:val="000000" w:themeColor="text1"/>
                 <w:sz w:val="16"/>
                 <w:szCs w:val="16"/>
               </w:rPr>
@@ -3589,7 +3724,7 @@
             <w:r>
               <w:rPr>
                 <w:rFonts w:ascii="Arial" w:hAnsi="Arial"/>
-                <w:color w:val="auto"/>
+                <w:color w:val="000000" w:themeColor="text1"/>
                 <w:sz w:val="16"/>
                 <w:szCs w:val="16"/>
               </w:rPr>
@@ -3598,6 +3733,7 @@
             <w:r>
               <w:rPr>
                 <w:rFonts w:ascii="Arial" w:hAnsi="Arial"/>
+                <w:color w:val="000000" w:themeColor="text1"/>
                 <w:sz w:val="16"/>
                 <w:szCs w:val="16"/>
               </w:rPr>
@@ -3606,7 +3742,7 @@
             <w:r>
               <w:rPr>
                 <w:rFonts w:ascii="Arial" w:hAnsi="Arial"/>
-                <w:color w:val="auto"/>
+                <w:color w:val="000000" w:themeColor="text1"/>
                 <w:sz w:val="16"/>
                 <w:szCs w:val="16"/>
               </w:rPr>
@@ -3615,6 +3751,7 @@
             <w:r>
               <w:rPr>
                 <w:rFonts w:ascii="Arial" w:hAnsi="Arial"/>
+                <w:color w:val="000000" w:themeColor="text1"/>
                 <w:sz w:val="16"/>
                 <w:szCs w:val="16"/>
               </w:rPr>
@@ -3632,17 +3769,17 @@
                 <w:rFonts w:ascii="Arial" w:hAnsi="Arial"/>
                 <w:b/>
                 <w:bCs/>
-                <w:color w:val="auto"/>
-                <w:sz w:val="16"/>
-                <w:szCs w:val="16"/>
-              </w:rPr>
-            </w:pPr>
-            <w:r>
-              <w:rPr>
-                <w:rFonts w:ascii="Arial" w:hAnsi="Arial"/>
-                <w:b/>
-                <w:bCs/>
-                <w:color w:val="auto"/>
+                <w:color w:val="000000" w:themeColor="text1"/>
+                <w:sz w:val="16"/>
+                <w:szCs w:val="16"/>
+              </w:rPr>
+            </w:pPr>
+            <w:r>
+              <w:rPr>
+                <w:rFonts w:ascii="Arial" w:hAnsi="Arial"/>
+                <w:b/>
+                <w:bCs/>
+                <w:color w:val="000000" w:themeColor="text1"/>
                 <w:sz w:val="16"/>
                 <w:szCs w:val="16"/>
                 <w:lang w:val="es-PE"/>
@@ -3659,14 +3796,15 @@
             <w:pPr>
               <w:rPr>
                 <w:rFonts w:ascii="Arial" w:hAnsi="Arial"/>
-                <w:color w:val="auto"/>
-                <w:sz w:val="16"/>
-                <w:szCs w:val="16"/>
-              </w:rPr>
-            </w:pPr>
-            <w:r>
-              <w:rPr>
-                <w:rFonts w:ascii="Arial" w:hAnsi="Arial"/>
+                <w:color w:val="000000" w:themeColor="text1"/>
+                <w:sz w:val="16"/>
+                <w:szCs w:val="16"/>
+              </w:rPr>
+            </w:pPr>
+            <w:r>
+              <w:rPr>
+                <w:rFonts w:ascii="Arial" w:hAnsi="Arial"/>
+                <w:color w:val="000000" w:themeColor="text1"/>
                 <w:sz w:val="16"/>
                 <w:szCs w:val="16"/>
               </w:rPr>
@@ -3675,7 +3813,7 @@
             <w:r>
               <w:rPr>
                 <w:rFonts w:ascii="Arial" w:hAnsi="Arial"/>
-                <w:color w:val="auto"/>
+                <w:color w:val="000000" w:themeColor="text1"/>
                 <w:sz w:val="16"/>
                 <w:szCs w:val="16"/>
               </w:rPr>
@@ -3684,6 +3822,7 @@
             <w:r>
               <w:rPr>
                 <w:rFonts w:ascii="Arial" w:hAnsi="Arial"/>
+                <w:color w:val="000000" w:themeColor="text1"/>
                 <w:sz w:val="16"/>
                 <w:szCs w:val="16"/>
               </w:rPr>
@@ -3692,7 +3831,7 @@
             <w:r>
               <w:rPr>
                 <w:rFonts w:ascii="Arial" w:hAnsi="Arial"/>
-                <w:color w:val="auto"/>
+                <w:color w:val="000000" w:themeColor="text1"/>
                 <w:sz w:val="16"/>
                 <w:szCs w:val="16"/>
               </w:rPr>
@@ -3701,6 +3840,7 @@
             <w:r>
               <w:rPr>
                 <w:rFonts w:ascii="Arial" w:hAnsi="Arial"/>
+                <w:color w:val="000000" w:themeColor="text1"/>
                 <w:sz w:val="16"/>
                 <w:szCs w:val="16"/>
               </w:rPr>
@@ -3723,17 +3863,17 @@
                 <w:rFonts w:ascii="Arial" w:hAnsi="Arial"/>
                 <w:b/>
                 <w:bCs/>
-                <w:color w:val="auto"/>
-                <w:sz w:val="16"/>
-                <w:szCs w:val="16"/>
-              </w:rPr>
-            </w:pPr>
-            <w:r>
-              <w:rPr>
-                <w:rFonts w:ascii="Arial" w:hAnsi="Arial"/>
-                <w:b/>
-                <w:bCs/>
-                <w:color w:val="auto"/>
+                <w:color w:val="000000" w:themeColor="text1"/>
+                <w:sz w:val="16"/>
+                <w:szCs w:val="16"/>
+              </w:rPr>
+            </w:pPr>
+            <w:r>
+              <w:rPr>
+                <w:rFonts w:ascii="Arial" w:hAnsi="Arial"/>
+                <w:b/>
+                <w:bCs/>
+                <w:color w:val="000000" w:themeColor="text1"/>
                 <w:sz w:val="16"/>
                 <w:szCs w:val="16"/>
                 <w:lang w:val="es-PE"/>
@@ -3750,14 +3890,15 @@
             <w:pPr>
               <w:rPr>
                 <w:rFonts w:ascii="Arial" w:hAnsi="Arial"/>
-                <w:color w:val="auto"/>
-                <w:sz w:val="16"/>
-                <w:szCs w:val="16"/>
-              </w:rPr>
-            </w:pPr>
-            <w:r>
-              <w:rPr>
-                <w:rFonts w:ascii="Arial" w:hAnsi="Arial"/>
+                <w:color w:val="000000" w:themeColor="text1"/>
+                <w:sz w:val="16"/>
+                <w:szCs w:val="16"/>
+              </w:rPr>
+            </w:pPr>
+            <w:r>
+              <w:rPr>
+                <w:rFonts w:ascii="Arial" w:hAnsi="Arial"/>
+                <w:color w:val="000000" w:themeColor="text1"/>
                 <w:sz w:val="16"/>
                 <w:szCs w:val="16"/>
               </w:rPr>
@@ -3766,7 +3907,7 @@
             <w:r>
               <w:rPr>
                 <w:rFonts w:ascii="Arial" w:hAnsi="Arial"/>
-                <w:color w:val="auto"/>
+                <w:color w:val="000000" w:themeColor="text1"/>
                 <w:sz w:val="16"/>
                 <w:szCs w:val="16"/>
               </w:rPr>
@@ -3775,6 +3916,7 @@
             <w:r>
               <w:rPr>
                 <w:rFonts w:ascii="Arial" w:hAnsi="Arial"/>
+                <w:color w:val="000000" w:themeColor="text1"/>
                 <w:sz w:val="16"/>
                 <w:szCs w:val="16"/>
               </w:rPr>
@@ -3783,7 +3925,7 @@
             <w:r>
               <w:rPr>
                 <w:rFonts w:ascii="Arial" w:hAnsi="Arial"/>
-                <w:color w:val="auto"/>
+                <w:color w:val="000000" w:themeColor="text1"/>
                 <w:sz w:val="16"/>
                 <w:szCs w:val="16"/>
               </w:rPr>
@@ -3792,6 +3934,7 @@
             <w:r>
               <w:rPr>
                 <w:rFonts w:ascii="Arial" w:hAnsi="Arial"/>
+                <w:color w:val="000000" w:themeColor="text1"/>
                 <w:sz w:val="16"/>
                 <w:szCs w:val="16"/>
               </w:rPr>
@@ -3800,7 +3943,7 @@
             <w:r>
               <w:rPr>
                 <w:rFonts w:ascii="Arial" w:hAnsi="Arial"/>
-                <w:color w:val="auto"/>
+                <w:color w:val="000000" w:themeColor="text1"/>
                 <w:sz w:val="16"/>
                 <w:szCs w:val="16"/>
               </w:rPr>
@@ -3809,7 +3952,7 @@
             <w:r>
               <w:rPr>
                 <w:rFonts w:ascii="Arial" w:hAnsi="Arial"/>
-                <w:color w:val="auto"/>
+                <w:color w:val="000000" w:themeColor="text1"/>
                 <w:sz w:val="14"/>
                 <w:szCs w:val="14"/>
               </w:rPr>
@@ -3825,15 +3968,15 @@
             <w:pPr>
               <w:rPr>
                 <w:rFonts w:ascii="Arial" w:hAnsi="Arial"/>
-                <w:color w:val="auto"/>
-                <w:sz w:val="16"/>
-                <w:szCs w:val="16"/>
-              </w:rPr>
-            </w:pPr>
-            <w:r>
-              <w:rPr>
-                <w:rFonts w:ascii="Arial" w:hAnsi="Arial"/>
-                <w:color w:val="auto"/>
+                <w:color w:val="000000" w:themeColor="text1"/>
+                <w:sz w:val="16"/>
+                <w:szCs w:val="16"/>
+              </w:rPr>
+            </w:pPr>
+            <w:r>
+              <w:rPr>
+                <w:rFonts w:ascii="Arial" w:hAnsi="Arial"/>
+                <w:color w:val="000000" w:themeColor="text1"/>
                 <w:sz w:val="16"/>
                 <w:szCs w:val="16"/>
               </w:rPr>
@@ -3842,6 +3985,7 @@
             <w:r>
               <w:rPr>
                 <w:rFonts w:ascii="Arial" w:hAnsi="Arial"/>
+                <w:color w:val="000000" w:themeColor="text1"/>
                 <w:sz w:val="16"/>
                 <w:szCs w:val="16"/>
               </w:rPr>
@@ -3850,7 +3994,7 @@
             <w:r>
               <w:rPr>
                 <w:rFonts w:ascii="Arial" w:hAnsi="Arial"/>
-                <w:color w:val="auto"/>
+                <w:color w:val="000000" w:themeColor="text1"/>
                 <w:sz w:val="16"/>
                 <w:szCs w:val="16"/>
               </w:rPr>
@@ -3859,6 +4003,7 @@
             <w:r>
               <w:rPr>
                 <w:rFonts w:ascii="Arial" w:hAnsi="Arial"/>
+                <w:color w:val="000000" w:themeColor="text1"/>
                 <w:sz w:val="16"/>
                 <w:szCs w:val="16"/>
               </w:rPr>
@@ -3867,7 +4012,7 @@
             <w:r>
               <w:rPr>
                 <w:rFonts w:ascii="Arial" w:hAnsi="Arial"/>
-                <w:color w:val="auto"/>
+                <w:color w:val="000000" w:themeColor="text1"/>
                 <w:sz w:val="16"/>
                 <w:szCs w:val="16"/>
               </w:rPr>
@@ -3876,6 +4021,7 @@
             <w:r>
               <w:rPr>
                 <w:rFonts w:ascii="Arial" w:hAnsi="Arial"/>
+                <w:color w:val="000000" w:themeColor="text1"/>
                 <w:sz w:val="16"/>
                 <w:szCs w:val="16"/>
               </w:rPr>
@@ -3893,17 +4039,17 @@
                 <w:rFonts w:ascii="Arial" w:hAnsi="Arial"/>
                 <w:b/>
                 <w:bCs/>
-                <w:color w:val="auto"/>
-                <w:sz w:val="16"/>
-                <w:szCs w:val="16"/>
-              </w:rPr>
-            </w:pPr>
-            <w:r>
-              <w:rPr>
-                <w:rFonts w:ascii="Arial" w:hAnsi="Arial"/>
-                <w:b/>
-                <w:bCs/>
-                <w:color w:val="auto"/>
+                <w:color w:val="000000" w:themeColor="text1"/>
+                <w:sz w:val="16"/>
+                <w:szCs w:val="16"/>
+              </w:rPr>
+            </w:pPr>
+            <w:r>
+              <w:rPr>
+                <w:rFonts w:ascii="Arial" w:hAnsi="Arial"/>
+                <w:b/>
+                <w:bCs/>
+                <w:color w:val="000000" w:themeColor="text1"/>
                 <w:sz w:val="16"/>
                 <w:szCs w:val="16"/>
               </w:rPr>
@@ -3919,14 +4065,15 @@
             <w:pPr>
               <w:rPr>
                 <w:rFonts w:ascii="Arial" w:hAnsi="Arial"/>
-                <w:color w:val="auto"/>
-                <w:sz w:val="16"/>
-                <w:szCs w:val="16"/>
-              </w:rPr>
-            </w:pPr>
-            <w:r>
-              <w:rPr>
-                <w:rFonts w:ascii="Arial" w:hAnsi="Arial"/>
+                <w:color w:val="000000" w:themeColor="text1"/>
+                <w:sz w:val="16"/>
+                <w:szCs w:val="16"/>
+              </w:rPr>
+            </w:pPr>
+            <w:r>
+              <w:rPr>
+                <w:rFonts w:ascii="Arial" w:hAnsi="Arial"/>
+                <w:color w:val="000000" w:themeColor="text1"/>
                 <w:sz w:val="16"/>
                 <w:szCs w:val="16"/>
               </w:rPr>
@@ -3935,7 +4082,7 @@
             <w:r>
               <w:rPr>
                 <w:rFonts w:ascii="Arial" w:hAnsi="Arial"/>
-                <w:color w:val="auto"/>
+                <w:color w:val="000000" w:themeColor="text1"/>
                 <w:sz w:val="16"/>
                 <w:szCs w:val="16"/>
               </w:rPr>
@@ -3944,6 +4091,7 @@
             <w:r>
               <w:rPr>
                 <w:rFonts w:ascii="Arial" w:hAnsi="Arial"/>
+                <w:color w:val="000000" w:themeColor="text1"/>
                 <w:sz w:val="16"/>
                 <w:szCs w:val="16"/>
               </w:rPr>
@@ -3952,7 +4100,7 @@
             <w:r>
               <w:rPr>
                 <w:rFonts w:ascii="Arial" w:hAnsi="Arial"/>
-                <w:color w:val="auto"/>
+                <w:color w:val="000000" w:themeColor="text1"/>
                 <w:sz w:val="16"/>
                 <w:szCs w:val="16"/>
               </w:rPr>
@@ -3961,6 +4109,7 @@
             <w:r>
               <w:rPr>
                 <w:rFonts w:ascii="Arial" w:hAnsi="Arial"/>
+                <w:color w:val="000000" w:themeColor="text1"/>
                 <w:sz w:val="16"/>
                 <w:szCs w:val="16"/>
               </w:rPr>
@@ -3983,17 +4132,17 @@
                 <w:rFonts w:ascii="Arial" w:hAnsi="Arial"/>
                 <w:b/>
                 <w:bCs/>
-                <w:color w:val="auto"/>
-                <w:sz w:val="16"/>
-                <w:szCs w:val="16"/>
-              </w:rPr>
-            </w:pPr>
-            <w:r>
-              <w:rPr>
-                <w:rFonts w:ascii="Arial" w:hAnsi="Arial"/>
-                <w:b/>
-                <w:bCs/>
-                <w:color w:val="auto"/>
+                <w:color w:val="000000" w:themeColor="text1"/>
+                <w:sz w:val="16"/>
+                <w:szCs w:val="16"/>
+              </w:rPr>
+            </w:pPr>
+            <w:r>
+              <w:rPr>
+                <w:rFonts w:ascii="Arial" w:hAnsi="Arial"/>
+                <w:b/>
+                <w:bCs/>
+                <w:color w:val="000000" w:themeColor="text1"/>
                 <w:sz w:val="16"/>
                 <w:szCs w:val="16"/>
                 <w:lang w:val="es-PE"/>
@@ -4010,14 +4159,15 @@
             <w:pPr>
               <w:rPr>
                 <w:rFonts w:ascii="Arial" w:hAnsi="Arial"/>
-                <w:color w:val="auto"/>
-                <w:sz w:val="16"/>
-                <w:szCs w:val="16"/>
-              </w:rPr>
-            </w:pPr>
-            <w:r>
-              <w:rPr>
-                <w:rFonts w:ascii="Arial" w:hAnsi="Arial"/>
+                <w:color w:val="000000" w:themeColor="text1"/>
+                <w:sz w:val="16"/>
+                <w:szCs w:val="16"/>
+              </w:rPr>
+            </w:pPr>
+            <w:r>
+              <w:rPr>
+                <w:rFonts w:ascii="Arial" w:hAnsi="Arial"/>
+                <w:color w:val="000000" w:themeColor="text1"/>
                 <w:sz w:val="16"/>
                 <w:szCs w:val="16"/>
               </w:rPr>
@@ -4026,7 +4176,7 @@
             <w:r>
               <w:rPr>
                 <w:rFonts w:ascii="Arial" w:hAnsi="Arial"/>
-                <w:color w:val="auto"/>
+                <w:color w:val="000000" w:themeColor="text1"/>
                 <w:sz w:val="16"/>
                 <w:szCs w:val="16"/>
               </w:rPr>
@@ -4035,6 +4185,7 @@
             <w:r>
               <w:rPr>
                 <w:rFonts w:ascii="Arial" w:hAnsi="Arial"/>
+                <w:color w:val="000000" w:themeColor="text1"/>
                 <w:sz w:val="16"/>
                 <w:szCs w:val="16"/>
               </w:rPr>
@@ -4044,7 +4195,7 @@
               <w:rPr>
                 <w:rFonts w:ascii="Arial" w:hAnsi="Arial"/>
                 <w:noProof/>
-                <w:color w:val="auto"/>
+                <w:color w:val="000000" w:themeColor="text1"/>
                 <w:sz w:val="16"/>
                 <w:szCs w:val="16"/>
               </w:rPr>
@@ -4053,6 +4204,7 @@
             <w:r>
               <w:rPr>
                 <w:rFonts w:ascii="Arial" w:hAnsi="Arial"/>
+                <w:color w:val="000000" w:themeColor="text1"/>
                 <w:sz w:val="16"/>
                 <w:szCs w:val="16"/>
               </w:rPr>
@@ -4061,7 +4213,7 @@
             <w:r>
               <w:rPr>
                 <w:rFonts w:ascii="Arial" w:hAnsi="Arial"/>
-                <w:color w:val="auto"/>
+                <w:color w:val="000000" w:themeColor="text1"/>
                 <w:sz w:val="16"/>
                 <w:szCs w:val="16"/>
               </w:rPr>
@@ -4070,7 +4222,7 @@
             <w:r>
               <w:rPr>
                 <w:rFonts w:ascii="Arial" w:hAnsi="Arial"/>
-                <w:color w:val="auto"/>
+                <w:color w:val="000000" w:themeColor="text1"/>
                 <w:sz w:val="14"/>
                 <w:szCs w:val="14"/>
               </w:rPr>
@@ -4086,7 +4238,7 @@
             <w:pPr>
               <w:rPr>
                 <w:rFonts w:ascii="Arial" w:hAnsi="Arial"/>
-                <w:color w:val="auto"/>
+                <w:color w:val="000000" w:themeColor="text1"/>
                 <w:sz w:val="16"/>
                 <w:szCs w:val="16"/>
                 <w:lang w:val="es-PE"/>
@@ -4104,17 +4256,17 @@
                 <w:rFonts w:ascii="Arial" w:hAnsi="Arial"/>
                 <w:b/>
                 <w:bCs/>
-                <w:color w:val="auto"/>
-                <w:sz w:val="16"/>
-                <w:szCs w:val="16"/>
-              </w:rPr>
-            </w:pPr>
-            <w:r>
-              <w:rPr>
-                <w:rFonts w:ascii="Arial" w:hAnsi="Arial"/>
-                <w:b/>
-                <w:bCs/>
-                <w:color w:val="auto"/>
+                <w:color w:val="000000" w:themeColor="text1"/>
+                <w:sz w:val="16"/>
+                <w:szCs w:val="16"/>
+              </w:rPr>
+            </w:pPr>
+            <w:r>
+              <w:rPr>
+                <w:rFonts w:ascii="Arial" w:hAnsi="Arial"/>
+                <w:b/>
+                <w:bCs/>
+                <w:color w:val="000000" w:themeColor="text1"/>
                 <w:sz w:val="16"/>
                 <w:szCs w:val="16"/>
                 <w:lang w:val="es-PE"/>
@@ -4131,14 +4283,15 @@
             <w:pPr>
               <w:rPr>
                 <w:rFonts w:ascii="Arial" w:hAnsi="Arial"/>
-                <w:color w:val="auto"/>
-                <w:sz w:val="16"/>
-                <w:szCs w:val="16"/>
-              </w:rPr>
-            </w:pPr>
-            <w:r>
-              <w:rPr>
-                <w:rFonts w:ascii="Arial" w:hAnsi="Arial"/>
+                <w:color w:val="000000" w:themeColor="text1"/>
+                <w:sz w:val="16"/>
+                <w:szCs w:val="16"/>
+              </w:rPr>
+            </w:pPr>
+            <w:r>
+              <w:rPr>
+                <w:rFonts w:ascii="Arial" w:hAnsi="Arial"/>
+                <w:color w:val="000000" w:themeColor="text1"/>
                 <w:sz w:val="16"/>
                 <w:szCs w:val="16"/>
               </w:rPr>
@@ -4147,7 +4300,7 @@
             <w:r>
               <w:rPr>
                 <w:rFonts w:ascii="Arial" w:hAnsi="Arial"/>
-                <w:color w:val="auto"/>
+                <w:color w:val="000000" w:themeColor="text1"/>
                 <w:sz w:val="16"/>
                 <w:szCs w:val="16"/>
               </w:rPr>
@@ -4156,6 +4309,7 @@
             <w:r>
               <w:rPr>
                 <w:rFonts w:ascii="Arial" w:hAnsi="Arial"/>
+                <w:color w:val="000000" w:themeColor="text1"/>
                 <w:sz w:val="16"/>
                 <w:szCs w:val="16"/>
               </w:rPr>
@@ -4164,7 +4318,7 @@
             <w:r>
               <w:rPr>
                 <w:rFonts w:ascii="Arial" w:hAnsi="Arial"/>
-                <w:color w:val="auto"/>
+                <w:color w:val="000000" w:themeColor="text1"/>
                 <w:sz w:val="16"/>
                 <w:szCs w:val="16"/>
               </w:rPr>
@@ -4173,6 +4327,7 @@
             <w:r>
               <w:rPr>
                 <w:rFonts w:ascii="Arial" w:hAnsi="Arial"/>
+                <w:color w:val="000000" w:themeColor="text1"/>
                 <w:sz w:val="16"/>
                 <w:szCs w:val="16"/>
               </w:rPr>

</xml_diff>